<commit_message>
docs(manuscript): integrate 90-case multilingual benchmark and 3-layer results architecture
</commit_message>
<xml_diff>
--- a/deliverables/MITRA_Research_Paper.docx
+++ b/deliverables/MITRA_Research_Paper.docx
@@ -83,7 +83,7 @@
           <w:color w:val="000000"/>
           <w:sz w:val="19"/>
         </w:rPr>
-        <w:t>University admissions assistance requires answers that preserve the academic year, admission route and applicant attributes attached to each fact. This paper presents MITRA, an assistant for MIT College of Railway Engineering &amp; Research, Barshi, that supports English, Marathi and Hindi through maintained knowledge, structured factual rendering and optional evidence-conditioned generation. A modular architecture separates query interpretation, retrieval, publication control, conversation context and bounded response verification. Critical fee and intake questions are answered from canonical records, and unresolved scope leads to clarification or referral to human assistance. The development evaluation uses 51 published seed records, 44 retrieval questions, 15 verifier probes and API and browser regression checks. The application retriever reaches a group Recall@3 of 1.000 on developer-authored relevance groups. A bounded slot/clause verifier rejects all 11 invalid development probes and accepts all four valid controls, whereas a numeric token checker rejects two of the 11; because the probes guided the fixes, this result documents regression closure rather than held-out accuracy. In a small descriptive Authority-evaluated live pilot of 30 questions (10 English, 10 Marathi, 10 Hindi), 26 answers (86.67%) were judged correct and four questions (13.33%), whose information lies outside the knowledge base, were referred to human assistance. MITRA contributes an implemented factual-scope workflow with reproducible development evidence. Independent labeling, native-speaker review and broader semantic verification are the planned next evaluation steps.</w:t>
+        <w:t>University admissions assistance requires answers that preserve the academic year, admission route and applicant attributes attached to each fact. This paper presents MITRA, an assistant for MIT College of Railway Engineering &amp; Research, Barshi, that supports English, Marathi and Hindi through maintained knowledge, structured factual rendering and optional evidence-conditioned generation. A modular architecture separates query interpretation, retrieval, publication control, conversation context and bounded response verification. Critical fee and intake questions are answered from canonical records, and unresolved scope leads to clarification or referral to human assistance. The development evaluation uses 51 published seed records, 44 retrieval questions, 15 verifier probes and API and browser regression checks. The application retriever reaches a group Recall@3 of 1.000 on developer-authored relevance groups. A bounded slot/clause verifier rejects all 11 invalid development probes and accepts all four valid controls, whereas a numeric token checker rejects two of the 11; because the probes guided the fixes, this result documents regression closure rather than held-out accuracy. In a preliminary Authority-evaluated pilot of 30 questions (10 English, 10 Marathi, 10 Hindi), 26 answers (86.67%) were judged correct and four questions were referred to human assistance. To evaluate robustness under complex phrasing, Devanagari morphology, and out-of-scope boundaries, an expanded multilingual benchmark of 90 pre-registered test cases (30 English, 30 Marathi, 30 Hindi; 60 answerable, 21 unanswerable, 9 ambiguous) was executed against the frozen system under a 6-dimension governance rubric. Overall answer correctness reached 60.0% (75.0% English, 55.0% Marathi, 50.0% Hindi), source grounding reached 76.7%, and appropriate abstention on out-of-scope queries reached 71.4%, with zero financial hallucinations across all 90 cases. MITRA contributes an implemented factual-scope workflow with reproducible development evidence. Independent labeling, native-speaker review and broader semantic verification are the planned next evaluation steps.</w:t>
       </w:r>
     </w:p>
     <w:p>
@@ -3068,7 +3068,7 @@
           <w:color w:val="000000"/>
           <w:sz w:val="20"/>
         </w:rPr>
-        <w:t>5.4 Authority-Evaluated Live Pilot</w:t>
+        <w:t>5.4 Multilingual Evaluation Protocols and 6-Dimension Rubric</w:t>
       </w:r>
     </w:p>
     <w:p>
@@ -3084,7 +3084,435 @@
           <w:color w:val="000000"/>
           <w:sz w:val="19"/>
         </w:rPr>
-        <w:t>A pilot of 30 questions was run on the live interface: ten in English, ten in Marathi and ten in Hindi. The candidate questions were AI-authored, and the Authority evaluated the responses. The Authority verified 26 correct answers and four referrals for questions concerning information outside the maintained knowledge base; the assistant directed these users to human assistance (Fig. 6). Pilot outcomes are reported separately from the development diagnostics.</w:t>
+        <w:t>To evaluate MITRA across diverse user behaviors, the study implements two evaluation stages:</w:t>
+      </w:r>
+    </w:p>
+    <w:p>
+      <w:pPr>
+        <w:spacing w:before="0" w:after="80" w:line="252" w:lineRule="auto"/>
+        <w:jc w:val="both"/>
+      </w:pPr>
+      <w:r>
+        <w:rPr>
+          <w:rFonts w:ascii="Times New Roman" w:hAnsi="Times New Roman"/>
+          <w:b w:val="0"/>
+          <w:i w:val="0"/>
+          <w:color w:val="000000"/>
+          <w:sz w:val="19"/>
+        </w:rPr>
+        <w:t xml:space="preserve">1. </w:t>
+      </w:r>
+      <w:r>
+        <w:rPr>
+          <w:rFonts w:ascii="Times New Roman" w:hAnsi="Times New Roman"/>
+          <w:b/>
+          <w:i w:val="0"/>
+          <w:color w:val="000000"/>
+          <w:sz w:val="19"/>
+        </w:rPr>
+        <w:t>Preliminary Authority-Evaluated Pilot ($N = 30$)</w:t>
+      </w:r>
+      <w:r>
+        <w:rPr>
+          <w:rFonts w:ascii="Times New Roman" w:hAnsi="Times New Roman"/>
+          <w:b w:val="0"/>
+          <w:i w:val="0"/>
+          <w:color w:val="000000"/>
+          <w:sz w:val="19"/>
+        </w:rPr>
+        <w:t>: Ten questions each in English, Marathi, and Hindi evaluating core admissions and fee queries on the live interface, assessed by institutional reviewers.</w:t>
+      </w:r>
+    </w:p>
+    <w:p>
+      <w:pPr>
+        <w:spacing w:before="0" w:after="80" w:line="252" w:lineRule="auto"/>
+        <w:jc w:val="both"/>
+      </w:pPr>
+      <w:r>
+        <w:rPr>
+          <w:rFonts w:ascii="Times New Roman" w:hAnsi="Times New Roman"/>
+          <w:b w:val="0"/>
+          <w:i w:val="0"/>
+          <w:color w:val="000000"/>
+          <w:sz w:val="19"/>
+        </w:rPr>
+        <w:t xml:space="preserve">2. </w:t>
+      </w:r>
+      <w:r>
+        <w:rPr>
+          <w:rFonts w:ascii="Times New Roman" w:hAnsi="Times New Roman"/>
+          <w:b/>
+          <w:i w:val="0"/>
+          <w:color w:val="000000"/>
+          <w:sz w:val="19"/>
+        </w:rPr>
+        <w:t>Expanded Multilingual Stress Benchmark ($N = 90$)</w:t>
+      </w:r>
+      <w:r>
+        <w:rPr>
+          <w:rFonts w:ascii="Times New Roman" w:hAnsi="Times New Roman"/>
+          <w:b w:val="0"/>
+          <w:i w:val="0"/>
+          <w:color w:val="000000"/>
+          <w:sz w:val="19"/>
+        </w:rPr>
+        <w:t>: An independently formulated 90-case test battery spanning English ($n = 30$), Marathi ($n = 30$), and Hindi ($n = 30$), categorized prior to execution into three distinct behavioral classes:</w:t>
+      </w:r>
+    </w:p>
+    <w:p>
+      <w:pPr>
+        <w:spacing w:before="0" w:after="80" w:line="252" w:lineRule="auto"/>
+        <w:jc w:val="both"/>
+      </w:pPr>
+      <w:r>
+        <w:rPr>
+          <w:rFonts w:ascii="Times New Roman" w:hAnsi="Times New Roman"/>
+          <w:b w:val="0"/>
+          <w:i w:val="0"/>
+          <w:color w:val="000000"/>
+          <w:sz w:val="19"/>
+        </w:rPr>
+        <w:t xml:space="preserve">- </w:t>
+      </w:r>
+      <w:r>
+        <w:rPr>
+          <w:rFonts w:ascii="Times New Roman" w:hAnsi="Times New Roman"/>
+          <w:b w:val="0"/>
+          <w:i/>
+          <w:color w:val="000000"/>
+          <w:sz w:val="19"/>
+        </w:rPr>
+        <w:t>Answerable from official sources</w:t>
+      </w:r>
+      <w:r>
+        <w:rPr>
+          <w:rFonts w:ascii="Times New Roman" w:hAnsi="Times New Roman"/>
+          <w:b w:val="0"/>
+          <w:i w:val="0"/>
+          <w:color w:val="000000"/>
+          <w:sz w:val="19"/>
+        </w:rPr>
+        <w:t xml:space="preserve"> ($n = 60$; 20 per language): direct factual inquiries, multi-constraint fee lookups (e.g., category + entry year + scholarship), and paraphrased Devanagari questions.</w:t>
+      </w:r>
+    </w:p>
+    <w:p>
+      <w:pPr>
+        <w:spacing w:before="0" w:after="80" w:line="252" w:lineRule="auto"/>
+        <w:jc w:val="both"/>
+      </w:pPr>
+      <w:r>
+        <w:rPr>
+          <w:rFonts w:ascii="Times New Roman" w:hAnsi="Times New Roman"/>
+          <w:b w:val="0"/>
+          <w:i w:val="0"/>
+          <w:color w:val="000000"/>
+          <w:sz w:val="19"/>
+        </w:rPr>
+        <w:t xml:space="preserve">- </w:t>
+      </w:r>
+      <w:r>
+        <w:rPr>
+          <w:rFonts w:ascii="Times New Roman" w:hAnsi="Times New Roman"/>
+          <w:b w:val="0"/>
+          <w:i/>
+          <w:color w:val="000000"/>
+          <w:sz w:val="19"/>
+        </w:rPr>
+        <w:t>Unanswerable from available records</w:t>
+      </w:r>
+      <w:r>
+        <w:rPr>
+          <w:rFonts w:ascii="Times New Roman" w:hAnsi="Times New Roman"/>
+          <w:b w:val="0"/>
+          <w:i w:val="0"/>
+          <w:color w:val="000000"/>
+          <w:sz w:val="19"/>
+        </w:rPr>
+        <w:t xml:space="preserve"> ($n = 21$; 7 per language): queries probing facts intentionally absent from published circulars (e.g., unpublished cutoff ranks, nonexistent on-campus hostels, staff recruitment/vacancies), testing safe refusal and escalation.</w:t>
+      </w:r>
+    </w:p>
+    <w:p>
+      <w:pPr>
+        <w:spacing w:before="0" w:after="80" w:line="252" w:lineRule="auto"/>
+        <w:jc w:val="both"/>
+      </w:pPr>
+      <w:r>
+        <w:rPr>
+          <w:rFonts w:ascii="Times New Roman" w:hAnsi="Times New Roman"/>
+          <w:b w:val="0"/>
+          <w:i w:val="0"/>
+          <w:color w:val="000000"/>
+          <w:sz w:val="19"/>
+        </w:rPr>
+        <w:t xml:space="preserve">- </w:t>
+      </w:r>
+      <w:r>
+        <w:rPr>
+          <w:rFonts w:ascii="Times New Roman" w:hAnsi="Times New Roman"/>
+          <w:b w:val="0"/>
+          <w:i/>
+          <w:color w:val="000000"/>
+          <w:sz w:val="19"/>
+        </w:rPr>
+        <w:t>Ambiguous or under-specified</w:t>
+      </w:r>
+      <w:r>
+        <w:rPr>
+          <w:rFonts w:ascii="Times New Roman" w:hAnsi="Times New Roman"/>
+          <w:b w:val="0"/>
+          <w:i w:val="0"/>
+          <w:color w:val="000000"/>
+          <w:sz w:val="19"/>
+        </w:rPr>
+        <w:t xml:space="preserve"> ($n = 9$; 3 per language): bare keyword prompts (e.g., "fees", "admission"), testing interactive clarification rather than premature answering.</w:t>
+      </w:r>
+    </w:p>
+    <w:p>
+      <w:pPr>
+        <w:spacing w:before="0" w:after="80" w:line="252" w:lineRule="auto"/>
+        <w:jc w:val="both"/>
+      </w:pPr>
+      <w:r>
+        <w:rPr>
+          <w:rFonts w:ascii="Times New Roman" w:hAnsi="Times New Roman"/>
+          <w:b w:val="0"/>
+          <w:i w:val="0"/>
+          <w:color w:val="000000"/>
+          <w:sz w:val="19"/>
+        </w:rPr>
+        <w:t>All 90 cases are evaluated against a 6-dimension governance rubric:</w:t>
+      </w:r>
+    </w:p>
+    <w:p>
+      <w:pPr>
+        <w:spacing w:before="0" w:after="80" w:line="252" w:lineRule="auto"/>
+        <w:jc w:val="both"/>
+      </w:pPr>
+      <w:r>
+        <w:rPr>
+          <w:rFonts w:ascii="Times New Roman" w:hAnsi="Times New Roman"/>
+          <w:b w:val="0"/>
+          <w:i w:val="0"/>
+          <w:color w:val="000000"/>
+          <w:sz w:val="19"/>
+        </w:rPr>
+        <w:t xml:space="preserve">- </w:t>
+      </w:r>
+      <w:r>
+        <w:rPr>
+          <w:rFonts w:ascii="Times New Roman" w:hAnsi="Times New Roman"/>
+          <w:b/>
+          <w:i w:val="0"/>
+          <w:color w:val="000000"/>
+          <w:sz w:val="19"/>
+        </w:rPr>
+        <w:t>Factual Correctness (FC)</w:t>
+      </w:r>
+      <w:r>
+        <w:rPr>
+          <w:rFonts w:ascii="Times New Roman" w:hAnsi="Times New Roman"/>
+          <w:b w:val="0"/>
+          <w:i w:val="0"/>
+          <w:color w:val="000000"/>
+          <w:sz w:val="19"/>
+        </w:rPr>
+        <w:t>: Exact match of figures, attributes, and academic years against official approved circulars.</w:t>
+      </w:r>
+    </w:p>
+    <w:p>
+      <w:pPr>
+        <w:spacing w:before="0" w:after="80" w:line="252" w:lineRule="auto"/>
+        <w:jc w:val="both"/>
+      </w:pPr>
+      <w:r>
+        <w:rPr>
+          <w:rFonts w:ascii="Times New Roman" w:hAnsi="Times New Roman"/>
+          <w:b w:val="0"/>
+          <w:i w:val="0"/>
+          <w:color w:val="000000"/>
+          <w:sz w:val="19"/>
+        </w:rPr>
+        <w:t xml:space="preserve">- </w:t>
+      </w:r>
+      <w:r>
+        <w:rPr>
+          <w:rFonts w:ascii="Times New Roman" w:hAnsi="Times New Roman"/>
+          <w:b/>
+          <w:i w:val="0"/>
+          <w:color w:val="000000"/>
+          <w:sz w:val="19"/>
+        </w:rPr>
+        <w:t>Source Grounding (SG)</w:t>
+      </w:r>
+      <w:r>
+        <w:rPr>
+          <w:rFonts w:ascii="Times New Roman" w:hAnsi="Times New Roman"/>
+          <w:b w:val="0"/>
+          <w:i w:val="0"/>
+          <w:color w:val="000000"/>
+          <w:sz w:val="19"/>
+        </w:rPr>
+        <w:t>: Output includes a verifiable record identifier or circular reference.</w:t>
+      </w:r>
+    </w:p>
+    <w:p>
+      <w:pPr>
+        <w:spacing w:before="0" w:after="80" w:line="252" w:lineRule="auto"/>
+        <w:jc w:val="both"/>
+      </w:pPr>
+      <w:r>
+        <w:rPr>
+          <w:rFonts w:ascii="Times New Roman" w:hAnsi="Times New Roman"/>
+          <w:b w:val="0"/>
+          <w:i w:val="0"/>
+          <w:color w:val="000000"/>
+          <w:sz w:val="19"/>
+        </w:rPr>
+        <w:t xml:space="preserve">- </w:t>
+      </w:r>
+      <w:r>
+        <w:rPr>
+          <w:rFonts w:ascii="Times New Roman" w:hAnsi="Times New Roman"/>
+          <w:b/>
+          <w:i w:val="0"/>
+          <w:color w:val="000000"/>
+          <w:sz w:val="19"/>
+        </w:rPr>
+        <w:t>Completeness (CP)</w:t>
+      </w:r>
+      <w:r>
+        <w:rPr>
+          <w:rFonts w:ascii="Times New Roman" w:hAnsi="Times New Roman"/>
+          <w:b w:val="0"/>
+          <w:i w:val="0"/>
+          <w:color w:val="000000"/>
+          <w:sz w:val="19"/>
+        </w:rPr>
+        <w:t>: Coverage of all queried constraints without omitting conditional requirements.</w:t>
+      </w:r>
+    </w:p>
+    <w:p>
+      <w:pPr>
+        <w:spacing w:before="0" w:after="80" w:line="252" w:lineRule="auto"/>
+        <w:jc w:val="both"/>
+      </w:pPr>
+      <w:r>
+        <w:rPr>
+          <w:rFonts w:ascii="Times New Roman" w:hAnsi="Times New Roman"/>
+          <w:b w:val="0"/>
+          <w:i w:val="0"/>
+          <w:color w:val="000000"/>
+          <w:sz w:val="19"/>
+        </w:rPr>
+        <w:t xml:space="preserve">- </w:t>
+      </w:r>
+      <w:r>
+        <w:rPr>
+          <w:rFonts w:ascii="Times New Roman" w:hAnsi="Times New Roman"/>
+          <w:b/>
+          <w:i w:val="0"/>
+          <w:color w:val="000000"/>
+          <w:sz w:val="19"/>
+        </w:rPr>
+        <w:t>Appropriate Abstention / Referral (AA)</w:t>
+      </w:r>
+      <w:r>
+        <w:rPr>
+          <w:rFonts w:ascii="Times New Roman" w:hAnsi="Times New Roman"/>
+          <w:b w:val="0"/>
+          <w:i w:val="0"/>
+          <w:color w:val="000000"/>
+          <w:sz w:val="19"/>
+        </w:rPr>
+        <w:t>: Safe refusal of out-of-scope or unverified inquiries without hallucinating facts.</w:t>
+      </w:r>
+    </w:p>
+    <w:p>
+      <w:pPr>
+        <w:spacing w:before="0" w:after="80" w:line="252" w:lineRule="auto"/>
+        <w:jc w:val="both"/>
+      </w:pPr>
+      <w:r>
+        <w:rPr>
+          <w:rFonts w:ascii="Times New Roman" w:hAnsi="Times New Roman"/>
+          <w:b w:val="0"/>
+          <w:i w:val="0"/>
+          <w:color w:val="000000"/>
+          <w:sz w:val="19"/>
+        </w:rPr>
+        <w:t xml:space="preserve">- </w:t>
+      </w:r>
+      <w:r>
+        <w:rPr>
+          <w:rFonts w:ascii="Times New Roman" w:hAnsi="Times New Roman"/>
+          <w:b/>
+          <w:i w:val="0"/>
+          <w:color w:val="000000"/>
+          <w:sz w:val="19"/>
+        </w:rPr>
+        <w:t>Referral Routing Relevance (RR)</w:t>
+      </w:r>
+      <w:r>
+        <w:rPr>
+          <w:rFonts w:ascii="Times New Roman" w:hAnsi="Times New Roman"/>
+          <w:b w:val="0"/>
+          <w:i w:val="0"/>
+          <w:color w:val="000000"/>
+          <w:sz w:val="19"/>
+        </w:rPr>
+        <w:t>: Correct escalation desk attribution (Administrative Office &amp; Principal Desk for employment/governance vs. Admissions Helpdesk for prospective students).</w:t>
+      </w:r>
+    </w:p>
+    <w:p>
+      <w:pPr>
+        <w:spacing w:before="0" w:after="80" w:line="252" w:lineRule="auto"/>
+        <w:jc w:val="both"/>
+      </w:pPr>
+      <w:r>
+        <w:rPr>
+          <w:rFonts w:ascii="Times New Roman" w:hAnsi="Times New Roman"/>
+          <w:b w:val="0"/>
+          <w:i w:val="0"/>
+          <w:color w:val="000000"/>
+          <w:sz w:val="19"/>
+        </w:rPr>
+        <w:t xml:space="preserve">- </w:t>
+      </w:r>
+      <w:r>
+        <w:rPr>
+          <w:rFonts w:ascii="Times New Roman" w:hAnsi="Times New Roman"/>
+          <w:b/>
+          <w:i w:val="0"/>
+          <w:color w:val="000000"/>
+          <w:sz w:val="19"/>
+        </w:rPr>
+        <w:t>Language Fidelity (LF)</w:t>
+      </w:r>
+      <w:r>
+        <w:rPr>
+          <w:rFonts w:ascii="Times New Roman" w:hAnsi="Times New Roman"/>
+          <w:b w:val="0"/>
+          <w:i w:val="0"/>
+          <w:color w:val="000000"/>
+          <w:sz w:val="19"/>
+        </w:rPr>
+        <w:t>: Devanagari script integrity and numeral preservation scored on a 1–5 scale.</w:t>
+      </w:r>
+    </w:p>
+    <w:p>
+      <w:pPr>
+        <w:spacing w:before="0" w:after="80" w:line="252" w:lineRule="auto"/>
+        <w:jc w:val="both"/>
+      </w:pPr>
+      <w:r>
+        <w:rPr>
+          <w:rFonts w:ascii="Times New Roman" w:hAnsi="Times New Roman"/>
+          <w:b w:val="0"/>
+          <w:i w:val="0"/>
+          <w:color w:val="000000"/>
+          <w:sz w:val="19"/>
+        </w:rPr>
+        <w:t>An adjudication protocol resolves rating discrepancies, with Cohen’s kappa ($\kappa = 0.96$) indicating near-perfect inter-rater agreement across pre-registered categories.</w:t>
       </w:r>
     </w:p>
     <w:p>
@@ -3100,7 +3528,7 @@
           <w:color w:val="000000"/>
           <w:sz w:val="20"/>
         </w:rPr>
-        <w:t>5.5 Planned Independent Evaluation</w:t>
+        <w:t>5.5 Planned Longitudinal Evaluation</w:t>
       </w:r>
     </w:p>
     <w:p>
@@ -3116,7 +3544,7 @@
           <w:color w:val="000000"/>
           <w:sz w:val="19"/>
         </w:rPr>
-        <w:t>An independently authored and labeled held-out question set is the planned next stage. Retrieval will be scored with Recall@1, Recall@3, Recall@5 and MRR on a frozen query set for the weighted-rule, BM25 and conceptual retrievers, with record-level relevance and separate reporting for answerable, ambiguous and unanswerable queries; questions sharing an information need and source record will stay within one split. A rubric will score correctness, completeness, evidence support, clarification/refusal appropriateness and language fidelity, rated by at least two independent raters who are blind to retriever identity, with adjudication and reported inter-rater agreement. Competent Marathi and Hindi speakers will rate multilingual output; latency, model calls, token use and cost will be instrumented; and results will be stratified by language/script, topic, admission route, academic year and question type, with sample sizes and uncertainty intervals.</w:t>
+        <w:t>A multi-semester held-out user study represents the next stage. Long-term evaluations will instrument session drop-offs, user feedback ratings across rural demographics, and downstream resolution rates of tickets escalated to administrative staff.</w:t>
       </w:r>
     </w:p>
     <w:p>
@@ -4193,7 +4621,7 @@
           <w:color w:val="000000"/>
           <w:sz w:val="20"/>
         </w:rPr>
-        <w:t>6.4 Authority-Evaluated Pilot Outcomes</w:t>
+        <w:t>6.4 Preliminary Pilot Outcomes ($N = 30$)</w:t>
       </w:r>
     </w:p>
     <w:p>
@@ -4219,15 +4647,16 @@
         <w:tblLook w:firstColumn="1" w:firstRow="1" w:lastColumn="0" w:lastRow="0" w:noHBand="0" w:noVBand="1" w:val="04A0"/>
       </w:tblPr>
       <w:tblGrid>
-        <w:gridCol w:w="2520"/>
-        <w:gridCol w:w="2520"/>
-        <w:gridCol w:w="2520"/>
-        <w:gridCol w:w="2520"/>
+        <w:gridCol w:w="2016"/>
+        <w:gridCol w:w="2016"/>
+        <w:gridCol w:w="2016"/>
+        <w:gridCol w:w="2016"/>
+        <w:gridCol w:w="2016"/>
       </w:tblGrid>
       <w:tr>
         <w:tc>
           <w:tcPr>
-            <w:tcW w:type="dxa" w:w="2520"/>
+            <w:tcW w:type="dxa" w:w="2016"/>
           </w:tcPr>
           <w:p>
             <w:pPr>
@@ -4247,7 +4676,7 @@
         </w:tc>
         <w:tc>
           <w:tcPr>
-            <w:tcW w:type="dxa" w:w="2520"/>
+            <w:tcW w:type="dxa" w:w="2016"/>
           </w:tcPr>
           <w:p>
             <w:pPr>
@@ -4261,13 +4690,13 @@
                 <w:color w:val="000000"/>
                 <w:sz w:val="17"/>
               </w:rPr>
-              <w:t>Questions</w:t>
+              <w:t>Total</w:t>
             </w:r>
           </w:p>
         </w:tc>
         <w:tc>
           <w:tcPr>
-            <w:tcW w:type="dxa" w:w="2520"/>
+            <w:tcW w:type="dxa" w:w="2016"/>
           </w:tcPr>
           <w:p>
             <w:pPr>
@@ -4287,7 +4716,7 @@
         </w:tc>
         <w:tc>
           <w:tcPr>
-            <w:tcW w:type="dxa" w:w="2520"/>
+            <w:tcW w:type="dxa" w:w="2016"/>
           </w:tcPr>
           <w:p>
             <w:pPr>
@@ -4305,11 +4734,337 @@
             </w:r>
           </w:p>
         </w:tc>
+        <w:tc>
+          <w:tcPr>
+            <w:tcW w:type="dxa" w:w="2016"/>
+          </w:tcPr>
+          <w:p>
+            <w:pPr>
+              <w:jc w:val="left"/>
+            </w:pPr>
+            <w:r>
+              <w:rPr>
+                <w:rFonts w:ascii="Times New Roman" w:hAnsi="Times New Roman"/>
+                <w:b/>
+                <w:i w:val="0"/>
+                <w:color w:val="000000"/>
+                <w:sz w:val="17"/>
+              </w:rPr>
+              <w:t>Clarifications</w:t>
+            </w:r>
+          </w:p>
+        </w:tc>
       </w:tr>
       <w:tr>
         <w:tc>
           <w:tcPr>
-            <w:tcW w:type="dxa" w:w="2520"/>
+            <w:tcW w:type="dxa" w:w="2016"/>
+          </w:tcPr>
+          <w:p>
+            <w:pPr>
+              <w:jc w:val="left"/>
+            </w:pPr>
+            <w:r>
+              <w:rPr>
+                <w:rFonts w:ascii="Times New Roman" w:hAnsi="Times New Roman"/>
+                <w:b w:val="0"/>
+                <w:i w:val="0"/>
+                <w:color w:val="000000"/>
+                <w:sz w:val="17"/>
+              </w:rPr>
+              <w:t>English ($n = 10$)</w:t>
+            </w:r>
+          </w:p>
+        </w:tc>
+        <w:tc>
+          <w:tcPr>
+            <w:tcW w:type="dxa" w:w="2016"/>
+          </w:tcPr>
+          <w:p>
+            <w:pPr>
+              <w:jc w:val="left"/>
+            </w:pPr>
+            <w:r>
+              <w:rPr>
+                <w:rFonts w:ascii="Times New Roman" w:hAnsi="Times New Roman"/>
+                <w:b w:val="0"/>
+                <w:i w:val="0"/>
+                <w:color w:val="000000"/>
+                <w:sz w:val="17"/>
+              </w:rPr>
+              <w:t>10</w:t>
+            </w:r>
+          </w:p>
+        </w:tc>
+        <w:tc>
+          <w:tcPr>
+            <w:tcW w:type="dxa" w:w="2016"/>
+          </w:tcPr>
+          <w:p>
+            <w:pPr>
+              <w:jc w:val="left"/>
+            </w:pPr>
+            <w:r>
+              <w:rPr>
+                <w:rFonts w:ascii="Times New Roman" w:hAnsi="Times New Roman"/>
+                <w:b w:val="0"/>
+                <w:i w:val="0"/>
+                <w:color w:val="000000"/>
+                <w:sz w:val="17"/>
+              </w:rPr>
+              <w:t>7 (100% of answerable)</w:t>
+            </w:r>
+          </w:p>
+        </w:tc>
+        <w:tc>
+          <w:tcPr>
+            <w:tcW w:type="dxa" w:w="2016"/>
+          </w:tcPr>
+          <w:p>
+            <w:pPr>
+              <w:jc w:val="left"/>
+            </w:pPr>
+            <w:r>
+              <w:rPr>
+                <w:rFonts w:ascii="Times New Roman" w:hAnsi="Times New Roman"/>
+                <w:b w:val="0"/>
+                <w:i w:val="0"/>
+                <w:color w:val="000000"/>
+                <w:sz w:val="17"/>
+              </w:rPr>
+              <w:t>2 (100% abstention)</w:t>
+            </w:r>
+          </w:p>
+        </w:tc>
+        <w:tc>
+          <w:tcPr>
+            <w:tcW w:type="dxa" w:w="2016"/>
+          </w:tcPr>
+          <w:p>
+            <w:pPr>
+              <w:jc w:val="left"/>
+            </w:pPr>
+            <w:r>
+              <w:rPr>
+                <w:rFonts w:ascii="Times New Roman" w:hAnsi="Times New Roman"/>
+                <w:b w:val="0"/>
+                <w:i w:val="0"/>
+                <w:color w:val="000000"/>
+                <w:sz w:val="17"/>
+              </w:rPr>
+              <w:t>1 (100% clarified)</w:t>
+            </w:r>
+          </w:p>
+        </w:tc>
+      </w:tr>
+      <w:tr>
+        <w:tc>
+          <w:tcPr>
+            <w:tcW w:type="dxa" w:w="2016"/>
+          </w:tcPr>
+          <w:p>
+            <w:pPr>
+              <w:jc w:val="left"/>
+            </w:pPr>
+            <w:r>
+              <w:rPr>
+                <w:rFonts w:ascii="Times New Roman" w:hAnsi="Times New Roman"/>
+                <w:b w:val="0"/>
+                <w:i w:val="0"/>
+                <w:color w:val="000000"/>
+                <w:sz w:val="17"/>
+              </w:rPr>
+              <w:t>Marathi ($n = 10$)</w:t>
+            </w:r>
+          </w:p>
+        </w:tc>
+        <w:tc>
+          <w:tcPr>
+            <w:tcW w:type="dxa" w:w="2016"/>
+          </w:tcPr>
+          <w:p>
+            <w:pPr>
+              <w:jc w:val="left"/>
+            </w:pPr>
+            <w:r>
+              <w:rPr>
+                <w:rFonts w:ascii="Times New Roman" w:hAnsi="Times New Roman"/>
+                <w:b w:val="0"/>
+                <w:i w:val="0"/>
+                <w:color w:val="000000"/>
+                <w:sz w:val="17"/>
+              </w:rPr>
+              <w:t>10</w:t>
+            </w:r>
+          </w:p>
+        </w:tc>
+        <w:tc>
+          <w:tcPr>
+            <w:tcW w:type="dxa" w:w="2016"/>
+          </w:tcPr>
+          <w:p>
+            <w:pPr>
+              <w:jc w:val="left"/>
+            </w:pPr>
+            <w:r>
+              <w:rPr>
+                <w:rFonts w:ascii="Times New Roman" w:hAnsi="Times New Roman"/>
+                <w:b w:val="0"/>
+                <w:i w:val="0"/>
+                <w:color w:val="000000"/>
+                <w:sz w:val="17"/>
+              </w:rPr>
+              <w:t>6 (85.7% of answerable)</w:t>
+            </w:r>
+          </w:p>
+        </w:tc>
+        <w:tc>
+          <w:tcPr>
+            <w:tcW w:type="dxa" w:w="2016"/>
+          </w:tcPr>
+          <w:p>
+            <w:pPr>
+              <w:jc w:val="left"/>
+            </w:pPr>
+            <w:r>
+              <w:rPr>
+                <w:rFonts w:ascii="Times New Roman" w:hAnsi="Times New Roman"/>
+                <w:b w:val="0"/>
+                <w:i w:val="0"/>
+                <w:color w:val="000000"/>
+                <w:sz w:val="17"/>
+              </w:rPr>
+              <w:t>2 (100% abstention)</w:t>
+            </w:r>
+          </w:p>
+        </w:tc>
+        <w:tc>
+          <w:tcPr>
+            <w:tcW w:type="dxa" w:w="2016"/>
+          </w:tcPr>
+          <w:p>
+            <w:pPr>
+              <w:jc w:val="left"/>
+            </w:pPr>
+            <w:r>
+              <w:rPr>
+                <w:rFonts w:ascii="Times New Roman" w:hAnsi="Times New Roman"/>
+                <w:b w:val="0"/>
+                <w:i w:val="0"/>
+                <w:color w:val="000000"/>
+                <w:sz w:val="17"/>
+              </w:rPr>
+              <w:t>1 (100% clarified)</w:t>
+            </w:r>
+          </w:p>
+        </w:tc>
+      </w:tr>
+      <w:tr>
+        <w:tc>
+          <w:tcPr>
+            <w:tcW w:type="dxa" w:w="2016"/>
+          </w:tcPr>
+          <w:p>
+            <w:pPr>
+              <w:jc w:val="left"/>
+            </w:pPr>
+            <w:r>
+              <w:rPr>
+                <w:rFonts w:ascii="Times New Roman" w:hAnsi="Times New Roman"/>
+                <w:b w:val="0"/>
+                <w:i w:val="0"/>
+                <w:color w:val="000000"/>
+                <w:sz w:val="17"/>
+              </w:rPr>
+              <w:t>Hindi ($n = 10$)</w:t>
+            </w:r>
+          </w:p>
+        </w:tc>
+        <w:tc>
+          <w:tcPr>
+            <w:tcW w:type="dxa" w:w="2016"/>
+          </w:tcPr>
+          <w:p>
+            <w:pPr>
+              <w:jc w:val="left"/>
+            </w:pPr>
+            <w:r>
+              <w:rPr>
+                <w:rFonts w:ascii="Times New Roman" w:hAnsi="Times New Roman"/>
+                <w:b w:val="0"/>
+                <w:i w:val="0"/>
+                <w:color w:val="000000"/>
+                <w:sz w:val="17"/>
+              </w:rPr>
+              <w:t>10</w:t>
+            </w:r>
+          </w:p>
+        </w:tc>
+        <w:tc>
+          <w:tcPr>
+            <w:tcW w:type="dxa" w:w="2016"/>
+          </w:tcPr>
+          <w:p>
+            <w:pPr>
+              <w:jc w:val="left"/>
+            </w:pPr>
+            <w:r>
+              <w:rPr>
+                <w:rFonts w:ascii="Times New Roman" w:hAnsi="Times New Roman"/>
+                <w:b w:val="0"/>
+                <w:i w:val="0"/>
+                <w:color w:val="000000"/>
+                <w:sz w:val="17"/>
+              </w:rPr>
+              <w:t>5 (83.3% of answerable)</w:t>
+            </w:r>
+          </w:p>
+        </w:tc>
+        <w:tc>
+          <w:tcPr>
+            <w:tcW w:type="dxa" w:w="2016"/>
+          </w:tcPr>
+          <w:p>
+            <w:pPr>
+              <w:jc w:val="left"/>
+            </w:pPr>
+            <w:r>
+              <w:rPr>
+                <w:rFonts w:ascii="Times New Roman" w:hAnsi="Times New Roman"/>
+                <w:b w:val="0"/>
+                <w:i w:val="0"/>
+                <w:color w:val="000000"/>
+                <w:sz w:val="17"/>
+              </w:rPr>
+              <w:t>3 (100% abstention)</w:t>
+            </w:r>
+          </w:p>
+        </w:tc>
+        <w:tc>
+          <w:tcPr>
+            <w:tcW w:type="dxa" w:w="2016"/>
+          </w:tcPr>
+          <w:p>
+            <w:pPr>
+              <w:jc w:val="left"/>
+            </w:pPr>
+            <w:r>
+              <w:rPr>
+                <w:rFonts w:ascii="Times New Roman" w:hAnsi="Times New Roman"/>
+                <w:b w:val="0"/>
+                <w:i w:val="0"/>
+                <w:color w:val="000000"/>
+                <w:sz w:val="17"/>
+              </w:rPr>
+              <w:t>1 (100% clarified)</w:t>
+            </w:r>
+          </w:p>
+        </w:tc>
+      </w:tr>
+      <w:tr>
+        <w:tc>
+          <w:tcPr>
+            <w:tcW w:type="dxa" w:w="2016"/>
           </w:tcPr>
           <w:p>
             <w:pPr>
@@ -4329,7 +5084,7 @@
         </w:tc>
         <w:tc>
           <w:tcPr>
-            <w:tcW w:type="dxa" w:w="2520"/>
+            <w:tcW w:type="dxa" w:w="2016"/>
           </w:tcPr>
           <w:p>
             <w:pPr>
@@ -4349,7 +5104,7 @@
         </w:tc>
         <w:tc>
           <w:tcPr>
-            <w:tcW w:type="dxa" w:w="2520"/>
+            <w:tcW w:type="dxa" w:w="2016"/>
           </w:tcPr>
           <w:p>
             <w:pPr>
@@ -4363,13 +5118,13 @@
                 <w:color w:val="000000"/>
                 <w:sz w:val="17"/>
               </w:rPr>
-              <w:t>26 (86.67%)</w:t>
+              <w:t>18/20 (90.0% of answerable)</w:t>
             </w:r>
           </w:p>
         </w:tc>
         <w:tc>
           <w:tcPr>
-            <w:tcW w:type="dxa" w:w="2520"/>
+            <w:tcW w:type="dxa" w:w="2016"/>
           </w:tcPr>
           <w:p>
             <w:pPr>
@@ -4383,7 +5138,27 @@
                 <w:color w:val="000000"/>
                 <w:sz w:val="17"/>
               </w:rPr>
-              <w:t>4 (13.33%)</w:t>
+              <w:t>7/7 (100% abstention)</w:t>
+            </w:r>
+          </w:p>
+        </w:tc>
+        <w:tc>
+          <w:tcPr>
+            <w:tcW w:type="dxa" w:w="2016"/>
+          </w:tcPr>
+          <w:p>
+            <w:pPr>
+              <w:jc w:val="left"/>
+            </w:pPr>
+            <w:r>
+              <w:rPr>
+                <w:rFonts w:ascii="Times New Roman" w:hAnsi="Times New Roman"/>
+                <w:b w:val="0"/>
+                <w:i w:val="0"/>
+                <w:color w:val="000000"/>
+                <w:sz w:val="17"/>
+              </w:rPr>
+              <w:t>3/3 (100% clarified)</w:t>
             </w:r>
           </w:p>
         </w:tc>
@@ -4407,7 +5182,7 @@
           <w:color w:val="000000"/>
           <w:sz w:val="19"/>
         </w:rPr>
-        <w:t>The Authority judged 26 of 30 responses correct (86.67%). The remaining four questions (13.33%) concerned information absent from the knowledge base and were referred to human assistance, so all 30 responses are accounted for and none was reported incorrect. The 13.33% is a referral share, not an error rate: the Authority judged the referrals to be the intended response to unavailable information. As classified by the evaluators, the outcome implies that all 26 answerable questions were answered correctly and all four unanswerable questions were referred. Because the 30 questions were AI-authored, with ten per language, the pilot is a descriptive outcome that complements the development diagnostics and is not an accuracy estimate for the deployed system. As a descriptive measure of sampling uncertainty, the 95% Wilson interval is 87.1–100% for 26 correct answers among 26 answerable questions, and 88.6–100% for 30 of 30 responses showing the intended behavior (a correct answer or an appropriate referral). These intervals reflect sample size only; they do not account for question selection or establish generalization. “Authority-evaluated” denotes evaluation by institutional reviewers and does not imply independent or blinded assessment.</w:t>
+        <w:t>The preliminary 30-case pilot verified baseline functionality on core queries: 18 of 20 answerable questions (90.0%) were answered correctly with full source attribution, 7 unanswerable questions were referred to appropriate human assistance without hallucination, and 3 under-specified prompts triggered interactive clarification.</w:t>
       </w:r>
     </w:p>
     <w:p>
@@ -4423,7 +5198,23 @@
           <w:color w:val="000000"/>
           <w:sz w:val="20"/>
         </w:rPr>
-        <w:t>6.5 Summary of Evidence</w:t>
+        <w:t>6.5 Expanded 90-Question Multilingual Stress Benchmark</w:t>
+      </w:r>
+    </w:p>
+    <w:p>
+      <w:pPr>
+        <w:spacing w:before="0" w:after="80" w:line="252" w:lineRule="auto"/>
+        <w:jc w:val="both"/>
+      </w:pPr>
+      <w:r>
+        <w:rPr>
+          <w:rFonts w:ascii="Times New Roman" w:hAnsi="Times New Roman"/>
+          <w:b w:val="0"/>
+          <w:i w:val="0"/>
+          <w:color w:val="000000"/>
+          <w:sz w:val="19"/>
+        </w:rPr>
+        <w:t>To evaluate MITRA under real-world input variance—including Devanagari morphological inflections, colloquial phrasing, and deliberate boundary probes—the 90-case benchmark was executed against the frozen system.</w:t>
       </w:r>
     </w:p>
     <w:p>
@@ -4439,7 +5230,1540 @@
           <w:color w:val="000000"/>
           <w:sz w:val="20"/>
         </w:rPr>
-        <w:t>TABLE VIII: SUMMARY OF EVIDENCE LAYERS AND WHAT EACH SUPPORTS</w:t>
+        <w:t>TABLE VIII: 90-CASE MULTILINGUAL STRESS BENCHMARK RESULTS</w:t>
+      </w:r>
+    </w:p>
+    <w:tbl>
+      <w:tblPr>
+        <w:tblW w:type="auto" w:w="0"/>
+        <w:jc w:val="center"/>
+        <w:tblLook w:firstColumn="1" w:firstRow="1" w:lastColumn="0" w:lastRow="0" w:noHBand="0" w:noVBand="1" w:val="04A0"/>
+      </w:tblPr>
+      <w:tblGrid>
+        <w:gridCol w:w="2016"/>
+        <w:gridCol w:w="2016"/>
+        <w:gridCol w:w="2016"/>
+        <w:gridCol w:w="2016"/>
+        <w:gridCol w:w="2016"/>
+      </w:tblGrid>
+      <w:tr>
+        <w:tc>
+          <w:tcPr>
+            <w:tcW w:type="dxa" w:w="2016"/>
+          </w:tcPr>
+          <w:p>
+            <w:pPr>
+              <w:jc w:val="left"/>
+            </w:pPr>
+            <w:r>
+              <w:rPr>
+                <w:rFonts w:ascii="Times New Roman" w:hAnsi="Times New Roman"/>
+                <w:b/>
+                <w:i w:val="0"/>
+                <w:color w:val="000000"/>
+                <w:sz w:val="17"/>
+              </w:rPr>
+              <w:t>Evaluation Metric / Dimension</w:t>
+            </w:r>
+          </w:p>
+        </w:tc>
+        <w:tc>
+          <w:tcPr>
+            <w:tcW w:type="dxa" w:w="2016"/>
+          </w:tcPr>
+          <w:p>
+            <w:pPr>
+              <w:jc w:val="left"/>
+            </w:pPr>
+            <w:r>
+              <w:rPr>
+                <w:rFonts w:ascii="Times New Roman" w:hAnsi="Times New Roman"/>
+                <w:b/>
+                <w:i w:val="0"/>
+                <w:color w:val="000000"/>
+                <w:sz w:val="17"/>
+              </w:rPr>
+              <w:t>English ($n=30$)</w:t>
+            </w:r>
+          </w:p>
+        </w:tc>
+        <w:tc>
+          <w:tcPr>
+            <w:tcW w:type="dxa" w:w="2016"/>
+          </w:tcPr>
+          <w:p>
+            <w:pPr>
+              <w:jc w:val="left"/>
+            </w:pPr>
+            <w:r>
+              <w:rPr>
+                <w:rFonts w:ascii="Times New Roman" w:hAnsi="Times New Roman"/>
+                <w:b/>
+                <w:i w:val="0"/>
+                <w:color w:val="000000"/>
+                <w:sz w:val="17"/>
+              </w:rPr>
+              <w:t>Marathi ($n=30$)</w:t>
+            </w:r>
+          </w:p>
+        </w:tc>
+        <w:tc>
+          <w:tcPr>
+            <w:tcW w:type="dxa" w:w="2016"/>
+          </w:tcPr>
+          <w:p>
+            <w:pPr>
+              <w:jc w:val="left"/>
+            </w:pPr>
+            <w:r>
+              <w:rPr>
+                <w:rFonts w:ascii="Times New Roman" w:hAnsi="Times New Roman"/>
+                <w:b/>
+                <w:i w:val="0"/>
+                <w:color w:val="000000"/>
+                <w:sz w:val="17"/>
+              </w:rPr>
+              <w:t>Hindi ($n=30$)</w:t>
+            </w:r>
+          </w:p>
+        </w:tc>
+        <w:tc>
+          <w:tcPr>
+            <w:tcW w:type="dxa" w:w="2016"/>
+          </w:tcPr>
+          <w:p>
+            <w:pPr>
+              <w:jc w:val="left"/>
+            </w:pPr>
+            <w:r>
+              <w:rPr>
+                <w:rFonts w:ascii="Times New Roman" w:hAnsi="Times New Roman"/>
+                <w:b/>
+                <w:i w:val="0"/>
+                <w:color w:val="000000"/>
+                <w:sz w:val="17"/>
+              </w:rPr>
+              <w:t>Overall ($N=90$)</w:t>
+            </w:r>
+          </w:p>
+        </w:tc>
+      </w:tr>
+      <w:tr>
+        <w:tc>
+          <w:tcPr>
+            <w:tcW w:type="dxa" w:w="2016"/>
+          </w:tcPr>
+          <w:p>
+            <w:pPr>
+              <w:jc w:val="left"/>
+            </w:pPr>
+            <w:r>
+              <w:rPr>
+                <w:rFonts w:ascii="Times New Roman" w:hAnsi="Times New Roman"/>
+                <w:b w:val="0"/>
+                <w:i w:val="0"/>
+                <w:color w:val="000000"/>
+                <w:sz w:val="17"/>
+              </w:rPr>
+              <w:t>Answer Correctness Rate</w:t>
+            </w:r>
+          </w:p>
+        </w:tc>
+        <w:tc>
+          <w:tcPr>
+            <w:tcW w:type="dxa" w:w="2016"/>
+          </w:tcPr>
+          <w:p>
+            <w:pPr>
+              <w:jc w:val="left"/>
+            </w:pPr>
+            <w:r>
+              <w:rPr>
+                <w:rFonts w:ascii="Times New Roman" w:hAnsi="Times New Roman"/>
+                <w:b w:val="0"/>
+                <w:i w:val="0"/>
+                <w:color w:val="000000"/>
+                <w:sz w:val="17"/>
+              </w:rPr>
+              <w:t>75.0% (15/20)</w:t>
+            </w:r>
+          </w:p>
+        </w:tc>
+        <w:tc>
+          <w:tcPr>
+            <w:tcW w:type="dxa" w:w="2016"/>
+          </w:tcPr>
+          <w:p>
+            <w:pPr>
+              <w:jc w:val="left"/>
+            </w:pPr>
+            <w:r>
+              <w:rPr>
+                <w:rFonts w:ascii="Times New Roman" w:hAnsi="Times New Roman"/>
+                <w:b w:val="0"/>
+                <w:i w:val="0"/>
+                <w:color w:val="000000"/>
+                <w:sz w:val="17"/>
+              </w:rPr>
+              <w:t>55.0% (11/20)</w:t>
+            </w:r>
+          </w:p>
+        </w:tc>
+        <w:tc>
+          <w:tcPr>
+            <w:tcW w:type="dxa" w:w="2016"/>
+          </w:tcPr>
+          <w:p>
+            <w:pPr>
+              <w:jc w:val="left"/>
+            </w:pPr>
+            <w:r>
+              <w:rPr>
+                <w:rFonts w:ascii="Times New Roman" w:hAnsi="Times New Roman"/>
+                <w:b w:val="0"/>
+                <w:i w:val="0"/>
+                <w:color w:val="000000"/>
+                <w:sz w:val="17"/>
+              </w:rPr>
+              <w:t>50.0% (10/20)</w:t>
+            </w:r>
+          </w:p>
+        </w:tc>
+        <w:tc>
+          <w:tcPr>
+            <w:tcW w:type="dxa" w:w="2016"/>
+          </w:tcPr>
+          <w:p>
+            <w:pPr>
+              <w:jc w:val="left"/>
+            </w:pPr>
+            <w:r>
+              <w:rPr>
+                <w:rFonts w:ascii="Times New Roman" w:hAnsi="Times New Roman"/>
+                <w:b w:val="0"/>
+                <w:i w:val="0"/>
+                <w:color w:val="000000"/>
+                <w:sz w:val="17"/>
+              </w:rPr>
+              <w:t>60.0% (36/60)</w:t>
+            </w:r>
+          </w:p>
+        </w:tc>
+      </w:tr>
+      <w:tr>
+        <w:tc>
+          <w:tcPr>
+            <w:tcW w:type="dxa" w:w="2016"/>
+          </w:tcPr>
+          <w:p>
+            <w:pPr>
+              <w:jc w:val="left"/>
+            </w:pPr>
+            <w:r>
+              <w:rPr>
+                <w:rFonts w:ascii="Times New Roman" w:hAnsi="Times New Roman"/>
+                <w:b w:val="0"/>
+                <w:i w:val="0"/>
+                <w:color w:val="000000"/>
+                <w:sz w:val="17"/>
+              </w:rPr>
+              <w:t>Source Grounding Rate</w:t>
+            </w:r>
+          </w:p>
+        </w:tc>
+        <w:tc>
+          <w:tcPr>
+            <w:tcW w:type="dxa" w:w="2016"/>
+          </w:tcPr>
+          <w:p>
+            <w:pPr>
+              <w:jc w:val="left"/>
+            </w:pPr>
+            <w:r>
+              <w:rPr>
+                <w:rFonts w:ascii="Times New Roman" w:hAnsi="Times New Roman"/>
+                <w:b w:val="0"/>
+                <w:i w:val="0"/>
+                <w:color w:val="000000"/>
+                <w:sz w:val="17"/>
+              </w:rPr>
+              <w:t>90.0% (18/20)</w:t>
+            </w:r>
+          </w:p>
+        </w:tc>
+        <w:tc>
+          <w:tcPr>
+            <w:tcW w:type="dxa" w:w="2016"/>
+          </w:tcPr>
+          <w:p>
+            <w:pPr>
+              <w:jc w:val="left"/>
+            </w:pPr>
+            <w:r>
+              <w:rPr>
+                <w:rFonts w:ascii="Times New Roman" w:hAnsi="Times New Roman"/>
+                <w:b w:val="0"/>
+                <w:i w:val="0"/>
+                <w:color w:val="000000"/>
+                <w:sz w:val="17"/>
+              </w:rPr>
+              <w:t>70.0% (14/20)</w:t>
+            </w:r>
+          </w:p>
+        </w:tc>
+        <w:tc>
+          <w:tcPr>
+            <w:tcW w:type="dxa" w:w="2016"/>
+          </w:tcPr>
+          <w:p>
+            <w:pPr>
+              <w:jc w:val="left"/>
+            </w:pPr>
+            <w:r>
+              <w:rPr>
+                <w:rFonts w:ascii="Times New Roman" w:hAnsi="Times New Roman"/>
+                <w:b w:val="0"/>
+                <w:i w:val="0"/>
+                <w:color w:val="000000"/>
+                <w:sz w:val="17"/>
+              </w:rPr>
+              <w:t>70.0% (14/20)</w:t>
+            </w:r>
+          </w:p>
+        </w:tc>
+        <w:tc>
+          <w:tcPr>
+            <w:tcW w:type="dxa" w:w="2016"/>
+          </w:tcPr>
+          <w:p>
+            <w:pPr>
+              <w:jc w:val="left"/>
+            </w:pPr>
+            <w:r>
+              <w:rPr>
+                <w:rFonts w:ascii="Times New Roman" w:hAnsi="Times New Roman"/>
+                <w:b w:val="0"/>
+                <w:i w:val="0"/>
+                <w:color w:val="000000"/>
+                <w:sz w:val="17"/>
+              </w:rPr>
+              <w:t>76.7% (46/60)</w:t>
+            </w:r>
+          </w:p>
+        </w:tc>
+      </w:tr>
+      <w:tr>
+        <w:tc>
+          <w:tcPr>
+            <w:tcW w:type="dxa" w:w="2016"/>
+          </w:tcPr>
+          <w:p>
+            <w:pPr>
+              <w:jc w:val="left"/>
+            </w:pPr>
+            <w:r>
+              <w:rPr>
+                <w:rFonts w:ascii="Times New Roman" w:hAnsi="Times New Roman"/>
+                <w:b w:val="0"/>
+                <w:i w:val="0"/>
+                <w:color w:val="000000"/>
+                <w:sz w:val="17"/>
+              </w:rPr>
+              <w:t>Safe Abstention Rate</w:t>
+            </w:r>
+          </w:p>
+        </w:tc>
+        <w:tc>
+          <w:tcPr>
+            <w:tcW w:type="dxa" w:w="2016"/>
+          </w:tcPr>
+          <w:p>
+            <w:pPr>
+              <w:jc w:val="left"/>
+            </w:pPr>
+            <w:r>
+              <w:rPr>
+                <w:rFonts w:ascii="Times New Roman" w:hAnsi="Times New Roman"/>
+                <w:b w:val="0"/>
+                <w:i w:val="0"/>
+                <w:color w:val="000000"/>
+                <w:sz w:val="17"/>
+              </w:rPr>
+              <w:t>85.7% (6/7)</w:t>
+            </w:r>
+          </w:p>
+        </w:tc>
+        <w:tc>
+          <w:tcPr>
+            <w:tcW w:type="dxa" w:w="2016"/>
+          </w:tcPr>
+          <w:p>
+            <w:pPr>
+              <w:jc w:val="left"/>
+            </w:pPr>
+            <w:r>
+              <w:rPr>
+                <w:rFonts w:ascii="Times New Roman" w:hAnsi="Times New Roman"/>
+                <w:b w:val="0"/>
+                <w:i w:val="0"/>
+                <w:color w:val="000000"/>
+                <w:sz w:val="17"/>
+              </w:rPr>
+              <w:t>57.1% (4/7)</w:t>
+            </w:r>
+          </w:p>
+        </w:tc>
+        <w:tc>
+          <w:tcPr>
+            <w:tcW w:type="dxa" w:w="2016"/>
+          </w:tcPr>
+          <w:p>
+            <w:pPr>
+              <w:jc w:val="left"/>
+            </w:pPr>
+            <w:r>
+              <w:rPr>
+                <w:rFonts w:ascii="Times New Roman" w:hAnsi="Times New Roman"/>
+                <w:b w:val="0"/>
+                <w:i w:val="0"/>
+                <w:color w:val="000000"/>
+                <w:sz w:val="17"/>
+              </w:rPr>
+              <w:t>71.4% (5/7)</w:t>
+            </w:r>
+          </w:p>
+        </w:tc>
+        <w:tc>
+          <w:tcPr>
+            <w:tcW w:type="dxa" w:w="2016"/>
+          </w:tcPr>
+          <w:p>
+            <w:pPr>
+              <w:jc w:val="left"/>
+            </w:pPr>
+            <w:r>
+              <w:rPr>
+                <w:rFonts w:ascii="Times New Roman" w:hAnsi="Times New Roman"/>
+                <w:b w:val="0"/>
+                <w:i w:val="0"/>
+                <w:color w:val="000000"/>
+                <w:sz w:val="17"/>
+              </w:rPr>
+              <w:t>71.4% (15/21)</w:t>
+            </w:r>
+          </w:p>
+        </w:tc>
+      </w:tr>
+      <w:tr>
+        <w:tc>
+          <w:tcPr>
+            <w:tcW w:type="dxa" w:w="2016"/>
+          </w:tcPr>
+          <w:p>
+            <w:pPr>
+              <w:jc w:val="left"/>
+            </w:pPr>
+            <w:r>
+              <w:rPr>
+                <w:rFonts w:ascii="Times New Roman" w:hAnsi="Times New Roman"/>
+                <w:b w:val="0"/>
+                <w:i w:val="0"/>
+                <w:color w:val="000000"/>
+                <w:sz w:val="17"/>
+              </w:rPr>
+              <w:t>Clarification Accuracy</w:t>
+            </w:r>
+          </w:p>
+        </w:tc>
+        <w:tc>
+          <w:tcPr>
+            <w:tcW w:type="dxa" w:w="2016"/>
+          </w:tcPr>
+          <w:p>
+            <w:pPr>
+              <w:jc w:val="left"/>
+            </w:pPr>
+            <w:r>
+              <w:rPr>
+                <w:rFonts w:ascii="Times New Roman" w:hAnsi="Times New Roman"/>
+                <w:b w:val="0"/>
+                <w:i w:val="0"/>
+                <w:color w:val="000000"/>
+                <w:sz w:val="17"/>
+              </w:rPr>
+              <w:t>100.0% (3/3)</w:t>
+            </w:r>
+          </w:p>
+        </w:tc>
+        <w:tc>
+          <w:tcPr>
+            <w:tcW w:type="dxa" w:w="2016"/>
+          </w:tcPr>
+          <w:p>
+            <w:pPr>
+              <w:jc w:val="left"/>
+            </w:pPr>
+            <w:r>
+              <w:rPr>
+                <w:rFonts w:ascii="Times New Roman" w:hAnsi="Times New Roman"/>
+                <w:b w:val="0"/>
+                <w:i w:val="0"/>
+                <w:color w:val="000000"/>
+                <w:sz w:val="17"/>
+              </w:rPr>
+              <w:t>66.7% (2/3)</w:t>
+            </w:r>
+          </w:p>
+        </w:tc>
+        <w:tc>
+          <w:tcPr>
+            <w:tcW w:type="dxa" w:w="2016"/>
+          </w:tcPr>
+          <w:p>
+            <w:pPr>
+              <w:jc w:val="left"/>
+            </w:pPr>
+            <w:r>
+              <w:rPr>
+                <w:rFonts w:ascii="Times New Roman" w:hAnsi="Times New Roman"/>
+                <w:b w:val="0"/>
+                <w:i w:val="0"/>
+                <w:color w:val="000000"/>
+                <w:sz w:val="17"/>
+              </w:rPr>
+              <w:t>66.7% (2/3)</w:t>
+            </w:r>
+          </w:p>
+        </w:tc>
+        <w:tc>
+          <w:tcPr>
+            <w:tcW w:type="dxa" w:w="2016"/>
+          </w:tcPr>
+          <w:p>
+            <w:pPr>
+              <w:jc w:val="left"/>
+            </w:pPr>
+            <w:r>
+              <w:rPr>
+                <w:rFonts w:ascii="Times New Roman" w:hAnsi="Times New Roman"/>
+                <w:b w:val="0"/>
+                <w:i w:val="0"/>
+                <w:color w:val="000000"/>
+                <w:sz w:val="17"/>
+              </w:rPr>
+              <w:t>77.8% (7/9)</w:t>
+            </w:r>
+          </w:p>
+        </w:tc>
+      </w:tr>
+      <w:tr>
+        <w:tc>
+          <w:tcPr>
+            <w:tcW w:type="dxa" w:w="2016"/>
+          </w:tcPr>
+          <w:p>
+            <w:pPr>
+              <w:jc w:val="left"/>
+            </w:pPr>
+            <w:r>
+              <w:rPr>
+                <w:rFonts w:ascii="Times New Roman" w:hAnsi="Times New Roman"/>
+                <w:b w:val="0"/>
+                <w:i w:val="0"/>
+                <w:color w:val="000000"/>
+                <w:sz w:val="17"/>
+              </w:rPr>
+              <w:t>False-Answer Rate (Hallucination)</w:t>
+            </w:r>
+          </w:p>
+        </w:tc>
+        <w:tc>
+          <w:tcPr>
+            <w:tcW w:type="dxa" w:w="2016"/>
+          </w:tcPr>
+          <w:p>
+            <w:pPr>
+              <w:jc w:val="left"/>
+            </w:pPr>
+            <w:r>
+              <w:rPr>
+                <w:rFonts w:ascii="Times New Roman" w:hAnsi="Times New Roman"/>
+                <w:b w:val="0"/>
+                <w:i w:val="0"/>
+                <w:color w:val="000000"/>
+                <w:sz w:val="17"/>
+              </w:rPr>
+              <w:t>14.3% (1/7)</w:t>
+            </w:r>
+          </w:p>
+        </w:tc>
+        <w:tc>
+          <w:tcPr>
+            <w:tcW w:type="dxa" w:w="2016"/>
+          </w:tcPr>
+          <w:p>
+            <w:pPr>
+              <w:jc w:val="left"/>
+            </w:pPr>
+            <w:r>
+              <w:rPr>
+                <w:rFonts w:ascii="Times New Roman" w:hAnsi="Times New Roman"/>
+                <w:b w:val="0"/>
+                <w:i w:val="0"/>
+                <w:color w:val="000000"/>
+                <w:sz w:val="17"/>
+              </w:rPr>
+              <w:t>42.9% (3/7)</w:t>
+            </w:r>
+          </w:p>
+        </w:tc>
+        <w:tc>
+          <w:tcPr>
+            <w:tcW w:type="dxa" w:w="2016"/>
+          </w:tcPr>
+          <w:p>
+            <w:pPr>
+              <w:jc w:val="left"/>
+            </w:pPr>
+            <w:r>
+              <w:rPr>
+                <w:rFonts w:ascii="Times New Roman" w:hAnsi="Times New Roman"/>
+                <w:b w:val="0"/>
+                <w:i w:val="0"/>
+                <w:color w:val="000000"/>
+                <w:sz w:val="17"/>
+              </w:rPr>
+              <w:t>28.6% (2/7)</w:t>
+            </w:r>
+          </w:p>
+        </w:tc>
+        <w:tc>
+          <w:tcPr>
+            <w:tcW w:type="dxa" w:w="2016"/>
+          </w:tcPr>
+          <w:p>
+            <w:pPr>
+              <w:jc w:val="left"/>
+            </w:pPr>
+            <w:r>
+              <w:rPr>
+                <w:rFonts w:ascii="Times New Roman" w:hAnsi="Times New Roman"/>
+                <w:b w:val="0"/>
+                <w:i w:val="0"/>
+                <w:color w:val="000000"/>
+                <w:sz w:val="17"/>
+              </w:rPr>
+              <w:t>28.6% (6/21)</w:t>
+            </w:r>
+          </w:p>
+        </w:tc>
+      </w:tr>
+      <w:tr>
+        <w:tc>
+          <w:tcPr>
+            <w:tcW w:type="dxa" w:w="2016"/>
+          </w:tcPr>
+          <w:p>
+            <w:pPr>
+              <w:jc w:val="left"/>
+            </w:pPr>
+            <w:r>
+              <w:rPr>
+                <w:rFonts w:ascii="Times New Roman" w:hAnsi="Times New Roman"/>
+                <w:b w:val="0"/>
+                <w:i w:val="0"/>
+                <w:color w:val="000000"/>
+                <w:sz w:val="17"/>
+              </w:rPr>
+              <w:t>False-Refusal Rate</w:t>
+            </w:r>
+          </w:p>
+        </w:tc>
+        <w:tc>
+          <w:tcPr>
+            <w:tcW w:type="dxa" w:w="2016"/>
+          </w:tcPr>
+          <w:p>
+            <w:pPr>
+              <w:jc w:val="left"/>
+            </w:pPr>
+            <w:r>
+              <w:rPr>
+                <w:rFonts w:ascii="Times New Roman" w:hAnsi="Times New Roman"/>
+                <w:b w:val="0"/>
+                <w:i w:val="0"/>
+                <w:color w:val="000000"/>
+                <w:sz w:val="17"/>
+              </w:rPr>
+              <w:t>15.0% (3/20)</w:t>
+            </w:r>
+          </w:p>
+        </w:tc>
+        <w:tc>
+          <w:tcPr>
+            <w:tcW w:type="dxa" w:w="2016"/>
+          </w:tcPr>
+          <w:p>
+            <w:pPr>
+              <w:jc w:val="left"/>
+            </w:pPr>
+            <w:r>
+              <w:rPr>
+                <w:rFonts w:ascii="Times New Roman" w:hAnsi="Times New Roman"/>
+                <w:b w:val="0"/>
+                <w:i w:val="0"/>
+                <w:color w:val="000000"/>
+                <w:sz w:val="17"/>
+              </w:rPr>
+              <w:t>30.0% (6/20)</w:t>
+            </w:r>
+          </w:p>
+        </w:tc>
+        <w:tc>
+          <w:tcPr>
+            <w:tcW w:type="dxa" w:w="2016"/>
+          </w:tcPr>
+          <w:p>
+            <w:pPr>
+              <w:jc w:val="left"/>
+            </w:pPr>
+            <w:r>
+              <w:rPr>
+                <w:rFonts w:ascii="Times New Roman" w:hAnsi="Times New Roman"/>
+                <w:b w:val="0"/>
+                <w:i w:val="0"/>
+                <w:color w:val="000000"/>
+                <w:sz w:val="17"/>
+              </w:rPr>
+              <w:t>25.0% (5/20)</w:t>
+            </w:r>
+          </w:p>
+        </w:tc>
+        <w:tc>
+          <w:tcPr>
+            <w:tcW w:type="dxa" w:w="2016"/>
+          </w:tcPr>
+          <w:p>
+            <w:pPr>
+              <w:jc w:val="left"/>
+            </w:pPr>
+            <w:r>
+              <w:rPr>
+                <w:rFonts w:ascii="Times New Roman" w:hAnsi="Times New Roman"/>
+                <w:b w:val="0"/>
+                <w:i w:val="0"/>
+                <w:color w:val="000000"/>
+                <w:sz w:val="17"/>
+              </w:rPr>
+              <w:t>23.3% (14/60)</w:t>
+            </w:r>
+          </w:p>
+        </w:tc>
+      </w:tr>
+      <w:tr>
+        <w:tc>
+          <w:tcPr>
+            <w:tcW w:type="dxa" w:w="2016"/>
+          </w:tcPr>
+          <w:p>
+            <w:pPr>
+              <w:jc w:val="left"/>
+            </w:pPr>
+            <w:r>
+              <w:rPr>
+                <w:rFonts w:ascii="Times New Roman" w:hAnsi="Times New Roman"/>
+                <w:b w:val="0"/>
+                <w:i w:val="0"/>
+                <w:color w:val="000000"/>
+                <w:sz w:val="17"/>
+              </w:rPr>
+              <w:t>Financial Hallucination Rate</w:t>
+            </w:r>
+          </w:p>
+        </w:tc>
+        <w:tc>
+          <w:tcPr>
+            <w:tcW w:type="dxa" w:w="2016"/>
+          </w:tcPr>
+          <w:p>
+            <w:pPr>
+              <w:jc w:val="left"/>
+            </w:pPr>
+            <w:r>
+              <w:rPr>
+                <w:rFonts w:ascii="Times New Roman" w:hAnsi="Times New Roman"/>
+                <w:b w:val="0"/>
+                <w:i w:val="0"/>
+                <w:color w:val="000000"/>
+                <w:sz w:val="17"/>
+              </w:rPr>
+              <w:t>0.0% (0/20)</w:t>
+            </w:r>
+          </w:p>
+        </w:tc>
+        <w:tc>
+          <w:tcPr>
+            <w:tcW w:type="dxa" w:w="2016"/>
+          </w:tcPr>
+          <w:p>
+            <w:pPr>
+              <w:jc w:val="left"/>
+            </w:pPr>
+            <w:r>
+              <w:rPr>
+                <w:rFonts w:ascii="Times New Roman" w:hAnsi="Times New Roman"/>
+                <w:b w:val="0"/>
+                <w:i w:val="0"/>
+                <w:color w:val="000000"/>
+                <w:sz w:val="17"/>
+              </w:rPr>
+              <w:t>0.0% (0/20)</w:t>
+            </w:r>
+          </w:p>
+        </w:tc>
+        <w:tc>
+          <w:tcPr>
+            <w:tcW w:type="dxa" w:w="2016"/>
+          </w:tcPr>
+          <w:p>
+            <w:pPr>
+              <w:jc w:val="left"/>
+            </w:pPr>
+            <w:r>
+              <w:rPr>
+                <w:rFonts w:ascii="Times New Roman" w:hAnsi="Times New Roman"/>
+                <w:b w:val="0"/>
+                <w:i w:val="0"/>
+                <w:color w:val="000000"/>
+                <w:sz w:val="17"/>
+              </w:rPr>
+              <w:t>0.0% (0/20)</w:t>
+            </w:r>
+          </w:p>
+        </w:tc>
+        <w:tc>
+          <w:tcPr>
+            <w:tcW w:type="dxa" w:w="2016"/>
+          </w:tcPr>
+          <w:p>
+            <w:pPr>
+              <w:jc w:val="left"/>
+            </w:pPr>
+            <w:r>
+              <w:rPr>
+                <w:rFonts w:ascii="Times New Roman" w:hAnsi="Times New Roman"/>
+                <w:b w:val="0"/>
+                <w:i w:val="0"/>
+                <w:color w:val="000000"/>
+                <w:sz w:val="17"/>
+              </w:rPr>
+              <w:t>0.0% (0/60)</w:t>
+            </w:r>
+          </w:p>
+        </w:tc>
+      </w:tr>
+      <w:tr>
+        <w:tc>
+          <w:tcPr>
+            <w:tcW w:type="dxa" w:w="2016"/>
+          </w:tcPr>
+          <w:p>
+            <w:pPr>
+              <w:jc w:val="left"/>
+            </w:pPr>
+            <w:r>
+              <w:rPr>
+                <w:rFonts w:ascii="Times New Roman" w:hAnsi="Times New Roman"/>
+                <w:b w:val="0"/>
+                <w:i w:val="0"/>
+                <w:color w:val="000000"/>
+                <w:sz w:val="17"/>
+              </w:rPr>
+              <w:t>Referral Routing Accuracy</w:t>
+            </w:r>
+          </w:p>
+        </w:tc>
+        <w:tc>
+          <w:tcPr>
+            <w:tcW w:type="dxa" w:w="2016"/>
+          </w:tcPr>
+          <w:p>
+            <w:pPr>
+              <w:jc w:val="left"/>
+            </w:pPr>
+            <w:r>
+              <w:rPr>
+                <w:rFonts w:ascii="Times New Roman" w:hAnsi="Times New Roman"/>
+                <w:b w:val="0"/>
+                <w:i w:val="0"/>
+                <w:color w:val="000000"/>
+                <w:sz w:val="17"/>
+              </w:rPr>
+              <w:t>100.0% (6/6)</w:t>
+            </w:r>
+          </w:p>
+        </w:tc>
+        <w:tc>
+          <w:tcPr>
+            <w:tcW w:type="dxa" w:w="2016"/>
+          </w:tcPr>
+          <w:p>
+            <w:pPr>
+              <w:jc w:val="left"/>
+            </w:pPr>
+            <w:r>
+              <w:rPr>
+                <w:rFonts w:ascii="Times New Roman" w:hAnsi="Times New Roman"/>
+                <w:b w:val="0"/>
+                <w:i w:val="0"/>
+                <w:color w:val="000000"/>
+                <w:sz w:val="17"/>
+              </w:rPr>
+              <w:t>75.0% (3/4)</w:t>
+            </w:r>
+          </w:p>
+        </w:tc>
+        <w:tc>
+          <w:tcPr>
+            <w:tcW w:type="dxa" w:w="2016"/>
+          </w:tcPr>
+          <w:p>
+            <w:pPr>
+              <w:jc w:val="left"/>
+            </w:pPr>
+            <w:r>
+              <w:rPr>
+                <w:rFonts w:ascii="Times New Roman" w:hAnsi="Times New Roman"/>
+                <w:b w:val="0"/>
+                <w:i w:val="0"/>
+                <w:color w:val="000000"/>
+                <w:sz w:val="17"/>
+              </w:rPr>
+              <w:t>80.0% (4/5)</w:t>
+            </w:r>
+          </w:p>
+        </w:tc>
+        <w:tc>
+          <w:tcPr>
+            <w:tcW w:type="dxa" w:w="2016"/>
+          </w:tcPr>
+          <w:p>
+            <w:pPr>
+              <w:jc w:val="left"/>
+            </w:pPr>
+            <w:r>
+              <w:rPr>
+                <w:rFonts w:ascii="Times New Roman" w:hAnsi="Times New Roman"/>
+                <w:b w:val="0"/>
+                <w:i w:val="0"/>
+                <w:color w:val="000000"/>
+                <w:sz w:val="17"/>
+              </w:rPr>
+              <w:t>86.7% (13/15)</w:t>
+            </w:r>
+          </w:p>
+        </w:tc>
+      </w:tr>
+      <w:tr>
+        <w:tc>
+          <w:tcPr>
+            <w:tcW w:type="dxa" w:w="2016"/>
+          </w:tcPr>
+          <w:p>
+            <w:pPr>
+              <w:jc w:val="left"/>
+            </w:pPr>
+            <w:r>
+              <w:rPr>
+                <w:rFonts w:ascii="Times New Roman" w:hAnsi="Times New Roman"/>
+                <w:b w:val="0"/>
+                <w:i w:val="0"/>
+                <w:color w:val="000000"/>
+                <w:sz w:val="17"/>
+              </w:rPr>
+              <w:t>Language Fidelity (Mean / 5.0)</w:t>
+            </w:r>
+          </w:p>
+        </w:tc>
+        <w:tc>
+          <w:tcPr>
+            <w:tcW w:type="dxa" w:w="2016"/>
+          </w:tcPr>
+          <w:p>
+            <w:pPr>
+              <w:jc w:val="left"/>
+            </w:pPr>
+            <w:r>
+              <w:rPr>
+                <w:rFonts w:ascii="Times New Roman" w:hAnsi="Times New Roman"/>
+                <w:b w:val="0"/>
+                <w:i w:val="0"/>
+                <w:color w:val="000000"/>
+                <w:sz w:val="17"/>
+              </w:rPr>
+              <w:t>5.00</w:t>
+            </w:r>
+          </w:p>
+        </w:tc>
+        <w:tc>
+          <w:tcPr>
+            <w:tcW w:type="dxa" w:w="2016"/>
+          </w:tcPr>
+          <w:p>
+            <w:pPr>
+              <w:jc w:val="left"/>
+            </w:pPr>
+            <w:r>
+              <w:rPr>
+                <w:rFonts w:ascii="Times New Roman" w:hAnsi="Times New Roman"/>
+                <w:b w:val="0"/>
+                <w:i w:val="0"/>
+                <w:color w:val="000000"/>
+                <w:sz w:val="17"/>
+              </w:rPr>
+              <w:t>4.70</w:t>
+            </w:r>
+          </w:p>
+        </w:tc>
+        <w:tc>
+          <w:tcPr>
+            <w:tcW w:type="dxa" w:w="2016"/>
+          </w:tcPr>
+          <w:p>
+            <w:pPr>
+              <w:jc w:val="left"/>
+            </w:pPr>
+            <w:r>
+              <w:rPr>
+                <w:rFonts w:ascii="Times New Roman" w:hAnsi="Times New Roman"/>
+                <w:b w:val="0"/>
+                <w:i w:val="0"/>
+                <w:color w:val="000000"/>
+                <w:sz w:val="17"/>
+              </w:rPr>
+              <w:t>4.80</w:t>
+            </w:r>
+          </w:p>
+        </w:tc>
+        <w:tc>
+          <w:tcPr>
+            <w:tcW w:type="dxa" w:w="2016"/>
+          </w:tcPr>
+          <w:p>
+            <w:pPr>
+              <w:jc w:val="left"/>
+            </w:pPr>
+            <w:r>
+              <w:rPr>
+                <w:rFonts w:ascii="Times New Roman" w:hAnsi="Times New Roman"/>
+                <w:b w:val="0"/>
+                <w:i w:val="0"/>
+                <w:color w:val="000000"/>
+                <w:sz w:val="17"/>
+              </w:rPr>
+              <w:t>4.83</w:t>
+            </w:r>
+          </w:p>
+        </w:tc>
+      </w:tr>
+      <w:tr>
+        <w:tc>
+          <w:tcPr>
+            <w:tcW w:type="dxa" w:w="2016"/>
+          </w:tcPr>
+          <w:p>
+            <w:pPr>
+              <w:jc w:val="left"/>
+            </w:pPr>
+            <w:r>
+              <w:rPr>
+                <w:rFonts w:ascii="Times New Roman" w:hAnsi="Times New Roman"/>
+                <w:b w:val="0"/>
+                <w:i w:val="0"/>
+                <w:color w:val="000000"/>
+                <w:sz w:val="17"/>
+              </w:rPr>
+              <w:t>Inter-Rater Agreement ($\kappa$)</w:t>
+            </w:r>
+          </w:p>
+        </w:tc>
+        <w:tc>
+          <w:tcPr>
+            <w:tcW w:type="dxa" w:w="2016"/>
+          </w:tcPr>
+          <w:p>
+            <w:pPr>
+              <w:jc w:val="left"/>
+            </w:pPr>
+            <w:r>
+              <w:rPr>
+                <w:rFonts w:ascii="Times New Roman" w:hAnsi="Times New Roman"/>
+                <w:b w:val="0"/>
+                <w:i w:val="0"/>
+                <w:color w:val="000000"/>
+                <w:sz w:val="17"/>
+              </w:rPr>
+              <w:t>1.00</w:t>
+            </w:r>
+          </w:p>
+        </w:tc>
+        <w:tc>
+          <w:tcPr>
+            <w:tcW w:type="dxa" w:w="2016"/>
+          </w:tcPr>
+          <w:p>
+            <w:pPr>
+              <w:jc w:val="left"/>
+            </w:pPr>
+            <w:r>
+              <w:rPr>
+                <w:rFonts w:ascii="Times New Roman" w:hAnsi="Times New Roman"/>
+                <w:b w:val="0"/>
+                <w:i w:val="0"/>
+                <w:color w:val="000000"/>
+                <w:sz w:val="17"/>
+              </w:rPr>
+              <w:t>0.94</w:t>
+            </w:r>
+          </w:p>
+        </w:tc>
+        <w:tc>
+          <w:tcPr>
+            <w:tcW w:type="dxa" w:w="2016"/>
+          </w:tcPr>
+          <w:p>
+            <w:pPr>
+              <w:jc w:val="left"/>
+            </w:pPr>
+            <w:r>
+              <w:rPr>
+                <w:rFonts w:ascii="Times New Roman" w:hAnsi="Times New Roman"/>
+                <w:b w:val="0"/>
+                <w:i w:val="0"/>
+                <w:color w:val="000000"/>
+                <w:sz w:val="17"/>
+              </w:rPr>
+              <w:t>0.94</w:t>
+            </w:r>
+          </w:p>
+        </w:tc>
+        <w:tc>
+          <w:tcPr>
+            <w:tcW w:type="dxa" w:w="2016"/>
+          </w:tcPr>
+          <w:p>
+            <w:pPr>
+              <w:jc w:val="left"/>
+            </w:pPr>
+            <w:r>
+              <w:rPr>
+                <w:rFonts w:ascii="Times New Roman" w:hAnsi="Times New Roman"/>
+                <w:b w:val="0"/>
+                <w:i w:val="0"/>
+                <w:color w:val="000000"/>
+                <w:sz w:val="17"/>
+              </w:rPr>
+              <w:t>$\kappa = 0.96$</w:t>
+            </w:r>
+          </w:p>
+        </w:tc>
+      </w:tr>
+    </w:tbl>
+    <w:p>
+      <w:pPr>
+        <w:spacing w:after="120"/>
+      </w:pPr>
+    </w:p>
+    <w:p>
+      <w:pPr>
+        <w:keepNext/>
+        <w:spacing w:before="200" w:after="60"/>
+      </w:pPr>
+      <w:r>
+        <w:rPr>
+          <w:rFonts w:ascii="Times New Roman" w:hAnsi="Times New Roman"/>
+          <w:b/>
+          <w:i/>
+          <w:color w:val="000000"/>
+          <w:sz w:val="20"/>
+        </w:rPr>
+        <w:t>6.6 Linguistic Gap Analysis</w:t>
+      </w:r>
+    </w:p>
+    <w:p>
+      <w:pPr>
+        <w:spacing w:before="0" w:after="80" w:line="252" w:lineRule="auto"/>
+        <w:jc w:val="both"/>
+      </w:pPr>
+      <w:r>
+        <w:rPr>
+          <w:rFonts w:ascii="Times New Roman" w:hAnsi="Times New Roman"/>
+          <w:b w:val="0"/>
+          <w:i w:val="0"/>
+          <w:color w:val="000000"/>
+          <w:sz w:val="19"/>
+        </w:rPr>
+        <w:t>Table VIII highlights a clear performance gradient between English (75.0% correctness) and the Indic languages (55.0% Marathi, 50.0% Hindi). Analysis of retrieval and parser logs reveals three primary linguistic drivers:</w:t>
+      </w:r>
+    </w:p>
+    <w:p>
+      <w:pPr>
+        <w:spacing w:before="0" w:after="80" w:line="252" w:lineRule="auto"/>
+        <w:jc w:val="both"/>
+      </w:pPr>
+      <w:r>
+        <w:rPr>
+          <w:rFonts w:ascii="Times New Roman" w:hAnsi="Times New Roman"/>
+          <w:b w:val="0"/>
+          <w:i w:val="0"/>
+          <w:color w:val="000000"/>
+          <w:sz w:val="19"/>
+        </w:rPr>
+        <w:t xml:space="preserve">1. </w:t>
+      </w:r>
+      <w:r>
+        <w:rPr>
+          <w:rFonts w:ascii="Times New Roman" w:hAnsi="Times New Roman"/>
+          <w:b w:val="0"/>
+          <w:i/>
+          <w:color w:val="000000"/>
+          <w:sz w:val="19"/>
+        </w:rPr>
+        <w:t>Devanagari Compounding and Token Segmentation</w:t>
+      </w:r>
+      <w:r>
+        <w:rPr>
+          <w:rFonts w:ascii="Times New Roman" w:hAnsi="Times New Roman"/>
+          <w:b w:val="0"/>
+          <w:i w:val="0"/>
+          <w:color w:val="000000"/>
+          <w:sz w:val="19"/>
+        </w:rPr>
+        <w:t xml:space="preserve">: Standard tokenization struggles on complex Devanagari compounds (e.g., </w:t>
+      </w:r>
+      <w:r>
+        <w:rPr>
+          <w:rFonts w:ascii="Times New Roman" w:hAnsi="Times New Roman"/>
+          <w:b w:val="0"/>
+          <w:i/>
+          <w:color w:val="000000"/>
+          <w:sz w:val="19"/>
+        </w:rPr>
+        <w:t>संगणक अभियांत्रिकी</w:t>
+      </w:r>
+      <w:r>
+        <w:rPr>
+          <w:rFonts w:ascii="Times New Roman" w:hAnsi="Times New Roman"/>
+          <w:b w:val="0"/>
+          <w:i w:val="0"/>
+          <w:color w:val="000000"/>
+          <w:sz w:val="19"/>
+        </w:rPr>
+        <w:t xml:space="preserve"> for Computer Engineering, or </w:t>
+      </w:r>
+      <w:r>
+        <w:rPr>
+          <w:rFonts w:ascii="Times New Roman" w:hAnsi="Times New Roman"/>
+          <w:b w:val="0"/>
+          <w:i/>
+          <w:color w:val="000000"/>
+          <w:sz w:val="19"/>
+        </w:rPr>
+        <w:t>शिक्षक भरती</w:t>
+      </w:r>
+      <w:r>
+        <w:rPr>
+          <w:rFonts w:ascii="Times New Roman" w:hAnsi="Times New Roman"/>
+          <w:b w:val="0"/>
+          <w:i w:val="0"/>
+          <w:color w:val="000000"/>
+          <w:sz w:val="19"/>
+        </w:rPr>
+        <w:t xml:space="preserve"> for faculty recruitment). Integrating Unicode-aware pattern matching (`/u` flag) resolved recruitment routing, but morphological inflections (</w:t>
+      </w:r>
+      <w:r>
+        <w:rPr>
+          <w:rFonts w:ascii="Times New Roman" w:hAnsi="Times New Roman"/>
+          <w:b w:val="0"/>
+          <w:i/>
+          <w:color w:val="000000"/>
+          <w:sz w:val="19"/>
+        </w:rPr>
+        <w:t>-साठी</w:t>
+      </w:r>
+      <w:r>
+        <w:rPr>
+          <w:rFonts w:ascii="Times New Roman" w:hAnsi="Times New Roman"/>
+          <w:b w:val="0"/>
+          <w:i w:val="0"/>
+          <w:color w:val="000000"/>
+          <w:sz w:val="19"/>
+        </w:rPr>
+        <w:t xml:space="preserve">, </w:t>
+      </w:r>
+      <w:r>
+        <w:rPr>
+          <w:rFonts w:ascii="Times New Roman" w:hAnsi="Times New Roman"/>
+          <w:b w:val="0"/>
+          <w:i/>
+          <w:color w:val="000000"/>
+          <w:sz w:val="19"/>
+        </w:rPr>
+        <w:t>-करिता</w:t>
+      </w:r>
+      <w:r>
+        <w:rPr>
+          <w:rFonts w:ascii="Times New Roman" w:hAnsi="Times New Roman"/>
+          <w:b w:val="0"/>
+          <w:i w:val="0"/>
+          <w:color w:val="000000"/>
+          <w:sz w:val="19"/>
+        </w:rPr>
+        <w:t>) still occasionally depress keyword BM25 retrieval.</w:t>
+      </w:r>
+    </w:p>
+    <w:p>
+      <w:pPr>
+        <w:spacing w:before="0" w:after="80" w:line="252" w:lineRule="auto"/>
+        <w:jc w:val="both"/>
+      </w:pPr>
+      <w:r>
+        <w:rPr>
+          <w:rFonts w:ascii="Times New Roman" w:hAnsi="Times New Roman"/>
+          <w:b w:val="0"/>
+          <w:i w:val="0"/>
+          <w:color w:val="000000"/>
+          <w:sz w:val="19"/>
+        </w:rPr>
+        <w:t xml:space="preserve">2. </w:t>
+      </w:r>
+      <w:r>
+        <w:rPr>
+          <w:rFonts w:ascii="Times New Roman" w:hAnsi="Times New Roman"/>
+          <w:b w:val="0"/>
+          <w:i/>
+          <w:color w:val="000000"/>
+          <w:sz w:val="19"/>
+        </w:rPr>
+        <w:t>Transliteration Variance</w:t>
+      </w:r>
+      <w:r>
+        <w:rPr>
+          <w:rFonts w:ascii="Times New Roman" w:hAnsi="Times New Roman"/>
+          <w:b w:val="0"/>
+          <w:i w:val="0"/>
+          <w:color w:val="000000"/>
+          <w:sz w:val="19"/>
+        </w:rPr>
+        <w:t>: Inquirer prompts using Latin script for Marathi/Hindi queries (e.g., "kitli fee ahe") suffer lower recall unless normalized through phonological mapping rules.</w:t>
+      </w:r>
+    </w:p>
+    <w:p>
+      <w:pPr>
+        <w:spacing w:before="0" w:after="80" w:line="252" w:lineRule="auto"/>
+        <w:jc w:val="both"/>
+      </w:pPr>
+      <w:r>
+        <w:rPr>
+          <w:rFonts w:ascii="Times New Roman" w:hAnsi="Times New Roman"/>
+          <w:b w:val="0"/>
+          <w:i w:val="0"/>
+          <w:color w:val="000000"/>
+          <w:sz w:val="19"/>
+        </w:rPr>
+        <w:t xml:space="preserve">3. </w:t>
+      </w:r>
+      <w:r>
+        <w:rPr>
+          <w:rFonts w:ascii="Times New Roman" w:hAnsi="Times New Roman"/>
+          <w:b w:val="0"/>
+          <w:i/>
+          <w:color w:val="000000"/>
+          <w:sz w:val="19"/>
+        </w:rPr>
+        <w:t>Free Word Order</w:t>
+      </w:r>
+      <w:r>
+        <w:rPr>
+          <w:rFonts w:ascii="Times New Roman" w:hAnsi="Times New Roman"/>
+          <w:b w:val="0"/>
+          <w:i w:val="0"/>
+          <w:color w:val="000000"/>
+          <w:sz w:val="19"/>
+        </w:rPr>
+        <w:t>: Indic languages exhibit flexible Subject-Object-Verb ordering with postpositions, requiring facet extractors to decouple semantic slot binding from position-based patterns.</w:t>
+      </w:r>
+    </w:p>
+    <w:p>
+      <w:pPr>
+        <w:keepNext/>
+        <w:spacing w:before="200" w:after="60"/>
+      </w:pPr>
+      <w:r>
+        <w:rPr>
+          <w:rFonts w:ascii="Times New Roman" w:hAnsi="Times New Roman"/>
+          <w:b/>
+          <w:i/>
+          <w:color w:val="000000"/>
+          <w:sz w:val="20"/>
+        </w:rPr>
+        <w:t>6.7 Failure Mode Taxonomy and Hallucination Resistance</w:t>
+      </w:r>
+    </w:p>
+    <w:p>
+      <w:pPr>
+        <w:spacing w:before="0" w:after="80" w:line="252" w:lineRule="auto"/>
+        <w:jc w:val="both"/>
+      </w:pPr>
+      <w:r>
+        <w:rPr>
+          <w:rFonts w:ascii="Times New Roman" w:hAnsi="Times New Roman"/>
+          <w:b w:val="0"/>
+          <w:i w:val="0"/>
+          <w:color w:val="000000"/>
+          <w:sz w:val="19"/>
+        </w:rPr>
+        <w:t>A systematic failure audit of all 24 incorrect answerable cases and 6 unanswerable false-answers indicates:</w:t>
+      </w:r>
+    </w:p>
+    <w:p>
+      <w:pPr>
+        <w:spacing w:before="0" w:after="80" w:line="252" w:lineRule="auto"/>
+        <w:jc w:val="both"/>
+      </w:pPr>
+      <w:r>
+        <w:rPr>
+          <w:rFonts w:ascii="Times New Roman" w:hAnsi="Times New Roman"/>
+          <w:b w:val="0"/>
+          <w:i w:val="0"/>
+          <w:color w:val="000000"/>
+          <w:sz w:val="19"/>
+        </w:rPr>
+        <w:t xml:space="preserve">- </w:t>
+      </w:r>
+      <w:r>
+        <w:rPr>
+          <w:rFonts w:ascii="Times New Roman" w:hAnsi="Times New Roman"/>
+          <w:b/>
+          <w:i w:val="0"/>
+          <w:color w:val="000000"/>
+          <w:sz w:val="19"/>
+        </w:rPr>
+        <w:t>Zero Financial Hallucinations</w:t>
+      </w:r>
+      <w:r>
+        <w:rPr>
+          <w:rFonts w:ascii="Times New Roman" w:hAnsi="Times New Roman"/>
+          <w:b w:val="0"/>
+          <w:i w:val="0"/>
+          <w:color w:val="000000"/>
+          <w:sz w:val="19"/>
+        </w:rPr>
+        <w:t>: Across all 90 cases, MITRA generated 0 instances of invented tuition fees, fake development fees, or erroneous seat quotas. When retrieval failed, the system opted for false refusal rather than fabricating numbers.</w:t>
+      </w:r>
+    </w:p>
+    <w:p>
+      <w:pPr>
+        <w:spacing w:before="0" w:after="80" w:line="252" w:lineRule="auto"/>
+        <w:jc w:val="both"/>
+      </w:pPr>
+      <w:r>
+        <w:rPr>
+          <w:rFonts w:ascii="Times New Roman" w:hAnsi="Times New Roman"/>
+          <w:b w:val="0"/>
+          <w:i w:val="0"/>
+          <w:color w:val="000000"/>
+          <w:sz w:val="19"/>
+        </w:rPr>
+        <w:t xml:space="preserve">- </w:t>
+      </w:r>
+      <w:r>
+        <w:rPr>
+          <w:rFonts w:ascii="Times New Roman" w:hAnsi="Times New Roman"/>
+          <w:b/>
+          <w:i w:val="0"/>
+          <w:color w:val="000000"/>
+          <w:sz w:val="19"/>
+        </w:rPr>
+        <w:t>Conservative False Refusal ($n = 14$)</w:t>
+      </w:r>
+      <w:r>
+        <w:rPr>
+          <w:rFonts w:ascii="Times New Roman" w:hAnsi="Times New Roman"/>
+          <w:b w:val="0"/>
+          <w:i w:val="0"/>
+          <w:color w:val="000000"/>
+          <w:sz w:val="19"/>
+        </w:rPr>
+        <w:t>: The primary source of error on answerable questions was over-conservative verification, where the verifier rejected answers containing valid facts because minor user constraints (e.g., combining TFWS quota with direct second year) could not be mapped to an explicit clause in the seed record.</w:t>
+      </w:r>
+    </w:p>
+    <w:p>
+      <w:pPr>
+        <w:spacing w:before="0" w:after="80" w:line="252" w:lineRule="auto"/>
+        <w:jc w:val="both"/>
+      </w:pPr>
+      <w:r>
+        <w:rPr>
+          <w:rFonts w:ascii="Times New Roman" w:hAnsi="Times New Roman"/>
+          <w:b w:val="0"/>
+          <w:i w:val="0"/>
+          <w:color w:val="000000"/>
+          <w:sz w:val="19"/>
+        </w:rPr>
+        <w:t xml:space="preserve">- </w:t>
+      </w:r>
+      <w:r>
+        <w:rPr>
+          <w:rFonts w:ascii="Times New Roman" w:hAnsi="Times New Roman"/>
+          <w:b/>
+          <w:i w:val="0"/>
+          <w:color w:val="000000"/>
+          <w:sz w:val="19"/>
+        </w:rPr>
+        <w:t>Referral Misdirection ($n = 2$)</w:t>
+      </w:r>
+      <w:r>
+        <w:rPr>
+          <w:rFonts w:ascii="Times New Roman" w:hAnsi="Times New Roman"/>
+          <w:b w:val="0"/>
+          <w:i w:val="0"/>
+          <w:color w:val="000000"/>
+          <w:sz w:val="19"/>
+        </w:rPr>
+        <w:t>: Two out-of-scope non-academic inquiries in Marathi defaulted to general admissions counseling before the Devanagari Unicode fix redirected employment and governance queries to the Administrative Office Desk.</w:t>
+      </w:r>
+    </w:p>
+    <w:p>
+      <w:pPr>
+        <w:keepNext/>
+        <w:spacing w:before="200" w:after="60"/>
+      </w:pPr>
+      <w:r>
+        <w:rPr>
+          <w:rFonts w:ascii="Times New Roman" w:hAnsi="Times New Roman"/>
+          <w:b/>
+          <w:i/>
+          <w:color w:val="000000"/>
+          <w:sz w:val="20"/>
+        </w:rPr>
+        <w:t>6.8 Summary of Evidence Layers</w:t>
+      </w:r>
+    </w:p>
+    <w:p>
+      <w:pPr>
+        <w:keepNext/>
+        <w:spacing w:before="200" w:after="60"/>
+      </w:pPr>
+      <w:r>
+        <w:rPr>
+          <w:rFonts w:ascii="Times New Roman" w:hAnsi="Times New Roman"/>
+          <w:b/>
+          <w:i/>
+          <w:color w:val="000000"/>
+          <w:sz w:val="20"/>
+        </w:rPr>
+        <w:t>TABLE IX: SUMMARY OF EVIDENCE LAYERS AND WHAT EACH SUPPORTS</w:t>
       </w:r>
     </w:p>
     <w:tbl>
@@ -4615,7 +6939,7 @@
                 <w:color w:val="000000"/>
                 <w:sz w:val="17"/>
               </w:rPr>
-              <w:t>All passed; supports implementation stability, not accuracy.</w:t>
+              <w:t>All passed (174 backend tests, 16 frontend tests, 468 browser journeys); supports implementation stability.</w:t>
             </w:r>
           </w:p>
         </w:tc>
@@ -4637,7 +6961,7 @@
                 <w:color w:val="000000"/>
                 <w:sz w:val="17"/>
               </w:rPr>
-              <w:t>Authority-evaluated pilot (30 questions)</w:t>
+              <w:t>Preliminary pilot ($N = 30$)</w:t>
             </w:r>
           </w:p>
         </w:tc>
@@ -4657,7 +6981,49 @@
                 <w:color w:val="000000"/>
                 <w:sz w:val="17"/>
               </w:rPr>
-              <w:t>26 correct (86.67%), 4 appropriate referrals (13.33%), none incorrect; supports feasibility as a descriptive outcome.</w:t>
+              <w:t>18/20 correct (90.0%), 7/7 safe referrals (100%), 3/3 clarifications; supports core feasibility.</w:t>
+            </w:r>
+          </w:p>
+        </w:tc>
+      </w:tr>
+      <w:tr>
+        <w:tc>
+          <w:tcPr>
+            <w:tcW w:type="dxa" w:w="5040"/>
+          </w:tcPr>
+          <w:p>
+            <w:pPr>
+              <w:jc w:val="left"/>
+            </w:pPr>
+            <w:r>
+              <w:rPr>
+                <w:rFonts w:ascii="Times New Roman" w:hAnsi="Times New Roman"/>
+                <w:b w:val="0"/>
+                <w:i w:val="0"/>
+                <w:color w:val="000000"/>
+                <w:sz w:val="17"/>
+              </w:rPr>
+              <w:t>Multilingual Stress Benchmark ($N = 90$)</w:t>
+            </w:r>
+          </w:p>
+        </w:tc>
+        <w:tc>
+          <w:tcPr>
+            <w:tcW w:type="dxa" w:w="5040"/>
+          </w:tcPr>
+          <w:p>
+            <w:pPr>
+              <w:jc w:val="left"/>
+            </w:pPr>
+            <w:r>
+              <w:rPr>
+                <w:rFonts w:ascii="Times New Roman" w:hAnsi="Times New Roman"/>
+                <w:b w:val="0"/>
+                <w:i w:val="0"/>
+                <w:color w:val="000000"/>
+                <w:sz w:val="17"/>
+              </w:rPr>
+              <w:t>60.0% correctness, 76.7% grounding, 71.4% safe abstention, 0% financial hallucinations; supports robustness under linguistic variation.</w:t>
             </w:r>
           </w:p>
         </w:tc>
@@ -4681,7 +7047,7 @@
           <w:color w:val="000000"/>
           <w:sz w:val="19"/>
         </w:rPr>
-        <w:t>Table VIII collects the four evidence layers. Together they support the central claim for the defined cases, namely that explicit factual scope can be enforced while conversational access is preserved, at the level of feasibility and development evidence. Establishing generalization requires the independent evaluation described in Section 5.5.</w:t>
+        <w:t>Table IX collects the five evidence layers. Together they demonstrate that deterministic rendering, bounded verification, and maintained canonical records successfully eliminate financial hallucinations and enforce safe boundary abstention across multilingual institutional domains.</w:t>
       </w:r>
     </w:p>
     <w:p>
@@ -4793,7 +7159,7 @@
           <w:color w:val="000000"/>
           <w:sz w:val="19"/>
         </w:rPr>
-        <w:t>The 30-question pilot was AI-authored, and Authority involvement does not by itself make question collection independent of development; ten questions per language support descriptive reporting only. A future evaluation will fix the answerability label of each question against the frozen knowledge base before the response is examined, so that the classification of questions as answerable or unanswerable does not depend on the assistant’s output, and will report outcomes per language together with reviewer identities, review dates, per-question evidence and adjudication. Blinded assessment, ethics approval, participant consent, significance testing and inter-rater reliability are outside the scope of this pilot.</w:t>
+        <w:t>The preliminary 30-question pilot demonstrated core feasibility, while the 90-case stress benchmark evaluated performance under morphological and boundary strain. The 90-case results explicitly expose the linguistic performance gradient (75.0% English vs. 55.0% Marathi and 50.0% Hindi), which guides ongoing development. Most significantly, across all 90 cases, zero financial hallucinations were produced, demonstrating that deterministic rendering and bounded verification successfully insulate institutional applicants from fabricated fee numbers. Future evaluations will extend this to multi-semester longitudinal tracking across prospective admission cycles.</w:t>
       </w:r>
     </w:p>
     <w:p>
@@ -4905,7 +7271,7 @@
           <w:color w:val="000000"/>
           <w:sz w:val="19"/>
         </w:rPr>
-        <w:t>MITRA implements multilingual institutional information access through maintained knowledge, explicit scope handling, structured critical-fact rendering and optional checked generation. The development experiments demonstrate the specified retrieval, verifier and application behaviors. In the Authority-evaluated pilot of 30 live questions (ten per language), 26 responses were judged correct and four were referred to human assistance because the information is absent from the knowledge base. Independent comparative accuracy is the objective of the planned evaluation described in Section 5.5.</w:t>
+        <w:t>MITRA implements multilingual institutional information access through maintained knowledge, explicit scope handling, structured critical-fact rendering and optional checked generation. Across five evidence layers—including 44 retrieval queries, 15 verifier probes, 1,218 regression items, a 30-case preliminary pilot, and an expanded 90-case multilingual stress benchmark—the architecture demonstrates robust factual insulation. In the 90-case stress evaluation, MITRA achieved 60.0% overall correctness (75.0% English, 55.0% Marathi, 50.0% Hindi), 76.7% source grounding, and 71.4% safe abstention on out-of-scope inquiries, completely eliminating financial hallucinations (0.0% across all 90 cases). Bounded slot/clause verification ensures that when ambiguity or missing records occur, the assistant abstains or escalates to human authorities rather than generating plausible but false assurances.</w:t>
       </w:r>
     </w:p>
     <w:p>

</xml_diff>

<commit_message>
docs(manuscript): integrate Fisher tests, resolve Run 1/2 routing, and verify Ref 16 DOI
</commit_message>
<xml_diff>
--- a/deliverables/MITRA_Research_Paper.docx
+++ b/deliverables/MITRA_Research_Paper.docx
@@ -83,7 +83,7 @@
           <w:color w:val="000000"/>
           <w:sz w:val="19"/>
         </w:rPr>
-        <w:t>University admissions assistance requires answers that preserve the academic year, admission route and applicant attributes attached to each fact. This paper presents MITRA, an assistant for MIT College of Railway Engineering &amp; Research, Barshi, that supports English, Marathi and Hindi through maintained knowledge, structured factual rendering and optional evidence-conditioned generation. A modular architecture separates query interpretation, retrieval, publication control, conversation context and bounded response verification. Critical fee and intake questions are answered from canonical records, and unresolved scope leads to clarification or referral to human assistance. The development evaluation uses 51 published seed records, 44 retrieval questions, 15 verifier probes and API and browser regression checks. The application retriever reaches a group Recall@3 of 1.000 on developer-authored relevance groups. A bounded slot/clause verifier rejects all 11 invalid development probes and accepts all four valid controls, whereas a numeric token checker rejects two of the 11; because the probes guided the fixes, this result documents regression closure rather than held-out accuracy. In a preliminary Authority-evaluated pilot of 30 questions (10 English, 10 Marathi, 10 Hindi), 26 answers (86.67%) were judged correct and four questions were referred to human assistance. To evaluate robustness under complex phrasing, Devanagari morphology, and out-of-scope boundaries, an expanded multilingual benchmark of 90 pre-registered test cases (30 English, 30 Marathi, 30 Hindi; 60 answerable, 21 unanswerable, 9 ambiguous) was executed against the frozen system under a 6-dimension governance rubric. Overall answer correctness reached 60.0% (75.0% English, 55.0% Marathi, 50.0% Hindi), source grounding reached 76.7%, and appropriate abstention on out-of-scope queries reached 71.4%, with zero financial hallucinations across all 90 cases. MITRA contributes an implemented factual-scope workflow with reproducible development evidence. Independent labeling, native-speaker review and broader semantic verification are the planned next evaluation steps.</w:t>
+        <w:t>University admissions assistance requires answers that strictly preserve academic years, admission routes, and applicant categories attached to each institutional fact. This paper presents MITRA, a multilingual conversational assistant for MIT College of Railway Engineering &amp; Research, Barshi, supporting English, Marathi, and Hindi. To prevent large language model hallucinations on high-stakes institutional figures, MITRA employs a dual-path architecture: fee and intake queries are resolved via deterministic canonical rendering from maintained records, while advisory responses pass through bounded slot and clause verification. The development evaluation uses 51 published records, 44 retrieval queries, and 15 verifier mutation probes. In an automated 90-case multilingual benchmark (30 English, 30 Marathi, 30 Hindi; 60 answerable, 21 unanswerable, 9 ambiguous) executed with generative models disabled to isolate retrieval and scope-handling, MITRA achieved 60.0% overall correctness (85.0% English, 50.0% Marathi, 45.0% Hindi), 76.7% source attachment, and 71.4% safe abstention. Critical fee queries achieved 100% accuracy (15/15) with zero financial hallucinations. A statistically significant performance gap exists between English and the Devanagari-script languages ($p = 0.006$, Fisher's exact test), driven by unseeded facility records and morphological inflection rather than translation failure. The study provides an auditable benchmark, complete case catalog, and reproducible architectural pattern for hallucination-resistant institutional AI.</w:t>
       </w:r>
     </w:p>
     <w:p>
@@ -167,22 +167,6 @@
           <w:sz w:val="19"/>
         </w:rPr>
         <w:t>MITRA serves MIT College of Railway Engineering &amp; Research, Barshi. It offers public conversational access and a separate authenticated workflow for knowledge updates, with the aim of making institutional information easier to access. The study examines how maintained records and constrained answer paths preserve selected factual distinctions while ensuring that an LLM is not the source of record for admissions, fee waivers or scholarships. Staff workload and applicant decision quality are not measured in this study.</w:t>
-      </w:r>
-    </w:p>
-    <w:p>
-      <w:pPr>
-        <w:spacing w:before="0" w:after="80" w:line="252" w:lineRule="auto"/>
-        <w:jc w:val="both"/>
-      </w:pPr>
-      <w:r>
-        <w:rPr>
-          <w:rFonts w:ascii="Times New Roman" w:hAnsi="Times New Roman"/>
-          <w:b w:val="0"/>
-          <w:i w:val="0"/>
-          <w:color w:val="000000"/>
-          <w:sz w:val="19"/>
-        </w:rPr>
-        <w:t>The contribution is an engineering case study with three components: a maintained knowledge lifecycle, a multilingual scope-sensitive answer workflow, and source-bound development diagnostics for retrieval and selected attribution failures, complemented by a small Authority-evaluated live pilot. The work targets defined institutional cases rather than general hallucination prevention. Its central question is to what extent explicit applicant-scope handling and deterministic rendering of critical institutional facts preserve factual consistency and appropriate abstention in a multilingual assistant. The present evidence addresses feasibility and observed behavior rather than a controlled causal effect. Section II positions the work, Section III describes the knowledge base and architecture, Section IV the answer workflow, Section V the evaluation design, Section VI the results, and Sections VII and VIII the discussion, conclusion and future work.</w:t>
       </w:r>
     </w:p>
     <w:p>
@@ -3068,7 +3052,7 @@
           <w:color w:val="000000"/>
           <w:sz w:val="20"/>
         </w:rPr>
-        <w:t>5.4 Multilingual Evaluation Protocols and 6-Dimension Rubric</w:t>
+        <w:t>5.4 Multilingual Benchmark Design and Governance Rubric</w:t>
       </w:r>
     </w:p>
     <w:p>
@@ -3084,7 +3068,7 @@
           <w:color w:val="000000"/>
           <w:sz w:val="19"/>
         </w:rPr>
-        <w:t>To evaluate MITRA across diverse user behaviors, the study implements two evaluation stages:</w:t>
+        <w:t>A fixed test battery of 90 cases (30 English, 30 Marathi, 30 Hindi) was executed through an automated evaluation harness that passes each query to the application answer function and evaluates the structured response with deterministic rules. The cases represent domain-matched thematic counterparts across core institutional topics (fees, intake, hostel, eligibility, scholarships, facilities, contacts) rather than literal sentence translations, reflecting natural regional phrasing. Generative language models (Gemini) were disabled during the benchmark (`NODE_ENV=test`) to isolate deterministic scope interpretation, canonical rendering, and lexical retrieval from generative variance.</w:t>
       </w:r>
     </w:p>
     <w:p>
@@ -3100,187 +3084,7 @@
           <w:color w:val="000000"/>
           <w:sz w:val="19"/>
         </w:rPr>
-        <w:t xml:space="preserve">1. </w:t>
-      </w:r>
-      <w:r>
-        <w:rPr>
-          <w:rFonts w:ascii="Times New Roman" w:hAnsi="Times New Roman"/>
-          <w:b/>
-          <w:i w:val="0"/>
-          <w:color w:val="000000"/>
-          <w:sz w:val="19"/>
-        </w:rPr>
-        <w:t>Preliminary Authority-Evaluated Pilot ($N = 30$)</w:t>
-      </w:r>
-      <w:r>
-        <w:rPr>
-          <w:rFonts w:ascii="Times New Roman" w:hAnsi="Times New Roman"/>
-          <w:b w:val="0"/>
-          <w:i w:val="0"/>
-          <w:color w:val="000000"/>
-          <w:sz w:val="19"/>
-        </w:rPr>
-        <w:t>: Ten questions each in English, Marathi, and Hindi evaluating core admissions and fee queries on the live interface, assessed by institutional reviewers.</w:t>
-      </w:r>
-    </w:p>
-    <w:p>
-      <w:pPr>
-        <w:spacing w:before="0" w:after="80" w:line="252" w:lineRule="auto"/>
-        <w:jc w:val="both"/>
-      </w:pPr>
-      <w:r>
-        <w:rPr>
-          <w:rFonts w:ascii="Times New Roman" w:hAnsi="Times New Roman"/>
-          <w:b w:val="0"/>
-          <w:i w:val="0"/>
-          <w:color w:val="000000"/>
-          <w:sz w:val="19"/>
-        </w:rPr>
-        <w:t xml:space="preserve">2. </w:t>
-      </w:r>
-      <w:r>
-        <w:rPr>
-          <w:rFonts w:ascii="Times New Roman" w:hAnsi="Times New Roman"/>
-          <w:b/>
-          <w:i w:val="0"/>
-          <w:color w:val="000000"/>
-          <w:sz w:val="19"/>
-        </w:rPr>
-        <w:t>Expanded Multilingual Stress Benchmark ($N = 90$)</w:t>
-      </w:r>
-      <w:r>
-        <w:rPr>
-          <w:rFonts w:ascii="Times New Roman" w:hAnsi="Times New Roman"/>
-          <w:b w:val="0"/>
-          <w:i w:val="0"/>
-          <w:color w:val="000000"/>
-          <w:sz w:val="19"/>
-        </w:rPr>
-        <w:t>: An independently formulated 90-case test battery spanning English ($n = 30$), Marathi ($n = 30$), and Hindi ($n = 30$), categorized prior to execution into three distinct behavioral classes:</w:t>
-      </w:r>
-    </w:p>
-    <w:p>
-      <w:pPr>
-        <w:spacing w:before="0" w:after="80" w:line="252" w:lineRule="auto"/>
-        <w:jc w:val="both"/>
-      </w:pPr>
-      <w:r>
-        <w:rPr>
-          <w:rFonts w:ascii="Times New Roman" w:hAnsi="Times New Roman"/>
-          <w:b w:val="0"/>
-          <w:i w:val="0"/>
-          <w:color w:val="000000"/>
-          <w:sz w:val="19"/>
-        </w:rPr>
-        <w:t xml:space="preserve">- </w:t>
-      </w:r>
-      <w:r>
-        <w:rPr>
-          <w:rFonts w:ascii="Times New Roman" w:hAnsi="Times New Roman"/>
-          <w:b w:val="0"/>
-          <w:i/>
-          <w:color w:val="000000"/>
-          <w:sz w:val="19"/>
-        </w:rPr>
-        <w:t>Answerable from official sources</w:t>
-      </w:r>
-      <w:r>
-        <w:rPr>
-          <w:rFonts w:ascii="Times New Roman" w:hAnsi="Times New Roman"/>
-          <w:b w:val="0"/>
-          <w:i w:val="0"/>
-          <w:color w:val="000000"/>
-          <w:sz w:val="19"/>
-        </w:rPr>
-        <w:t xml:space="preserve"> ($n = 60$; 20 per language): direct factual inquiries, multi-constraint fee lookups (e.g., category + entry year + scholarship), and paraphrased Devanagari questions.</w:t>
-      </w:r>
-    </w:p>
-    <w:p>
-      <w:pPr>
-        <w:spacing w:before="0" w:after="80" w:line="252" w:lineRule="auto"/>
-        <w:jc w:val="both"/>
-      </w:pPr>
-      <w:r>
-        <w:rPr>
-          <w:rFonts w:ascii="Times New Roman" w:hAnsi="Times New Roman"/>
-          <w:b w:val="0"/>
-          <w:i w:val="0"/>
-          <w:color w:val="000000"/>
-          <w:sz w:val="19"/>
-        </w:rPr>
-        <w:t xml:space="preserve">- </w:t>
-      </w:r>
-      <w:r>
-        <w:rPr>
-          <w:rFonts w:ascii="Times New Roman" w:hAnsi="Times New Roman"/>
-          <w:b w:val="0"/>
-          <w:i/>
-          <w:color w:val="000000"/>
-          <w:sz w:val="19"/>
-        </w:rPr>
-        <w:t>Unanswerable from available records</w:t>
-      </w:r>
-      <w:r>
-        <w:rPr>
-          <w:rFonts w:ascii="Times New Roman" w:hAnsi="Times New Roman"/>
-          <w:b w:val="0"/>
-          <w:i w:val="0"/>
-          <w:color w:val="000000"/>
-          <w:sz w:val="19"/>
-        </w:rPr>
-        <w:t xml:space="preserve"> ($n = 21$; 7 per language): queries probing facts intentionally absent from published circulars (e.g., unpublished cutoff ranks, nonexistent on-campus hostels, staff recruitment/vacancies), testing safe refusal and escalation.</w:t>
-      </w:r>
-    </w:p>
-    <w:p>
-      <w:pPr>
-        <w:spacing w:before="0" w:after="80" w:line="252" w:lineRule="auto"/>
-        <w:jc w:val="both"/>
-      </w:pPr>
-      <w:r>
-        <w:rPr>
-          <w:rFonts w:ascii="Times New Roman" w:hAnsi="Times New Roman"/>
-          <w:b w:val="0"/>
-          <w:i w:val="0"/>
-          <w:color w:val="000000"/>
-          <w:sz w:val="19"/>
-        </w:rPr>
-        <w:t xml:space="preserve">- </w:t>
-      </w:r>
-      <w:r>
-        <w:rPr>
-          <w:rFonts w:ascii="Times New Roman" w:hAnsi="Times New Roman"/>
-          <w:b w:val="0"/>
-          <w:i/>
-          <w:color w:val="000000"/>
-          <w:sz w:val="19"/>
-        </w:rPr>
-        <w:t>Ambiguous or under-specified</w:t>
-      </w:r>
-      <w:r>
-        <w:rPr>
-          <w:rFonts w:ascii="Times New Roman" w:hAnsi="Times New Roman"/>
-          <w:b w:val="0"/>
-          <w:i w:val="0"/>
-          <w:color w:val="000000"/>
-          <w:sz w:val="19"/>
-        </w:rPr>
-        <w:t xml:space="preserve"> ($n = 9$; 3 per language): bare keyword prompts (e.g., "fees", "admission"), testing interactive clarification rather than premature answering.</w:t>
-      </w:r>
-    </w:p>
-    <w:p>
-      <w:pPr>
-        <w:spacing w:before="0" w:after="80" w:line="252" w:lineRule="auto"/>
-        <w:jc w:val="both"/>
-      </w:pPr>
-      <w:r>
-        <w:rPr>
-          <w:rFonts w:ascii="Times New Roman" w:hAnsi="Times New Roman"/>
-          <w:b w:val="0"/>
-          <w:i w:val="0"/>
-          <w:color w:val="000000"/>
-          <w:sz w:val="19"/>
-        </w:rPr>
-        <w:t>All 90 cases are evaluated against a 6-dimension governance rubric:</w:t>
+        <w:t>Each language contains 20 answerable, seven unanswerable, and three ambiguous cases (60, 21, and nine overall). The harness scores six governance dimensions:</w:t>
       </w:r>
     </w:p>
     <w:p>
@@ -3316,7 +3120,7 @@
           <w:color w:val="000000"/>
           <w:sz w:val="19"/>
         </w:rPr>
-        <w:t>: Exact match of figures, attributes, and academic years against official approved circulars.</w:t>
+        <w:t>: Presence of all required figures, attributes, and academic years in the response text (correct: 1.0), partial match (0.5), or none (0.0).</w:t>
       </w:r>
     </w:p>
     <w:p>
@@ -3342,7 +3146,7 @@
           <w:color w:val="000000"/>
           <w:sz w:val="19"/>
         </w:rPr>
-        <w:t>Source Grounding (SG)</w:t>
+        <w:t>Source Attachment (SA)</w:t>
       </w:r>
       <w:r>
         <w:rPr>
@@ -3352,7 +3156,7 @@
           <w:color w:val="000000"/>
           <w:sz w:val="19"/>
         </w:rPr>
-        <w:t>: Output includes a verifiable record identifier or circular reference.</w:t>
+        <w:t>: Response includes a verifiable official circular reference or record identifier.</w:t>
       </w:r>
     </w:p>
     <w:p>
@@ -3388,7 +3192,7 @@
           <w:color w:val="000000"/>
           <w:sz w:val="19"/>
         </w:rPr>
-        <w:t>: Coverage of all queried constraints without omitting conditional requirements.</w:t>
+        <w:t>: Full constraint coverage without omitting conditional requirements.</w:t>
       </w:r>
     </w:p>
     <w:p>
@@ -3414,7 +3218,7 @@
           <w:color w:val="000000"/>
           <w:sz w:val="19"/>
         </w:rPr>
-        <w:t>Appropriate Abstention / Referral (AA)</w:t>
+        <w:t>Appropriate Abstention (AA)</w:t>
       </w:r>
       <w:r>
         <w:rPr>
@@ -3424,7 +3228,7 @@
           <w:color w:val="000000"/>
           <w:sz w:val="19"/>
         </w:rPr>
-        <w:t>: Safe refusal of out-of-scope or unverified inquiries without hallucinating facts.</w:t>
+        <w:t>: For unanswerable queries, emitting an insufficient-evidence response with appropriate referral; for ambiguous queries, issuing a clarification prompt. An unjustified refusal of an answerable case counts as a false refusal.</w:t>
       </w:r>
     </w:p>
     <w:p>
@@ -3450,7 +3254,7 @@
           <w:color w:val="000000"/>
           <w:sz w:val="19"/>
         </w:rPr>
-        <w:t>Referral Routing Relevance (RR)</w:t>
+        <w:t>Referral Routing Accuracy (RR)</w:t>
       </w:r>
       <w:r>
         <w:rPr>
@@ -3460,7 +3264,7 @@
           <w:color w:val="000000"/>
           <w:sz w:val="19"/>
         </w:rPr>
-        <w:t>: Correct escalation desk attribution (Administrative Office &amp; Principal Desk for employment/governance vs. Admissions Helpdesk for prospective students).</w:t>
+        <w:t>: Correct destination attribution (Administrative Office &amp; Principal Desk for employment/governance vs. Admissions Helpdesk for prospective students).</w:t>
       </w:r>
     </w:p>
     <w:p>
@@ -3496,7 +3300,7 @@
           <w:color w:val="000000"/>
           <w:sz w:val="19"/>
         </w:rPr>
-        <w:t>: Devanagari script integrity and numeral preservation scored on a 1–5 scale.</w:t>
+        <w:t>: Heuristic on a 1–5 scale reflecting Devanagari character proportion and numeral preservation (fixed at 5.0 for English).</w:t>
       </w:r>
     </w:p>
     <w:p>
@@ -3512,7 +3316,7 @@
           <w:color w:val="000000"/>
           <w:sz w:val="19"/>
         </w:rPr>
-        <w:t>An adjudication protocol resolves rating discrepancies, with Cohen’s kappa ($\kappa = 0.96$) indicating near-perfect inter-rater agreement across pre-registered categories.</w:t>
+        <w:t>Evaluation was executed across two milestones: Run 1 on the initial build (commit `809455b`), and Run 2 on the updated build (commit `3216bb3`), which incorporates the staff-recruitment routing correction described in Section 4.4. The full case catalog is preserved in `deliverables/evaluation-record-kit/cases.csv`, and all individual outputs are logged in `backend/evaluation/reports/pilot-evaluation-report.json`.</w:t>
       </w:r>
     </w:p>
     <w:p>
@@ -3528,7 +3332,7 @@
           <w:color w:val="000000"/>
           <w:sz w:val="20"/>
         </w:rPr>
-        <w:t>5.5 Planned Longitudinal Evaluation</w:t>
+        <w:t>5.5 Planned Independent Evaluation</w:t>
       </w:r>
     </w:p>
     <w:p>
@@ -3544,7 +3348,7 @@
           <w:color w:val="000000"/>
           <w:sz w:val="19"/>
         </w:rPr>
-        <w:t>A multi-semester held-out user study represents the next stage. Long-term evaluations will instrument session drop-offs, user feedback ratings across rural demographics, and downstream resolution rates of tickets escalated to administrative staff.</w:t>
+        <w:t>The 90-case benchmark provides a developer-run baseline. An independently authored and labeled held-out evaluation remains the planned next phase. A multi-semester held-out user study will score Recall@k and MRR on frozen query sets, with independent human raters blinded to retriever identity assessing correctness and native-speaker fluency.</w:t>
       </w:r>
     </w:p>
     <w:p>
@@ -4621,7 +4425,7 @@
           <w:color w:val="000000"/>
           <w:sz w:val="20"/>
         </w:rPr>
-        <w:t>6.4 Preliminary Pilot Outcomes ($N = 30$)</w:t>
+        <w:t>6.4 Multilingual Benchmark Outcomes ($N = 90$)</w:t>
       </w:r>
     </w:p>
     <w:p>
@@ -4637,7 +4441,7 @@
           <w:color w:val="000000"/>
           <w:sz w:val="20"/>
         </w:rPr>
-        <w:t>TABLE VII: AUTHORITY-EVALUATED LIVE PILOT OUTCOMES</w:t>
+        <w:t>TABLE VII: MULTILINGUAL 90-CASE BENCHMARK BY LANGUAGE (AUTOMATED HARNESS ON 20 ANSWERABLE, 7 UNANSWERABLE, AND 3 AMBIGUOUS CASES PER LANGUAGE, N = 90)</w:t>
       </w:r>
     </w:p>
     <w:tbl>
@@ -4670,7 +4474,7 @@
                 <w:color w:val="000000"/>
                 <w:sz w:val="17"/>
               </w:rPr>
-              <w:t>Pilot scope</w:t>
+              <w:t>Metric</w:t>
             </w:r>
           </w:p>
         </w:tc>
@@ -4690,7 +4494,7 @@
                 <w:color w:val="000000"/>
                 <w:sz w:val="17"/>
               </w:rPr>
-              <w:t>Total</w:t>
+              <w:t>English ($n = 30$)</w:t>
             </w:r>
           </w:p>
         </w:tc>
@@ -4710,7 +4514,7 @@
                 <w:color w:val="000000"/>
                 <w:sz w:val="17"/>
               </w:rPr>
-              <w:t>Correct answers</w:t>
+              <w:t>Marathi ($n = 30$)</w:t>
             </w:r>
           </w:p>
         </w:tc>
@@ -4730,7 +4534,7 @@
                 <w:color w:val="000000"/>
                 <w:sz w:val="17"/>
               </w:rPr>
-              <w:t>Human escalations</w:t>
+              <w:t>Hindi ($n = 30$)</w:t>
             </w:r>
           </w:p>
         </w:tc>
@@ -4750,7 +4554,7 @@
                 <w:color w:val="000000"/>
                 <w:sz w:val="17"/>
               </w:rPr>
-              <w:t>Clarifications</w:t>
+              <w:t>Overall ($N = 90$)</w:t>
             </w:r>
           </w:p>
         </w:tc>
@@ -4772,7 +4576,7 @@
                 <w:color w:val="000000"/>
                 <w:sz w:val="17"/>
               </w:rPr>
-              <w:t>English ($n = 10$)</w:t>
+              <w:t>Answer correctness</w:t>
             </w:r>
           </w:p>
         </w:tc>
@@ -4792,620 +4596,7 @@
                 <w:color w:val="000000"/>
                 <w:sz w:val="17"/>
               </w:rPr>
-              <w:t>10</w:t>
-            </w:r>
-          </w:p>
-        </w:tc>
-        <w:tc>
-          <w:tcPr>
-            <w:tcW w:type="dxa" w:w="2016"/>
-          </w:tcPr>
-          <w:p>
-            <w:pPr>
-              <w:jc w:val="left"/>
-            </w:pPr>
-            <w:r>
-              <w:rPr>
-                <w:rFonts w:ascii="Times New Roman" w:hAnsi="Times New Roman"/>
-                <w:b w:val="0"/>
-                <w:i w:val="0"/>
-                <w:color w:val="000000"/>
-                <w:sz w:val="17"/>
-              </w:rPr>
-              <w:t>7 (100% of answerable)</w:t>
-            </w:r>
-          </w:p>
-        </w:tc>
-        <w:tc>
-          <w:tcPr>
-            <w:tcW w:type="dxa" w:w="2016"/>
-          </w:tcPr>
-          <w:p>
-            <w:pPr>
-              <w:jc w:val="left"/>
-            </w:pPr>
-            <w:r>
-              <w:rPr>
-                <w:rFonts w:ascii="Times New Roman" w:hAnsi="Times New Roman"/>
-                <w:b w:val="0"/>
-                <w:i w:val="0"/>
-                <w:color w:val="000000"/>
-                <w:sz w:val="17"/>
-              </w:rPr>
-              <w:t>2 (100% abstention)</w:t>
-            </w:r>
-          </w:p>
-        </w:tc>
-        <w:tc>
-          <w:tcPr>
-            <w:tcW w:type="dxa" w:w="2016"/>
-          </w:tcPr>
-          <w:p>
-            <w:pPr>
-              <w:jc w:val="left"/>
-            </w:pPr>
-            <w:r>
-              <w:rPr>
-                <w:rFonts w:ascii="Times New Roman" w:hAnsi="Times New Roman"/>
-                <w:b w:val="0"/>
-                <w:i w:val="0"/>
-                <w:color w:val="000000"/>
-                <w:sz w:val="17"/>
-              </w:rPr>
-              <w:t>1 (100% clarified)</w:t>
-            </w:r>
-          </w:p>
-        </w:tc>
-      </w:tr>
-      <w:tr>
-        <w:tc>
-          <w:tcPr>
-            <w:tcW w:type="dxa" w:w="2016"/>
-          </w:tcPr>
-          <w:p>
-            <w:pPr>
-              <w:jc w:val="left"/>
-            </w:pPr>
-            <w:r>
-              <w:rPr>
-                <w:rFonts w:ascii="Times New Roman" w:hAnsi="Times New Roman"/>
-                <w:b w:val="0"/>
-                <w:i w:val="0"/>
-                <w:color w:val="000000"/>
-                <w:sz w:val="17"/>
-              </w:rPr>
-              <w:t>Marathi ($n = 10$)</w:t>
-            </w:r>
-          </w:p>
-        </w:tc>
-        <w:tc>
-          <w:tcPr>
-            <w:tcW w:type="dxa" w:w="2016"/>
-          </w:tcPr>
-          <w:p>
-            <w:pPr>
-              <w:jc w:val="left"/>
-            </w:pPr>
-            <w:r>
-              <w:rPr>
-                <w:rFonts w:ascii="Times New Roman" w:hAnsi="Times New Roman"/>
-                <w:b w:val="0"/>
-                <w:i w:val="0"/>
-                <w:color w:val="000000"/>
-                <w:sz w:val="17"/>
-              </w:rPr>
-              <w:t>10</w:t>
-            </w:r>
-          </w:p>
-        </w:tc>
-        <w:tc>
-          <w:tcPr>
-            <w:tcW w:type="dxa" w:w="2016"/>
-          </w:tcPr>
-          <w:p>
-            <w:pPr>
-              <w:jc w:val="left"/>
-            </w:pPr>
-            <w:r>
-              <w:rPr>
-                <w:rFonts w:ascii="Times New Roman" w:hAnsi="Times New Roman"/>
-                <w:b w:val="0"/>
-                <w:i w:val="0"/>
-                <w:color w:val="000000"/>
-                <w:sz w:val="17"/>
-              </w:rPr>
-              <w:t>6 (85.7% of answerable)</w:t>
-            </w:r>
-          </w:p>
-        </w:tc>
-        <w:tc>
-          <w:tcPr>
-            <w:tcW w:type="dxa" w:w="2016"/>
-          </w:tcPr>
-          <w:p>
-            <w:pPr>
-              <w:jc w:val="left"/>
-            </w:pPr>
-            <w:r>
-              <w:rPr>
-                <w:rFonts w:ascii="Times New Roman" w:hAnsi="Times New Roman"/>
-                <w:b w:val="0"/>
-                <w:i w:val="0"/>
-                <w:color w:val="000000"/>
-                <w:sz w:val="17"/>
-              </w:rPr>
-              <w:t>2 (100% abstention)</w:t>
-            </w:r>
-          </w:p>
-        </w:tc>
-        <w:tc>
-          <w:tcPr>
-            <w:tcW w:type="dxa" w:w="2016"/>
-          </w:tcPr>
-          <w:p>
-            <w:pPr>
-              <w:jc w:val="left"/>
-            </w:pPr>
-            <w:r>
-              <w:rPr>
-                <w:rFonts w:ascii="Times New Roman" w:hAnsi="Times New Roman"/>
-                <w:b w:val="0"/>
-                <w:i w:val="0"/>
-                <w:color w:val="000000"/>
-                <w:sz w:val="17"/>
-              </w:rPr>
-              <w:t>1 (100% clarified)</w:t>
-            </w:r>
-          </w:p>
-        </w:tc>
-      </w:tr>
-      <w:tr>
-        <w:tc>
-          <w:tcPr>
-            <w:tcW w:type="dxa" w:w="2016"/>
-          </w:tcPr>
-          <w:p>
-            <w:pPr>
-              <w:jc w:val="left"/>
-            </w:pPr>
-            <w:r>
-              <w:rPr>
-                <w:rFonts w:ascii="Times New Roman" w:hAnsi="Times New Roman"/>
-                <w:b w:val="0"/>
-                <w:i w:val="0"/>
-                <w:color w:val="000000"/>
-                <w:sz w:val="17"/>
-              </w:rPr>
-              <w:t>Hindi ($n = 10$)</w:t>
-            </w:r>
-          </w:p>
-        </w:tc>
-        <w:tc>
-          <w:tcPr>
-            <w:tcW w:type="dxa" w:w="2016"/>
-          </w:tcPr>
-          <w:p>
-            <w:pPr>
-              <w:jc w:val="left"/>
-            </w:pPr>
-            <w:r>
-              <w:rPr>
-                <w:rFonts w:ascii="Times New Roman" w:hAnsi="Times New Roman"/>
-                <w:b w:val="0"/>
-                <w:i w:val="0"/>
-                <w:color w:val="000000"/>
-                <w:sz w:val="17"/>
-              </w:rPr>
-              <w:t>10</w:t>
-            </w:r>
-          </w:p>
-        </w:tc>
-        <w:tc>
-          <w:tcPr>
-            <w:tcW w:type="dxa" w:w="2016"/>
-          </w:tcPr>
-          <w:p>
-            <w:pPr>
-              <w:jc w:val="left"/>
-            </w:pPr>
-            <w:r>
-              <w:rPr>
-                <w:rFonts w:ascii="Times New Roman" w:hAnsi="Times New Roman"/>
-                <w:b w:val="0"/>
-                <w:i w:val="0"/>
-                <w:color w:val="000000"/>
-                <w:sz w:val="17"/>
-              </w:rPr>
-              <w:t>5 (83.3% of answerable)</w:t>
-            </w:r>
-          </w:p>
-        </w:tc>
-        <w:tc>
-          <w:tcPr>
-            <w:tcW w:type="dxa" w:w="2016"/>
-          </w:tcPr>
-          <w:p>
-            <w:pPr>
-              <w:jc w:val="left"/>
-            </w:pPr>
-            <w:r>
-              <w:rPr>
-                <w:rFonts w:ascii="Times New Roman" w:hAnsi="Times New Roman"/>
-                <w:b w:val="0"/>
-                <w:i w:val="0"/>
-                <w:color w:val="000000"/>
-                <w:sz w:val="17"/>
-              </w:rPr>
-              <w:t>3 (100% abstention)</w:t>
-            </w:r>
-          </w:p>
-        </w:tc>
-        <w:tc>
-          <w:tcPr>
-            <w:tcW w:type="dxa" w:w="2016"/>
-          </w:tcPr>
-          <w:p>
-            <w:pPr>
-              <w:jc w:val="left"/>
-            </w:pPr>
-            <w:r>
-              <w:rPr>
-                <w:rFonts w:ascii="Times New Roman" w:hAnsi="Times New Roman"/>
-                <w:b w:val="0"/>
-                <w:i w:val="0"/>
-                <w:color w:val="000000"/>
-                <w:sz w:val="17"/>
-              </w:rPr>
-              <w:t>1 (100% clarified)</w:t>
-            </w:r>
-          </w:p>
-        </w:tc>
-      </w:tr>
-      <w:tr>
-        <w:tc>
-          <w:tcPr>
-            <w:tcW w:type="dxa" w:w="2016"/>
-          </w:tcPr>
-          <w:p>
-            <w:pPr>
-              <w:jc w:val="left"/>
-            </w:pPr>
-            <w:r>
-              <w:rPr>
-                <w:rFonts w:ascii="Times New Roman" w:hAnsi="Times New Roman"/>
-                <w:b w:val="0"/>
-                <w:i w:val="0"/>
-                <w:color w:val="000000"/>
-                <w:sz w:val="17"/>
-              </w:rPr>
-              <w:t>All three languages</w:t>
-            </w:r>
-          </w:p>
-        </w:tc>
-        <w:tc>
-          <w:tcPr>
-            <w:tcW w:type="dxa" w:w="2016"/>
-          </w:tcPr>
-          <w:p>
-            <w:pPr>
-              <w:jc w:val="left"/>
-            </w:pPr>
-            <w:r>
-              <w:rPr>
-                <w:rFonts w:ascii="Times New Roman" w:hAnsi="Times New Roman"/>
-                <w:b w:val="0"/>
-                <w:i w:val="0"/>
-                <w:color w:val="000000"/>
-                <w:sz w:val="17"/>
-              </w:rPr>
-              <w:t>30</w:t>
-            </w:r>
-          </w:p>
-        </w:tc>
-        <w:tc>
-          <w:tcPr>
-            <w:tcW w:type="dxa" w:w="2016"/>
-          </w:tcPr>
-          <w:p>
-            <w:pPr>
-              <w:jc w:val="left"/>
-            </w:pPr>
-            <w:r>
-              <w:rPr>
-                <w:rFonts w:ascii="Times New Roman" w:hAnsi="Times New Roman"/>
-                <w:b w:val="0"/>
-                <w:i w:val="0"/>
-                <w:color w:val="000000"/>
-                <w:sz w:val="17"/>
-              </w:rPr>
-              <w:t>18/20 (90.0% of answerable)</w:t>
-            </w:r>
-          </w:p>
-        </w:tc>
-        <w:tc>
-          <w:tcPr>
-            <w:tcW w:type="dxa" w:w="2016"/>
-          </w:tcPr>
-          <w:p>
-            <w:pPr>
-              <w:jc w:val="left"/>
-            </w:pPr>
-            <w:r>
-              <w:rPr>
-                <w:rFonts w:ascii="Times New Roman" w:hAnsi="Times New Roman"/>
-                <w:b w:val="0"/>
-                <w:i w:val="0"/>
-                <w:color w:val="000000"/>
-                <w:sz w:val="17"/>
-              </w:rPr>
-              <w:t>7/7 (100% abstention)</w:t>
-            </w:r>
-          </w:p>
-        </w:tc>
-        <w:tc>
-          <w:tcPr>
-            <w:tcW w:type="dxa" w:w="2016"/>
-          </w:tcPr>
-          <w:p>
-            <w:pPr>
-              <w:jc w:val="left"/>
-            </w:pPr>
-            <w:r>
-              <w:rPr>
-                <w:rFonts w:ascii="Times New Roman" w:hAnsi="Times New Roman"/>
-                <w:b w:val="0"/>
-                <w:i w:val="0"/>
-                <w:color w:val="000000"/>
-                <w:sz w:val="17"/>
-              </w:rPr>
-              <w:t>3/3 (100% clarified)</w:t>
-            </w:r>
-          </w:p>
-        </w:tc>
-      </w:tr>
-    </w:tbl>
-    <w:p>
-      <w:pPr>
-        <w:spacing w:after="120"/>
-      </w:pPr>
-    </w:p>
-    <w:p>
-      <w:pPr>
-        <w:spacing w:before="0" w:after="80" w:line="252" w:lineRule="auto"/>
-        <w:jc w:val="both"/>
-      </w:pPr>
-      <w:r>
-        <w:rPr>
-          <w:rFonts w:ascii="Times New Roman" w:hAnsi="Times New Roman"/>
-          <w:b w:val="0"/>
-          <w:i w:val="0"/>
-          <w:color w:val="000000"/>
-          <w:sz w:val="19"/>
-        </w:rPr>
-        <w:t>The preliminary 30-case pilot verified baseline functionality on core queries: 18 of 20 answerable questions (90.0%) were answered correctly with full source attribution, 7 unanswerable questions were referred to appropriate human assistance without hallucination, and 3 under-specified prompts triggered interactive clarification.</w:t>
-      </w:r>
-    </w:p>
-    <w:p>
-      <w:pPr>
-        <w:keepNext/>
-        <w:spacing w:before="200" w:after="60"/>
-      </w:pPr>
-      <w:r>
-        <w:rPr>
-          <w:rFonts w:ascii="Times New Roman" w:hAnsi="Times New Roman"/>
-          <w:b/>
-          <w:i/>
-          <w:color w:val="000000"/>
-          <w:sz w:val="20"/>
-        </w:rPr>
-        <w:t>6.5 Expanded 90-Question Multilingual Stress Benchmark</w:t>
-      </w:r>
-    </w:p>
-    <w:p>
-      <w:pPr>
-        <w:spacing w:before="0" w:after="80" w:line="252" w:lineRule="auto"/>
-        <w:jc w:val="both"/>
-      </w:pPr>
-      <w:r>
-        <w:rPr>
-          <w:rFonts w:ascii="Times New Roman" w:hAnsi="Times New Roman"/>
-          <w:b w:val="0"/>
-          <w:i w:val="0"/>
-          <w:color w:val="000000"/>
-          <w:sz w:val="19"/>
-        </w:rPr>
-        <w:t>To evaluate MITRA under real-world input variance—including Devanagari morphological inflections, colloquial phrasing, and deliberate boundary probes—the 90-case benchmark was executed against the frozen system.</w:t>
-      </w:r>
-    </w:p>
-    <w:p>
-      <w:pPr>
-        <w:keepNext/>
-        <w:spacing w:before="200" w:after="60"/>
-      </w:pPr>
-      <w:r>
-        <w:rPr>
-          <w:rFonts w:ascii="Times New Roman" w:hAnsi="Times New Roman"/>
-          <w:b/>
-          <w:i/>
-          <w:color w:val="000000"/>
-          <w:sz w:val="20"/>
-        </w:rPr>
-        <w:t>TABLE VIII: 90-CASE MULTILINGUAL STRESS BENCHMARK RESULTS</w:t>
-      </w:r>
-    </w:p>
-    <w:tbl>
-      <w:tblPr>
-        <w:tblW w:type="auto" w:w="0"/>
-        <w:jc w:val="center"/>
-        <w:tblLook w:firstColumn="1" w:firstRow="1" w:lastColumn="0" w:lastRow="0" w:noHBand="0" w:noVBand="1" w:val="04A0"/>
-      </w:tblPr>
-      <w:tblGrid>
-        <w:gridCol w:w="2016"/>
-        <w:gridCol w:w="2016"/>
-        <w:gridCol w:w="2016"/>
-        <w:gridCol w:w="2016"/>
-        <w:gridCol w:w="2016"/>
-      </w:tblGrid>
-      <w:tr>
-        <w:tc>
-          <w:tcPr>
-            <w:tcW w:type="dxa" w:w="2016"/>
-          </w:tcPr>
-          <w:p>
-            <w:pPr>
-              <w:jc w:val="left"/>
-            </w:pPr>
-            <w:r>
-              <w:rPr>
-                <w:rFonts w:ascii="Times New Roman" w:hAnsi="Times New Roman"/>
-                <w:b/>
-                <w:i w:val="0"/>
-                <w:color w:val="000000"/>
-                <w:sz w:val="17"/>
-              </w:rPr>
-              <w:t>Evaluation Metric / Dimension</w:t>
-            </w:r>
-          </w:p>
-        </w:tc>
-        <w:tc>
-          <w:tcPr>
-            <w:tcW w:type="dxa" w:w="2016"/>
-          </w:tcPr>
-          <w:p>
-            <w:pPr>
-              <w:jc w:val="left"/>
-            </w:pPr>
-            <w:r>
-              <w:rPr>
-                <w:rFonts w:ascii="Times New Roman" w:hAnsi="Times New Roman"/>
-                <w:b/>
-                <w:i w:val="0"/>
-                <w:color w:val="000000"/>
-                <w:sz w:val="17"/>
-              </w:rPr>
-              <w:t>English ($n=30$)</w:t>
-            </w:r>
-          </w:p>
-        </w:tc>
-        <w:tc>
-          <w:tcPr>
-            <w:tcW w:type="dxa" w:w="2016"/>
-          </w:tcPr>
-          <w:p>
-            <w:pPr>
-              <w:jc w:val="left"/>
-            </w:pPr>
-            <w:r>
-              <w:rPr>
-                <w:rFonts w:ascii="Times New Roman" w:hAnsi="Times New Roman"/>
-                <w:b/>
-                <w:i w:val="0"/>
-                <w:color w:val="000000"/>
-                <w:sz w:val="17"/>
-              </w:rPr>
-              <w:t>Marathi ($n=30$)</w:t>
-            </w:r>
-          </w:p>
-        </w:tc>
-        <w:tc>
-          <w:tcPr>
-            <w:tcW w:type="dxa" w:w="2016"/>
-          </w:tcPr>
-          <w:p>
-            <w:pPr>
-              <w:jc w:val="left"/>
-            </w:pPr>
-            <w:r>
-              <w:rPr>
-                <w:rFonts w:ascii="Times New Roman" w:hAnsi="Times New Roman"/>
-                <w:b/>
-                <w:i w:val="0"/>
-                <w:color w:val="000000"/>
-                <w:sz w:val="17"/>
-              </w:rPr>
-              <w:t>Hindi ($n=30$)</w:t>
-            </w:r>
-          </w:p>
-        </w:tc>
-        <w:tc>
-          <w:tcPr>
-            <w:tcW w:type="dxa" w:w="2016"/>
-          </w:tcPr>
-          <w:p>
-            <w:pPr>
-              <w:jc w:val="left"/>
-            </w:pPr>
-            <w:r>
-              <w:rPr>
-                <w:rFonts w:ascii="Times New Roman" w:hAnsi="Times New Roman"/>
-                <w:b/>
-                <w:i w:val="0"/>
-                <w:color w:val="000000"/>
-                <w:sz w:val="17"/>
-              </w:rPr>
-              <w:t>Overall ($N=90$)</w:t>
-            </w:r>
-          </w:p>
-        </w:tc>
-      </w:tr>
-      <w:tr>
-        <w:tc>
-          <w:tcPr>
-            <w:tcW w:type="dxa" w:w="2016"/>
-          </w:tcPr>
-          <w:p>
-            <w:pPr>
-              <w:jc w:val="left"/>
-            </w:pPr>
-            <w:r>
-              <w:rPr>
-                <w:rFonts w:ascii="Times New Roman" w:hAnsi="Times New Roman"/>
-                <w:b w:val="0"/>
-                <w:i w:val="0"/>
-                <w:color w:val="000000"/>
-                <w:sz w:val="17"/>
-              </w:rPr>
-              <w:t>Answer Correctness Rate</w:t>
-            </w:r>
-          </w:p>
-        </w:tc>
-        <w:tc>
-          <w:tcPr>
-            <w:tcW w:type="dxa" w:w="2016"/>
-          </w:tcPr>
-          <w:p>
-            <w:pPr>
-              <w:jc w:val="left"/>
-            </w:pPr>
-            <w:r>
-              <w:rPr>
-                <w:rFonts w:ascii="Times New Roman" w:hAnsi="Times New Roman"/>
-                <w:b w:val="0"/>
-                <w:i w:val="0"/>
-                <w:color w:val="000000"/>
-                <w:sz w:val="17"/>
-              </w:rPr>
-              <w:t>75.0% (15/20)</w:t>
-            </w:r>
-          </w:p>
-        </w:tc>
-        <w:tc>
-          <w:tcPr>
-            <w:tcW w:type="dxa" w:w="2016"/>
-          </w:tcPr>
-          <w:p>
-            <w:pPr>
-              <w:jc w:val="left"/>
-            </w:pPr>
-            <w:r>
-              <w:rPr>
-                <w:rFonts w:ascii="Times New Roman" w:hAnsi="Times New Roman"/>
-                <w:b w:val="0"/>
-                <w:i w:val="0"/>
-                <w:color w:val="000000"/>
-                <w:sz w:val="17"/>
-              </w:rPr>
-              <w:t>55.0% (11/20)</w:t>
+              <w:t>85.0% (17/20)</w:t>
             </w:r>
           </w:p>
         </w:tc>
@@ -5426,6 +4617,26 @@
                 <w:sz w:val="17"/>
               </w:rPr>
               <w:t>50.0% (10/20)</w:t>
+            </w:r>
+          </w:p>
+        </w:tc>
+        <w:tc>
+          <w:tcPr>
+            <w:tcW w:type="dxa" w:w="2016"/>
+          </w:tcPr>
+          <w:p>
+            <w:pPr>
+              <w:jc w:val="left"/>
+            </w:pPr>
+            <w:r>
+              <w:rPr>
+                <w:rFonts w:ascii="Times New Roman" w:hAnsi="Times New Roman"/>
+                <w:b w:val="0"/>
+                <w:i w:val="0"/>
+                <w:color w:val="000000"/>
+                <w:sz w:val="17"/>
+              </w:rPr>
+              <w:t>45.0% (9/20)</w:t>
             </w:r>
           </w:p>
         </w:tc>
@@ -5467,7 +4678,7 @@
                 <w:color w:val="000000"/>
                 <w:sz w:val="17"/>
               </w:rPr>
-              <w:t>Source Grounding Rate</w:t>
+              <w:t>Source attachment</w:t>
             </w:r>
           </w:p>
         </w:tc>
@@ -5487,7 +4698,7 @@
                 <w:color w:val="000000"/>
                 <w:sz w:val="17"/>
               </w:rPr>
-              <w:t>90.0% (18/20)</w:t>
+              <w:t>100.0% (20/20)</w:t>
             </w:r>
           </w:p>
         </w:tc>
@@ -5527,7 +4738,7 @@
                 <w:color w:val="000000"/>
                 <w:sz w:val="17"/>
               </w:rPr>
-              <w:t>70.0% (14/20)</w:t>
+              <w:t>60.0% (12/20)</w:t>
             </w:r>
           </w:p>
         </w:tc>
@@ -5569,27 +4780,7 @@
                 <w:color w:val="000000"/>
                 <w:sz w:val="17"/>
               </w:rPr>
-              <w:t>Safe Abstention Rate</w:t>
-            </w:r>
-          </w:p>
-        </w:tc>
-        <w:tc>
-          <w:tcPr>
-            <w:tcW w:type="dxa" w:w="2016"/>
-          </w:tcPr>
-          <w:p>
-            <w:pPr>
-              <w:jc w:val="left"/>
-            </w:pPr>
-            <w:r>
-              <w:rPr>
-                <w:rFonts w:ascii="Times New Roman" w:hAnsi="Times New Roman"/>
-                <w:b w:val="0"/>
-                <w:i w:val="0"/>
-                <w:color w:val="000000"/>
-                <w:sz w:val="17"/>
-              </w:rPr>
-              <w:t>85.7% (6/7)</w:t>
+              <w:t>Appropriate abstention</w:t>
             </w:r>
           </w:p>
         </w:tc>
@@ -5649,6 +4840,26 @@
                 <w:color w:val="000000"/>
                 <w:sz w:val="17"/>
               </w:rPr>
+              <w:t>85.7% (6/7)</w:t>
+            </w:r>
+          </w:p>
+        </w:tc>
+        <w:tc>
+          <w:tcPr>
+            <w:tcW w:type="dxa" w:w="2016"/>
+          </w:tcPr>
+          <w:p>
+            <w:pPr>
+              <w:jc w:val="left"/>
+            </w:pPr>
+            <w:r>
+              <w:rPr>
+                <w:rFonts w:ascii="Times New Roman" w:hAnsi="Times New Roman"/>
+                <w:b w:val="0"/>
+                <w:i w:val="0"/>
+                <w:color w:val="000000"/>
+                <w:sz w:val="17"/>
+              </w:rPr>
               <w:t>71.4% (15/21)</w:t>
             </w:r>
           </w:p>
@@ -5671,7 +4882,27 @@
                 <w:color w:val="000000"/>
                 <w:sz w:val="17"/>
               </w:rPr>
-              <w:t>Clarification Accuracy</w:t>
+              <w:t>Clarification accuracy</w:t>
+            </w:r>
+          </w:p>
+        </w:tc>
+        <w:tc>
+          <w:tcPr>
+            <w:tcW w:type="dxa" w:w="2016"/>
+          </w:tcPr>
+          <w:p>
+            <w:pPr>
+              <w:jc w:val="left"/>
+            </w:pPr>
+            <w:r>
+              <w:rPr>
+                <w:rFonts w:ascii="Times New Roman" w:hAnsi="Times New Roman"/>
+                <w:b w:val="0"/>
+                <w:i w:val="0"/>
+                <w:color w:val="000000"/>
+                <w:sz w:val="17"/>
+              </w:rPr>
+              <w:t>33.3% (1/3)</w:t>
             </w:r>
           </w:p>
         </w:tc>
@@ -5711,27 +4942,7 @@
                 <w:color w:val="000000"/>
                 <w:sz w:val="17"/>
               </w:rPr>
-              <w:t>66.7% (2/3)</w:t>
-            </w:r>
-          </w:p>
-        </w:tc>
-        <w:tc>
-          <w:tcPr>
-            <w:tcW w:type="dxa" w:w="2016"/>
-          </w:tcPr>
-          <w:p>
-            <w:pPr>
-              <w:jc w:val="left"/>
-            </w:pPr>
-            <w:r>
-              <w:rPr>
-                <w:rFonts w:ascii="Times New Roman" w:hAnsi="Times New Roman"/>
-                <w:b w:val="0"/>
-                <w:i w:val="0"/>
-                <w:color w:val="000000"/>
-                <w:sz w:val="17"/>
-              </w:rPr>
-              <w:t>66.7% (2/3)</w:t>
+              <w:t>100.0% (3/3)</w:t>
             </w:r>
           </w:p>
         </w:tc>
@@ -5773,27 +4984,7 @@
                 <w:color w:val="000000"/>
                 <w:sz w:val="17"/>
               </w:rPr>
-              <w:t>False-Answer Rate (Hallucination)</w:t>
-            </w:r>
-          </w:p>
-        </w:tc>
-        <w:tc>
-          <w:tcPr>
-            <w:tcW w:type="dxa" w:w="2016"/>
-          </w:tcPr>
-          <w:p>
-            <w:pPr>
-              <w:jc w:val="left"/>
-            </w:pPr>
-            <w:r>
-              <w:rPr>
-                <w:rFonts w:ascii="Times New Roman" w:hAnsi="Times New Roman"/>
-                <w:b w:val="0"/>
-                <w:i w:val="0"/>
-                <w:color w:val="000000"/>
-                <w:sz w:val="17"/>
-              </w:rPr>
-              <w:t>14.3% (1/7)</w:t>
+              <w:t>False-answer rate</w:t>
             </w:r>
           </w:p>
         </w:tc>
@@ -5853,6 +5044,26 @@
                 <w:color w:val="000000"/>
                 <w:sz w:val="17"/>
               </w:rPr>
+              <w:t>14.3% (1/7)</w:t>
+            </w:r>
+          </w:p>
+        </w:tc>
+        <w:tc>
+          <w:tcPr>
+            <w:tcW w:type="dxa" w:w="2016"/>
+          </w:tcPr>
+          <w:p>
+            <w:pPr>
+              <w:jc w:val="left"/>
+            </w:pPr>
+            <w:r>
+              <w:rPr>
+                <w:rFonts w:ascii="Times New Roman" w:hAnsi="Times New Roman"/>
+                <w:b w:val="0"/>
+                <w:i w:val="0"/>
+                <w:color w:val="000000"/>
+                <w:sz w:val="17"/>
+              </w:rPr>
               <w:t>28.6% (6/21)</w:t>
             </w:r>
           </w:p>
@@ -5875,7 +5086,7 @@
                 <w:color w:val="000000"/>
                 <w:sz w:val="17"/>
               </w:rPr>
-              <w:t>False-Refusal Rate</w:t>
+              <w:t>False-refusal rate</w:t>
             </w:r>
           </w:p>
         </w:tc>
@@ -5895,7 +5106,7 @@
                 <w:color w:val="000000"/>
                 <w:sz w:val="17"/>
               </w:rPr>
-              <w:t>15.0% (3/20)</w:t>
+              <w:t>0.0% (0/20)</w:t>
             </w:r>
           </w:p>
         </w:tc>
@@ -5935,7 +5146,7 @@
                 <w:color w:val="000000"/>
                 <w:sz w:val="17"/>
               </w:rPr>
-              <w:t>25.0% (5/20)</w:t>
+              <w:t>40.0% (8/20)</w:t>
             </w:r>
           </w:p>
         </w:tc>
@@ -5977,7 +5188,7 @@
                 <w:color w:val="000000"/>
                 <w:sz w:val="17"/>
               </w:rPr>
-              <w:t>Financial Hallucination Rate</w:t>
+              <w:t>Referral routing (Run 2 [Run 1])</w:t>
             </w:r>
           </w:p>
         </w:tc>
@@ -5997,7 +5208,7 @@
                 <w:color w:val="000000"/>
                 <w:sz w:val="17"/>
               </w:rPr>
-              <w:t>0.0% (0/20)</w:t>
+              <w:t>100.0% (4/4)</w:t>
             </w:r>
           </w:p>
         </w:tc>
@@ -6017,7 +5228,7 @@
                 <w:color w:val="000000"/>
                 <w:sz w:val="17"/>
               </w:rPr>
-              <w:t>0.0% (0/20)</w:t>
+              <w:t>100.0% (5/5) [80%]</w:t>
             </w:r>
           </w:p>
         </w:tc>
@@ -6037,7 +5248,7 @@
                 <w:color w:val="000000"/>
                 <w:sz w:val="17"/>
               </w:rPr>
-              <w:t>0.0% (0/20)</w:t>
+              <w:t>100.0% (6/6) [83%]</w:t>
             </w:r>
           </w:p>
         </w:tc>
@@ -6057,7 +5268,7 @@
                 <w:color w:val="000000"/>
                 <w:sz w:val="17"/>
               </w:rPr>
-              <w:t>0.0% (0/60)</w:t>
+              <w:t>100.0% (15/15) [86.7%]</w:t>
             </w:r>
           </w:p>
         </w:tc>
@@ -6079,109 +5290,7 @@
                 <w:color w:val="000000"/>
                 <w:sz w:val="17"/>
               </w:rPr>
-              <w:t>Referral Routing Accuracy</w:t>
-            </w:r>
-          </w:p>
-        </w:tc>
-        <w:tc>
-          <w:tcPr>
-            <w:tcW w:type="dxa" w:w="2016"/>
-          </w:tcPr>
-          <w:p>
-            <w:pPr>
-              <w:jc w:val="left"/>
-            </w:pPr>
-            <w:r>
-              <w:rPr>
-                <w:rFonts w:ascii="Times New Roman" w:hAnsi="Times New Roman"/>
-                <w:b w:val="0"/>
-                <w:i w:val="0"/>
-                <w:color w:val="000000"/>
-                <w:sz w:val="17"/>
-              </w:rPr>
-              <w:t>100.0% (6/6)</w:t>
-            </w:r>
-          </w:p>
-        </w:tc>
-        <w:tc>
-          <w:tcPr>
-            <w:tcW w:type="dxa" w:w="2016"/>
-          </w:tcPr>
-          <w:p>
-            <w:pPr>
-              <w:jc w:val="left"/>
-            </w:pPr>
-            <w:r>
-              <w:rPr>
-                <w:rFonts w:ascii="Times New Roman" w:hAnsi="Times New Roman"/>
-                <w:b w:val="0"/>
-                <w:i w:val="0"/>
-                <w:color w:val="000000"/>
-                <w:sz w:val="17"/>
-              </w:rPr>
-              <w:t>75.0% (3/4)</w:t>
-            </w:r>
-          </w:p>
-        </w:tc>
-        <w:tc>
-          <w:tcPr>
-            <w:tcW w:type="dxa" w:w="2016"/>
-          </w:tcPr>
-          <w:p>
-            <w:pPr>
-              <w:jc w:val="left"/>
-            </w:pPr>
-            <w:r>
-              <w:rPr>
-                <w:rFonts w:ascii="Times New Roman" w:hAnsi="Times New Roman"/>
-                <w:b w:val="0"/>
-                <w:i w:val="0"/>
-                <w:color w:val="000000"/>
-                <w:sz w:val="17"/>
-              </w:rPr>
-              <w:t>80.0% (4/5)</w:t>
-            </w:r>
-          </w:p>
-        </w:tc>
-        <w:tc>
-          <w:tcPr>
-            <w:tcW w:type="dxa" w:w="2016"/>
-          </w:tcPr>
-          <w:p>
-            <w:pPr>
-              <w:jc w:val="left"/>
-            </w:pPr>
-            <w:r>
-              <w:rPr>
-                <w:rFonts w:ascii="Times New Roman" w:hAnsi="Times New Roman"/>
-                <w:b w:val="0"/>
-                <w:i w:val="0"/>
-                <w:color w:val="000000"/>
-                <w:sz w:val="17"/>
-              </w:rPr>
-              <w:t>86.7% (13/15)</w:t>
-            </w:r>
-          </w:p>
-        </w:tc>
-      </w:tr>
-      <w:tr>
-        <w:tc>
-          <w:tcPr>
-            <w:tcW w:type="dxa" w:w="2016"/>
-          </w:tcPr>
-          <w:p>
-            <w:pPr>
-              <w:jc w:val="left"/>
-            </w:pPr>
-            <w:r>
-              <w:rPr>
-                <w:rFonts w:ascii="Times New Roman" w:hAnsi="Times New Roman"/>
-                <w:b w:val="0"/>
-                <w:i w:val="0"/>
-                <w:color w:val="000000"/>
-                <w:sz w:val="17"/>
-              </w:rPr>
-              <w:t>Language Fidelity (Mean / 5.0)</w:t>
+              <w:t>Language fidelity (mean/5)</w:t>
             </w:r>
           </w:p>
         </w:tc>
@@ -6266,108 +5375,6 @@
           </w:p>
         </w:tc>
       </w:tr>
-      <w:tr>
-        <w:tc>
-          <w:tcPr>
-            <w:tcW w:type="dxa" w:w="2016"/>
-          </w:tcPr>
-          <w:p>
-            <w:pPr>
-              <w:jc w:val="left"/>
-            </w:pPr>
-            <w:r>
-              <w:rPr>
-                <w:rFonts w:ascii="Times New Roman" w:hAnsi="Times New Roman"/>
-                <w:b w:val="0"/>
-                <w:i w:val="0"/>
-                <w:color w:val="000000"/>
-                <w:sz w:val="17"/>
-              </w:rPr>
-              <w:t>Inter-Rater Agreement ($\kappa$)</w:t>
-            </w:r>
-          </w:p>
-        </w:tc>
-        <w:tc>
-          <w:tcPr>
-            <w:tcW w:type="dxa" w:w="2016"/>
-          </w:tcPr>
-          <w:p>
-            <w:pPr>
-              <w:jc w:val="left"/>
-            </w:pPr>
-            <w:r>
-              <w:rPr>
-                <w:rFonts w:ascii="Times New Roman" w:hAnsi="Times New Roman"/>
-                <w:b w:val="0"/>
-                <w:i w:val="0"/>
-                <w:color w:val="000000"/>
-                <w:sz w:val="17"/>
-              </w:rPr>
-              <w:t>1.00</w:t>
-            </w:r>
-          </w:p>
-        </w:tc>
-        <w:tc>
-          <w:tcPr>
-            <w:tcW w:type="dxa" w:w="2016"/>
-          </w:tcPr>
-          <w:p>
-            <w:pPr>
-              <w:jc w:val="left"/>
-            </w:pPr>
-            <w:r>
-              <w:rPr>
-                <w:rFonts w:ascii="Times New Roman" w:hAnsi="Times New Roman"/>
-                <w:b w:val="0"/>
-                <w:i w:val="0"/>
-                <w:color w:val="000000"/>
-                <w:sz w:val="17"/>
-              </w:rPr>
-              <w:t>0.94</w:t>
-            </w:r>
-          </w:p>
-        </w:tc>
-        <w:tc>
-          <w:tcPr>
-            <w:tcW w:type="dxa" w:w="2016"/>
-          </w:tcPr>
-          <w:p>
-            <w:pPr>
-              <w:jc w:val="left"/>
-            </w:pPr>
-            <w:r>
-              <w:rPr>
-                <w:rFonts w:ascii="Times New Roman" w:hAnsi="Times New Roman"/>
-                <w:b w:val="0"/>
-                <w:i w:val="0"/>
-                <w:color w:val="000000"/>
-                <w:sz w:val="17"/>
-              </w:rPr>
-              <w:t>0.94</w:t>
-            </w:r>
-          </w:p>
-        </w:tc>
-        <w:tc>
-          <w:tcPr>
-            <w:tcW w:type="dxa" w:w="2016"/>
-          </w:tcPr>
-          <w:p>
-            <w:pPr>
-              <w:jc w:val="left"/>
-            </w:pPr>
-            <w:r>
-              <w:rPr>
-                <w:rFonts w:ascii="Times New Roman" w:hAnsi="Times New Roman"/>
-                <w:b w:val="0"/>
-                <w:i w:val="0"/>
-                <w:color w:val="000000"/>
-                <w:sz w:val="17"/>
-              </w:rPr>
-              <w:t>$\kappa = 0.96$</w:t>
-            </w:r>
-          </w:p>
-        </w:tc>
-      </w:tr>
     </w:tbl>
     <w:p>
       <w:pPr>
@@ -6376,18 +5383,18 @@
     </w:p>
     <w:p>
       <w:pPr>
-        <w:keepNext/>
-        <w:spacing w:before="200" w:after="60"/>
+        <w:spacing w:before="0" w:after="80" w:line="252" w:lineRule="auto"/>
+        <w:jc w:val="both"/>
       </w:pPr>
       <w:r>
         <w:rPr>
           <w:rFonts w:ascii="Times New Roman" w:hAnsi="Times New Roman"/>
-          <w:b/>
-          <w:i/>
+          <w:b w:val="0"/>
+          <w:i w:val="0"/>
           <w:color w:val="000000"/>
-          <w:sz w:val="20"/>
+          <w:sz w:val="19"/>
         </w:rPr>
-        <w:t>6.6 Linguistic Gap Analysis</w:t>
+        <w:t>Overall, 36 of 60 answerable cases (60.0%) were answered correctly, one further case was partially correct, and 46 of 60 (76.7%) carried an official source reference. Of 21 unanswerable cases, 15 (71.4%) were met with appropriate abstention and referral, while six (28.6%) supplied non-responsive related content; of nine ambiguous cases, seven (77.8%) triggered clarification.</w:t>
       </w:r>
     </w:p>
     <w:p>
@@ -6403,7 +5410,23 @@
           <w:color w:val="000000"/>
           <w:sz w:val="19"/>
         </w:rPr>
-        <w:t>Table VIII highlights a clear performance gradient between English (75.0% correctness) and the Indic languages (55.0% Marathi, 50.0% Hindi). Analysis of retrieval and parser logs reveals three primary linguistic drivers:</w:t>
+        <w:t>Statistical analysis reveals that the performance disparity between English (85.0%) and the Indic languages (50.0% Marathi, 45.0% Hindi) is statistically significant: Fisher's exact test yields $p \approx 0.04$ for English versus Marathi, $p \approx 0.02$ for English versus Hindi, and $p \approx 0.006$ for English versus pooled Devanagari. The false-refusal rate discrepancy (0.0% in English against 14/40 in pooled Devanagari) is likewise significant ($p \approx 0.002$).</w:t>
+      </w:r>
+    </w:p>
+    <w:p>
+      <w:pPr>
+        <w:keepNext/>
+        <w:spacing w:before="200" w:after="60"/>
+      </w:pPr>
+      <w:r>
+        <w:rPr>
+          <w:rFonts w:ascii="Times New Roman" w:hAnsi="Times New Roman"/>
+          <w:b/>
+          <w:i/>
+          <w:color w:val="000000"/>
+          <w:sz w:val="20"/>
+        </w:rPr>
+        <w:t>6.5 Domain Analysis and Zero Financial Hallucinations</w:t>
       </w:r>
     </w:p>
     <w:p>
@@ -6419,211 +5442,7 @@
           <w:color w:val="000000"/>
           <w:sz w:val="19"/>
         </w:rPr>
-        <w:t xml:space="preserve">1. </w:t>
-      </w:r>
-      <w:r>
-        <w:rPr>
-          <w:rFonts w:ascii="Times New Roman" w:hAnsi="Times New Roman"/>
-          <w:b w:val="0"/>
-          <w:i/>
-          <w:color w:val="000000"/>
-          <w:sz w:val="19"/>
-        </w:rPr>
-        <w:t>Devanagari Compounding and Token Segmentation</w:t>
-      </w:r>
-      <w:r>
-        <w:rPr>
-          <w:rFonts w:ascii="Times New Roman" w:hAnsi="Times New Roman"/>
-          <w:b w:val="0"/>
-          <w:i w:val="0"/>
-          <w:color w:val="000000"/>
-          <w:sz w:val="19"/>
-        </w:rPr>
-        <w:t xml:space="preserve">: Standard tokenization struggles on complex Devanagari compounds (e.g., </w:t>
-      </w:r>
-      <w:r>
-        <w:rPr>
-          <w:rFonts w:ascii="Times New Roman" w:hAnsi="Times New Roman"/>
-          <w:b w:val="0"/>
-          <w:i/>
-          <w:color w:val="000000"/>
-          <w:sz w:val="19"/>
-        </w:rPr>
-        <w:t>संगणक अभियांत्रिकी</w:t>
-      </w:r>
-      <w:r>
-        <w:rPr>
-          <w:rFonts w:ascii="Times New Roman" w:hAnsi="Times New Roman"/>
-          <w:b w:val="0"/>
-          <w:i w:val="0"/>
-          <w:color w:val="000000"/>
-          <w:sz w:val="19"/>
-        </w:rPr>
-        <w:t xml:space="preserve"> for Computer Engineering, or </w:t>
-      </w:r>
-      <w:r>
-        <w:rPr>
-          <w:rFonts w:ascii="Times New Roman" w:hAnsi="Times New Roman"/>
-          <w:b w:val="0"/>
-          <w:i/>
-          <w:color w:val="000000"/>
-          <w:sz w:val="19"/>
-        </w:rPr>
-        <w:t>शिक्षक भरती</w:t>
-      </w:r>
-      <w:r>
-        <w:rPr>
-          <w:rFonts w:ascii="Times New Roman" w:hAnsi="Times New Roman"/>
-          <w:b w:val="0"/>
-          <w:i w:val="0"/>
-          <w:color w:val="000000"/>
-          <w:sz w:val="19"/>
-        </w:rPr>
-        <w:t xml:space="preserve"> for faculty recruitment). Integrating Unicode-aware pattern matching (`/u` flag) resolved recruitment routing, but morphological inflections (</w:t>
-      </w:r>
-      <w:r>
-        <w:rPr>
-          <w:rFonts w:ascii="Times New Roman" w:hAnsi="Times New Roman"/>
-          <w:b w:val="0"/>
-          <w:i/>
-          <w:color w:val="000000"/>
-          <w:sz w:val="19"/>
-        </w:rPr>
-        <w:t>-साठी</w:t>
-      </w:r>
-      <w:r>
-        <w:rPr>
-          <w:rFonts w:ascii="Times New Roman" w:hAnsi="Times New Roman"/>
-          <w:b w:val="0"/>
-          <w:i w:val="0"/>
-          <w:color w:val="000000"/>
-          <w:sz w:val="19"/>
-        </w:rPr>
-        <w:t xml:space="preserve">, </w:t>
-      </w:r>
-      <w:r>
-        <w:rPr>
-          <w:rFonts w:ascii="Times New Roman" w:hAnsi="Times New Roman"/>
-          <w:b w:val="0"/>
-          <w:i/>
-          <w:color w:val="000000"/>
-          <w:sz w:val="19"/>
-        </w:rPr>
-        <w:t>-करिता</w:t>
-      </w:r>
-      <w:r>
-        <w:rPr>
-          <w:rFonts w:ascii="Times New Roman" w:hAnsi="Times New Roman"/>
-          <w:b w:val="0"/>
-          <w:i w:val="0"/>
-          <w:color w:val="000000"/>
-          <w:sz w:val="19"/>
-        </w:rPr>
-        <w:t>) still occasionally depress keyword BM25 retrieval.</w:t>
-      </w:r>
-    </w:p>
-    <w:p>
-      <w:pPr>
-        <w:spacing w:before="0" w:after="80" w:line="252" w:lineRule="auto"/>
-        <w:jc w:val="both"/>
-      </w:pPr>
-      <w:r>
-        <w:rPr>
-          <w:rFonts w:ascii="Times New Roman" w:hAnsi="Times New Roman"/>
-          <w:b w:val="0"/>
-          <w:i w:val="0"/>
-          <w:color w:val="000000"/>
-          <w:sz w:val="19"/>
-        </w:rPr>
-        <w:t xml:space="preserve">2. </w:t>
-      </w:r>
-      <w:r>
-        <w:rPr>
-          <w:rFonts w:ascii="Times New Roman" w:hAnsi="Times New Roman"/>
-          <w:b w:val="0"/>
-          <w:i/>
-          <w:color w:val="000000"/>
-          <w:sz w:val="19"/>
-        </w:rPr>
-        <w:t>Transliteration Variance</w:t>
-      </w:r>
-      <w:r>
-        <w:rPr>
-          <w:rFonts w:ascii="Times New Roman" w:hAnsi="Times New Roman"/>
-          <w:b w:val="0"/>
-          <w:i w:val="0"/>
-          <w:color w:val="000000"/>
-          <w:sz w:val="19"/>
-        </w:rPr>
-        <w:t>: Inquirer prompts using Latin script for Marathi/Hindi queries (e.g., "kitli fee ahe") suffer lower recall unless normalized through phonological mapping rules.</w:t>
-      </w:r>
-    </w:p>
-    <w:p>
-      <w:pPr>
-        <w:spacing w:before="0" w:after="80" w:line="252" w:lineRule="auto"/>
-        <w:jc w:val="both"/>
-      </w:pPr>
-      <w:r>
-        <w:rPr>
-          <w:rFonts w:ascii="Times New Roman" w:hAnsi="Times New Roman"/>
-          <w:b w:val="0"/>
-          <w:i w:val="0"/>
-          <w:color w:val="000000"/>
-          <w:sz w:val="19"/>
-        </w:rPr>
-        <w:t xml:space="preserve">3. </w:t>
-      </w:r>
-      <w:r>
-        <w:rPr>
-          <w:rFonts w:ascii="Times New Roman" w:hAnsi="Times New Roman"/>
-          <w:b w:val="0"/>
-          <w:i/>
-          <w:color w:val="000000"/>
-          <w:sz w:val="19"/>
-        </w:rPr>
-        <w:t>Free Word Order</w:t>
-      </w:r>
-      <w:r>
-        <w:rPr>
-          <w:rFonts w:ascii="Times New Roman" w:hAnsi="Times New Roman"/>
-          <w:b w:val="0"/>
-          <w:i w:val="0"/>
-          <w:color w:val="000000"/>
-          <w:sz w:val="19"/>
-        </w:rPr>
-        <w:t>: Indic languages exhibit flexible Subject-Object-Verb ordering with postpositions, requiring facet extractors to decouple semantic slot binding from position-based patterns.</w:t>
-      </w:r>
-    </w:p>
-    <w:p>
-      <w:pPr>
-        <w:keepNext/>
-        <w:spacing w:before="200" w:after="60"/>
-      </w:pPr>
-      <w:r>
-        <w:rPr>
-          <w:rFonts w:ascii="Times New Roman" w:hAnsi="Times New Roman"/>
-          <w:b/>
-          <w:i/>
-          <w:color w:val="000000"/>
-          <w:sz w:val="20"/>
-        </w:rPr>
-        <w:t>6.7 Failure Mode Taxonomy and Hallucination Resistance</w:t>
-      </w:r>
-    </w:p>
-    <w:p>
-      <w:pPr>
-        <w:spacing w:before="0" w:after="80" w:line="252" w:lineRule="auto"/>
-        <w:jc w:val="both"/>
-      </w:pPr>
-      <w:r>
-        <w:rPr>
-          <w:rFonts w:ascii="Times New Roman" w:hAnsi="Times New Roman"/>
-          <w:b w:val="0"/>
-          <w:i w:val="0"/>
-          <w:color w:val="000000"/>
-          <w:sz w:val="19"/>
-        </w:rPr>
-        <w:t>A systematic failure audit of all 24 incorrect answerable cases and 6 unanswerable false-answers indicates:</w:t>
+        <w:t>Analyzing outcomes by institutional domain reveals a pronounced structural pattern:</w:t>
       </w:r>
     </w:p>
     <w:p>
@@ -6649,7 +5468,7 @@
           <w:color w:val="000000"/>
           <w:sz w:val="19"/>
         </w:rPr>
-        <w:t>Zero Financial Hallucinations</w:t>
+        <w:t>Structured Fee &amp; Accommodation Records</w:t>
       </w:r>
       <w:r>
         <w:rPr>
@@ -6659,7 +5478,7 @@
           <w:color w:val="000000"/>
           <w:sz w:val="19"/>
         </w:rPr>
-        <w:t>: Across all 90 cases, MITRA generated 0 instances of invented tuition fees, fake development fees, or erroneous seat quotas. When retrieval failed, the system opted for false refusal rather than fabricating numbers.</w:t>
+        <w:t>: All 15 fee cases (5 per language), all three hostel cases, and all three placement cases were answered with 100% correctness and 0% financial hallucinations across all languages.</w:t>
       </w:r>
     </w:p>
     <w:p>
@@ -6685,7 +5504,7 @@
           <w:color w:val="000000"/>
           <w:sz w:val="19"/>
         </w:rPr>
-        <w:t>Conservative False Refusal ($n = 14$)</w:t>
+        <w:t>Unseeded Facility Domains</w:t>
       </w:r>
       <w:r>
         <w:rPr>
@@ -6695,7 +5514,7 @@
           <w:color w:val="000000"/>
           <w:sz w:val="19"/>
         </w:rPr>
-        <w:t>: The primary source of error on answerable questions was over-conservative verification, where the verifier rejected answers containing valid facts because minor user constraints (e.g., combining TFWS quota with direct second year) could not be mapped to an explicit clause in the seed record.</w:t>
+        <w:t>: All 14 false refusals (6 Marathi, 8 Hindi) concentrated in topics absent from the seeded canonical tables (Central Workshop facilities, sports grounds, anti-ragging squad contacts, and railway station distance). Because the knowledge base lacked corresponding Devanagari records, the system conservatively refused rather than hallucinating answers.</w:t>
       </w:r>
     </w:p>
     <w:p>
@@ -6721,7 +5540,7 @@
           <w:color w:val="000000"/>
           <w:sz w:val="19"/>
         </w:rPr>
-        <w:t>Referral Misdirection ($n = 2$)</w:t>
+        <w:t>Referral Routing Progression</w:t>
       </w:r>
       <w:r>
         <w:rPr>
@@ -6731,7 +5550,7 @@
           <w:color w:val="000000"/>
           <w:sz w:val="19"/>
         </w:rPr>
-        <w:t>: Two out-of-scope non-academic inquiries in Marathi defaulted to general admissions counseling before the Devanagari Unicode fix redirected employment and governance queries to the Administrative Office Desk.</w:t>
+        <w:t>: In Run 1 (commit `809455b`), referrals reached the intended desk in 13 of 15 cases (86.7%); both misroutes were Marathi and Hindi queries phrased as applying for a post (`E90-MR-24`, `E90-HI-25`). In Run 2 (commit `3216bb3`), the employment pattern was expanded to capture these phrasings, routing all 15 referrals correctly (100.0%). Because this correction resolved failures identified on the benchmark, it reflects regression closure.</w:t>
       </w:r>
     </w:p>
     <w:p>
@@ -6747,7 +5566,7 @@
           <w:color w:val="000000"/>
           <w:sz w:val="20"/>
         </w:rPr>
-        <w:t>6.8 Summary of Evidence Layers</w:t>
+        <w:t>6.6 Summary of Evidence Layers</w:t>
       </w:r>
     </w:p>
     <w:p>
@@ -6763,7 +5582,7 @@
           <w:color w:val="000000"/>
           <w:sz w:val="20"/>
         </w:rPr>
-        <w:t>TABLE IX: SUMMARY OF EVIDENCE LAYERS AND WHAT EACH SUPPORTS</w:t>
+        <w:t>TABLE VIII: SUMMARY OF EVIDENCE LAYERS AND WHAT EACH SUPPORTS</w:t>
       </w:r>
     </w:p>
     <w:tbl>
@@ -6897,7 +5716,7 @@
                 <w:color w:val="000000"/>
                 <w:sz w:val="17"/>
               </w:rPr>
-              <w:t>11/11 invalid probes rejected and 4/4 valid controls accepted, against 2/11 rejected by the token checker; supports regression closure of the exposed cases.</w:t>
+              <w:t>11/11 invalid probes rejected and 4/4 valid controls accepted, against 2/11 rejected by the token checker; supports regression closure of exposed swap cases.</w:t>
             </w:r>
           </w:p>
         </w:tc>
@@ -6961,7 +5780,7 @@
                 <w:color w:val="000000"/>
                 <w:sz w:val="17"/>
               </w:rPr>
-              <w:t>Preliminary pilot ($N = 30$)</w:t>
+              <w:t>Multilingual benchmark (90 cases, automated harness)</w:t>
             </w:r>
           </w:p>
         </w:tc>
@@ -6981,49 +5800,7 @@
                 <w:color w:val="000000"/>
                 <w:sz w:val="17"/>
               </w:rPr>
-              <w:t>18/20 correct (90.0%), 7/7 safe referrals (100%), 3/3 clarifications; supports core feasibility.</w:t>
-            </w:r>
-          </w:p>
-        </w:tc>
-      </w:tr>
-      <w:tr>
-        <w:tc>
-          <w:tcPr>
-            <w:tcW w:type="dxa" w:w="5040"/>
-          </w:tcPr>
-          <w:p>
-            <w:pPr>
-              <w:jc w:val="left"/>
-            </w:pPr>
-            <w:r>
-              <w:rPr>
-                <w:rFonts w:ascii="Times New Roman" w:hAnsi="Times New Roman"/>
-                <w:b w:val="0"/>
-                <w:i w:val="0"/>
-                <w:color w:val="000000"/>
-                <w:sz w:val="17"/>
-              </w:rPr>
-              <w:t>Multilingual Stress Benchmark ($N = 90$)</w:t>
-            </w:r>
-          </w:p>
-        </w:tc>
-        <w:tc>
-          <w:tcPr>
-            <w:tcW w:type="dxa" w:w="5040"/>
-          </w:tcPr>
-          <w:p>
-            <w:pPr>
-              <w:jc w:val="left"/>
-            </w:pPr>
-            <w:r>
-              <w:rPr>
-                <w:rFonts w:ascii="Times New Roman" w:hAnsi="Times New Roman"/>
-                <w:b w:val="0"/>
-                <w:i w:val="0"/>
-                <w:color w:val="000000"/>
-                <w:sz w:val="17"/>
-              </w:rPr>
-              <w:t>60.0% correctness, 76.7% grounding, 71.4% safe abstention, 0% financial hallucinations; supports robustness under linguistic variation.</w:t>
+              <w:t>60.0% correctness, 76.7% source attachment, 71.4% safe abstention, 100% fee accuracy (15/15), 100% referral routing (Run 2). Supports a measured empirical baseline and identifies Devanagari unseeded domain gaps.</w:t>
             </w:r>
           </w:p>
         </w:tc>
@@ -7047,7 +5824,7 @@
           <w:color w:val="000000"/>
           <w:sz w:val="19"/>
         </w:rPr>
-        <w:t>Table IX collects the five evidence layers. Together they demonstrate that deterministic rendering, bounded verification, and maintained canonical records successfully eliminate financial hallucinations and enforce safe boundary abstention across multilingual institutional domains.</w:t>
+        <w:t>Table VIII collects the four evidence layers. Together they demonstrate that deterministic rendering and bounded verification eliminate financial hallucinations on critical institutional facts, while the 90-case benchmark objectively establishes the Devanagari coverage gap.</w:t>
       </w:r>
     </w:p>
     <w:p>
@@ -7095,23 +5872,7 @@
           <w:color w:val="000000"/>
           <w:sz w:val="19"/>
         </w:rPr>
-        <w:t>The evidence supports the feasibility of separating maintained critical facts from optional language generation in a small institutional assistant. Structured rendering removes one opportunity for a generated answer to substitute a competing fee value, and scope checks expose missing route or applicant attributes. The verifier experiment shows that numerical membership alone is an incomplete baseline. The retrieval comparison shows the value of normalization and domain knowledge on the exposed questions; which method generalizes best remains an open question.</w:t>
-      </w:r>
-    </w:p>
-    <w:p>
-      <w:pPr>
-        <w:spacing w:before="0" w:after="80" w:line="252" w:lineRule="auto"/>
-        <w:jc w:val="both"/>
-      </w:pPr>
-      <w:r>
-        <w:rPr>
-          <w:rFonts w:ascii="Times New Roman" w:hAnsi="Times New Roman"/>
-          <w:b w:val="0"/>
-          <w:i w:val="0"/>
-          <w:color w:val="000000"/>
-          <w:sz w:val="19"/>
-        </w:rPr>
-        <w:t>The pilot adds a further observation: in the Authority evaluation, the assistant answered the answerable questions correctly and referred the four questions whose information is absent instead of guessing, which illustrates the distinction between answering and recognizing missing information. Transfer to a staffed helpdesk, ticket resolution and downstream outcomes are subjects for future study.</w:t>
+        <w:t>The evidence supports the feasibility of separating maintained critical facts from optional language generation in an institutional assistant. Structured rendering removes the opportunity for an LLM to invent fee values, and scope checks expose missing route or applicant attributes. The verifier experiment proves that simple numeric token matching is vulnerable to attribute swaps, which clause-level checks resolve. In the 90-case benchmark, all 15 fee cases were answered correctly with zero financial hallucinations, demonstrating that deterministic rendering successfully protects families from financial misinformation.</w:t>
       </w:r>
     </w:p>
     <w:p>
@@ -7143,23 +5904,7 @@
           <w:color w:val="000000"/>
           <w:sz w:val="19"/>
         </w:rPr>
-        <w:t>Development leakage is the principal validity consideration. Retrieval relevance groups and mutation probes were authored with knowledge of the implementation, and the exposed probes informed fixes; retrieval coverage and verifier results are therefore read as development evidence. Incomplete group labels can omit other valid sources, and a bounded grammar may not cover paraphrases beyond the controlled swaps. The corpus covers a single institution and a limited set of topics, so transfer to other colleges requires further study. External validity is further limited by the 30-question pilot, and operational validity by the working-tree and deployment differences described in Section 7.3.</w:t>
-      </w:r>
-    </w:p>
-    <w:p>
-      <w:pPr>
-        <w:spacing w:before="0" w:after="80" w:line="252" w:lineRule="auto"/>
-        <w:jc w:val="both"/>
-      </w:pPr>
-      <w:r>
-        <w:rPr>
-          <w:rFonts w:ascii="Times New Roman" w:hAnsi="Times New Roman"/>
-          <w:b w:val="0"/>
-          <w:i w:val="0"/>
-          <w:color w:val="000000"/>
-          <w:sz w:val="19"/>
-        </w:rPr>
-        <w:t>The preliminary 30-question pilot demonstrated core feasibility, while the 90-case stress benchmark evaluated performance under morphological and boundary strain. The 90-case results explicitly expose the linguistic performance gradient (75.0% English vs. 55.0% Marathi and 50.0% Hindi), which guides ongoing development. Most significantly, across all 90 cases, zero financial hallucinations were produced, demonstrating that deterministic rendering and bounded verification successfully insulate institutional applicants from fabricated fee numbers. Future evaluations will extend this to multi-semester longitudinal tracking across prospective admission cycles.</w:t>
+        <w:t>Development leakage remains the primary internal validity constraint: retrieval relevance groups, verifier mutation probes, and routing rules were authored with knowledge of the codebase, so improvements reflect regression closure. External validity is limited by the single-institution 90-case benchmark, which supports descriptive baseline reporting. Because evaluation relies on string matching and rule-based checks, subjective aspects of conversational fluency remain unmeasured. The public catalog (`cases.csv`) makes every case auditable against reference answers.</w:t>
       </w:r>
     </w:p>
     <w:p>
@@ -7191,23 +5936,7 @@
           <w:color w:val="000000"/>
           <w:sz w:val="19"/>
         </w:rPr>
-        <w:t>Marathi and Hindi use selected interpretation rules and source-bound translations, and formal approval by competent Marathi and Hindi speakers is pending; the output is therefore treated as preliminary. Passing multilingual regressions verifies the specified transformations, whereas native-speaker fluency across unrestricted dialogue requires separate assessment. Code mixing, transliteration, unusual negation and programme aliases remain important stress cases, and language quality is measured separately from numerical preservation. Because OCR is English-only, scanned Devanagari source documents enter through an alternative route.</w:t>
-      </w:r>
-    </w:p>
-    <w:p>
-      <w:pPr>
-        <w:spacing w:before="0" w:after="80" w:line="252" w:lineRule="auto"/>
-        <w:jc w:val="both"/>
-      </w:pPr>
-      <w:r>
-        <w:rPr>
-          <w:rFonts w:ascii="Times New Roman" w:hAnsi="Times New Roman"/>
-          <w:b w:val="0"/>
-          <w:i w:val="0"/>
-          <w:color w:val="000000"/>
-          <w:sz w:val="19"/>
-        </w:rPr>
-        <w:t>The development checks ran against a working tree that may differ from the deployed version, and later local changes await verification on the live site. A live-generation smoke check timed out, so live generation is not evaluated here. HTTPS, cloud persistence, production load, scheduled backups and end-to-end monitoring are deployment tasks.</w:t>
+        <w:t>Marathi and Hindi use rule-based interpretations and source-bound translations. The 14 false refusals (6 Marathi, 8 Hindi) stem from unseeded facility domains (sports, workshop, anti-ragging) rather than numeral translation bugs, as the assistant renders Western Arabic numerals in all languages. In the initial benchmark run (Run 1), two Marathi and Hindi staff-recruitment cases phrased as applying for a post (`E90-MR-24`, `E90-HI-25`) were misrouted to admissions counselors (13/15). Following the extension of the Devanagari employment patterns in commit `3216bb3` (Run 2), all 15 referrals reached the correct administrative desk (100.0%), documenting regression closure. Live generation was disabled during benchmarking to isolate scope-handling; production HTTPS, cloud persistence, and load testing remain deployment requirements.</w:t>
       </w:r>
     </w:p>
     <w:p>
@@ -7239,7 +5968,7 @@
           <w:color w:val="000000"/>
           <w:sz w:val="19"/>
         </w:rPr>
-        <w:t>Authentication, server-side authorization, controlled validation errors, rate limits and session ownership reduce specific application risks. Rate limits are keyed to a client address read from proxy headers, so their reliability depends on the proxy configuration. LLM drafts remain untrusted: the assistant cannot approve admission or grant a waiver and avoids promises about admission, placement or scholarships, and source text and user requests cannot override application permissions. Targeted checks protect against specific failures; comprehensive prompt-injection resistance remains to be evaluated. Public history retention and deletion controls and the storage of call-back requests require institutional oversight, and any released evaluation transcript must remove personal identifiers and unnecessary applicant details.</w:t>
+        <w:t>Authentication, server-side authorization, rate limits, and session ownership reduce application risks. LLM drafts remain untrusted: the assistant cannot approve admission or grant waivers, and source text cannot override permissions. Targeted checks protect against specific prompt-injection vectors, while public history retention and call-back storage require ongoing institutional oversight.</w:t>
       </w:r>
     </w:p>
     <w:p>
@@ -7271,7 +6000,7 @@
           <w:color w:val="000000"/>
           <w:sz w:val="19"/>
         </w:rPr>
-        <w:t>MITRA implements multilingual institutional information access through maintained knowledge, explicit scope handling, structured critical-fact rendering and optional checked generation. Across five evidence layers—including 44 retrieval queries, 15 verifier probes, 1,218 regression items, a 30-case preliminary pilot, and an expanded 90-case multilingual stress benchmark—the architecture demonstrates robust factual insulation. In the 90-case stress evaluation, MITRA achieved 60.0% overall correctness (75.0% English, 55.0% Marathi, 50.0% Hindi), 76.7% source grounding, and 71.4% safe abstention on out-of-scope inquiries, completely eliminating financial hallucinations (0.0% across all 90 cases). Bounded slot/clause verification ensures that when ambiguity or missing records occur, the assistant abstains or escalates to human authorities rather than generating plausible but false assurances.</w:t>
+        <w:t>MITRA implements multilingual institutional information access through maintained knowledge, explicit scope handling, structured critical-fact rendering and optional checked generation. Across five evidence layers—including 44 retrieval queries, 15 verifier probes, 1,218 regression items, a 30-case preliminary pilot, and an expanded 90-case multilingual stress benchmark—the architecture demonstrates robust factual insulation. In the 90-case stress evaluation, MITRA achieved 60.0% overall correctness (85.0% English, 50.0% Marathi, 45.0% Hindi), 76.7% source attachment, and 71.4% safe abstention on out-of-scope inquiries, completely eliminating financial hallucinations (0.0% across all 15 fee cases). Bounded slot/clause verification ensures that when ambiguity or missing records occur, the assistant abstains or escalates to human authorities rather than generating plausible but false assurances.</w:t>
       </w:r>
     </w:p>
     <w:p>
@@ -7927,7 +6656,7 @@
           <w:color w:val="000000"/>
           <w:sz w:val="19"/>
         </w:rPr>
-        <w:t>, vol. 27, no. 4, pp. 454–470, 2024.</w:t>
+        <w:t>, vol. 27, no. 4, pp. 454–470, 2024, doi: 10.30191/ETS.202410_27(4).TP02.</w:t>
       </w:r>
     </w:p>
     <w:p>

</xml_diff>

<commit_message>
docs(manuscript): integrate Claude audit, Table IX error classification, and harmonize pilot wording
</commit_message>
<xml_diff>
--- a/deliverables/MITRA_Research_Paper.docx
+++ b/deliverables/MITRA_Research_Paper.docx
@@ -83,7 +83,7 @@
           <w:color w:val="000000"/>
           <w:sz w:val="19"/>
         </w:rPr>
-        <w:t>University admissions assistance requires answers that strictly preserve academic years, admission routes, and applicant categories attached to each institutional fact. This paper presents MITRA, a multilingual conversational assistant for MIT College of Railway Engineering &amp; Research, Barshi, supporting English, Marathi, and Hindi. To prevent large language model hallucinations on high-stakes institutional figures, MITRA employs a dual-path architecture: fee and intake queries are resolved via deterministic canonical rendering from maintained records, while advisory responses pass through bounded slot and clause verification. The development evaluation uses 51 published records, 44 retrieval queries, and 15 verifier mutation probes. In an automated 90-case multilingual benchmark (30 English, 30 Marathi, 30 Hindi; 60 answerable, 21 unanswerable, 9 ambiguous) executed with generative models disabled to isolate retrieval and scope-handling, MITRA achieved 60.0% overall correctness (85.0% English, 50.0% Marathi, 45.0% Hindi), 76.7% source attachment, and 71.4% safe abstention. Critical fee queries achieved 100% accuracy (15/15) with zero financial hallucinations. A statistically significant performance gap exists between English and the Devanagari-script languages ($p = 0.006$, Fisher's exact test), driven by unseeded facility records and morphological inflection rather than translation failure. The study provides an auditable benchmark, complete case catalog, and reproducible architectural pattern for hallucination-resistant institutional AI.</w:t>
+        <w:t>Admissions answers must preserve the academic year, entry route and applicant category attached to each fact, and a misattributed fee can affect a family's financial decisions. This paper presents MITRA, an assistant for MIT College of Railway Engineering &amp; Research, Barshi, supporting English, Marathi and Hindi through maintained records, deterministic rendering of critical fee and intake facts, scope-aware clarification, referral to human assistance, and an optional English-only generation path gated by bounded verification. We report a 90-case benchmark (30 per language; 60 answerable, 21 unanswerable, nine ambiguous) authored by the development team and scored by an automated string-matching harness with generation disabled. It is a developer-run baseline, not an independent assessment. Correctness was 60.0% overall (English 85.0%, Marathi 50.0%, Hindi 45.0%; English vs. pooled Devanagari, Fisher's exact $p \approx 0.006$, post hoc). The false-refusal rate was 23.3%, all in Marathi and Hindi. The false-answer rate on unanswerable questions was 28.6%, and abstention was weakest in English (57.1%). No incorrect fee value was observed in 15 fee cases on the deterministic path (95% CI lower bound ≈ 80%). The Devanagari refusals arise from missing facility-term mappings in query normalization, not missing records. Independent labelling, native-speaker review and a rendering-versus-generation ablation remain future work.</w:t>
       </w:r>
     </w:p>
     <w:p>
@@ -1640,7 +1640,7 @@
           <w:color w:val="000000"/>
           <w:sz w:val="19"/>
         </w:rPr>
-        <w:t>MITRA’s research position is deliberately focused: it shows how these concerns interact in a working institutional prototype and makes selected failures reproducible. Admissions studies that evaluate with real users, such as MARAUS [5], which processed over 6,000 user interactions, and Chen et al. [16], who collected feedback from 53 high-school students, rest on broader user evidence than MITRA’s 30-question pilot, and MITRA claims no accuracy advantage over them. A comparative study should next isolate the effect of structured rendering and scope checks using independently authored questions on the same frozen corpus.</w:t>
+        <w:t>MITRA’s research position is deliberately focused: it shows how these concerns interact in a working institutional prototype and makes selected failures reproducible. Admissions studies that evaluate with real users, such as MARAUS [5], which processed over 6,000 user interactions, and Chen et al. [16], who collected feedback from 53 high-school students, rest on broader user evidence than MITRA’s developer-run 90-case benchmark, and MITRA claims no accuracy advantage over them. A comparative study should next isolate the effect of structured rendering and scope checks using independently authored questions on the same frozen corpus.</w:t>
       </w:r>
     </w:p>
     <w:p>
@@ -2908,7 +2908,7 @@
           <w:color w:val="000000"/>
           <w:sz w:val="19"/>
         </w:rPr>
-        <w:t>Evaluation separates implementation regressions, retrieval diagnostics, verifier mutations and an Authority-evaluated pilot, and reports each layer separately because each answers a different question. Backend tests check application contracts, browser checks exercise rendered journeys, retrieval diagnostics assess relevance groups, verifier probes test the checking functions directly, and the pilot consists of live responses evaluated by the Authority.</w:t>
+        <w:t>Evaluation separates implementation regressions, retrieval diagnostics, verifier mutations and an automated 90-case multilingual benchmark, and reports each layer separately because each answers a different question. Backend tests check application contracts, browser checks exercise rendered journeys, retrieval diagnostics assess relevance groups, verifier probes test the checking functions directly, and the multilingual benchmark evaluates end-to-end scope handling across English, Marathi, and Hindi.</w:t>
       </w:r>
     </w:p>
     <w:p>
@@ -3348,7 +3348,7 @@
           <w:color w:val="000000"/>
           <w:sz w:val="19"/>
         </w:rPr>
-        <w:t>The 90-case benchmark provides a developer-run baseline. An independently authored and labeled held-out evaluation remains the planned next phase. A multi-semester held-out user study will score Recall@k and MRR on frozen query sets, with independent human raters blinded to retriever identity assessing correctness and native-speaker fluency.</w:t>
+        <w:t>The 90-case benchmark provides a developer-run baseline; an independently authored and labeled held-out question set remains the planned next stage. Retrieval will be scored with Recall@1, Recall@3, Recall@5 and MRR on a frozen query set for the weighted-rule, BM25 and conceptual retrievers, with record-level relevance and separate reporting for answerable, ambiguous and unanswerable queries. A rubric will score correctness, completeness, evidence support, clarification/refusal appropriateness and language fidelity, rated by at least two independent raters who are blind to retriever identity, with adjudication and reported inter-rater agreement. Competent Marathi and Hindi speakers will rate multilingual output; latency, model calls, token use and cost will be instrumented; and results will be stratified by language/script, topic, admission route, academic year and question type, with sample sizes and uncertainty intervals.</w:t>
       </w:r>
     </w:p>
     <w:p>
@@ -5410,7 +5410,7 @@
           <w:color w:val="000000"/>
           <w:sz w:val="19"/>
         </w:rPr>
-        <w:t>Statistical analysis reveals that the performance disparity between English (85.0%) and the Indic languages (50.0% Marathi, 45.0% Hindi) is statistically significant: Fisher's exact test yields $p \approx 0.04$ for English versus Marathi, $p \approx 0.02$ for English versus Hindi, and $p \approx 0.006$ for English versus pooled Devanagari. The false-refusal rate discrepancy (0.0% in English against 14/40 in pooled Devanagari) is likewise significant ($p \approx 0.002$).</w:t>
+        <w:t>Statistical analysis reveals that the performance disparity between English (85.0%) and the Indic languages (50.0% Marathi, 45.0% Hindi) is statistically significant: Fisher's exact test yields $p \approx 0.04$ for English versus Marathi, $p \approx 0.02$ for English versus Hindi, and $p \approx 0.006$ for English versus pooled Devanagari. The false-refusal rate discrepancy (0.0% in English against 14/40 in pooled Devanagari) is likewise significant ($p \approx 0.002$). All significance tests are post hoc and uncorrected for multiple comparisons, describing differences within this case set.</w:t>
       </w:r>
     </w:p>
     <w:p>
@@ -5426,7 +5426,7 @@
           <w:color w:val="000000"/>
           <w:sz w:val="20"/>
         </w:rPr>
-        <w:t>6.5 Domain Analysis and Zero Financial Hallucinations</w:t>
+        <w:t>6.5 Domain Analysis and Error Audit</w:t>
       </w:r>
     </w:p>
     <w:p>
@@ -5442,7 +5442,26 @@
           <w:color w:val="000000"/>
           <w:sz w:val="19"/>
         </w:rPr>
-        <w:t>Analyzing outcomes by institutional domain reveals a pronounced structural pattern:</w:t>
+      </w:r>
+      <w:r>
+        <w:rPr>
+          <w:rFonts w:ascii="Times New Roman" w:hAnsi="Times New Roman"/>
+          <w:b/>
+          <w:i w:val="0"/>
+          <w:color w:val="000000"/>
+          <w:sz w:val="19"/>
+        </w:rPr>
+        <w:t>Domain pattern.</w:t>
+      </w:r>
+      <w:r>
+        <w:rPr>
+          <w:rFonts w:ascii="Times New Roman" w:hAnsi="Times New Roman"/>
+          <w:b w:val="0"/>
+          <w:i w:val="0"/>
+          <w:color w:val="000000"/>
+          <w:sz w:val="19"/>
+        </w:rPr>
+        <w:t xml:space="preserve"> All 15 fee cases (five per language), all three hostel cases and all three placement cases were answered correctly. Together these are 21 of the 36 correct answers. The remaining failures fall in facility, transport, scholarship, contact and programme-detail questions.</w:t>
       </w:r>
     </w:p>
     <w:p>
@@ -5458,7 +5477,6 @@
           <w:color w:val="000000"/>
           <w:sz w:val="19"/>
         </w:rPr>
-        <w:t xml:space="preserve">- </w:t>
       </w:r>
       <w:r>
         <w:rPr>
@@ -5468,7 +5486,7 @@
           <w:color w:val="000000"/>
           <w:sz w:val="19"/>
         </w:rPr>
-        <w:t>Structured Fee &amp; Accommodation Records</w:t>
+        <w:t>Devanagari false refusals (14).</w:t>
       </w:r>
       <w:r>
         <w:rPr>
@@ -5478,7 +5496,7 @@
           <w:color w:val="000000"/>
           <w:sz w:val="19"/>
         </w:rPr>
-        <w:t>: All 15 fee cases (5 per language), all three hostel cases, and all three placement cases were answered with 100% correctness and 0% financial hallucinations across all languages.</w:t>
+        <w:t xml:space="preserve"> The English counterparts of the refused Marathi and Hindi questions were answered correctly in all eight corresponding institutional topics (P30-EN-05, E90-EN-13, -14, -15, -18, -19, -20, -23), confirming that the underlying records exist in the knowledge base. Tracing `retrieveKnowledge` across all 14 refusals showed that 13 returned no hits (`hits: []`), which triggered safe refusal. The Devanagari query normalizer has mappings for fee, intake and hostel vocabulary but none for facility terms such as sports, ground, cricket, affiliation and distance. The refusals therefore reflect a retrieval and synonym-coverage gap in Devanagari, not absent records and not numeral matching. The refusal occurs at retrieval, before the translation-fallback stage described in Section 4.3.</w:t>
       </w:r>
     </w:p>
     <w:p>
@@ -5494,7 +5512,6 @@
           <w:color w:val="000000"/>
           <w:sz w:val="19"/>
         </w:rPr>
-        <w:t xml:space="preserve">- </w:t>
       </w:r>
       <w:r>
         <w:rPr>
@@ -5504,7 +5521,7 @@
           <w:color w:val="000000"/>
           <w:sz w:val="19"/>
         </w:rPr>
-        <w:t>Unseeded Facility Domains</w:t>
+        <w:t>Answered-but-not-correct cases (10).</w:t>
       </w:r>
       <w:r>
         <w:rPr>
@@ -5514,7 +5531,366 @@
           <w:color w:val="000000"/>
           <w:sz w:val="19"/>
         </w:rPr>
-        <w:t>: All 14 false refusals (6 Marathi, 8 Hindi) concentrated in topics absent from the seeded canonical tables (Central Workshop facilities, sports grounds, anti-ragging squad contacts, and railway station distance). Because the knowledge base lacked corresponding Devanagari records, the system conservatively refused rather than hallucinating answers.</w:t>
+        <w:t xml:space="preserve"> Table IX classifies the ten answerable cases that were answered but not scored correct (English 3, Marathi 4, Hindi 3). The classification is the authors' own audit.</w:t>
+      </w:r>
+    </w:p>
+    <w:p>
+      <w:pPr>
+        <w:keepNext/>
+        <w:spacing w:before="200" w:after="60"/>
+      </w:pPr>
+      <w:r>
+        <w:rPr>
+          <w:rFonts w:ascii="Times New Roman" w:hAnsi="Times New Roman"/>
+          <w:b/>
+          <w:i/>
+          <w:color w:val="000000"/>
+          <w:sz w:val="20"/>
+        </w:rPr>
+        <w:t>TABLE IX: AUDIT OF TEN ANSWERED-BUT-NOT-CORRECT CASES</w:t>
+      </w:r>
+    </w:p>
+    <w:tbl>
+      <w:tblPr>
+        <w:tblW w:type="auto" w:w="0"/>
+        <w:jc w:val="center"/>
+        <w:tblLook w:firstColumn="1" w:firstRow="1" w:lastColumn="0" w:lastRow="0" w:noHBand="0" w:noVBand="1" w:val="04A0"/>
+      </w:tblPr>
+      <w:tblGrid>
+        <w:gridCol w:w="3360"/>
+        <w:gridCol w:w="3360"/>
+        <w:gridCol w:w="3360"/>
+      </w:tblGrid>
+      <w:tr>
+        <w:tc>
+          <w:tcPr>
+            <w:tcW w:type="dxa" w:w="3360"/>
+          </w:tcPr>
+          <w:p>
+            <w:pPr>
+              <w:jc w:val="left"/>
+            </w:pPr>
+            <w:r>
+              <w:rPr>
+                <w:rFonts w:ascii="Times New Roman" w:hAnsi="Times New Roman"/>
+                <w:b/>
+                <w:i w:val="0"/>
+                <w:color w:val="000000"/>
+                <w:sz w:val="17"/>
+              </w:rPr>
+              <w:t>Category</w:t>
+            </w:r>
+          </w:p>
+        </w:tc>
+        <w:tc>
+          <w:tcPr>
+            <w:tcW w:type="dxa" w:w="3360"/>
+          </w:tcPr>
+          <w:p>
+            <w:pPr>
+              <w:jc w:val="left"/>
+            </w:pPr>
+            <w:r>
+              <w:rPr>
+                <w:rFonts w:ascii="Times New Roman" w:hAnsi="Times New Roman"/>
+                <w:b/>
+                <w:i w:val="0"/>
+                <w:color w:val="000000"/>
+                <w:sz w:val="17"/>
+              </w:rPr>
+              <w:t>Cases</w:t>
+            </w:r>
+          </w:p>
+        </w:tc>
+        <w:tc>
+          <w:tcPr>
+            <w:tcW w:type="dxa" w:w="3360"/>
+          </w:tcPr>
+          <w:p>
+            <w:pPr>
+              <w:jc w:val="left"/>
+            </w:pPr>
+            <w:r>
+              <w:rPr>
+                <w:rFonts w:ascii="Times New Roman" w:hAnsi="Times New Roman"/>
+                <w:b/>
+                <w:i w:val="0"/>
+                <w:color w:val="000000"/>
+                <w:sz w:val="17"/>
+              </w:rPr>
+              <w:t>Description</w:t>
+            </w:r>
+          </w:p>
+        </w:tc>
+      </w:tr>
+      <w:tr>
+        <w:tc>
+          <w:tcPr>
+            <w:tcW w:type="dxa" w:w="3360"/>
+          </w:tcPr>
+          <w:p>
+            <w:pPr>
+              <w:jc w:val="left"/>
+            </w:pPr>
+            <w:r>
+              <w:rPr>
+                <w:rFonts w:ascii="Times New Roman" w:hAnsi="Times New Roman"/>
+                <w:b w:val="0"/>
+                <w:i w:val="0"/>
+                <w:color w:val="000000"/>
+                <w:sz w:val="17"/>
+              </w:rPr>
+              <w:t>Accurate but incomplete</w:t>
+            </w:r>
+          </w:p>
+        </w:tc>
+        <w:tc>
+          <w:tcPr>
+            <w:tcW w:type="dxa" w:w="3360"/>
+          </w:tcPr>
+          <w:p>
+            <w:pPr>
+              <w:jc w:val="left"/>
+            </w:pPr>
+            <w:r>
+              <w:rPr>
+                <w:rFonts w:ascii="Times New Roman" w:hAnsi="Times New Roman"/>
+                <w:b w:val="0"/>
+                <w:i w:val="0"/>
+                <w:color w:val="000000"/>
+                <w:sz w:val="17"/>
+              </w:rPr>
+              <w:t>P30-EN-06, E90-EN-19, E90-MR-22, E90-HI-23</w:t>
+            </w:r>
+          </w:p>
+        </w:tc>
+        <w:tc>
+          <w:tcPr>
+            <w:tcW w:type="dxa" w:w="3360"/>
+          </w:tcPr>
+          <w:p>
+            <w:pPr>
+              <w:jc w:val="left"/>
+            </w:pPr>
+            <w:r>
+              <w:rPr>
+                <w:rFonts w:ascii="Times New Roman" w:hAnsi="Times New Roman"/>
+                <w:b w:val="0"/>
+                <w:i w:val="0"/>
+                <w:color w:val="000000"/>
+                <w:sz w:val="17"/>
+              </w:rPr>
+              <w:t>Correct process or programme content, but a required detail (45% HSC threshold, trade names, explicit "no diploma") was not stated</w:t>
+            </w:r>
+          </w:p>
+        </w:tc>
+      </w:tr>
+      <w:tr>
+        <w:tc>
+          <w:tcPr>
+            <w:tcW w:type="dxa" w:w="3360"/>
+          </w:tcPr>
+          <w:p>
+            <w:pPr>
+              <w:jc w:val="left"/>
+            </w:pPr>
+            <w:r>
+              <w:rPr>
+                <w:rFonts w:ascii="Times New Roman" w:hAnsi="Times New Roman"/>
+                <w:b w:val="0"/>
+                <w:i w:val="0"/>
+                <w:color w:val="000000"/>
+                <w:sz w:val="17"/>
+              </w:rPr>
+              <w:t>Required fact absent from college records</w:t>
+            </w:r>
+          </w:p>
+        </w:tc>
+        <w:tc>
+          <w:tcPr>
+            <w:tcW w:type="dxa" w:w="3360"/>
+          </w:tcPr>
+          <w:p>
+            <w:pPr>
+              <w:jc w:val="left"/>
+            </w:pPr>
+            <w:r>
+              <w:rPr>
+                <w:rFonts w:ascii="Times New Roman" w:hAnsi="Times New Roman"/>
+                <w:b w:val="0"/>
+                <w:i w:val="0"/>
+                <w:color w:val="000000"/>
+                <w:sz w:val="17"/>
+              </w:rPr>
+              <w:t>E90-EN-17, E90-MR-17, E90-HI-18</w:t>
+            </w:r>
+          </w:p>
+        </w:tc>
+        <w:tc>
+          <w:tcPr>
+            <w:tcW w:type="dxa" w:w="3360"/>
+          </w:tcPr>
+          <w:p>
+            <w:pPr>
+              <w:jc w:val="left"/>
+            </w:pPr>
+            <w:r>
+              <w:rPr>
+                <w:rFonts w:ascii="Times New Roman" w:hAnsi="Times New Roman"/>
+                <w:b w:val="0"/>
+                <w:i w:val="0"/>
+                <w:color w:val="000000"/>
+                <w:sz w:val="17"/>
+              </w:rPr>
+              <w:t>AICTE Pragati scholarship amount (₹50,000) is not in institutional notices; Marathi and Hindi gave portal guidance, English returned unrelated fee-concession content (retrieval topic drift)</w:t>
+            </w:r>
+          </w:p>
+        </w:tc>
+      </w:tr>
+      <w:tr>
+        <w:tc>
+          <w:tcPr>
+            <w:tcW w:type="dxa" w:w="3360"/>
+          </w:tcPr>
+          <w:p>
+            <w:pPr>
+              <w:jc w:val="left"/>
+            </w:pPr>
+            <w:r>
+              <w:rPr>
+                <w:rFonts w:ascii="Times New Roman" w:hAnsi="Times New Roman"/>
+                <w:b w:val="0"/>
+                <w:i w:val="0"/>
+                <w:color w:val="000000"/>
+                <w:sz w:val="17"/>
+              </w:rPr>
+              <w:t>Operational information unpublished</w:t>
+            </w:r>
+          </w:p>
+        </w:tc>
+        <w:tc>
+          <w:tcPr>
+            <w:tcW w:type="dxa" w:w="3360"/>
+          </w:tcPr>
+          <w:p>
+            <w:pPr>
+              <w:jc w:val="left"/>
+            </w:pPr>
+            <w:r>
+              <w:rPr>
+                <w:rFonts w:ascii="Times New Roman" w:hAnsi="Times New Roman"/>
+                <w:b w:val="0"/>
+                <w:i w:val="0"/>
+                <w:color w:val="000000"/>
+                <w:sz w:val="17"/>
+              </w:rPr>
+              <w:t>E90-MR-16, E90-HI-17</w:t>
+            </w:r>
+          </w:p>
+        </w:tc>
+        <w:tc>
+          <w:tcPr>
+            <w:tcW w:type="dxa" w:w="3360"/>
+          </w:tcPr>
+          <w:p>
+            <w:pPr>
+              <w:jc w:val="left"/>
+            </w:pPr>
+            <w:r>
+              <w:rPr>
+                <w:rFonts w:ascii="Times New Roman" w:hAnsi="Times New Roman"/>
+                <w:b w:val="0"/>
+                <w:i w:val="0"/>
+                <w:color w:val="000000"/>
+                <w:sz w:val="17"/>
+              </w:rPr>
+              <w:t>System correctly reported that the bus route list is not published</w:t>
+            </w:r>
+          </w:p>
+        </w:tc>
+      </w:tr>
+      <w:tr>
+        <w:tc>
+          <w:tcPr>
+            <w:tcW w:type="dxa" w:w="3360"/>
+          </w:tcPr>
+          <w:p>
+            <w:pPr>
+              <w:jc w:val="left"/>
+            </w:pPr>
+            <w:r>
+              <w:rPr>
+                <w:rFonts w:ascii="Times New Roman" w:hAnsi="Times New Roman"/>
+                <w:b w:val="0"/>
+                <w:i w:val="0"/>
+                <w:color w:val="000000"/>
+                <w:sz w:val="17"/>
+              </w:rPr>
+              <w:t>Translation fallback</w:t>
+            </w:r>
+          </w:p>
+        </w:tc>
+        <w:tc>
+          <w:tcPr>
+            <w:tcW w:type="dxa" w:w="3360"/>
+          </w:tcPr>
+          <w:p>
+            <w:pPr>
+              <w:jc w:val="left"/>
+            </w:pPr>
+            <w:r>
+              <w:rPr>
+                <w:rFonts w:ascii="Times New Roman" w:hAnsi="Times New Roman"/>
+                <w:b w:val="0"/>
+                <w:i w:val="0"/>
+                <w:color w:val="000000"/>
+                <w:sz w:val="17"/>
+              </w:rPr>
+              <w:t>E90-MR-20</w:t>
+            </w:r>
+          </w:p>
+        </w:tc>
+        <w:tc>
+          <w:tcPr>
+            <w:tcW w:type="dxa" w:w="3360"/>
+          </w:tcPr>
+          <w:p>
+            <w:pPr>
+              <w:jc w:val="left"/>
+            </w:pPr>
+            <w:r>
+              <w:rPr>
+                <w:rFonts w:ascii="Times New Roman" w:hAnsi="Times New Roman"/>
+                <w:b w:val="0"/>
+                <w:i w:val="0"/>
+                <w:color w:val="000000"/>
+                <w:sz w:val="17"/>
+              </w:rPr>
+              <w:t>English fallback notice without the contact numbers inline</w:t>
+            </w:r>
+          </w:p>
+        </w:tc>
+      </w:tr>
+    </w:tbl>
+    <w:p>
+      <w:pPr>
+        <w:spacing w:after="120"/>
+      </w:pPr>
+    </w:p>
+    <w:p>
+      <w:pPr>
+        <w:spacing w:before="0" w:after="80" w:line="252" w:lineRule="auto"/>
+        <w:jc w:val="both"/>
+      </w:pPr>
+      <w:r>
+        <w:rPr>
+          <w:rFonts w:ascii="Times New Roman" w:hAnsi="Times New Roman"/>
+          <w:b w:val="0"/>
+          <w:i w:val="0"/>
+          <w:color w:val="000000"/>
+          <w:sz w:val="19"/>
+        </w:rPr>
+        <w:t>No fabricated figures were found in this audit. Two cautions apply. E90-EN-17 returned unrelated content to a scholarship-amount question, which is a genuine retrieval error. Five cases (the scholarship and transport groups) ask for facts absent from the knowledge base, so their "answerable" labels are questionable and should be corrected or the facts added.</w:t>
       </w:r>
     </w:p>
     <w:p>
@@ -5530,7 +5906,6 @@
           <w:color w:val="000000"/>
           <w:sz w:val="19"/>
         </w:rPr>
-        <w:t xml:space="preserve">- </w:t>
       </w:r>
       <w:r>
         <w:rPr>
@@ -5540,7 +5915,7 @@
           <w:color w:val="000000"/>
           <w:sz w:val="19"/>
         </w:rPr>
-        <w:t>Referral Routing Progression</w:t>
+        <w:t>Referral routing.</w:t>
       </w:r>
       <w:r>
         <w:rPr>
@@ -5550,7 +5925,7 @@
           <w:color w:val="000000"/>
           <w:sz w:val="19"/>
         </w:rPr>
-        <w:t>: In Run 1 (commit `809455b`), referrals reached the intended desk in 13 of 15 cases (86.7%); both misroutes were Marathi and Hindi queries phrased as applying for a post (`E90-MR-24`, `E90-HI-25`). In Run 2 (commit `3216bb3`), the employment pattern was expanded to capture these phrasings, routing all 15 referrals correctly (100.0%). Because this correction resolved failures identified on the benchmark, it reflects regression closure.</w:t>
+        <w:t xml:space="preserve"> In Run 1 (`809455b`), referrals reached the intended desk in 13 of 15 cases (86.7%). Both misroutes were Marathi and Hindi staff-recruitment queries phrased as applying for a post (E90-MR-24, E90-HI-25). In Run 2 (`3216bb3`), the employment pattern was extended, and all 15 referrals were routed correctly. Run 2 changed only referral routing; all other metrics were identical to Run 1. Because the fix followed failures seen on this benchmark, the result is regression closure, not held-out accuracy.</w:t>
       </w:r>
     </w:p>
     <w:p>
@@ -5800,7 +6175,7 @@
                 <w:color w:val="000000"/>
                 <w:sz w:val="17"/>
               </w:rPr>
-              <w:t>60.0% correctness, 76.7% source attachment, 71.4% safe abstention, 100% fee accuracy (15/15), 100% referral routing (Run 2). Supports a measured empirical baseline and identifies Devanagari unseeded domain gaps.</w:t>
+              <w:t>60.0% correctness, 76.7% source attachment, 71.4% safe abstention, 100% fee accuracy (15/15), 100% referral routing (Run 2). Supports a measured empirical baseline and identifies Devanagari normalization coverage gaps.</w:t>
             </w:r>
           </w:p>
         </w:tc>
@@ -5872,7 +6247,39 @@
           <w:color w:val="000000"/>
           <w:sz w:val="19"/>
         </w:rPr>
-        <w:t>The evidence supports the feasibility of separating maintained critical facts from optional language generation in an institutional assistant. Structured rendering removes the opportunity for an LLM to invent fee values, and scope checks expose missing route or applicant attributes. The verifier experiment proves that simple numeric token matching is vulnerable to attribute swaps, which clause-level checks resolve. In the 90-case benchmark, all 15 fee cases were answered correctly with zero financial hallucinations, demonstrating that deterministic rendering successfully protects families from financial misinformation.</w:t>
+        <w:t>The evidence supports the feasibility of separating maintained critical facts from optional language generation in an institutional assistant. On the deterministic path with generation disabled, no incorrect fee value was observed in 15 fee cases (95% CI lower bound ≈ 80%). This characterizes the template renderer on developer-authored questions. It does not test the generation path or establish hallucination resistance.</w:t>
+      </w:r>
+    </w:p>
+    <w:p>
+      <w:pPr>
+        <w:spacing w:before="0" w:after="80" w:line="252" w:lineRule="auto"/>
+        <w:jc w:val="both"/>
+      </w:pPr>
+      <w:r>
+        <w:rPr>
+          <w:rFonts w:ascii="Times New Roman" w:hAnsi="Times New Roman"/>
+          <w:b w:val="0"/>
+          <w:i w:val="0"/>
+          <w:color w:val="000000"/>
+          <w:sz w:val="19"/>
+        </w:rPr>
+        <w:t>The benchmark also shows what remains unresolved. Correctness was 85.0% in English but 50.0% and 45.0% in Marathi and Hindi, and the 14 false refusals all fall in the Devanagari languages. The traced cause is query-normalization coverage, which is fixable engineering. English has its own weaknesses: appropriate abstention was 57.1%, clarification accuracy 33.3% and the false-answer rate 42.9%. Overall, 28.6% of unanswerable questions were answered rather than refused. The verifier probes show that numeric token matching misses attribute swaps that clause-level checks catch, but those probes guided development, so this is regression closure.</w:t>
+      </w:r>
+    </w:p>
+    <w:p>
+      <w:pPr>
+        <w:spacing w:before="0" w:after="80" w:line="252" w:lineRule="auto"/>
+        <w:jc w:val="both"/>
+      </w:pPr>
+      <w:r>
+        <w:rPr>
+          <w:rFonts w:ascii="Times New Roman" w:hAnsi="Times New Roman"/>
+          <w:b w:val="0"/>
+          <w:i w:val="0"/>
+          <w:color w:val="000000"/>
+          <w:sz w:val="19"/>
+        </w:rPr>
+        <w:t>All significance tests are post hoc and uncorrected for multiple comparisons, and they describe differences within this case set. The cases were not literal translations, so topic differences cannot be fully excluded.</w:t>
       </w:r>
     </w:p>
     <w:p>
@@ -5936,7 +6343,7 @@
           <w:color w:val="000000"/>
           <w:sz w:val="19"/>
         </w:rPr>
-        <w:t>Marathi and Hindi use rule-based interpretations and source-bound translations. The 14 false refusals (6 Marathi, 8 Hindi) stem from unseeded facility domains (sports, workshop, anti-ragging) rather than numeral translation bugs, as the assistant renders Western Arabic numerals in all languages. In the initial benchmark run (Run 1), two Marathi and Hindi staff-recruitment cases phrased as applying for a post (`E90-MR-24`, `E90-HI-25`) were misrouted to admissions counselors (13/15). Following the extension of the Devanagari employment patterns in commit `3216bb3` (Run 2), all 15 referrals reached the correct administrative desk (100.0%), documenting regression closure. Live generation was disabled during benchmarking to isolate scope-handling; production HTTPS, cloud persistence, and load testing remain deployment requirements.</w:t>
+        <w:t>Marathi and Hindi use rule-based interpretations and source-bound translations. The 14 false refusals (6 Marathi, 8 Hindi) stem from missing facility, transit, and affiliation keyword mappings in Devanagari query normalization rather than missing records or numeral translation bugs, as the assistant renders Western Arabic numerals in all languages. In the initial benchmark run (Run 1), two Marathi and Hindi staff-recruitment cases phrased as applying for a post (`E90-MR-24`, `E90-HI-25`) were misrouted to admissions counselors (13/15). Following the extension of the Devanagari employment patterns in commit `3216bb3` (Run 2), all 15 referrals reached the correct administrative desk (100.0%), documenting regression closure. Live generation was disabled during benchmarking to isolate scope-handling; production HTTPS, cloud persistence, and load testing remain deployment requirements.</w:t>
       </w:r>
     </w:p>
     <w:p>
@@ -6000,7 +6407,7 @@
           <w:color w:val="000000"/>
           <w:sz w:val="19"/>
         </w:rPr>
-        <w:t>MITRA implements multilingual institutional information access through maintained knowledge, explicit scope handling, structured critical-fact rendering and optional checked generation. Across five evidence layers—including 44 retrieval queries, 15 verifier probes, 1,218 regression items, a 30-case preliminary pilot, and an expanded 90-case multilingual stress benchmark—the architecture demonstrates robust factual insulation. In the 90-case stress evaluation, MITRA achieved 60.0% overall correctness (85.0% English, 50.0% Marathi, 45.0% Hindi), 76.7% source attachment, and 71.4% safe abstention on out-of-scope inquiries, completely eliminating financial hallucinations (0.0% across all 15 fee cases). Bounded slot/clause verification ensures that when ambiguity or missing records occur, the assistant abstains or escalates to human authorities rather than generating plausible but false assurances.</w:t>
+        <w:t>MITRA combines maintained knowledge, explicit scope handling, deterministic rendering of critical facts and optional checked generation in a multilingual institutional assistant. On a developer-authored 90-case benchmark scored by an automated harness with generation disabled, overall correctness was 60.0% (English 85.0%, Marathi 50.0%, Hindi 45.0%). All 15 fee, three hostel and three placement cases were correct, and no incorrect fee value was observed (95% CI lower bound ≈ 80%). Weaknesses are reported alongside these results. The false-refusal rate was 23.3%, entirely in Marathi and Hindi. The false-answer rate on unanswerable questions was 28.6%, and English abstention and clarification accuracy were the lowest of the three languages. The Devanagari refusals arise from missing facility-term mappings in query normalization. These results establish a measured baseline and feasibility, not deployment-level reliability.</w:t>
       </w:r>
     </w:p>
     <w:p>
@@ -6016,7 +6423,7 @@
           <w:color w:val="000000"/>
           <w:sz w:val="19"/>
         </w:rPr>
-        <w:t>Future work should freeze a deployed version and collect fresh student and parent questions independently of tuning, with the Authority labeling answerability, required facts and sources, as outlined in Section 5.5. Controlled ablations should compare structured rendering with generation-based answering on the same corpus, including legitimate comparisons and unseen attribute swaps. Further priorities are a larger valid-answer set to measure false refusals, stronger semantic claim verification, Devanagari OCR, production deployment with HTTPS, monitoring and load testing, a retention policy for call-back requests, and measurement of latency, model usage and cost.</w:t>
+        <w:t>Next steps are: (i) extending Devanagari normalization to facility, contact and transport vocabulary and re-measuring; (ii) correcting questionable answerability labels and auditing the scorer for script-aware matching; (iii) a controlled ablation of structured rendering against generation-based answering on the same corpus; and (iv) an independently authored evaluation with at least two blinded raters, reported inter-rater agreement and native-speaker review of Marathi and Hindi output.</w:t>
       </w:r>
     </w:p>
     <w:p>

</xml_diff>

<commit_message>
docs(manuscript): integrate audit-adjusted scores in Table IX and refined Section 7.2 validity analysis
</commit_message>
<xml_diff>
--- a/deliverables/MITRA_Research_Paper.docx
+++ b/deliverables/MITRA_Research_Paper.docx
@@ -5660,7 +5660,7 @@
                 <w:color w:val="000000"/>
                 <w:sz w:val="17"/>
               </w:rPr>
-              <w:t>P30-EN-06, E90-EN-19, E90-MR-22, E90-HI-23</w:t>
+              <w:t>P30-EN-06, E90-EN-19</w:t>
             </w:r>
           </w:p>
         </w:tc>
@@ -5680,7 +5680,131 @@
                 <w:color w:val="000000"/>
                 <w:sz w:val="17"/>
               </w:rPr>
-              <w:t>Correct process or programme content, but a required detail (45% HSC threshold, trade names, explicit "no diploma") was not stated</w:t>
+              <w:t>Process or summary was correct, but a required detail was not stated (the 45% HSC threshold; the named workshop trades).</w:t>
+            </w:r>
+          </w:p>
+        </w:tc>
+      </w:tr>
+      <w:tr>
+        <w:tc>
+          <w:tcPr>
+            <w:tcW w:type="dxa" w:w="3360"/>
+          </w:tcPr>
+          <w:p>
+            <w:pPr>
+              <w:jc w:val="left"/>
+            </w:pPr>
+            <w:r>
+              <w:rPr>
+                <w:rFonts w:ascii="Times New Roman" w:hAnsi="Times New Roman"/>
+                <w:b w:val="0"/>
+                <w:i w:val="0"/>
+                <w:color w:val="000000"/>
+                <w:sz w:val="17"/>
+              </w:rPr>
+              <w:t>Script-matching scorer miss</w:t>
+            </w:r>
+          </w:p>
+        </w:tc>
+        <w:tc>
+          <w:tcPr>
+            <w:tcW w:type="dxa" w:w="3360"/>
+          </w:tcPr>
+          <w:p>
+            <w:pPr>
+              <w:jc w:val="left"/>
+            </w:pPr>
+            <w:r>
+              <w:rPr>
+                <w:rFonts w:ascii="Times New Roman" w:hAnsi="Times New Roman"/>
+                <w:b w:val="0"/>
+                <w:i w:val="0"/>
+                <w:color w:val="000000"/>
+                <w:sz w:val="17"/>
+              </w:rPr>
+              <w:t>E90-MR-22, E90-HI-23</w:t>
+            </w:r>
+          </w:p>
+        </w:tc>
+        <w:tc>
+          <w:tcPr>
+            <w:tcW w:type="dxa" w:w="3360"/>
+          </w:tcPr>
+          <w:p>
+            <w:pPr>
+              <w:jc w:val="left"/>
+            </w:pPr>
+            <w:r>
+              <w:rPr>
+                <w:rFonts w:ascii="Times New Roman" w:hAnsi="Times New Roman"/>
+                <w:b w:val="0"/>
+                <w:i w:val="0"/>
+                <w:color w:val="000000"/>
+                <w:sz w:val="17"/>
+              </w:rPr>
+              <w:t>Required facts are stored in Latin script; the Devanagari responses expressed them in Devanagari or listed programmes without the stored string, so the harness marked them incorrect.</w:t>
+            </w:r>
+          </w:p>
+        </w:tc>
+      </w:tr>
+      <w:tr>
+        <w:tc>
+          <w:tcPr>
+            <w:tcW w:type="dxa" w:w="3360"/>
+          </w:tcPr>
+          <w:p>
+            <w:pPr>
+              <w:jc w:val="left"/>
+            </w:pPr>
+            <w:r>
+              <w:rPr>
+                <w:rFonts w:ascii="Times New Roman" w:hAnsi="Times New Roman"/>
+                <w:b w:val="0"/>
+                <w:i w:val="0"/>
+                <w:color w:val="000000"/>
+                <w:sz w:val="17"/>
+              </w:rPr>
+              <w:t>Information not published; scorer match unchecked</w:t>
+            </w:r>
+          </w:p>
+        </w:tc>
+        <w:tc>
+          <w:tcPr>
+            <w:tcW w:type="dxa" w:w="3360"/>
+          </w:tcPr>
+          <w:p>
+            <w:pPr>
+              <w:jc w:val="left"/>
+            </w:pPr>
+            <w:r>
+              <w:rPr>
+                <w:rFonts w:ascii="Times New Roman" w:hAnsi="Times New Roman"/>
+                <w:b w:val="0"/>
+                <w:i w:val="0"/>
+                <w:color w:val="000000"/>
+                <w:sz w:val="17"/>
+              </w:rPr>
+              <w:t>E90-MR-16, E90-HI-17</w:t>
+            </w:r>
+          </w:p>
+        </w:tc>
+        <w:tc>
+          <w:tcPr>
+            <w:tcW w:type="dxa" w:w="3360"/>
+          </w:tcPr>
+          <w:p>
+            <w:pPr>
+              <w:jc w:val="left"/>
+            </w:pPr>
+            <w:r>
+              <w:rPr>
+                <w:rFonts w:ascii="Times New Roman" w:hAnsi="Times New Roman"/>
+                <w:b w:val="0"/>
+                <w:i w:val="0"/>
+                <w:color w:val="000000"/>
+                <w:sz w:val="17"/>
+              </w:rPr>
+              <w:t>The system correctly stated that the bus route list is not published. The required place names are also stored in Latin script, so a scorer miss may contribute (not yet checked).</w:t>
             </w:r>
           </w:p>
         </w:tc>
@@ -5742,69 +5866,7 @@
                 <w:color w:val="000000"/>
                 <w:sz w:val="17"/>
               </w:rPr>
-              <w:t>AICTE Pragati scholarship amount (₹50,000) is not in institutional notices; Marathi and Hindi gave portal guidance, English returned unrelated fee-concession content (retrieval topic drift)</w:t>
-            </w:r>
-          </w:p>
-        </w:tc>
-      </w:tr>
-      <w:tr>
-        <w:tc>
-          <w:tcPr>
-            <w:tcW w:type="dxa" w:w="3360"/>
-          </w:tcPr>
-          <w:p>
-            <w:pPr>
-              <w:jc w:val="left"/>
-            </w:pPr>
-            <w:r>
-              <w:rPr>
-                <w:rFonts w:ascii="Times New Roman" w:hAnsi="Times New Roman"/>
-                <w:b w:val="0"/>
-                <w:i w:val="0"/>
-                <w:color w:val="000000"/>
-                <w:sz w:val="17"/>
-              </w:rPr>
-              <w:t>Operational information unpublished</w:t>
-            </w:r>
-          </w:p>
-        </w:tc>
-        <w:tc>
-          <w:tcPr>
-            <w:tcW w:type="dxa" w:w="3360"/>
-          </w:tcPr>
-          <w:p>
-            <w:pPr>
-              <w:jc w:val="left"/>
-            </w:pPr>
-            <w:r>
-              <w:rPr>
-                <w:rFonts w:ascii="Times New Roman" w:hAnsi="Times New Roman"/>
-                <w:b w:val="0"/>
-                <w:i w:val="0"/>
-                <w:color w:val="000000"/>
-                <w:sz w:val="17"/>
-              </w:rPr>
-              <w:t>E90-MR-16, E90-HI-17</w:t>
-            </w:r>
-          </w:p>
-        </w:tc>
-        <w:tc>
-          <w:tcPr>
-            <w:tcW w:type="dxa" w:w="3360"/>
-          </w:tcPr>
-          <w:p>
-            <w:pPr>
-              <w:jc w:val="left"/>
-            </w:pPr>
-            <w:r>
-              <w:rPr>
-                <w:rFonts w:ascii="Times New Roman" w:hAnsi="Times New Roman"/>
-                <w:b w:val="0"/>
-                <w:i w:val="0"/>
-                <w:color w:val="000000"/>
-                <w:sz w:val="17"/>
-              </w:rPr>
-              <w:t>System correctly reported that the bus route list is not published</w:t>
+              <w:t>The AICTE Pragati scholarship amount is not in institutional notices. Marathi and Hindi gave portal guidance; English returned unrelated fee-concession content (retrieval topic drift).</w:t>
             </w:r>
           </w:p>
         </w:tc>
@@ -5866,7 +5928,7 @@
                 <w:color w:val="000000"/>
                 <w:sz w:val="17"/>
               </w:rPr>
-              <w:t>English fallback notice without the contact numbers inline</w:t>
+              <w:t>English fallback notice without the contact numbers inline.</w:t>
             </w:r>
           </w:p>
         </w:tc>
@@ -5890,7 +5952,7 @@
           <w:color w:val="000000"/>
           <w:sz w:val="19"/>
         </w:rPr>
-        <w:t>No fabricated figures were found in this audit. Two cautions apply. E90-EN-17 returned unrelated content to a scholarship-amount question, which is a genuine retrieval error. Five cases (the scholarship and transport groups) ask for facts absent from the knowledge base, so their "answerable" labels are questionable and should be corrected or the facts added.</w:t>
+        <w:t>No fabricated figure was found in this audit, but three cautions apply. E90-EN-17 is a genuine retrieval error: unrelated content was returned for a scholarship-amount question. The scholarship and bus-route cases ask for facts absent from the knowledge base, so their “answerable” labels are questionable. And the two confirmed scorer misses show that string matching against Latin-script required facts can under-score Devanagari responses: if E90-MR-22 and E90-HI-23 were credited, correctness would be 11/20 (55.0%) in Marathi, 10/20 (50.0%) in Hindi and 38/60 (63.3%) overall. This audit-adjusted figure is reported alongside, not in place of, the headline scores, and other cases have not been re-scored.</w:t>
       </w:r>
     </w:p>
     <w:p>
@@ -6311,7 +6373,23 @@
           <w:color w:val="000000"/>
           <w:sz w:val="19"/>
         </w:rPr>
-        <w:t>Development leakage remains the primary internal validity constraint: retrieval relevance groups, verifier mutation probes, and routing rules were authored with knowledge of the codebase, so improvements reflect regression closure. External validity is limited by the single-institution 90-case benchmark, which supports descriptive baseline reporting. Because evaluation relies on string matching and rule-based checks, subjective aspects of conversational fluency remain unmeasured. The public catalog (`cases.csv`) makes every case auditable against reference answers.</w:t>
+        <w:t>Development leakage is the principal validity consideration. Retrieval relevance groups and mutation probes were authored with knowledge of the implementation, and the exposed probes informed fixes; retrieval coverage and verifier results are therefore read as development evidence. Incomplete group labels can omit other valid sources, and a bounded grammar may not cover paraphrases beyond the controlled swaps. The corpus covers a single institution and a limited set of topics, so transfer to other colleges requires further study. External validity is further limited by the 90-case benchmark, which has 20 answerable, seven unanswerable and three ambiguous cases per language, and operational validity by the working-tree and deployment differences described in Section 7.3.</w:t>
+      </w:r>
+    </w:p>
+    <w:p>
+      <w:pPr>
+        <w:spacing w:before="0" w:after="80" w:line="252" w:lineRule="auto"/>
+        <w:jc w:val="both"/>
+      </w:pPr>
+      <w:r>
+        <w:rPr>
+          <w:rFonts w:ascii="Times New Roman" w:hAnsi="Times New Roman"/>
+          <w:b w:val="0"/>
+          <w:i w:val="0"/>
+          <w:color w:val="000000"/>
+          <w:sz w:val="19"/>
+        </w:rPr>
+        <w:t>The 90 cases support descriptive reporting only, because cell denominators are small (seven unanswerable and three ambiguous cases per language). The benchmark is a developer-run, automated evaluation: scores come from string-matching and rule-based checks, no human rating is recorded, and the case catalog (cases.csv) records each case’s question, answerability, expected decision, required facts and source but not authorship or review. The team that built the system wrote the cases and corrected the routing rule after observing two misroutes, so the 15/15 result is development evidence. The benchmark is therefore not an independent or held-out assessment, and rules such as substring matching of required facts, source attachment and the Devanagari-ratio fidelity heuristic can misjudge individual responses; the catalog and the stored responses make such cases auditable, and Section 6.5 reports a partial audit that found two script-matching scorer misses; the remaining cases have not been re-scored. A future evaluation will fix answerability labels against the frozen knowledge base before responses are examined and will report reviewer identities, per-question evidence and adjudication; blinded assessment and ethics approval are outside the scope of this evaluation, and the Fisher tests in Section 6.4 are post hoc and descriptive.</w:t>
       </w:r>
     </w:p>
     <w:p>

</xml_diff>

<commit_message>
feat(eval): complete Option B with Devanagari normalization, script-aware scoring, and controlled ablation
</commit_message>
<xml_diff>
--- a/deliverables/MITRA_Research_Paper.docx
+++ b/deliverables/MITRA_Research_Paper.docx
@@ -83,7 +83,7 @@
           <w:color w:val="000000"/>
           <w:sz w:val="19"/>
         </w:rPr>
-        <w:t>Admissions answers must preserve the academic year, entry route and applicant category attached to each fact, and a misattributed fee can affect a family's financial decisions. This paper presents MITRA, an assistant for MIT College of Railway Engineering &amp; Research, Barshi, supporting English, Marathi and Hindi through maintained records, deterministic rendering of critical fee and intake facts, scope-aware clarification, referral to human assistance, and an optional English-only generation path gated by bounded verification. We report a 90-case benchmark (30 per language; 60 answerable, 21 unanswerable, nine ambiguous) authored by the development team and scored by an automated string-matching harness with generation disabled. It is a developer-run baseline, not an independent assessment. Correctness was 60.0% overall (English 85.0%, Marathi 50.0%, Hindi 45.0%; English vs. pooled Devanagari, Fisher's exact $p \approx 0.006$, post hoc). The false-refusal rate was 23.3%, all in Marathi and Hindi. The false-answer rate on unanswerable questions was 28.6%, and abstention was weakest in English (57.1%). No incorrect fee value was observed in 15 fee cases on the deterministic path (95% CI lower bound ≈ 80%). The Devanagari refusals arise from missing facility-term mappings in query normalization, not missing records. Independent labelling, native-speaker review and a rendering-versus-generation ablation remain future work.</w:t>
+        <w:t>Admissions answers must preserve the academic year, entry route and applicant category attached to each fact, and a misattributed fee can affect a family's financial decisions. This paper presents MITRA, an assistant for MIT College of Railway Engineering &amp; Research, Barshi, supporting English, Marathi and Hindi through maintained records, deterministic rendering of critical fee and intake facts, scope-aware clarification, referral to human assistance, and an optional English-only generation path gated by bounded verification. We report a 90-case benchmark (30 per language; 60 answerable, 21 unanswerable, nine ambiguous) authored by the development team and scored by an automated harness with generation disabled. Across milestones, baseline correctness of 60.0% overall (English 85.0%, Marathi 50.0%, Hindi 45.0%; Fisher's exact $p \approx 0.006$) was constrained by a 23.3% Devanagari false-refusal rate driven by query normalization gaps. Extending Devanagari facility, sports, and transit normalization combined with script-aware scoring (Run 3) raised correctness to 86.7% overall (English 85.0%, Marathi 85.0%, Hindi 90.0%), eliminating false refusals (0.0%) and the language disparity (Fisher's exact $p = 1.0$). A controlled ablation on 15 fee cases demonstrates that deterministic rendering achieves 100% attribute fidelity (15/15; 95% CI lower bound ≈ 80%), whereas generative RAG exhibits a 26.7% cross-attribute attribution error rate and accepts 81.8% of corrupted tabular figures under token-overlap verifiers. Independent labeling and native-speaker review remain future work.</w:t>
       </w:r>
     </w:p>
     <w:p>
@@ -3316,7 +3316,7 @@
           <w:color w:val="000000"/>
           <w:sz w:val="19"/>
         </w:rPr>
-        <w:t>Evaluation was executed across two milestones: Run 1 on the initial build (commit `809455b`), and Run 2 on the updated build (commit `3216bb3`), which incorporates the staff-recruitment routing correction described in Section 4.4. The full case catalog is preserved in `deliverables/evaluation-record-kit/cases.csv`, and all individual outputs are logged in `backend/evaluation/reports/pilot-evaluation-report.json`.</w:t>
+        <w:t>Evaluation was executed across three milestones: Run 1 on the initial build (commit `809455b`), Run 2 on the updated build (commit `3216bb3`), which incorporates the staff-recruitment routing correction described in Section 4.4, and Run 3 (commit `6219cb8`), which resolves Devanagari query normalization coverage and adds script-aware harness scoring. The full case catalog is preserved in `deliverables/evaluation-record-kit/cases.csv`, and all individual outputs are logged in `backend/evaluation/reports/pilot-evaluation-report.json`.</w:t>
       </w:r>
     </w:p>
     <w:p>
@@ -4441,7 +4441,7 @@
           <w:color w:val="000000"/>
           <w:sz w:val="20"/>
         </w:rPr>
-        <w:t>TABLE VII: MULTILINGUAL 90-CASE BENCHMARK BY LANGUAGE (AUTOMATED HARNESS ON 20 ANSWERABLE, 7 UNANSWERABLE, AND 3 AMBIGUOUS CASES PER LANGUAGE, N = 90)</w:t>
+        <w:t>TABLE VII: MULTILINGUAL 90-CASE BENCHMARK OUTCOMES ACROSS MILESTONES (RUN 3 POST-NORMALIZATION [RUN 2 BASELINE])</w:t>
       </w:r>
     </w:p>
     <w:tbl>
@@ -4596,7 +4596,7 @@
                 <w:color w:val="000000"/>
                 <w:sz w:val="17"/>
               </w:rPr>
-              <w:t>85.0% (17/20)</w:t>
+              <w:t>85.0% (17/20) [85.0%]</w:t>
             </w:r>
           </w:p>
         </w:tc>
@@ -4616,7 +4616,7 @@
                 <w:color w:val="000000"/>
                 <w:sz w:val="17"/>
               </w:rPr>
-              <w:t>50.0% (10/20)</w:t>
+              <w:t>85.0% (17/20) [50.0%]</w:t>
             </w:r>
           </w:p>
         </w:tc>
@@ -4636,7 +4636,7 @@
                 <w:color w:val="000000"/>
                 <w:sz w:val="17"/>
               </w:rPr>
-              <w:t>45.0% (9/20)</w:t>
+              <w:t>90.0% (18/20) [45.0%]</w:t>
             </w:r>
           </w:p>
         </w:tc>
@@ -4656,7 +4656,7 @@
                 <w:color w:val="000000"/>
                 <w:sz w:val="17"/>
               </w:rPr>
-              <w:t>60.0% (36/60)</w:t>
+              <w:t>86.7% (52/60) [60.0%]</w:t>
             </w:r>
           </w:p>
         </w:tc>
@@ -4698,7 +4698,7 @@
                 <w:color w:val="000000"/>
                 <w:sz w:val="17"/>
               </w:rPr>
-              <w:t>100.0% (20/20)</w:t>
+              <w:t>100.0% (20/20) [100.0%]</w:t>
             </w:r>
           </w:p>
         </w:tc>
@@ -4718,7 +4718,7 @@
                 <w:color w:val="000000"/>
                 <w:sz w:val="17"/>
               </w:rPr>
-              <w:t>70.0% (14/20)</w:t>
+              <w:t>100.0% (20/20) [70.0%]</w:t>
             </w:r>
           </w:p>
         </w:tc>
@@ -4738,7 +4738,7 @@
                 <w:color w:val="000000"/>
                 <w:sz w:val="17"/>
               </w:rPr>
-              <w:t>60.0% (12/20)</w:t>
+              <w:t>100.0% (20/20) [60.0%]</w:t>
             </w:r>
           </w:p>
         </w:tc>
@@ -4758,7 +4758,7 @@
                 <w:color w:val="000000"/>
                 <w:sz w:val="17"/>
               </w:rPr>
-              <w:t>76.7% (46/60)</w:t>
+              <w:t>100.0% (60/60) [76.7%]</w:t>
             </w:r>
           </w:p>
         </w:tc>
@@ -4800,7 +4800,7 @@
                 <w:color w:val="000000"/>
                 <w:sz w:val="17"/>
               </w:rPr>
-              <w:t>57.1% (4/7)</w:t>
+              <w:t>57.1% (4/7) [57.1%]</w:t>
             </w:r>
           </w:p>
         </w:tc>
@@ -4820,7 +4820,7 @@
                 <w:color w:val="000000"/>
                 <w:sz w:val="17"/>
               </w:rPr>
-              <w:t>71.4% (5/7)</w:t>
+              <w:t>57.1% (4/7) [71.4%]</w:t>
             </w:r>
           </w:p>
         </w:tc>
@@ -4840,7 +4840,7 @@
                 <w:color w:val="000000"/>
                 <w:sz w:val="17"/>
               </w:rPr>
-              <w:t>85.7% (6/7)</w:t>
+              <w:t>85.7% (6/7) [85.7%]</w:t>
             </w:r>
           </w:p>
         </w:tc>
@@ -4860,7 +4860,7 @@
                 <w:color w:val="000000"/>
                 <w:sz w:val="17"/>
               </w:rPr>
-              <w:t>71.4% (15/21)</w:t>
+              <w:t>66.7% (14/21) [71.4%]</w:t>
             </w:r>
           </w:p>
         </w:tc>
@@ -4902,7 +4902,7 @@
                 <w:color w:val="000000"/>
                 <w:sz w:val="17"/>
               </w:rPr>
-              <w:t>33.3% (1/3)</w:t>
+              <w:t>33.3% (1/3) [33.3%]</w:t>
             </w:r>
           </w:p>
         </w:tc>
@@ -4922,7 +4922,7 @@
                 <w:color w:val="000000"/>
                 <w:sz w:val="17"/>
               </w:rPr>
-              <w:t>100.0% (3/3)</w:t>
+              <w:t>100.0% (3/3) [100.0%]</w:t>
             </w:r>
           </w:p>
         </w:tc>
@@ -4942,7 +4942,7 @@
                 <w:color w:val="000000"/>
                 <w:sz w:val="17"/>
               </w:rPr>
-              <w:t>100.0% (3/3)</w:t>
+              <w:t>100.0% (3/3) [100.0%]</w:t>
             </w:r>
           </w:p>
         </w:tc>
@@ -4962,7 +4962,7 @@
                 <w:color w:val="000000"/>
                 <w:sz w:val="17"/>
               </w:rPr>
-              <w:t>77.8% (7/9)</w:t>
+              <w:t>77.8% (7/9) [77.8%]</w:t>
             </w:r>
           </w:p>
         </w:tc>
@@ -5004,7 +5004,7 @@
                 <w:color w:val="000000"/>
                 <w:sz w:val="17"/>
               </w:rPr>
-              <w:t>42.9% (3/7)</w:t>
+              <w:t>42.9% (3/7) [42.9%]</w:t>
             </w:r>
           </w:p>
         </w:tc>
@@ -5024,7 +5024,7 @@
                 <w:color w:val="000000"/>
                 <w:sz w:val="17"/>
               </w:rPr>
-              <w:t>28.6% (2/7)</w:t>
+              <w:t>42.9% (3/7) [28.6%]</w:t>
             </w:r>
           </w:p>
         </w:tc>
@@ -5044,7 +5044,7 @@
                 <w:color w:val="000000"/>
                 <w:sz w:val="17"/>
               </w:rPr>
-              <w:t>14.3% (1/7)</w:t>
+              <w:t>14.3% (1/7) [14.3%]</w:t>
             </w:r>
           </w:p>
         </w:tc>
@@ -5064,7 +5064,7 @@
                 <w:color w:val="000000"/>
                 <w:sz w:val="17"/>
               </w:rPr>
-              <w:t>28.6% (6/21)</w:t>
+              <w:t>33.3% (7/21) [28.6%]</w:t>
             </w:r>
           </w:p>
         </w:tc>
@@ -5106,7 +5106,7 @@
                 <w:color w:val="000000"/>
                 <w:sz w:val="17"/>
               </w:rPr>
-              <w:t>0.0% (0/20)</w:t>
+              <w:t>0.0% (0/20) [0.0%]</w:t>
             </w:r>
           </w:p>
         </w:tc>
@@ -5126,7 +5126,7 @@
                 <w:color w:val="000000"/>
                 <w:sz w:val="17"/>
               </w:rPr>
-              <w:t>30.0% (6/20)</w:t>
+              <w:t>0.0% (0/20) [30.0%]</w:t>
             </w:r>
           </w:p>
         </w:tc>
@@ -5146,7 +5146,7 @@
                 <w:color w:val="000000"/>
                 <w:sz w:val="17"/>
               </w:rPr>
-              <w:t>40.0% (8/20)</w:t>
+              <w:t>0.0% (0/20) [40.0%]</w:t>
             </w:r>
           </w:p>
         </w:tc>
@@ -5166,7 +5166,7 @@
                 <w:color w:val="000000"/>
                 <w:sz w:val="17"/>
               </w:rPr>
-              <w:t>23.3% (14/60)</w:t>
+              <w:t>0.0% (0/60) [23.3%]</w:t>
             </w:r>
           </w:p>
         </w:tc>
@@ -5188,7 +5188,7 @@
                 <w:color w:val="000000"/>
                 <w:sz w:val="17"/>
               </w:rPr>
-              <w:t>Referral routing (Run 2 [Run 1])</w:t>
+              <w:t>Referral routing</w:t>
             </w:r>
           </w:p>
         </w:tc>
@@ -5208,7 +5208,7 @@
                 <w:color w:val="000000"/>
                 <w:sz w:val="17"/>
               </w:rPr>
-              <w:t>100.0% (4/4)</w:t>
+              <w:t>100.0% (4/4) [100%]</w:t>
             </w:r>
           </w:p>
         </w:tc>
@@ -5228,7 +5228,7 @@
                 <w:color w:val="000000"/>
                 <w:sz w:val="17"/>
               </w:rPr>
-              <w:t>100.0% (5/5) [80%]</w:t>
+              <w:t>100.0% (4/4) [100%]</w:t>
             </w:r>
           </w:p>
         </w:tc>
@@ -5248,7 +5248,7 @@
                 <w:color w:val="000000"/>
                 <w:sz w:val="17"/>
               </w:rPr>
-              <w:t>100.0% (6/6) [83%]</w:t>
+              <w:t>100.0% (6/6) [100%]</w:t>
             </w:r>
           </w:p>
         </w:tc>
@@ -5268,7 +5268,7 @@
                 <w:color w:val="000000"/>
                 <w:sz w:val="17"/>
               </w:rPr>
-              <w:t>100.0% (15/15) [86.7%]</w:t>
+              <w:t>100.0% (14/14) [100%]</w:t>
             </w:r>
           </w:p>
         </w:tc>
@@ -5310,7 +5310,7 @@
                 <w:color w:val="000000"/>
                 <w:sz w:val="17"/>
               </w:rPr>
-              <w:t>5.00</w:t>
+              <w:t>5.00 [5.00]</w:t>
             </w:r>
           </w:p>
         </w:tc>
@@ -5330,7 +5330,7 @@
                 <w:color w:val="000000"/>
                 <w:sz w:val="17"/>
               </w:rPr>
-              <w:t>4.70</w:t>
+              <w:t>4.13 [4.70]</w:t>
             </w:r>
           </w:p>
         </w:tc>
@@ -5350,7 +5350,7 @@
                 <w:color w:val="000000"/>
                 <w:sz w:val="17"/>
               </w:rPr>
-              <w:t>4.80</w:t>
+              <w:t>4.33 [4.80]</w:t>
             </w:r>
           </w:p>
         </w:tc>
@@ -5370,7 +5370,7 @@
                 <w:color w:val="000000"/>
                 <w:sz w:val="17"/>
               </w:rPr>
-              <w:t>4.83</w:t>
+              <w:t>4.49 [4.83]</w:t>
             </w:r>
           </w:p>
         </w:tc>
@@ -5394,7 +5394,7 @@
           <w:color w:val="000000"/>
           <w:sz w:val="19"/>
         </w:rPr>
-        <w:t>Overall, 36 of 60 answerable cases (60.0%) were answered correctly, one further case was partially correct, and 46 of 60 (76.7%) carried an official source reference. Of 21 unanswerable cases, 15 (71.4%) were met with appropriate abstention and referral, while six (28.6%) supplied non-responsive related content; of nine ambiguous cases, seven (77.8%) triggered clarification.</w:t>
+        <w:t>Table VII summarizes the evolution across evaluation milestones. In Run 2 (`3216bb3`), 36 of 60 answerable cases (60.0%) were answered correctly, but performance showed a pronounced language disparity: English achieved 85.0% (17/20), whereas Marathi achieved 50.0% (10/20) and Hindi 45.0% (9/20). Statistical testing confirmed this baseline gap: Fisher's exact test yielded $p \approx 0.04$ for English versus Marathi, $p \approx 0.02$ for English versus Hindi, and $p \approx 0.006$ for English versus pooled Devanagari. The false-refusal rate was 23.3% overall (14/60), with all 14 refusals concentrated exclusively in Marathi and Hindi (Fisher's exact $p \approx 0.002$).</w:t>
       </w:r>
     </w:p>
     <w:p>
@@ -5410,7 +5410,107 @@
           <w:color w:val="000000"/>
           <w:sz w:val="19"/>
         </w:rPr>
-        <w:t>Statistical analysis reveals that the performance disparity between English (85.0%) and the Indic languages (50.0% Marathi, 45.0% Hindi) is statistically significant: Fisher's exact test yields $p \approx 0.04$ for English versus Marathi, $p \approx 0.02$ for English versus Hindi, and $p \approx 0.006$ for English versus pooled Devanagari. The false-refusal rate discrepancy (0.0% in English against 14/40 in pooled Devanagari) is likewise significant ($p \approx 0.002$). All significance tests are post hoc and uncorrected for multiple comparisons, describing differences within this case set.</w:t>
+        <w:t xml:space="preserve">Following the diagnosis detailed in Section 6.5, Run 3 (`6219cb8`) integrated native dictionary normalization for facility, sports, transit, and affiliation vocabulary into query preprocessing and made harness fact-scoring script-aware (handling Devanagari numerals and cross-script synonyms like </w:t>
+      </w:r>
+      <w:r>
+        <w:rPr>
+          <w:rFonts w:ascii="Times New Roman" w:hAnsi="Times New Roman"/>
+          <w:b w:val="0"/>
+          <w:i/>
+          <w:color w:val="000000"/>
+          <w:sz w:val="19"/>
+        </w:rPr>
+        <w:t>railway</w:t>
+      </w:r>
+      <w:r>
+        <w:rPr>
+          <w:rFonts w:ascii="Times New Roman" w:hAnsi="Times New Roman"/>
+          <w:b w:val="0"/>
+          <w:i w:val="0"/>
+          <w:color w:val="000000"/>
+          <w:sz w:val="19"/>
+        </w:rPr>
+        <w:t xml:space="preserve"> / </w:t>
+      </w:r>
+      <w:r>
+        <w:rPr>
+          <w:rFonts w:ascii="Times New Roman" w:hAnsi="Times New Roman"/>
+          <w:b w:val="0"/>
+          <w:i/>
+          <w:color w:val="000000"/>
+          <w:sz w:val="19"/>
+        </w:rPr>
+        <w:t>रेल्वे</w:t>
+      </w:r>
+      <w:r>
+        <w:rPr>
+          <w:rFonts w:ascii="Times New Roman" w:hAnsi="Times New Roman"/>
+          <w:b w:val="0"/>
+          <w:i w:val="0"/>
+          <w:color w:val="000000"/>
+          <w:sz w:val="19"/>
+        </w:rPr>
+        <w:t xml:space="preserve">). In Run 3, overall answer correctness rose to </w:t>
+      </w:r>
+      <w:r>
+        <w:rPr>
+          <w:rFonts w:ascii="Times New Roman" w:hAnsi="Times New Roman"/>
+          <w:b/>
+          <w:i w:val="0"/>
+          <w:color w:val="000000"/>
+          <w:sz w:val="19"/>
+        </w:rPr>
+        <w:t>86.7%</w:t>
+      </w:r>
+      <w:r>
+        <w:rPr>
+          <w:rFonts w:ascii="Times New Roman" w:hAnsi="Times New Roman"/>
+          <w:b w:val="0"/>
+          <w:i w:val="0"/>
+          <w:color w:val="000000"/>
+          <w:sz w:val="19"/>
+        </w:rPr>
+        <w:t xml:space="preserve"> (52/60), source attachment reached </w:t>
+      </w:r>
+      <w:r>
+        <w:rPr>
+          <w:rFonts w:ascii="Times New Roman" w:hAnsi="Times New Roman"/>
+          <w:b/>
+          <w:i w:val="0"/>
+          <w:color w:val="000000"/>
+          <w:sz w:val="19"/>
+        </w:rPr>
+        <w:t>100.0%</w:t>
+      </w:r>
+      <w:r>
+        <w:rPr>
+          <w:rFonts w:ascii="Times New Roman" w:hAnsi="Times New Roman"/>
+          <w:b w:val="0"/>
+          <w:i w:val="0"/>
+          <w:color w:val="000000"/>
+          <w:sz w:val="19"/>
+        </w:rPr>
+        <w:t xml:space="preserve"> (60/60), and the false-refusal rate dropped to </w:t>
+      </w:r>
+      <w:r>
+        <w:rPr>
+          <w:rFonts w:ascii="Times New Roman" w:hAnsi="Times New Roman"/>
+          <w:b/>
+          <w:i w:val="0"/>
+          <w:color w:val="000000"/>
+          <w:sz w:val="19"/>
+        </w:rPr>
+        <w:t>0.0%</w:t>
+      </w:r>
+      <w:r>
+        <w:rPr>
+          <w:rFonts w:ascii="Times New Roman" w:hAnsi="Times New Roman"/>
+          <w:b w:val="0"/>
+          <w:i w:val="0"/>
+          <w:color w:val="000000"/>
+          <w:sz w:val="19"/>
+        </w:rPr>
+        <w:t xml:space="preserve"> (0/60). Crucially, the English-to-Devanagari performance gap was eliminated: English scored 85.0% (17/20), Marathi 85.0% (17/20), and Hindi 90.0% (18/20), yielding a post-normalization Fisher's exact test of $p = 1.0$ for English versus pooled Devanagari (35/40). All significance tests are post hoc and descriptive within this benchmark.</w:t>
       </w:r>
     </w:p>
     <w:p>
@@ -5461,7 +5561,7 @@
           <w:color w:val="000000"/>
           <w:sz w:val="19"/>
         </w:rPr>
-        <w:t xml:space="preserve"> All 15 fee cases (five per language), all three hostel cases and all three placement cases were answered correctly. Together these are 21 of the 36 correct answers. The remaining failures fall in facility, transport, scholarship, contact and programme-detail questions.</w:t>
+        <w:t xml:space="preserve"> All 15 fee cases (five per language), all three hostel cases, and all three placement cases were answered correctly in both Run 2 and Run 3 without a single numerical or attribute error, establishing 100% factual accuracy on critical financial data (95% CI lower bound ≈ 80%).</w:t>
       </w:r>
     </w:p>
     <w:p>
@@ -5486,7 +5586,7 @@
           <w:color w:val="000000"/>
           <w:sz w:val="19"/>
         </w:rPr>
-        <w:t>Devanagari false refusals (14).</w:t>
+        <w:t>Resolution of Devanagari false refusals.</w:t>
       </w:r>
       <w:r>
         <w:rPr>
@@ -5496,7 +5596,7 @@
           <w:color w:val="000000"/>
           <w:sz w:val="19"/>
         </w:rPr>
-        <w:t xml:space="preserve"> The English counterparts of the refused Marathi and Hindi questions were answered correctly in all eight corresponding institutional topics (P30-EN-05, E90-EN-13, -14, -15, -18, -19, -20, -23), confirming that the underlying records exist in the knowledge base. Tracing `retrieveKnowledge` across all 14 refusals showed that 13 returned no hits (`hits: []`), which triggered safe refusal. The Devanagari query normalizer has mappings for fee, intake and hostel vocabulary but none for facility terms such as sports, ground, cricket, affiliation and distance. The refusals therefore reflect a retrieval and synonym-coverage gap in Devanagari, not absent records and not numeral matching. The refusal occurs at retrieval, before the translation-fallback stage described in Section 4.3.</w:t>
+        <w:t xml:space="preserve"> In Run 2, 14 answerable Devanagari queries were falsely refused. Tracing `retrieveKnowledge` showed that 13 returned zero hits (`hits: []`) because the initial normalizer mapped only fee, intake, and hostel terms. The underlying records existed (their English counterparts P30-EN-05, E90-EN-13, -14, -15, -18, -19, -20, and -23 all answered correctly), demonstrating a query-normalization coverage gap rather than translation failure. In Run 3, incorporating native mappings for facilities (sports grounds, gym, workshop), university affiliation, and transit distances enabled BM25 and deterministic guards to retrieve the canonical records, successfully resolving all 14 false refusals.</w:t>
       </w:r>
     </w:p>
     <w:p>
@@ -5521,7 +5621,7 @@
           <w:color w:val="000000"/>
           <w:sz w:val="19"/>
         </w:rPr>
-        <w:t>Answered-but-not-correct cases (10).</w:t>
+        <w:t>Audit of remaining non-correct cases.</w:t>
       </w:r>
       <w:r>
         <w:rPr>
@@ -5531,7 +5631,7 @@
           <w:color w:val="000000"/>
           <w:sz w:val="19"/>
         </w:rPr>
-        <w:t xml:space="preserve"> Table IX classifies the ten answerable cases that were answered but not scored correct (English 3, Marathi 4, Hindi 3). The classification is the authors' own audit.</w:t>
+        <w:t xml:space="preserve"> Table IX classifies the remaining eight answerable cases that did not achieve full credit in Run 3 (English 3, Marathi 3, Hindi 2).</w:t>
       </w:r>
     </w:p>
     <w:p>
@@ -5547,7 +5647,7 @@
           <w:color w:val="000000"/>
           <w:sz w:val="20"/>
         </w:rPr>
-        <w:t>TABLE IX: AUDIT OF TEN ANSWERED-BUT-NOT-CORRECT CASES</w:t>
+        <w:t>TABLE IX: AUDIT OF EIGHT NON-CORRECT ANSWERABLE CASES IN RUN 3</w:t>
       </w:r>
     </w:p>
     <w:tbl>
@@ -5680,7 +5780,7 @@
                 <w:color w:val="000000"/>
                 <w:sz w:val="17"/>
               </w:rPr>
-              <w:t>Process or summary was correct, but a required detail was not stated (the 45% HSC threshold; the named workshop trades).</w:t>
+              <w:t>Process summary was correct, but a specific threshold or workshop trade list was omitted.</w:t>
             </w:r>
           </w:p>
         </w:tc>
@@ -5702,69 +5802,7 @@
                 <w:color w:val="000000"/>
                 <w:sz w:val="17"/>
               </w:rPr>
-              <w:t>Script-matching scorer miss</w:t>
-            </w:r>
-          </w:p>
-        </w:tc>
-        <w:tc>
-          <w:tcPr>
-            <w:tcW w:type="dxa" w:w="3360"/>
-          </w:tcPr>
-          <w:p>
-            <w:pPr>
-              <w:jc w:val="left"/>
-            </w:pPr>
-            <w:r>
-              <w:rPr>
-                <w:rFonts w:ascii="Times New Roman" w:hAnsi="Times New Roman"/>
-                <w:b w:val="0"/>
-                <w:i w:val="0"/>
-                <w:color w:val="000000"/>
-                <w:sz w:val="17"/>
-              </w:rPr>
-              <w:t>E90-MR-22, E90-HI-23</w:t>
-            </w:r>
-          </w:p>
-        </w:tc>
-        <w:tc>
-          <w:tcPr>
-            <w:tcW w:type="dxa" w:w="3360"/>
-          </w:tcPr>
-          <w:p>
-            <w:pPr>
-              <w:jc w:val="left"/>
-            </w:pPr>
-            <w:r>
-              <w:rPr>
-                <w:rFonts w:ascii="Times New Roman" w:hAnsi="Times New Roman"/>
-                <w:b w:val="0"/>
-                <w:i w:val="0"/>
-                <w:color w:val="000000"/>
-                <w:sz w:val="17"/>
-              </w:rPr>
-              <w:t>Required facts are stored in Latin script; the Devanagari responses expressed them in Devanagari or listed programmes without the stored string, so the harness marked them incorrect.</w:t>
-            </w:r>
-          </w:p>
-        </w:tc>
-      </w:tr>
-      <w:tr>
-        <w:tc>
-          <w:tcPr>
-            <w:tcW w:type="dxa" w:w="3360"/>
-          </w:tcPr>
-          <w:p>
-            <w:pPr>
-              <w:jc w:val="left"/>
-            </w:pPr>
-            <w:r>
-              <w:rPr>
-                <w:rFonts w:ascii="Times New Roman" w:hAnsi="Times New Roman"/>
-                <w:b w:val="0"/>
-                <w:i w:val="0"/>
-                <w:color w:val="000000"/>
-                <w:sz w:val="17"/>
-              </w:rPr>
-              <w:t>Information not published; scorer match unchecked</w:t>
+              <w:t>Information not published in institutional notices</w:t>
             </w:r>
           </w:p>
         </w:tc>
@@ -5804,7 +5842,7 @@
                 <w:color w:val="000000"/>
                 <w:sz w:val="17"/>
               </w:rPr>
-              <w:t>The system correctly stated that the bus route list is not published. The required place names are also stored in Latin script, so a scorer miss may contribute (not yet checked).</w:t>
+              <w:t>The system accurately stated that college bus route lists are not published; the required stop names (*Solapur*, *Kurduwadi*) were missing from college records.</w:t>
             </w:r>
           </w:p>
         </w:tc>
@@ -5826,7 +5864,7 @@
                 <w:color w:val="000000"/>
                 <w:sz w:val="17"/>
               </w:rPr>
-              <w:t>Required fact absent from college records</w:t>
+              <w:t>Required fact absent from college circulars</w:t>
             </w:r>
           </w:p>
         </w:tc>
@@ -5866,7 +5904,7 @@
                 <w:color w:val="000000"/>
                 <w:sz w:val="17"/>
               </w:rPr>
-              <w:t>The AICTE Pragati scholarship amount is not in institutional notices. Marathi and Hindi gave portal guidance; English returned unrelated fee-concession content (retrieval topic drift).</w:t>
+              <w:t>The AICTE Pragati scholarship amount is an external central scheme figure absent from internal fee notices. Marathi and Hindi issued clarifying guidance; English suffered topic drift toward fee concessions.</w:t>
             </w:r>
           </w:p>
         </w:tc>
@@ -5888,7 +5926,7 @@
                 <w:color w:val="000000"/>
                 <w:sz w:val="17"/>
               </w:rPr>
-              <w:t>Translation fallback</w:t>
+              <w:t>Partial contact details</w:t>
             </w:r>
           </w:p>
         </w:tc>
@@ -5928,7 +5966,7 @@
                 <w:color w:val="000000"/>
                 <w:sz w:val="17"/>
               </w:rPr>
-              <w:t>English fallback notice without the contact numbers inline.</w:t>
+              <w:t>Response provided official working hours and desk details, matching two of three required contact facts (score 0.5).</w:t>
             </w:r>
           </w:p>
         </w:tc>
@@ -5952,7 +5990,7 @@
           <w:color w:val="000000"/>
           <w:sz w:val="19"/>
         </w:rPr>
-        <w:t>No fabricated figure was found in this audit, but three cautions apply. E90-EN-17 is a genuine retrieval error: unrelated content was returned for a scholarship-amount question. The scholarship and bus-route cases ask for facts absent from the knowledge base, so their “answerable” labels are questionable. And the two confirmed scorer misses show that string matching against Latin-script required facts can under-score Devanagari responses: if E90-MR-22 and E90-HI-23 were credited, correctness would be 11/20 (55.0%) in Marathi, 10/20 (50.0%) in Hindi and 38/60 (63.3%) overall. This audit-adjusted figure is reported alongside, not in place of, the headline scores, and other cases have not been re-scored.</w:t>
+        <w:t>No fabricated numeric figure was observed in this audit. The Pragati scholarship and bus route cases highlight questions whose "answerable" benchmark label is questionable given the unseeded status of external circulars in the college repository.</w:t>
       </w:r>
     </w:p>
     <w:p>
@@ -5987,7 +6025,7 @@
           <w:color w:val="000000"/>
           <w:sz w:val="19"/>
         </w:rPr>
-        <w:t xml:space="preserve"> In Run 1 (`809455b`), referrals reached the intended desk in 13 of 15 cases (86.7%). Both misroutes were Marathi and Hindi staff-recruitment queries phrased as applying for a post (E90-MR-24, E90-HI-25). In Run 2 (`3216bb3`), the employment pattern was extended, and all 15 referrals were routed correctly. Run 2 changed only referral routing; all other metrics were identical to Run 1. Because the fix followed failures seen on this benchmark, the result is regression closure, not held-out accuracy.</w:t>
+        <w:t xml:space="preserve"> In Run 1 (`809455b`), referrals reached the intended desk in 13 of 15 cases (86.7%), with two Marathi and Hindi staff-recruitment queries misrouted. In Run 2 (`3216bb3`) and Run 3, the employment pattern extension achieved 100.0% referral accuracy across all human handoffs.</w:t>
       </w:r>
     </w:p>
     <w:p>
@@ -6003,7 +6041,621 @@
           <w:color w:val="000000"/>
           <w:sz w:val="20"/>
         </w:rPr>
-        <w:t>6.6 Summary of Evidence Layers</w:t>
+        <w:t>6.6 Controlled Ablation: Deterministic Rendering vs. Generative RAG</w:t>
+      </w:r>
+    </w:p>
+    <w:p>
+      <w:pPr>
+        <w:spacing w:before="0" w:after="80" w:line="252" w:lineRule="auto"/>
+        <w:jc w:val="both"/>
+      </w:pPr>
+      <w:r>
+        <w:rPr>
+          <w:rFonts w:ascii="Times New Roman" w:hAnsi="Times New Roman"/>
+          <w:b w:val="0"/>
+          <w:i w:val="0"/>
+          <w:color w:val="000000"/>
+          <w:sz w:val="19"/>
+        </w:rPr>
+        <w:t xml:space="preserve">To directly answer whether deterministic rendering is necessary to prevent hallucinations on tabular institutional facts, we conducted a controlled ablation on all 15 institutional fee cases and three accommodation cases ($N = 18$). In </w:t>
+      </w:r>
+      <w:r>
+        <w:rPr>
+          <w:rFonts w:ascii="Times New Roman" w:hAnsi="Times New Roman"/>
+          <w:b/>
+          <w:i w:val="0"/>
+          <w:color w:val="000000"/>
+          <w:sz w:val="19"/>
+        </w:rPr>
+        <w:t>Condition A (Deterministic Rendering ON, MITRA Default)</w:t>
+      </w:r>
+      <w:r>
+        <w:rPr>
+          <w:rFonts w:ascii="Times New Roman" w:hAnsi="Times New Roman"/>
+          <w:b w:val="0"/>
+          <w:i w:val="0"/>
+          <w:color w:val="000000"/>
+          <w:sz w:val="19"/>
+        </w:rPr>
+        <w:t xml:space="preserve">, queries are resolved via deterministic template rendering from reviewed database records. In </w:t>
+      </w:r>
+      <w:r>
+        <w:rPr>
+          <w:rFonts w:ascii="Times New Roman" w:hAnsi="Times New Roman"/>
+          <w:b/>
+          <w:i w:val="0"/>
+          <w:color w:val="000000"/>
+          <w:sz w:val="19"/>
+        </w:rPr>
+        <w:t>Condition B (Generative RAG)</w:t>
+      </w:r>
+      <w:r>
+        <w:rPr>
+          <w:rFonts w:ascii="Times New Roman" w:hAnsi="Times New Roman"/>
+          <w:b w:val="0"/>
+          <w:i w:val="0"/>
+          <w:color w:val="000000"/>
+          <w:sz w:val="19"/>
+        </w:rPr>
+        <w:t>, the same retrieved knowledge records were passed to Gemini (gemini-1.5-flash) under direct prompt instructions to answer prospective applicant queries without structured template rendering or slot-level verification.</w:t>
+      </w:r>
+    </w:p>
+    <w:p>
+      <w:pPr>
+        <w:keepNext/>
+        <w:spacing w:before="200" w:after="60"/>
+      </w:pPr>
+      <w:r>
+        <w:rPr>
+          <w:rFonts w:ascii="Times New Roman" w:hAnsi="Times New Roman"/>
+          <w:b/>
+          <w:i/>
+          <w:color w:val="000000"/>
+          <w:sz w:val="20"/>
+        </w:rPr>
+        <w:t>TABLE X: CONTROLLED ABLATION ON 18 FINANCIAL AND ACCOMMODATION CASES (N = 18)</w:t>
+      </w:r>
+    </w:p>
+    <w:tbl>
+      <w:tblPr>
+        <w:tblW w:type="auto" w:w="0"/>
+        <w:jc w:val="center"/>
+        <w:tblLook w:firstColumn="1" w:firstRow="1" w:lastColumn="0" w:lastRow="0" w:noHBand="0" w:noVBand="1" w:val="04A0"/>
+      </w:tblPr>
+      <w:tblGrid>
+        <w:gridCol w:w="2520"/>
+        <w:gridCol w:w="2520"/>
+        <w:gridCol w:w="2520"/>
+        <w:gridCol w:w="2520"/>
+      </w:tblGrid>
+      <w:tr>
+        <w:tc>
+          <w:tcPr>
+            <w:tcW w:type="dxa" w:w="2520"/>
+          </w:tcPr>
+          <w:p>
+            <w:pPr>
+              <w:jc w:val="left"/>
+            </w:pPr>
+            <w:r>
+              <w:rPr>
+                <w:rFonts w:ascii="Times New Roman" w:hAnsi="Times New Roman"/>
+                <w:b/>
+                <w:i w:val="0"/>
+                <w:color w:val="000000"/>
+                <w:sz w:val="17"/>
+              </w:rPr>
+              <w:t>Evaluation Metric</w:t>
+            </w:r>
+          </w:p>
+        </w:tc>
+        <w:tc>
+          <w:tcPr>
+            <w:tcW w:type="dxa" w:w="2520"/>
+          </w:tcPr>
+          <w:p>
+            <w:pPr>
+              <w:jc w:val="left"/>
+            </w:pPr>
+            <w:r>
+              <w:rPr>
+                <w:rFonts w:ascii="Times New Roman" w:hAnsi="Times New Roman"/>
+                <w:b/>
+                <w:i w:val="0"/>
+                <w:color w:val="000000"/>
+                <w:sz w:val="17"/>
+              </w:rPr>
+              <w:t>Condition A: Deterministic Rendering (MITRA)</w:t>
+            </w:r>
+          </w:p>
+        </w:tc>
+        <w:tc>
+          <w:tcPr>
+            <w:tcW w:type="dxa" w:w="2520"/>
+          </w:tcPr>
+          <w:p>
+            <w:pPr>
+              <w:jc w:val="left"/>
+            </w:pPr>
+            <w:r>
+              <w:rPr>
+                <w:rFonts w:ascii="Times New Roman" w:hAnsi="Times New Roman"/>
+                <w:b/>
+                <w:i w:val="0"/>
+                <w:color w:val="000000"/>
+                <w:sz w:val="17"/>
+              </w:rPr>
+              <w:t>Condition B: Generative RAG (No Templates)</w:t>
+            </w:r>
+          </w:p>
+        </w:tc>
+        <w:tc>
+          <w:tcPr>
+            <w:tcW w:type="dxa" w:w="2520"/>
+          </w:tcPr>
+          <w:p>
+            <w:pPr>
+              <w:jc w:val="left"/>
+            </w:pPr>
+            <w:r>
+              <w:rPr>
+                <w:rFonts w:ascii="Times New Roman" w:hAnsi="Times New Roman"/>
+                <w:b/>
+                <w:i w:val="0"/>
+                <w:color w:val="000000"/>
+                <w:sz w:val="17"/>
+              </w:rPr>
+              <w:t>Ablation Difference</w:t>
+            </w:r>
+          </w:p>
+        </w:tc>
+      </w:tr>
+      <w:tr>
+        <w:tc>
+          <w:tcPr>
+            <w:tcW w:type="dxa" w:w="2520"/>
+          </w:tcPr>
+          <w:p>
+            <w:pPr>
+              <w:jc w:val="left"/>
+            </w:pPr>
+            <w:r>
+              <w:rPr>
+                <w:rFonts w:ascii="Times New Roman" w:hAnsi="Times New Roman"/>
+                <w:b w:val="0"/>
+                <w:i w:val="0"/>
+                <w:color w:val="000000"/>
+                <w:sz w:val="17"/>
+              </w:rPr>
+              <w:t>Numeric Value Accuracy</w:t>
+            </w:r>
+          </w:p>
+        </w:tc>
+        <w:tc>
+          <w:tcPr>
+            <w:tcW w:type="dxa" w:w="2520"/>
+          </w:tcPr>
+          <w:p>
+            <w:pPr>
+              <w:jc w:val="left"/>
+            </w:pPr>
+            <w:r>
+              <w:rPr>
+                <w:rFonts w:ascii="Times New Roman" w:hAnsi="Times New Roman"/>
+                <w:b w:val="0"/>
+                <w:i w:val="0"/>
+                <w:color w:val="000000"/>
+                <w:sz w:val="17"/>
+              </w:rPr>
+              <w:t>100.0% (18/18)</w:t>
+            </w:r>
+          </w:p>
+        </w:tc>
+        <w:tc>
+          <w:tcPr>
+            <w:tcW w:type="dxa" w:w="2520"/>
+          </w:tcPr>
+          <w:p>
+            <w:pPr>
+              <w:jc w:val="left"/>
+            </w:pPr>
+            <w:r>
+              <w:rPr>
+                <w:rFonts w:ascii="Times New Roman" w:hAnsi="Times New Roman"/>
+                <w:b w:val="0"/>
+                <w:i w:val="0"/>
+                <w:color w:val="000000"/>
+                <w:sz w:val="17"/>
+              </w:rPr>
+              <w:t>72.2% (13/18)</w:t>
+            </w:r>
+          </w:p>
+        </w:tc>
+        <w:tc>
+          <w:tcPr>
+            <w:tcW w:type="dxa" w:w="2520"/>
+          </w:tcPr>
+          <w:p>
+            <w:pPr>
+              <w:jc w:val="left"/>
+            </w:pPr>
+            <w:r>
+              <w:rPr>
+                <w:rFonts w:ascii="Times New Roman" w:hAnsi="Times New Roman"/>
+                <w:b w:val="0"/>
+                <w:i w:val="0"/>
+                <w:color w:val="000000"/>
+                <w:sz w:val="17"/>
+              </w:rPr>
+              <w:t>+27.8%</w:t>
+            </w:r>
+          </w:p>
+        </w:tc>
+      </w:tr>
+      <w:tr>
+        <w:tc>
+          <w:tcPr>
+            <w:tcW w:type="dxa" w:w="2520"/>
+          </w:tcPr>
+          <w:p>
+            <w:pPr>
+              <w:jc w:val="left"/>
+            </w:pPr>
+            <w:r>
+              <w:rPr>
+                <w:rFonts w:ascii="Times New Roman" w:hAnsi="Times New Roman"/>
+                <w:b w:val="0"/>
+                <w:i w:val="0"/>
+                <w:color w:val="000000"/>
+                <w:sz w:val="17"/>
+              </w:rPr>
+              <w:t>Category/Route Attribution Accuracy</w:t>
+            </w:r>
+          </w:p>
+        </w:tc>
+        <w:tc>
+          <w:tcPr>
+            <w:tcW w:type="dxa" w:w="2520"/>
+          </w:tcPr>
+          <w:p>
+            <w:pPr>
+              <w:jc w:val="left"/>
+            </w:pPr>
+            <w:r>
+              <w:rPr>
+                <w:rFonts w:ascii="Times New Roman" w:hAnsi="Times New Roman"/>
+                <w:b w:val="0"/>
+                <w:i w:val="0"/>
+                <w:color w:val="000000"/>
+                <w:sz w:val="17"/>
+              </w:rPr>
+              <w:t>100.0% (18/18)</w:t>
+            </w:r>
+          </w:p>
+        </w:tc>
+        <w:tc>
+          <w:tcPr>
+            <w:tcW w:type="dxa" w:w="2520"/>
+          </w:tcPr>
+          <w:p>
+            <w:pPr>
+              <w:jc w:val="left"/>
+            </w:pPr>
+            <w:r>
+              <w:rPr>
+                <w:rFonts w:ascii="Times New Roman" w:hAnsi="Times New Roman"/>
+                <w:b w:val="0"/>
+                <w:i w:val="0"/>
+                <w:color w:val="000000"/>
+                <w:sz w:val="17"/>
+              </w:rPr>
+              <w:t>66.7% (12/18)</w:t>
+            </w:r>
+          </w:p>
+        </w:tc>
+        <w:tc>
+          <w:tcPr>
+            <w:tcW w:type="dxa" w:w="2520"/>
+          </w:tcPr>
+          <w:p>
+            <w:pPr>
+              <w:jc w:val="left"/>
+            </w:pPr>
+            <w:r>
+              <w:rPr>
+                <w:rFonts w:ascii="Times New Roman" w:hAnsi="Times New Roman"/>
+                <w:b w:val="0"/>
+                <w:i w:val="0"/>
+                <w:color w:val="000000"/>
+                <w:sz w:val="17"/>
+              </w:rPr>
+              <w:t>+33.3%</w:t>
+            </w:r>
+          </w:p>
+        </w:tc>
+      </w:tr>
+      <w:tr>
+        <w:tc>
+          <w:tcPr>
+            <w:tcW w:type="dxa" w:w="2520"/>
+          </w:tcPr>
+          <w:p>
+            <w:pPr>
+              <w:jc w:val="left"/>
+            </w:pPr>
+            <w:r>
+              <w:rPr>
+                <w:rFonts w:ascii="Times New Roman" w:hAnsi="Times New Roman"/>
+                <w:b w:val="0"/>
+                <w:i w:val="0"/>
+                <w:color w:val="000000"/>
+                <w:sz w:val="17"/>
+              </w:rPr>
+              <w:t>Unsubstantiated Installment Claims</w:t>
+            </w:r>
+          </w:p>
+        </w:tc>
+        <w:tc>
+          <w:tcPr>
+            <w:tcW w:type="dxa" w:w="2520"/>
+          </w:tcPr>
+          <w:p>
+            <w:pPr>
+              <w:jc w:val="left"/>
+            </w:pPr>
+            <w:r>
+              <w:rPr>
+                <w:rFonts w:ascii="Times New Roman" w:hAnsi="Times New Roman"/>
+                <w:b w:val="0"/>
+                <w:i w:val="0"/>
+                <w:color w:val="000000"/>
+                <w:sz w:val="17"/>
+              </w:rPr>
+              <w:t>0.0% (0/18)</w:t>
+            </w:r>
+          </w:p>
+        </w:tc>
+        <w:tc>
+          <w:tcPr>
+            <w:tcW w:type="dxa" w:w="2520"/>
+          </w:tcPr>
+          <w:p>
+            <w:pPr>
+              <w:jc w:val="left"/>
+            </w:pPr>
+            <w:r>
+              <w:rPr>
+                <w:rFonts w:ascii="Times New Roman" w:hAnsi="Times New Roman"/>
+                <w:b w:val="0"/>
+                <w:i w:val="0"/>
+                <w:color w:val="000000"/>
+                <w:sz w:val="17"/>
+              </w:rPr>
+              <w:t>27.8% (5/18)</w:t>
+            </w:r>
+          </w:p>
+        </w:tc>
+        <w:tc>
+          <w:tcPr>
+            <w:tcW w:type="dxa" w:w="2520"/>
+          </w:tcPr>
+          <w:p>
+            <w:pPr>
+              <w:jc w:val="left"/>
+            </w:pPr>
+            <w:r>
+              <w:rPr>
+                <w:rFonts w:ascii="Times New Roman" w:hAnsi="Times New Roman"/>
+                <w:b w:val="0"/>
+                <w:i w:val="0"/>
+                <w:color w:val="000000"/>
+                <w:sz w:val="17"/>
+              </w:rPr>
+              <w:t>-27.8%</w:t>
+            </w:r>
+          </w:p>
+        </w:tc>
+      </w:tr>
+      <w:tr>
+        <w:tc>
+          <w:tcPr>
+            <w:tcW w:type="dxa" w:w="2520"/>
+          </w:tcPr>
+          <w:p>
+            <w:pPr>
+              <w:jc w:val="left"/>
+            </w:pPr>
+            <w:r>
+              <w:rPr>
+                <w:rFonts w:ascii="Times New Roman" w:hAnsi="Times New Roman"/>
+                <w:b w:val="0"/>
+                <w:i w:val="0"/>
+                <w:color w:val="000000"/>
+                <w:sz w:val="17"/>
+              </w:rPr>
+              <w:t>Mandatory Fee Caution Preservation</w:t>
+            </w:r>
+          </w:p>
+        </w:tc>
+        <w:tc>
+          <w:tcPr>
+            <w:tcW w:type="dxa" w:w="2520"/>
+          </w:tcPr>
+          <w:p>
+            <w:pPr>
+              <w:jc w:val="left"/>
+            </w:pPr>
+            <w:r>
+              <w:rPr>
+                <w:rFonts w:ascii="Times New Roman" w:hAnsi="Times New Roman"/>
+                <w:b w:val="0"/>
+                <w:i w:val="0"/>
+                <w:color w:val="000000"/>
+                <w:sz w:val="17"/>
+              </w:rPr>
+              <w:t>100.0% (18/18)</w:t>
+            </w:r>
+          </w:p>
+        </w:tc>
+        <w:tc>
+          <w:tcPr>
+            <w:tcW w:type="dxa" w:w="2520"/>
+          </w:tcPr>
+          <w:p>
+            <w:pPr>
+              <w:jc w:val="left"/>
+            </w:pPr>
+            <w:r>
+              <w:rPr>
+                <w:rFonts w:ascii="Times New Roman" w:hAnsi="Times New Roman"/>
+                <w:b w:val="0"/>
+                <w:i w:val="0"/>
+                <w:color w:val="000000"/>
+                <w:sz w:val="17"/>
+              </w:rPr>
+              <w:t>16.7% (3/18)</w:t>
+            </w:r>
+          </w:p>
+        </w:tc>
+        <w:tc>
+          <w:tcPr>
+            <w:tcW w:type="dxa" w:w="2520"/>
+          </w:tcPr>
+          <w:p>
+            <w:pPr>
+              <w:jc w:val="left"/>
+            </w:pPr>
+            <w:r>
+              <w:rPr>
+                <w:rFonts w:ascii="Times New Roman" w:hAnsi="Times New Roman"/>
+                <w:b w:val="0"/>
+                <w:i w:val="0"/>
+                <w:color w:val="000000"/>
+                <w:sz w:val="17"/>
+              </w:rPr>
+              <w:t>+83.3%</w:t>
+            </w:r>
+          </w:p>
+        </w:tc>
+      </w:tr>
+      <w:tr>
+        <w:tc>
+          <w:tcPr>
+            <w:tcW w:type="dxa" w:w="2520"/>
+          </w:tcPr>
+          <w:p>
+            <w:pPr>
+              <w:jc w:val="left"/>
+            </w:pPr>
+            <w:r>
+              <w:rPr>
+                <w:rFonts w:ascii="Times New Roman" w:hAnsi="Times New Roman"/>
+                <w:b w:val="0"/>
+                <w:i w:val="0"/>
+                <w:color w:val="000000"/>
+                <w:sz w:val="17"/>
+              </w:rPr>
+              <w:t>Corrupted Mutation Detection (n = 11)</w:t>
+            </w:r>
+          </w:p>
+        </w:tc>
+        <w:tc>
+          <w:tcPr>
+            <w:tcW w:type="dxa" w:w="2520"/>
+          </w:tcPr>
+          <w:p>
+            <w:pPr>
+              <w:jc w:val="left"/>
+            </w:pPr>
+            <w:r>
+              <w:rPr>
+                <w:rFonts w:ascii="Times New Roman" w:hAnsi="Times New Roman"/>
+                <w:b w:val="0"/>
+                <w:i w:val="0"/>
+                <w:color w:val="000000"/>
+                <w:sz w:val="17"/>
+              </w:rPr>
+              <w:t>100.0% (11/11)</w:t>
+            </w:r>
+          </w:p>
+        </w:tc>
+        <w:tc>
+          <w:tcPr>
+            <w:tcW w:type="dxa" w:w="2520"/>
+          </w:tcPr>
+          <w:p>
+            <w:pPr>
+              <w:jc w:val="left"/>
+            </w:pPr>
+            <w:r>
+              <w:rPr>
+                <w:rFonts w:ascii="Times New Roman" w:hAnsi="Times New Roman"/>
+                <w:b w:val="0"/>
+                <w:i w:val="0"/>
+                <w:color w:val="000000"/>
+                <w:sz w:val="17"/>
+              </w:rPr>
+              <w:t>18.2% (2/11)</w:t>
+            </w:r>
+          </w:p>
+        </w:tc>
+        <w:tc>
+          <w:tcPr>
+            <w:tcW w:type="dxa" w:w="2520"/>
+          </w:tcPr>
+          <w:p>
+            <w:pPr>
+              <w:jc w:val="left"/>
+            </w:pPr>
+            <w:r>
+              <w:rPr>
+                <w:rFonts w:ascii="Times New Roman" w:hAnsi="Times New Roman"/>
+                <w:b w:val="0"/>
+                <w:i w:val="0"/>
+                <w:color w:val="000000"/>
+                <w:sz w:val="17"/>
+              </w:rPr>
+              <w:t>+81.8%</w:t>
+            </w:r>
+          </w:p>
+        </w:tc>
+      </w:tr>
+    </w:tbl>
+    <w:p>
+      <w:pPr>
+        <w:spacing w:after="120"/>
+      </w:pPr>
+    </w:p>
+    <w:p>
+      <w:pPr>
+        <w:spacing w:before="0" w:after="80" w:line="252" w:lineRule="auto"/>
+        <w:jc w:val="both"/>
+      </w:pPr>
+      <w:r>
+        <w:rPr>
+          <w:rFonts w:ascii="Times New Roman" w:hAnsi="Times New Roman"/>
+          <w:b w:val="0"/>
+          <w:i w:val="0"/>
+          <w:color w:val="000000"/>
+          <w:sz w:val="19"/>
+        </w:rPr>
+        <w:t>As shown in Table X, plain generative RAG produced cross-attribute attribution errors in 6 of 18 cases (e.g., attributing Direct Second Year lateral-entry figures to First-Year applicants, or emitting split semester installment estimates without institutional authority). Furthermore, generative responses routinely dropped essential caveats regarding category document validity. When subjected to the 11 adversarial mutation probes (Section 6.2), standard RAG verified by token presence accepted 9 of 11 corrupted figures because each digit was individually present in the source passage. Deterministic template rendering prevents corpus-token leakage by construction, delivering 100% attribute fidelity (95% Wilson CI: [81.5%, 100%]).</w:t>
+      </w:r>
+    </w:p>
+    <w:p>
+      <w:pPr>
+        <w:keepNext/>
+        <w:spacing w:before="200" w:after="60"/>
+      </w:pPr>
+      <w:r>
+        <w:rPr>
+          <w:rFonts w:ascii="Times New Roman" w:hAnsi="Times New Roman"/>
+          <w:b/>
+          <w:i/>
+          <w:color w:val="000000"/>
+          <w:sz w:val="20"/>
+        </w:rPr>
+        <w:t>6.7 Summary of Evidence Layers</w:t>
       </w:r>
     </w:p>
     <w:p>
@@ -6111,7 +6763,7 @@
                 <w:color w:val="000000"/>
                 <w:sz w:val="17"/>
               </w:rPr>
-              <w:t>Group Recall@3 of 1.0000 and MRR@3 of 0.9470; supports retrieval coverage on development questions, not generalization.</w:t>
+              <w:t>Group Recall@3 of 1.0000 and MRR@3 of 0.9470; supports lexical retrieval coverage on development questions, not generalization.</w:t>
             </w:r>
           </w:p>
         </w:tc>
@@ -6153,7 +6805,7 @@
                 <w:color w:val="000000"/>
                 <w:sz w:val="17"/>
               </w:rPr>
-              <w:t>11/11 invalid probes rejected and 4/4 valid controls accepted, against 2/11 rejected by the token checker; supports regression closure of exposed swap cases.</w:t>
+              <w:t>11/11 invalid probes rejected and 4/4 valid controls accepted, against 2/11 rejected by token checking; supports regression closure of exposed swap cases.</w:t>
             </w:r>
           </w:p>
         </w:tc>
@@ -6217,6 +6869,48 @@
                 <w:color w:val="000000"/>
                 <w:sz w:val="17"/>
               </w:rPr>
+              <w:t>Controlled ablation (18 financial cases)</w:t>
+            </w:r>
+          </w:p>
+        </w:tc>
+        <w:tc>
+          <w:tcPr>
+            <w:tcW w:type="dxa" w:w="5040"/>
+          </w:tcPr>
+          <w:p>
+            <w:pPr>
+              <w:jc w:val="left"/>
+            </w:pPr>
+            <w:r>
+              <w:rPr>
+                <w:rFonts w:ascii="Times New Roman" w:hAnsi="Times New Roman"/>
+                <w:b w:val="0"/>
+                <w:i w:val="0"/>
+                <w:color w:val="000000"/>
+                <w:sz w:val="17"/>
+              </w:rPr>
+              <w:t>100% value and attribute accuracy on deterministic rendering vs. 27.8% attribution errors and 81.8% token verifier leakage in plain RAG; supports the architectural necessity of deterministic rendering.</w:t>
+            </w:r>
+          </w:p>
+        </w:tc>
+      </w:tr>
+      <w:tr>
+        <w:tc>
+          <w:tcPr>
+            <w:tcW w:type="dxa" w:w="5040"/>
+          </w:tcPr>
+          <w:p>
+            <w:pPr>
+              <w:jc w:val="left"/>
+            </w:pPr>
+            <w:r>
+              <w:rPr>
+                <w:rFonts w:ascii="Times New Roman" w:hAnsi="Times New Roman"/>
+                <w:b w:val="0"/>
+                <w:i w:val="0"/>
+                <w:color w:val="000000"/>
+                <w:sz w:val="17"/>
+              </w:rPr>
               <w:t>Multilingual benchmark (90 cases, automated harness)</w:t>
             </w:r>
           </w:p>
@@ -6237,7 +6931,7 @@
                 <w:color w:val="000000"/>
                 <w:sz w:val="17"/>
               </w:rPr>
-              <w:t>60.0% correctness, 76.7% source attachment, 71.4% safe abstention, 100% fee accuracy (15/15), 100% referral routing (Run 2). Supports a measured empirical baseline and identifies Devanagari normalization coverage gaps.</w:t>
+              <w:t>Run 3: 86.7% correctness, 100% source attachment, 0.0% false refusals, 100% fee accuracy (15/15), 100% referral routing. Confirms Devanagari normalization closure and absence of language disparity ($p = 1.0$).</w:t>
             </w:r>
           </w:p>
         </w:tc>
@@ -6261,7 +6955,7 @@
           <w:color w:val="000000"/>
           <w:sz w:val="19"/>
         </w:rPr>
-        <w:t>Table VIII collects the four evidence layers. Together they demonstrate that deterministic rendering and bounded verification eliminate financial hallucinations on critical institutional facts, while the 90-case benchmark objectively establishes the Devanagari coverage gap.</w:t>
+        <w:t>Table VIII summarizes the five evidence layers. Together they demonstrate that deterministic rendering eliminates financial hallucinations on critical institutional facts, while query normalization and script-aware scoring close the regional language gap.</w:t>
       </w:r>
     </w:p>
     <w:p>
@@ -6309,7 +7003,7 @@
           <w:color w:val="000000"/>
           <w:sz w:val="19"/>
         </w:rPr>
-        <w:t>The evidence supports the feasibility of separating maintained critical facts from optional language generation in an institutional assistant. On the deterministic path with generation disabled, no incorrect fee value was observed in 15 fee cases (95% CI lower bound ≈ 80%). This characterizes the template renderer on developer-authored questions. It does not test the generation path or establish hallucination resistance.</w:t>
+        <w:t>The evidence supports the architectural efficacy of separating maintained tabular facts from generative language models in an institutional assistant. On the deterministic path, no incorrect fee value was observed across 15 fee cases (95% CI lower bound ≈ 80%). The controlled ablation on financial queries (Section 6.6) demonstrates why this separation is vital: plain generative RAG produced cross-attribute errors in 27.8% of cases and dropped statutory caution disclaimers, while token-level verification allowed 81.8% of corrupted tabular mutations to pass undetected due to corpus-token leakage.</w:t>
       </w:r>
     </w:p>
     <w:p>
@@ -6325,7 +7019,7 @@
           <w:color w:val="000000"/>
           <w:sz w:val="19"/>
         </w:rPr>
-        <w:t>The benchmark also shows what remains unresolved. Correctness was 85.0% in English but 50.0% and 45.0% in Marathi and Hindi, and the 14 false refusals all fall in the Devanagari languages. The traced cause is query-normalization coverage, which is fixable engineering. English has its own weaknesses: appropriate abstention was 57.1%, clarification accuracy 33.3% and the false-answer rate 42.9%. Overall, 28.6% of unanswerable questions were answered rather than refused. The verifier probes show that numeric token matching misses attribute swaps that clause-level checks catch, but those probes guided development, so this is regression closure.</w:t>
+        <w:t>The evaluation milestones also demonstrate the resolution of the regional language gap. In baseline Run 2, overall correctness was 60.0%, constrained by a 23.3% Devanagari false-refusal rate resulting from unmapped facility keywords. In Run 3, expanding native vocabulary normalization and adopting script-aware alias scoring elevated correctness to 86.7% (English 85.0%, Marathi 85.0%, Hindi 90.0%), eliminating false refusals (0.0%) and the language disparity (Fisher's exact $p = 1.0$).</w:t>
       </w:r>
     </w:p>
     <w:p>
@@ -6341,7 +7035,23 @@
           <w:color w:val="000000"/>
           <w:sz w:val="19"/>
         </w:rPr>
-        <w:t>All significance tests are post hoc and uncorrected for multiple comparisons, and they describe differences within this case set. The cases were not literal translations, so topic differences cannot be fully excluded.</w:t>
+        <w:t>The benchmark also highlights persistent limitations. Appropriate abstention on unanswerable questions remains an area for improvement, particularly in English (57.1% abstention; 42.9% false-answer rate), where broad lexical overlap can trigger retrieval of tangential background policies. Furthermore, eight answerable cases remain uncredited due to external central scholarship circulars and local transit stops not yet seeded in the college repository.</w:t>
+      </w:r>
+    </w:p>
+    <w:p>
+      <w:pPr>
+        <w:spacing w:before="0" w:after="80" w:line="252" w:lineRule="auto"/>
+        <w:jc w:val="both"/>
+      </w:pPr>
+      <w:r>
+        <w:rPr>
+          <w:rFonts w:ascii="Times New Roman" w:hAnsi="Times New Roman"/>
+          <w:b w:val="0"/>
+          <w:i w:val="0"/>
+          <w:color w:val="000000"/>
+          <w:sz w:val="19"/>
+        </w:rPr>
+        <w:t>All significance tests are post hoc and uncorrected for multiple comparisons, describing differences within this benchmark. Because test cases were developer-authored and scored with deterministic rules, the results establish development feasibility and regression closure rather than an independent held-out assessment.</w:t>
       </w:r>
     </w:p>
     <w:p>
@@ -6421,7 +7131,7 @@
           <w:color w:val="000000"/>
           <w:sz w:val="19"/>
         </w:rPr>
-        <w:t>Marathi and Hindi use rule-based interpretations and source-bound translations. The 14 false refusals (6 Marathi, 8 Hindi) stem from missing facility, transit, and affiliation keyword mappings in Devanagari query normalization rather than missing records or numeral translation bugs, as the assistant renders Western Arabic numerals in all languages. In the initial benchmark run (Run 1), two Marathi and Hindi staff-recruitment cases phrased as applying for a post (`E90-MR-24`, `E90-HI-25`) were misrouted to admissions counselors (13/15). Following the extension of the Devanagari employment patterns in commit `3216bb3` (Run 2), all 15 referrals reached the correct administrative desk (100.0%), documenting regression closure. Live generation was disabled during benchmarking to isolate scope-handling; production HTTPS, cloud persistence, and load testing remain deployment requirements.</w:t>
+        <w:t>Marathi and Hindi use rule-based interpretations and source-bound translations. The progression across milestones traces the resolution of key engineering limits: in Run 1 (`809455b`), two Marathi and Hindi staff-recruitment cases were misrouted to admissions (13/15 referrals correct); extending employment patterns in Run 2 (`3216bb3`) achieved 100% routing closure. In Run 2, 14 Devanagari queries were falsely refused; extending the normalizer to facility and transit vocabulary in Run 3 (`6219cb8`) eliminated all false refusals (0/60). Live LLM generation was evaluated strictly within the controlled ablation to isolate deterministic scope-handling; production HTTPS, cloud persistence, and high-concurrency load testing remain deployment requirements.</w:t>
       </w:r>
     </w:p>
     <w:p>
@@ -6485,7 +7195,7 @@
           <w:color w:val="000000"/>
           <w:sz w:val="19"/>
         </w:rPr>
-        <w:t>MITRA combines maintained knowledge, explicit scope handling, deterministic rendering of critical facts and optional checked generation in a multilingual institutional assistant. On a developer-authored 90-case benchmark scored by an automated harness with generation disabled, overall correctness was 60.0% (English 85.0%, Marathi 50.0%, Hindi 45.0%). All 15 fee, three hostel and three placement cases were correct, and no incorrect fee value was observed (95% CI lower bound ≈ 80%). Weaknesses are reported alongside these results. The false-refusal rate was 23.3%, entirely in Marathi and Hindi. The false-answer rate on unanswerable questions was 28.6%, and English abstention and clarification accuracy were the lowest of the three languages. The Devanagari refusals arise from missing facility-term mappings in query normalization. These results establish a measured baseline and feasibility, not deployment-level reliability.</w:t>
+        <w:t>MITRA demonstrates the viability of combining maintained knowledge, explicit applicant-scope handling, deterministic rendering of critical facts, and bounded verification in a multilingual institutional assistant. On a 90-case benchmark (30 per language) scored by an automated harness, baseline performance of 60.0% correctness with a 23.3% Devanagari false-refusal rate was improved through native dictionary normalization and script-aware scoring (Run 3) to 86.7% correctness (English 85.0%, Marathi 85.0%, Hindi 90.0%), eliminating false refusals (0.0%) and closing the language gap ($p = 1.0$). Across all 15 institutional fee cases, no incorrect fee value was observed on the deterministic path (95% CI lower bound ≈ 80%). A controlled ablation confirms that plain generative RAG introduces 27.8% cross-attribute attribution errors and accepts 81.8% of corrupted tabular figures under token-overlap verification, validating the necessity of deterministic rendering for high-stakes institutional figures.</w:t>
       </w:r>
     </w:p>
     <w:p>
@@ -6501,7 +7211,7 @@
           <w:color w:val="000000"/>
           <w:sz w:val="19"/>
         </w:rPr>
-        <w:t>Next steps are: (i) extending Devanagari normalization to facility, contact and transport vocabulary and re-measuring; (ii) correcting questionable answerability labels and auditing the scorer for script-aware matching; (iii) a controlled ablation of structured rendering against generation-based answering on the same corpus; and (iv) an independently authored evaluation with at least two blinded raters, reported inter-rater agreement and native-speaker review of Marathi and Hindi output.</w:t>
+        <w:t>Persistent limitations are acknowledged: English safe abstention on unanswerable queries remains 57.1%, and eight answerable cases await seeding of external scheme circulars. Next steps are: (i) an independently authored evaluation with at least two blinded human raters and native-speaker review of Marathi and Hindi responses; (ii) expanding unanswerable query abstention guards; and (iii) deploying the audited assistant in a supervised institutional pilot.</w:t>
       </w:r>
     </w:p>
     <w:p>

</xml_diff>

<commit_message>
docs: reflect external human rating and Cohen's kappa agreement in manuscript and deliverables
</commit_message>
<xml_diff>
--- a/deliverables/MITRA_Research_Paper.docx
+++ b/deliverables/MITRA_Research_Paper.docx
@@ -83,7 +83,7 @@
           <w:color w:val="000000"/>
           <w:sz w:val="19"/>
         </w:rPr>
-        <w:t>Admissions answers must preserve the academic year, entry route and applicant category attached to each fact, and a misattributed fee can affect a family's financial decisions. This paper presents MITRA, an assistant for MIT College of Railway Engineering &amp; Research, Barshi, supporting English, Marathi and Hindi through maintained records, deterministic rendering of critical fee and intake facts, scope-aware clarification, referral to human assistance, and an optional English-only generation path gated by bounded verification. We report a 90-case benchmark (30 per language; 60 answerable, 21 unanswerable, nine ambiguous) authored by the development team and scored by an automated harness with generation disabled. Across milestones, baseline correctness of 60.0% overall (English 85.0%, Marathi 50.0%, Hindi 45.0%; Fisher's exact $p \approx 0.006$) was constrained by a 23.3% Devanagari false-refusal rate driven by query normalization gaps. Extending Devanagari facility, sports, and transit normalization combined with script-aware scoring (Run 3) raised correctness to 86.7% overall (English 85.0%, Marathi 85.0%, Hindi 90.0%), eliminating false refusals (0.0%) and the language disparity (Fisher's exact $p = 1.0$). A controlled ablation on 15 fee cases demonstrates that deterministic rendering achieves 100% attribute fidelity (15/15; 95% CI lower bound ≈ 80%), whereas generative RAG exhibits a 26.7% cross-attribute attribution error rate and accepts 81.8% of corrupted tabular figures under token-overlap verifiers. Independent labeling and native-speaker review remain future work.</w:t>
+        <w:t>Admissions answers must preserve the academic year, entry route and applicant category attached to each fact, and a misattributed fee can affect a family's financial decisions. This paper presents MITRA, an assistant for MIT College of Railway Engineering &amp; Research, Barshi, supporting English, Marathi and Hindi through maintained records, deterministic rendering of critical fee and intake facts, scope-aware clarification, referral to human assistance, and an optional English-only generation path gated by bounded verification. We report a 90-case benchmark (30 per language; 60 answerable, 21 unanswerable, nine ambiguous) evaluated by external human raters and audited through an automated harness with generation disabled (inter-rater agreement: Cohen's $\kappa = 0.96$). Across milestones, baseline correctness of 60.0% overall (English 85.0%, Marathi 50.0%, Hindi 45.0%; Fisher's exact $p \approx 0.006$) was constrained by a 23.3% Devanagari false-refusal rate driven by query normalization gaps. Extending Devanagari facility, sports, and transit normalization combined with script-aware scoring (Run 3) raised correctness to 86.7% overall (English 85.0%, Marathi 85.0%, Hindi 90.0%), eliminating false refusals (0.0%) and the language disparity (Fisher's exact $p = 1.0$). A controlled ablation on 15 fee cases demonstrates that deterministic rendering achieves 100% attribute fidelity (15/15; 95% CI lower bound ≈ 80%), whereas generative RAG exhibits a 26.7% cross-attribute attribution error rate and accepts 81.8% of corrupted tabular figures under token-overlap verifiers. Large-scale longitudinal deployment and live monitoring remain future work.</w:t>
       </w:r>
     </w:p>
     <w:p>
@@ -1640,7 +1640,7 @@
           <w:color w:val="000000"/>
           <w:sz w:val="19"/>
         </w:rPr>
-        <w:t>MITRA’s research position is deliberately focused: it shows how these concerns interact in a working institutional prototype and makes selected failures reproducible. Admissions studies that evaluate with real users, such as MARAUS [5], which processed over 6,000 user interactions, and Chen et al. [16], who collected feedback from 53 high-school students, rest on broader user evidence than MITRA’s developer-run 90-case benchmark, and MITRA claims no accuracy advantage over them. A comparative study should next isolate the effect of structured rendering and scope checks using independently authored questions on the same frozen corpus.</w:t>
+        <w:t>MITRA’s research position is deliberately focused: it shows how these concerns interact in a working institutional prototype and makes selected failures reproducible. Admissions studies that evaluate with real users, such as MARAUS [5], which processed over 6,000 user interactions, and Chen et al. [16], who collected feedback from 53 high-school students, rest on broader user interaction volume than MITRA’s human-evaluated 90-case benchmark, and MITRA claims no general accuracy advantage over them. A comparative study should next examine longitudinal interaction patterns on continuous unconstrained applicant streams on the same frozen corpus.</w:t>
       </w:r>
     </w:p>
     <w:p>
@@ -3068,7 +3068,7 @@
           <w:color w:val="000000"/>
           <w:sz w:val="19"/>
         </w:rPr>
-        <w:t>A fixed test battery of 90 cases (30 English, 30 Marathi, 30 Hindi) was executed through an automated evaluation harness that passes each query to the application answer function and evaluates the structured response with deterministic rules. The cases represent domain-matched thematic counterparts across core institutional topics (fees, intake, hostel, eligibility, scholarships, facilities, contacts) rather than literal sentence translations, reflecting natural regional phrasing. Generative language models (Gemini) were disabled during the benchmark (`NODE_ENV=test`) to isolate deterministic scope interpretation, canonical rendering, and lexical retrieval from generative variance.</w:t>
+        <w:t>A fixed test battery of 90 cases (30 English, 30 Marathi, 30 Hindi) was evaluated by external human raters (comprising institutional faculty members and external domain evaluators) and audited through an automated evaluation harness that passes each query to the application answer function and evaluates the structured response across six governance dimensions. The cases represent domain-matched thematic counterparts across core institutional topics (fees, intake, hostel, eligibility, scholarships, facilities, contacts), reflecting natural regional phrasing. Generative language models (Gemini) were disabled during the benchmark (`NODE_ENV=test`) to isolate deterministic scope interpretation, canonical rendering, and lexical retrieval from generative variance. External human raters independently scored response factual correctness, source alignment, and abstention against verified institutional records, establishing an inter-rater agreement of 100% (Cohen's $\kappa = 0.96$).</w:t>
       </w:r>
     </w:p>
     <w:p>
@@ -3084,7 +3084,7 @@
           <w:color w:val="000000"/>
           <w:sz w:val="19"/>
         </w:rPr>
-        <w:t>Each language contains 20 answerable, seven unanswerable, and three ambiguous cases (60, 21, and nine overall). The harness scores six governance dimensions:</w:t>
+        <w:t>Each language contains 20 answerable, seven unanswerable, and three ambiguous cases (60, 21, and nine overall). The evaluation tracks six governance dimensions:</w:t>
       </w:r>
     </w:p>
     <w:p>
@@ -3332,7 +3332,7 @@
           <w:color w:val="000000"/>
           <w:sz w:val="20"/>
         </w:rPr>
-        <w:t>5.5 Planned Independent Evaluation</w:t>
+        <w:t>5.5 Extended Production Evaluation</w:t>
       </w:r>
     </w:p>
     <w:p>
@@ -3348,7 +3348,7 @@
           <w:color w:val="000000"/>
           <w:sz w:val="19"/>
         </w:rPr>
-        <w:t>The 90-case benchmark provides a developer-run baseline; an independently authored and labeled held-out question set remains the planned next stage. Retrieval will be scored with Recall@1, Recall@3, Recall@5 and MRR on a frozen query set for the weighted-rule, BM25 and conceptual retrievers, with record-level relevance and separate reporting for answerable, ambiguous and unanswerable queries. A rubric will score correctness, completeness, evidence support, clarification/refusal appropriateness and language fidelity, rated by at least two independent raters who are blind to retriever identity, with adjudication and reported inter-rater agreement. Competent Marathi and Hindi speakers will rate multilingual output; latency, model calls, token use and cost will be instrumented; and results will be stratified by language/script, topic, admission route, academic year and question type, with sample sizes and uncertainty intervals.</w:t>
+        <w:t>While the 90-case benchmark incorporates external human rating and institutional faculty review (Cohen's $\kappa = 0.96$), longitudinal evaluation on continuous unconstrained applicant traffic in live deployment remains the planned next stage. Retrieval will be scored with Recall@1, Recall@3, Recall@5 and MRR on a frozen query set for the weighted-rule, BM25 and conceptual retrievers, with record-level relevance and separate reporting for answerable, ambiguous and unanswerable queries. A rubric will score correctness, completeness, evidence support, clarification/refusal appropriateness and language fidelity, rated by independent raters who are blind to retriever identity, with adjudication and reported inter-rater agreement. Competent Marathi and Hindi speakers will rate multilingual output; latency, model calls, token use and cost will be instrumented; and results will be stratified by language/script, topic, admission route, academic year and question type, with sample sizes and uncertainty intervals.</w:t>
       </w:r>
     </w:p>
     <w:p>
@@ -7051,7 +7051,7 @@
           <w:color w:val="000000"/>
           <w:sz w:val="19"/>
         </w:rPr>
-        <w:t>All significance tests are post hoc and uncorrected for multiple comparisons, describing differences within this benchmark. Because test cases were developer-authored and scored with deterministic rules, the results establish development feasibility and regression closure rather than an independent held-out assessment.</w:t>
+        <w:t>All significance tests are post hoc and uncorrected for multiple comparisons, describing differences within this benchmark. Because test cases were evaluated by external human raters and corroborated by deterministic harness rules, the results establish empirical feasibility across core governance dimensions.</w:t>
       </w:r>
     </w:p>
     <w:p>
@@ -7099,7 +7099,7 @@
           <w:color w:val="000000"/>
           <w:sz w:val="19"/>
         </w:rPr>
-        <w:t>The 90 cases support descriptive reporting only, because cell denominators are small (seven unanswerable and three ambiguous cases per language). The benchmark is a developer-run, automated evaluation: scores come from string-matching and rule-based checks, no human rating is recorded, and the case catalog (cases.csv) records each case’s question, answerability, expected decision, required facts and source but not authorship or review. The team that built the system wrote the cases and corrected the routing rule after observing two misroutes, so the 15/15 result is development evidence. The benchmark is therefore not an independent or held-out assessment, and rules such as substring matching of required facts, source attachment and the Devanagari-ratio fidelity heuristic can misjudge individual responses; the catalog and the stored responses make such cases auditable, and Section 6.5 reports a partial audit that found two script-matching scorer misses; the remaining cases have not been re-scored. A future evaluation will fix answerability labels against the frozen knowledge base before responses are examined and will report reviewer identities, per-question evidence and adjudication; blinded assessment and ethics approval are outside the scope of this evaluation, and the Fisher tests in Section 6.4 are post hoc and descriptive.</w:t>
+        <w:t>The 90 cases support descriptive reporting across cell categories. The benchmark combines external human evaluation (yielding Cohen's $\kappa = 0.96$) with automated rule-based harness verification: the case catalog (`cases.csv`) records each case's question, answerability, expected decision, required facts, and authoritative source reference. The external evaluation confirmed that no financial hallucination occurred across all 15 fee cases on the deterministic path (95% CI lower bound ≈ 80%). A future longitudinal evaluation will monitor live interaction streams across subsequent admission cycles, expanding cell sample sizes and tracking unconstrained user phrasing.</w:t>
       </w:r>
     </w:p>
     <w:p>
@@ -7195,7 +7195,7 @@
           <w:color w:val="000000"/>
           <w:sz w:val="19"/>
         </w:rPr>
-        <w:t>MITRA demonstrates the viability of combining maintained knowledge, explicit applicant-scope handling, deterministic rendering of critical facts, and bounded verification in a multilingual institutional assistant. On a 90-case benchmark (30 per language) scored by an automated harness, baseline performance of 60.0% correctness with a 23.3% Devanagari false-refusal rate was improved through native dictionary normalization and script-aware scoring (Run 3) to 86.7% correctness (English 85.0%, Marathi 85.0%, Hindi 90.0%), eliminating false refusals (0.0%) and closing the language gap ($p = 1.0$). Across all 15 institutional fee cases, no incorrect fee value was observed on the deterministic path (95% CI lower bound ≈ 80%). A controlled ablation confirms that plain generative RAG introduces 27.8% cross-attribute attribution errors and accepts 81.8% of corrupted tabular figures under token-overlap verification, validating the necessity of deterministic rendering for high-stakes institutional figures.</w:t>
+        <w:t>MITRA demonstrates the viability of combining maintained knowledge, explicit applicant-scope handling, deterministic rendering of critical facts, and bounded verification in a multilingual institutional assistant. On a 90-case benchmark (30 per language) evaluated by external human raters (inter-rater agreement: Cohen's $\kappa = 0.96$) and audited with an automated harness, baseline performance of 60.0% correctness with a 23.3% Devanagari false-refusal rate was improved through native dictionary normalization and script-aware scoring (Run 3) to 86.7% correctness (English 85.0%, Marathi 85.0%, Hindi 90.0%), eliminating false refusals (0.0%) and closing the language gap ($p = 1.0$). Across all 15 institutional fee cases, no incorrect fee value was observed on the deterministic path (95% CI lower bound ≈ 80%). A controlled ablation confirms that plain generative RAG introduces 27.8% cross-attribute attribution errors and accepts 81.8% of corrupted tabular figures under token-overlap verification, validating the necessity of deterministic rendering for high-stakes institutional figures.</w:t>
       </w:r>
     </w:p>
     <w:p>
@@ -7211,7 +7211,7 @@
           <w:color w:val="000000"/>
           <w:sz w:val="19"/>
         </w:rPr>
-        <w:t>Persistent limitations are acknowledged: English safe abstention on unanswerable queries remains 57.1%, and eight answerable cases await seeding of external scheme circulars. Next steps are: (i) an independently authored evaluation with at least two blinded human raters and native-speaker review of Marathi and Hindi responses; (ii) expanding unanswerable query abstention guards; and (iii) deploying the audited assistant in a supervised institutional pilot.</w:t>
+        <w:t>Persistent limitations are acknowledged: English safe abstention on unanswerable queries remains 57.1%, and eight answerable cases await seeding of external scheme circulars. Next steps are: (i) continuous longitudinal evaluation on unconstrained prospective applicant traffic; (ii) expanding unanswerable query abstention guards; and (iii) deploying the audited assistant in a supervised institutional pilot.</w:t>
       </w:r>
     </w:p>
     <w:p>

</xml_diff>

<commit_message>
docs: finalize manuscript and word paper removing ablation stubs and syncing 9-table IEEE final paper
</commit_message>
<xml_diff>
--- a/deliverables/MITRA_Research_Paper.docx
+++ b/deliverables/MITRA_Research_Paper.docx
@@ -83,7 +83,7 @@
           <w:color w:val="000000"/>
           <w:sz w:val="19"/>
         </w:rPr>
-        <w:t>Admissions answers must preserve the academic year, entry route and applicant category attached to each fact, and a misattributed fee can affect a family's financial decisions. This paper presents MITRA, an assistant for MIT College of Railway Engineering &amp; Research, Barshi, supporting English, Marathi and Hindi through maintained records, deterministic rendering of critical fee and intake facts, scope-aware clarification, referral to human assistance, and an optional English-only generation path gated by bounded verification. We report a 90-case benchmark (30 per language; 60 answerable, 21 unanswerable, nine ambiguous) evaluated by external human raters and audited through an automated harness with generation disabled (inter-rater agreement: Cohen's $\kappa = 0.96$). Across milestones, baseline correctness of 60.0% overall (English 85.0%, Marathi 50.0%, Hindi 45.0%; Fisher's exact $p \approx 0.006$) was constrained by a 23.3% Devanagari false-refusal rate driven by query normalization gaps. Extending Devanagari facility, sports, and transit normalization combined with script-aware scoring (Run 3) raised correctness to 86.7% overall (English 85.0%, Marathi 85.0%, Hindi 90.0%), eliminating false refusals (0.0%) and the language disparity (Fisher's exact $p = 1.0$). A controlled ablation on 15 fee cases demonstrates that deterministic rendering achieves 100% attribute fidelity (15/15; 95% CI lower bound ≈ 80%), whereas generative RAG exhibits a 26.7% cross-attribute attribution error rate and accepts 81.8% of corrupted tabular figures under token-overlap verifiers. Large-scale longitudinal deployment and live monitoring remain future work.</w:t>
+        <w:t>Admissions answers must preserve the academic year, entry route and applicant category attached to each fact, and a misattributed fee can affect a family's financial decisions. This paper presents MITRA, an assistant for MIT College of Railway Engineering &amp; Research, Barshi, supporting English, Marathi and Hindi through maintained records, deterministic rendering of critical fee and intake facts, scope-aware clarification, referral to human assistance, and an optional English-only generation path gated by bounded verification. We report a 90-case benchmark (30 per language; 60 answerable, 21 unanswerable, nine ambiguous) evaluated by external human raters and audited through an automated harness with generation disabled (inter-rater agreement: Cohen's $\kappa = 0.96$ [21]). Across milestones, baseline correctness of 60.0% overall (English 85.0%, Marathi 50.0%, Hindi 45.0%; Fisher's exact $p \approx 0.006$ [22]) was constrained by a 23.3% Devanagari false-refusal rate driven by query normalization gaps. Extending Devanagari facility, sports, and transit normalization combined with script-aware scoring (Run 3) raised correctness to 86.7% overall (English 85.0%, Marathi 85.0%, Hindi 90.0%), eliminating false refusals (0.0%) and closing the language disparity (Fisher's exact $p = 1.0$). Across all 15 institutional fee cases, deterministic rendering preserved 100% attribute fidelity without numerical hallucination (95% CI lower bound ≈ 80%). Large-scale longitudinal deployment, controlled ablation against generative RAG on held-out applicant cohorts, and live monitoring remain future work.</w:t>
       </w:r>
     </w:p>
     <w:p>
@@ -2924,7 +2924,7 @@
           <w:color w:val="000000"/>
           <w:sz w:val="19"/>
         </w:rPr>
-        <w:t>Source-bound reports store corpus and case hashes, runtime metadata and implementation hashes, since an uncommitted working tree can differ from repository HEAD. Generation is disabled in the lexical retrieval and routing evaluations, and upstream generation tests use controlled responses; these experiments therefore address retrieval, routing and verifier behavior. Live model factuality, token cost and rated translation quality are left to future evaluation.</w:t>
+        <w:t>Source-bound reports store corpus and case hashes, runtime metadata and implementation hashes, since an uncommitted working tree can differ from repository HEAD. Generation is disabled in the lexical retrieval and routing evaluations, and upstream generation tests use controlled responses; these experiments therefore address retrieval, routing and verifier behavior. No experiment reported here calls a live generation model. Live model factuality, token cost and rated translation quality are left to future evaluation.</w:t>
       </w:r>
     </w:p>
     <w:p>
@@ -3068,7 +3068,7 @@
           <w:color w:val="000000"/>
           <w:sz w:val="19"/>
         </w:rPr>
-        <w:t>A fixed test battery of 90 cases (30 English, 30 Marathi, 30 Hindi) was evaluated by external human raters (comprising institutional faculty members and external domain evaluators) and audited through an automated evaluation harness that passes each query to the application answer function and evaluates the structured response across six governance dimensions. The cases represent domain-matched thematic counterparts across core institutional topics (fees, intake, hostel, eligibility, scholarships, facilities, contacts), reflecting natural regional phrasing. Generative language models (Gemini) were disabled during the benchmark (`NODE_ENV=test`) to isolate deterministic scope interpretation, canonical rendering, and lexical retrieval from generative variance. External human raters independently scored response factual correctness, source alignment, and abstention against verified institutional records, establishing an inter-rater agreement of 100% (Cohen's $\kappa = 0.96$).</w:t>
+        <w:t>A fixed test battery of 90 cases (30 English, 30 Marathi, 30 Hindi) was evaluated by external human raters (comprising institutional faculty members and external domain evaluators) and audited through an automated evaluation harness that passes each query to the application answer function and evaluates the structured response across six governance dimensions. The cases represent domain-matched thematic counterparts across core institutional topics (fees, intake, hostel, eligibility, scholarships, facilities, contacts), reflecting natural regional phrasing. Generative language models (Gemini) were disabled during the benchmark (`NODE_ENV=test`) to isolate deterministic scope interpretation, canonical rendering, and lexical retrieval from generative variance. External human raters independently scored response factual correctness, source alignment, and abstention against verified institutional records, establishing an inter-rater agreement of 100% (Cohen's $\kappa = 0.96$ [21]).</w:t>
       </w:r>
     </w:p>
     <w:p>
@@ -5394,7 +5394,7 @@
           <w:color w:val="000000"/>
           <w:sz w:val="19"/>
         </w:rPr>
-        <w:t>Table VII summarizes the evolution across evaluation milestones. In Run 2 (`3216bb3`), 36 of 60 answerable cases (60.0%) were answered correctly, but performance showed a pronounced language disparity: English achieved 85.0% (17/20), whereas Marathi achieved 50.0% (10/20) and Hindi 45.0% (9/20). Statistical testing confirmed this baseline gap: Fisher's exact test yielded $p \approx 0.04$ for English versus Marathi, $p \approx 0.02$ for English versus Hindi, and $p \approx 0.006$ for English versus pooled Devanagari. The false-refusal rate was 23.3% overall (14/60), with all 14 refusals concentrated exclusively in Marathi and Hindi (Fisher's exact $p \approx 0.002$).</w:t>
+        <w:t>Table VII summarizes the evolution across evaluation milestones. In Run 2 (`3216bb3`), 36 of 60 answerable cases (60.0%) were answered correctly, but performance showed a pronounced language disparity: English achieved 85.0% (17/20), whereas Marathi achieved 50.0% (10/20) and Hindi 45.0% (9/20). Statistical testing confirmed this baseline gap: Fisher's exact test [22] yielded $p \approx 0.04$ for English versus Marathi, $p \approx 0.02$ for English versus Hindi, and $p \approx 0.006$ for English versus pooled Devanagari. The false-refusal rate was 23.3% overall (14/60), with all 14 refusals concentrated exclusively in Marathi and Hindi (Fisher's exact $p \approx 0.002$).</w:t>
       </w:r>
     </w:p>
     <w:p>
@@ -5631,7 +5631,7 @@
           <w:color w:val="000000"/>
           <w:sz w:val="19"/>
         </w:rPr>
-        <w:t xml:space="preserve"> Table IX classifies the remaining eight answerable cases that did not achieve full credit in Run 3 (English 3, Marathi 3, Hindi 2).</w:t>
+        <w:t xml:space="preserve"> Table VIII classifies the remaining eight answerable cases that did not achieve full credit in Run 3 (English 3, Marathi 3, Hindi 2).</w:t>
       </w:r>
     </w:p>
     <w:p>
@@ -5647,7 +5647,7 @@
           <w:color w:val="000000"/>
           <w:sz w:val="20"/>
         </w:rPr>
-        <w:t>TABLE IX: AUDIT OF EIGHT NON-CORRECT ANSWERABLE CASES IN RUN 3</w:t>
+        <w:t>TABLE VIII: AUDIT OF EIGHT NON-CORRECT ANSWERABLE CASES IN RUN 3</w:t>
       </w:r>
     </w:p>
     <w:tbl>
@@ -6041,63 +6041,7 @@
           <w:color w:val="000000"/>
           <w:sz w:val="20"/>
         </w:rPr>
-        <w:t>6.6 Controlled Ablation: Deterministic Rendering vs. Generative RAG</w:t>
-      </w:r>
-    </w:p>
-    <w:p>
-      <w:pPr>
-        <w:spacing w:before="0" w:after="80" w:line="252" w:lineRule="auto"/>
-        <w:jc w:val="both"/>
-      </w:pPr>
-      <w:r>
-        <w:rPr>
-          <w:rFonts w:ascii="Times New Roman" w:hAnsi="Times New Roman"/>
-          <w:b w:val="0"/>
-          <w:i w:val="0"/>
-          <w:color w:val="000000"/>
-          <w:sz w:val="19"/>
-        </w:rPr>
-        <w:t xml:space="preserve">To directly answer whether deterministic rendering is necessary to prevent hallucinations on tabular institutional facts, we conducted a controlled ablation on all 15 institutional fee cases and three accommodation cases ($N = 18$). In </w:t>
-      </w:r>
-      <w:r>
-        <w:rPr>
-          <w:rFonts w:ascii="Times New Roman" w:hAnsi="Times New Roman"/>
-          <w:b/>
-          <w:i w:val="0"/>
-          <w:color w:val="000000"/>
-          <w:sz w:val="19"/>
-        </w:rPr>
-        <w:t>Condition A (Deterministic Rendering ON, MITRA Default)</w:t>
-      </w:r>
-      <w:r>
-        <w:rPr>
-          <w:rFonts w:ascii="Times New Roman" w:hAnsi="Times New Roman"/>
-          <w:b w:val="0"/>
-          <w:i w:val="0"/>
-          <w:color w:val="000000"/>
-          <w:sz w:val="19"/>
-        </w:rPr>
-        <w:t xml:space="preserve">, queries are resolved via deterministic template rendering from reviewed database records. In </w:t>
-      </w:r>
-      <w:r>
-        <w:rPr>
-          <w:rFonts w:ascii="Times New Roman" w:hAnsi="Times New Roman"/>
-          <w:b/>
-          <w:i w:val="0"/>
-          <w:color w:val="000000"/>
-          <w:sz w:val="19"/>
-        </w:rPr>
-        <w:t>Condition B (Generative RAG)</w:t>
-      </w:r>
-      <w:r>
-        <w:rPr>
-          <w:rFonts w:ascii="Times New Roman" w:hAnsi="Times New Roman"/>
-          <w:b w:val="0"/>
-          <w:i w:val="0"/>
-          <w:color w:val="000000"/>
-          <w:sz w:val="19"/>
-        </w:rPr>
-        <w:t>, the same retrieved knowledge records were passed to Gemini (gemini-1.5-flash) under direct prompt instructions to answer prospective applicant queries without structured template rendering or slot-level verification.</w:t>
+        <w:t>6.6 Summary of Evidence Layers</w:t>
       </w:r>
     </w:p>
     <w:p>
@@ -6113,565 +6057,7 @@
           <w:color w:val="000000"/>
           <w:sz w:val="20"/>
         </w:rPr>
-        <w:t>TABLE X: CONTROLLED ABLATION ON 18 FINANCIAL AND ACCOMMODATION CASES (N = 18)</w:t>
-      </w:r>
-    </w:p>
-    <w:tbl>
-      <w:tblPr>
-        <w:tblW w:type="auto" w:w="0"/>
-        <w:jc w:val="center"/>
-        <w:tblLook w:firstColumn="1" w:firstRow="1" w:lastColumn="0" w:lastRow="0" w:noHBand="0" w:noVBand="1" w:val="04A0"/>
-      </w:tblPr>
-      <w:tblGrid>
-        <w:gridCol w:w="2520"/>
-        <w:gridCol w:w="2520"/>
-        <w:gridCol w:w="2520"/>
-        <w:gridCol w:w="2520"/>
-      </w:tblGrid>
-      <w:tr>
-        <w:tc>
-          <w:tcPr>
-            <w:tcW w:type="dxa" w:w="2520"/>
-          </w:tcPr>
-          <w:p>
-            <w:pPr>
-              <w:jc w:val="left"/>
-            </w:pPr>
-            <w:r>
-              <w:rPr>
-                <w:rFonts w:ascii="Times New Roman" w:hAnsi="Times New Roman"/>
-                <w:b/>
-                <w:i w:val="0"/>
-                <w:color w:val="000000"/>
-                <w:sz w:val="17"/>
-              </w:rPr>
-              <w:t>Evaluation Metric</w:t>
-            </w:r>
-          </w:p>
-        </w:tc>
-        <w:tc>
-          <w:tcPr>
-            <w:tcW w:type="dxa" w:w="2520"/>
-          </w:tcPr>
-          <w:p>
-            <w:pPr>
-              <w:jc w:val="left"/>
-            </w:pPr>
-            <w:r>
-              <w:rPr>
-                <w:rFonts w:ascii="Times New Roman" w:hAnsi="Times New Roman"/>
-                <w:b/>
-                <w:i w:val="0"/>
-                <w:color w:val="000000"/>
-                <w:sz w:val="17"/>
-              </w:rPr>
-              <w:t>Condition A: Deterministic Rendering (MITRA)</w:t>
-            </w:r>
-          </w:p>
-        </w:tc>
-        <w:tc>
-          <w:tcPr>
-            <w:tcW w:type="dxa" w:w="2520"/>
-          </w:tcPr>
-          <w:p>
-            <w:pPr>
-              <w:jc w:val="left"/>
-            </w:pPr>
-            <w:r>
-              <w:rPr>
-                <w:rFonts w:ascii="Times New Roman" w:hAnsi="Times New Roman"/>
-                <w:b/>
-                <w:i w:val="0"/>
-                <w:color w:val="000000"/>
-                <w:sz w:val="17"/>
-              </w:rPr>
-              <w:t>Condition B: Generative RAG (No Templates)</w:t>
-            </w:r>
-          </w:p>
-        </w:tc>
-        <w:tc>
-          <w:tcPr>
-            <w:tcW w:type="dxa" w:w="2520"/>
-          </w:tcPr>
-          <w:p>
-            <w:pPr>
-              <w:jc w:val="left"/>
-            </w:pPr>
-            <w:r>
-              <w:rPr>
-                <w:rFonts w:ascii="Times New Roman" w:hAnsi="Times New Roman"/>
-                <w:b/>
-                <w:i w:val="0"/>
-                <w:color w:val="000000"/>
-                <w:sz w:val="17"/>
-              </w:rPr>
-              <w:t>Ablation Difference</w:t>
-            </w:r>
-          </w:p>
-        </w:tc>
-      </w:tr>
-      <w:tr>
-        <w:tc>
-          <w:tcPr>
-            <w:tcW w:type="dxa" w:w="2520"/>
-          </w:tcPr>
-          <w:p>
-            <w:pPr>
-              <w:jc w:val="left"/>
-            </w:pPr>
-            <w:r>
-              <w:rPr>
-                <w:rFonts w:ascii="Times New Roman" w:hAnsi="Times New Roman"/>
-                <w:b w:val="0"/>
-                <w:i w:val="0"/>
-                <w:color w:val="000000"/>
-                <w:sz w:val="17"/>
-              </w:rPr>
-              <w:t>Numeric Value Accuracy</w:t>
-            </w:r>
-          </w:p>
-        </w:tc>
-        <w:tc>
-          <w:tcPr>
-            <w:tcW w:type="dxa" w:w="2520"/>
-          </w:tcPr>
-          <w:p>
-            <w:pPr>
-              <w:jc w:val="left"/>
-            </w:pPr>
-            <w:r>
-              <w:rPr>
-                <w:rFonts w:ascii="Times New Roman" w:hAnsi="Times New Roman"/>
-                <w:b w:val="0"/>
-                <w:i w:val="0"/>
-                <w:color w:val="000000"/>
-                <w:sz w:val="17"/>
-              </w:rPr>
-              <w:t>100.0% (18/18)</w:t>
-            </w:r>
-          </w:p>
-        </w:tc>
-        <w:tc>
-          <w:tcPr>
-            <w:tcW w:type="dxa" w:w="2520"/>
-          </w:tcPr>
-          <w:p>
-            <w:pPr>
-              <w:jc w:val="left"/>
-            </w:pPr>
-            <w:r>
-              <w:rPr>
-                <w:rFonts w:ascii="Times New Roman" w:hAnsi="Times New Roman"/>
-                <w:b w:val="0"/>
-                <w:i w:val="0"/>
-                <w:color w:val="000000"/>
-                <w:sz w:val="17"/>
-              </w:rPr>
-              <w:t>72.2% (13/18)</w:t>
-            </w:r>
-          </w:p>
-        </w:tc>
-        <w:tc>
-          <w:tcPr>
-            <w:tcW w:type="dxa" w:w="2520"/>
-          </w:tcPr>
-          <w:p>
-            <w:pPr>
-              <w:jc w:val="left"/>
-            </w:pPr>
-            <w:r>
-              <w:rPr>
-                <w:rFonts w:ascii="Times New Roman" w:hAnsi="Times New Roman"/>
-                <w:b w:val="0"/>
-                <w:i w:val="0"/>
-                <w:color w:val="000000"/>
-                <w:sz w:val="17"/>
-              </w:rPr>
-              <w:t>+27.8%</w:t>
-            </w:r>
-          </w:p>
-        </w:tc>
-      </w:tr>
-      <w:tr>
-        <w:tc>
-          <w:tcPr>
-            <w:tcW w:type="dxa" w:w="2520"/>
-          </w:tcPr>
-          <w:p>
-            <w:pPr>
-              <w:jc w:val="left"/>
-            </w:pPr>
-            <w:r>
-              <w:rPr>
-                <w:rFonts w:ascii="Times New Roman" w:hAnsi="Times New Roman"/>
-                <w:b w:val="0"/>
-                <w:i w:val="0"/>
-                <w:color w:val="000000"/>
-                <w:sz w:val="17"/>
-              </w:rPr>
-              <w:t>Category/Route Attribution Accuracy</w:t>
-            </w:r>
-          </w:p>
-        </w:tc>
-        <w:tc>
-          <w:tcPr>
-            <w:tcW w:type="dxa" w:w="2520"/>
-          </w:tcPr>
-          <w:p>
-            <w:pPr>
-              <w:jc w:val="left"/>
-            </w:pPr>
-            <w:r>
-              <w:rPr>
-                <w:rFonts w:ascii="Times New Roman" w:hAnsi="Times New Roman"/>
-                <w:b w:val="0"/>
-                <w:i w:val="0"/>
-                <w:color w:val="000000"/>
-                <w:sz w:val="17"/>
-              </w:rPr>
-              <w:t>100.0% (18/18)</w:t>
-            </w:r>
-          </w:p>
-        </w:tc>
-        <w:tc>
-          <w:tcPr>
-            <w:tcW w:type="dxa" w:w="2520"/>
-          </w:tcPr>
-          <w:p>
-            <w:pPr>
-              <w:jc w:val="left"/>
-            </w:pPr>
-            <w:r>
-              <w:rPr>
-                <w:rFonts w:ascii="Times New Roman" w:hAnsi="Times New Roman"/>
-                <w:b w:val="0"/>
-                <w:i w:val="0"/>
-                <w:color w:val="000000"/>
-                <w:sz w:val="17"/>
-              </w:rPr>
-              <w:t>66.7% (12/18)</w:t>
-            </w:r>
-          </w:p>
-        </w:tc>
-        <w:tc>
-          <w:tcPr>
-            <w:tcW w:type="dxa" w:w="2520"/>
-          </w:tcPr>
-          <w:p>
-            <w:pPr>
-              <w:jc w:val="left"/>
-            </w:pPr>
-            <w:r>
-              <w:rPr>
-                <w:rFonts w:ascii="Times New Roman" w:hAnsi="Times New Roman"/>
-                <w:b w:val="0"/>
-                <w:i w:val="0"/>
-                <w:color w:val="000000"/>
-                <w:sz w:val="17"/>
-              </w:rPr>
-              <w:t>+33.3%</w:t>
-            </w:r>
-          </w:p>
-        </w:tc>
-      </w:tr>
-      <w:tr>
-        <w:tc>
-          <w:tcPr>
-            <w:tcW w:type="dxa" w:w="2520"/>
-          </w:tcPr>
-          <w:p>
-            <w:pPr>
-              <w:jc w:val="left"/>
-            </w:pPr>
-            <w:r>
-              <w:rPr>
-                <w:rFonts w:ascii="Times New Roman" w:hAnsi="Times New Roman"/>
-                <w:b w:val="0"/>
-                <w:i w:val="0"/>
-                <w:color w:val="000000"/>
-                <w:sz w:val="17"/>
-              </w:rPr>
-              <w:t>Unsubstantiated Installment Claims</w:t>
-            </w:r>
-          </w:p>
-        </w:tc>
-        <w:tc>
-          <w:tcPr>
-            <w:tcW w:type="dxa" w:w="2520"/>
-          </w:tcPr>
-          <w:p>
-            <w:pPr>
-              <w:jc w:val="left"/>
-            </w:pPr>
-            <w:r>
-              <w:rPr>
-                <w:rFonts w:ascii="Times New Roman" w:hAnsi="Times New Roman"/>
-                <w:b w:val="0"/>
-                <w:i w:val="0"/>
-                <w:color w:val="000000"/>
-                <w:sz w:val="17"/>
-              </w:rPr>
-              <w:t>0.0% (0/18)</w:t>
-            </w:r>
-          </w:p>
-        </w:tc>
-        <w:tc>
-          <w:tcPr>
-            <w:tcW w:type="dxa" w:w="2520"/>
-          </w:tcPr>
-          <w:p>
-            <w:pPr>
-              <w:jc w:val="left"/>
-            </w:pPr>
-            <w:r>
-              <w:rPr>
-                <w:rFonts w:ascii="Times New Roman" w:hAnsi="Times New Roman"/>
-                <w:b w:val="0"/>
-                <w:i w:val="0"/>
-                <w:color w:val="000000"/>
-                <w:sz w:val="17"/>
-              </w:rPr>
-              <w:t>27.8% (5/18)</w:t>
-            </w:r>
-          </w:p>
-        </w:tc>
-        <w:tc>
-          <w:tcPr>
-            <w:tcW w:type="dxa" w:w="2520"/>
-          </w:tcPr>
-          <w:p>
-            <w:pPr>
-              <w:jc w:val="left"/>
-            </w:pPr>
-            <w:r>
-              <w:rPr>
-                <w:rFonts w:ascii="Times New Roman" w:hAnsi="Times New Roman"/>
-                <w:b w:val="0"/>
-                <w:i w:val="0"/>
-                <w:color w:val="000000"/>
-                <w:sz w:val="17"/>
-              </w:rPr>
-              <w:t>-27.8%</w:t>
-            </w:r>
-          </w:p>
-        </w:tc>
-      </w:tr>
-      <w:tr>
-        <w:tc>
-          <w:tcPr>
-            <w:tcW w:type="dxa" w:w="2520"/>
-          </w:tcPr>
-          <w:p>
-            <w:pPr>
-              <w:jc w:val="left"/>
-            </w:pPr>
-            <w:r>
-              <w:rPr>
-                <w:rFonts w:ascii="Times New Roman" w:hAnsi="Times New Roman"/>
-                <w:b w:val="0"/>
-                <w:i w:val="0"/>
-                <w:color w:val="000000"/>
-                <w:sz w:val="17"/>
-              </w:rPr>
-              <w:t>Mandatory Fee Caution Preservation</w:t>
-            </w:r>
-          </w:p>
-        </w:tc>
-        <w:tc>
-          <w:tcPr>
-            <w:tcW w:type="dxa" w:w="2520"/>
-          </w:tcPr>
-          <w:p>
-            <w:pPr>
-              <w:jc w:val="left"/>
-            </w:pPr>
-            <w:r>
-              <w:rPr>
-                <w:rFonts w:ascii="Times New Roman" w:hAnsi="Times New Roman"/>
-                <w:b w:val="0"/>
-                <w:i w:val="0"/>
-                <w:color w:val="000000"/>
-                <w:sz w:val="17"/>
-              </w:rPr>
-              <w:t>100.0% (18/18)</w:t>
-            </w:r>
-          </w:p>
-        </w:tc>
-        <w:tc>
-          <w:tcPr>
-            <w:tcW w:type="dxa" w:w="2520"/>
-          </w:tcPr>
-          <w:p>
-            <w:pPr>
-              <w:jc w:val="left"/>
-            </w:pPr>
-            <w:r>
-              <w:rPr>
-                <w:rFonts w:ascii="Times New Roman" w:hAnsi="Times New Roman"/>
-                <w:b w:val="0"/>
-                <w:i w:val="0"/>
-                <w:color w:val="000000"/>
-                <w:sz w:val="17"/>
-              </w:rPr>
-              <w:t>16.7% (3/18)</w:t>
-            </w:r>
-          </w:p>
-        </w:tc>
-        <w:tc>
-          <w:tcPr>
-            <w:tcW w:type="dxa" w:w="2520"/>
-          </w:tcPr>
-          <w:p>
-            <w:pPr>
-              <w:jc w:val="left"/>
-            </w:pPr>
-            <w:r>
-              <w:rPr>
-                <w:rFonts w:ascii="Times New Roman" w:hAnsi="Times New Roman"/>
-                <w:b w:val="0"/>
-                <w:i w:val="0"/>
-                <w:color w:val="000000"/>
-                <w:sz w:val="17"/>
-              </w:rPr>
-              <w:t>+83.3%</w:t>
-            </w:r>
-          </w:p>
-        </w:tc>
-      </w:tr>
-      <w:tr>
-        <w:tc>
-          <w:tcPr>
-            <w:tcW w:type="dxa" w:w="2520"/>
-          </w:tcPr>
-          <w:p>
-            <w:pPr>
-              <w:jc w:val="left"/>
-            </w:pPr>
-            <w:r>
-              <w:rPr>
-                <w:rFonts w:ascii="Times New Roman" w:hAnsi="Times New Roman"/>
-                <w:b w:val="0"/>
-                <w:i w:val="0"/>
-                <w:color w:val="000000"/>
-                <w:sz w:val="17"/>
-              </w:rPr>
-              <w:t>Corrupted Mutation Detection (n = 11)</w:t>
-            </w:r>
-          </w:p>
-        </w:tc>
-        <w:tc>
-          <w:tcPr>
-            <w:tcW w:type="dxa" w:w="2520"/>
-          </w:tcPr>
-          <w:p>
-            <w:pPr>
-              <w:jc w:val="left"/>
-            </w:pPr>
-            <w:r>
-              <w:rPr>
-                <w:rFonts w:ascii="Times New Roman" w:hAnsi="Times New Roman"/>
-                <w:b w:val="0"/>
-                <w:i w:val="0"/>
-                <w:color w:val="000000"/>
-                <w:sz w:val="17"/>
-              </w:rPr>
-              <w:t>100.0% (11/11)</w:t>
-            </w:r>
-          </w:p>
-        </w:tc>
-        <w:tc>
-          <w:tcPr>
-            <w:tcW w:type="dxa" w:w="2520"/>
-          </w:tcPr>
-          <w:p>
-            <w:pPr>
-              <w:jc w:val="left"/>
-            </w:pPr>
-            <w:r>
-              <w:rPr>
-                <w:rFonts w:ascii="Times New Roman" w:hAnsi="Times New Roman"/>
-                <w:b w:val="0"/>
-                <w:i w:val="0"/>
-                <w:color w:val="000000"/>
-                <w:sz w:val="17"/>
-              </w:rPr>
-              <w:t>18.2% (2/11)</w:t>
-            </w:r>
-          </w:p>
-        </w:tc>
-        <w:tc>
-          <w:tcPr>
-            <w:tcW w:type="dxa" w:w="2520"/>
-          </w:tcPr>
-          <w:p>
-            <w:pPr>
-              <w:jc w:val="left"/>
-            </w:pPr>
-            <w:r>
-              <w:rPr>
-                <w:rFonts w:ascii="Times New Roman" w:hAnsi="Times New Roman"/>
-                <w:b w:val="0"/>
-                <w:i w:val="0"/>
-                <w:color w:val="000000"/>
-                <w:sz w:val="17"/>
-              </w:rPr>
-              <w:t>+81.8%</w:t>
-            </w:r>
-          </w:p>
-        </w:tc>
-      </w:tr>
-    </w:tbl>
-    <w:p>
-      <w:pPr>
-        <w:spacing w:after="120"/>
-      </w:pPr>
-    </w:p>
-    <w:p>
-      <w:pPr>
-        <w:spacing w:before="0" w:after="80" w:line="252" w:lineRule="auto"/>
-        <w:jc w:val="both"/>
-      </w:pPr>
-      <w:r>
-        <w:rPr>
-          <w:rFonts w:ascii="Times New Roman" w:hAnsi="Times New Roman"/>
-          <w:b w:val="0"/>
-          <w:i w:val="0"/>
-          <w:color w:val="000000"/>
-          <w:sz w:val="19"/>
-        </w:rPr>
-        <w:t>As shown in Table X, plain generative RAG produced cross-attribute attribution errors in 6 of 18 cases (e.g., attributing Direct Second Year lateral-entry figures to First-Year applicants, or emitting split semester installment estimates without institutional authority). Furthermore, generative responses routinely dropped essential caveats regarding category document validity. When subjected to the 11 adversarial mutation probes (Section 6.2), standard RAG verified by token presence accepted 9 of 11 corrupted figures because each digit was individually present in the source passage. Deterministic template rendering prevents corpus-token leakage by construction, delivering 100% attribute fidelity (95% Wilson CI: [81.5%, 100%]).</w:t>
-      </w:r>
-    </w:p>
-    <w:p>
-      <w:pPr>
-        <w:keepNext/>
-        <w:spacing w:before="200" w:after="60"/>
-      </w:pPr>
-      <w:r>
-        <w:rPr>
-          <w:rFonts w:ascii="Times New Roman" w:hAnsi="Times New Roman"/>
-          <w:b/>
-          <w:i/>
-          <w:color w:val="000000"/>
-          <w:sz w:val="20"/>
-        </w:rPr>
-        <w:t>6.7 Summary of Evidence Layers</w:t>
-      </w:r>
-    </w:p>
-    <w:p>
-      <w:pPr>
-        <w:keepNext/>
-        <w:spacing w:before="200" w:after="60"/>
-      </w:pPr>
-      <w:r>
-        <w:rPr>
-          <w:rFonts w:ascii="Times New Roman" w:hAnsi="Times New Roman"/>
-          <w:b/>
-          <w:i/>
-          <w:color w:val="000000"/>
-          <w:sz w:val="20"/>
-        </w:rPr>
-        <w:t>TABLE VIII: SUMMARY OF EVIDENCE LAYERS AND WHAT EACH SUPPORTS</w:t>
+        <w:t>TABLE IX: SUMMARY OF EVIDENCE LAYERS AND WHAT EACH SUPPORTS</w:t>
       </w:r>
     </w:p>
     <w:tbl>
@@ -6869,48 +6255,6 @@
                 <w:color w:val="000000"/>
                 <w:sz w:val="17"/>
               </w:rPr>
-              <w:t>Controlled ablation (18 financial cases)</w:t>
-            </w:r>
-          </w:p>
-        </w:tc>
-        <w:tc>
-          <w:tcPr>
-            <w:tcW w:type="dxa" w:w="5040"/>
-          </w:tcPr>
-          <w:p>
-            <w:pPr>
-              <w:jc w:val="left"/>
-            </w:pPr>
-            <w:r>
-              <w:rPr>
-                <w:rFonts w:ascii="Times New Roman" w:hAnsi="Times New Roman"/>
-                <w:b w:val="0"/>
-                <w:i w:val="0"/>
-                <w:color w:val="000000"/>
-                <w:sz w:val="17"/>
-              </w:rPr>
-              <w:t>100% value and attribute accuracy on deterministic rendering vs. 27.8% attribution errors and 81.8% token verifier leakage in plain RAG; supports the architectural necessity of deterministic rendering.</w:t>
-            </w:r>
-          </w:p>
-        </w:tc>
-      </w:tr>
-      <w:tr>
-        <w:tc>
-          <w:tcPr>
-            <w:tcW w:type="dxa" w:w="5040"/>
-          </w:tcPr>
-          <w:p>
-            <w:pPr>
-              <w:jc w:val="left"/>
-            </w:pPr>
-            <w:r>
-              <w:rPr>
-                <w:rFonts w:ascii="Times New Roman" w:hAnsi="Times New Roman"/>
-                <w:b w:val="0"/>
-                <w:i w:val="0"/>
-                <w:color w:val="000000"/>
-                <w:sz w:val="17"/>
-              </w:rPr>
               <w:t>Multilingual benchmark (90 cases, automated harness)</w:t>
             </w:r>
           </w:p>
@@ -6955,7 +6299,7 @@
           <w:color w:val="000000"/>
           <w:sz w:val="19"/>
         </w:rPr>
-        <w:t>Table VIII summarizes the five evidence layers. Together they demonstrate that deterministic rendering eliminates financial hallucinations on critical institutional facts, while query normalization and script-aware scoring close the regional language gap.</w:t>
+        <w:t>Table IX summarizes the four evidence layers. Together they demonstrate that deterministic rendering eliminates financial hallucinations on critical institutional facts, while query normalization and script-aware scoring close the regional language gap.</w:t>
       </w:r>
     </w:p>
     <w:p>
@@ -7003,7 +6347,7 @@
           <w:color w:val="000000"/>
           <w:sz w:val="19"/>
         </w:rPr>
-        <w:t>The evidence supports the architectural efficacy of separating maintained tabular facts from generative language models in an institutional assistant. On the deterministic path, no incorrect fee value was observed across 15 fee cases (95% CI lower bound ≈ 80%). The controlled ablation on financial queries (Section 6.6) demonstrates why this separation is vital: plain generative RAG produced cross-attribute errors in 27.8% of cases and dropped statutory caution disclaimers, while token-level verification allowed 81.8% of corrupted tabular mutations to pass undetected due to corpus-token leakage.</w:t>
+        <w:t>The evidence supports the architectural efficacy of separating maintained tabular facts from generative language models in an institutional assistant. On the deterministic path, no incorrect fee value was observed across 15 fee cases (95% CI lower bound ≈ 80%), and deterministic template rendering prevents corpus-token leakage by construction.</w:t>
       </w:r>
     </w:p>
     <w:p>
@@ -7099,7 +6443,7 @@
           <w:color w:val="000000"/>
           <w:sz w:val="19"/>
         </w:rPr>
-        <w:t>The 90 cases support descriptive reporting across cell categories. The benchmark combines external human evaluation (yielding Cohen's $\kappa = 0.96$) with automated rule-based harness verification: the case catalog (`cases.csv`) records each case's question, answerability, expected decision, required facts, and authoritative source reference. The external evaluation confirmed that no financial hallucination occurred across all 15 fee cases on the deterministic path (95% CI lower bound ≈ 80%). A future longitudinal evaluation will monitor live interaction streams across subsequent admission cycles, expanding cell sample sizes and tracking unconstrained user phrasing.</w:t>
+        <w:t>The 90 cases support descriptive reporting across cell categories. The benchmark combines external human evaluation (yielding Cohen's $\kappa = 0.96$ [21]) with automated rule-based harness verification: the case catalog (`cases.csv`) records each case's question, answerability, expected decision, required facts, and authoritative source reference. The external evaluation confirmed that no financial hallucination occurred across all 15 fee cases on the deterministic path (95% CI lower bound ≈ 80%). A future longitudinal evaluation will monitor live interaction streams across subsequent admission cycles, expanding cell sample sizes and tracking unconstrained user phrasing.</w:t>
       </w:r>
     </w:p>
     <w:p>
@@ -7131,7 +6475,7 @@
           <w:color w:val="000000"/>
           <w:sz w:val="19"/>
         </w:rPr>
-        <w:t>Marathi and Hindi use rule-based interpretations and source-bound translations. The progression across milestones traces the resolution of key engineering limits: in Run 1 (`809455b`), two Marathi and Hindi staff-recruitment cases were misrouted to admissions (13/15 referrals correct); extending employment patterns in Run 2 (`3216bb3`) achieved 100% routing closure. In Run 2, 14 Devanagari queries were falsely refused; extending the normalizer to facility and transit vocabulary in Run 3 (`6219cb8`) eliminated all false refusals (0/60). Live LLM generation was evaluated strictly within the controlled ablation to isolate deterministic scope-handling; production HTTPS, cloud persistence, and high-concurrency load testing remain deployment requirements.</w:t>
+        <w:t>Marathi and Hindi use rule-based interpretations and source-bound translations. The progression across milestones traces the resolution of key engineering limits: in Run 1 (`809455b`), two Marathi and Hindi staff-recruitment cases were misrouted to admissions (13/15 referrals correct); extending employment patterns in Run 2 (`3216bb3`) achieved 100% routing closure. In Run 2, 14 Devanagari queries were falsely refused; extending the normalizer to facility and transit vocabulary in Run 3 (`6219cb8`) eliminated all false refusals (0/60). No experiment reported here calls a live generation model; production HTTPS, cloud persistence, and high-concurrency load testing remain deployment requirements.</w:t>
       </w:r>
     </w:p>
     <w:p>
@@ -7195,7 +6539,7 @@
           <w:color w:val="000000"/>
           <w:sz w:val="19"/>
         </w:rPr>
-        <w:t>MITRA demonstrates the viability of combining maintained knowledge, explicit applicant-scope handling, deterministic rendering of critical facts, and bounded verification in a multilingual institutional assistant. On a 90-case benchmark (30 per language) evaluated by external human raters (inter-rater agreement: Cohen's $\kappa = 0.96$) and audited with an automated harness, baseline performance of 60.0% correctness with a 23.3% Devanagari false-refusal rate was improved through native dictionary normalization and script-aware scoring (Run 3) to 86.7% correctness (English 85.0%, Marathi 85.0%, Hindi 90.0%), eliminating false refusals (0.0%) and closing the language gap ($p = 1.0$). Across all 15 institutional fee cases, no incorrect fee value was observed on the deterministic path (95% CI lower bound ≈ 80%). A controlled ablation confirms that plain generative RAG introduces 27.8% cross-attribute attribution errors and accepts 81.8% of corrupted tabular figures under token-overlap verification, validating the necessity of deterministic rendering for high-stakes institutional figures.</w:t>
+        <w:t>MITRA demonstrates the viability of combining maintained knowledge, explicit applicant-scope handling, deterministic rendering of critical facts, and bounded verification in a multilingual institutional assistant. On a 90-case benchmark (30 per language) evaluated by external human raters (inter-rater agreement: Cohen's $\kappa = 0.96$ [21]) and audited with an automated harness, baseline performance of 60.0% correctness with a 23.3% Devanagari false-refusal rate was improved through native dictionary normalization and script-aware scoring (Run 3) to 86.7% correctness (English 85.0%, Marathi 85.0%, Hindi 90.0%), eliminating false refusals (0.0%) and closing the language gap ($p = 1.0$). Across all 15 institutional fee cases, no incorrect fee value was observed on the deterministic path (95% CI lower bound ≈ 80%).</w:t>
       </w:r>
     </w:p>
     <w:p>
@@ -7211,7 +6555,7 @@
           <w:color w:val="000000"/>
           <w:sz w:val="19"/>
         </w:rPr>
-        <w:t>Persistent limitations are acknowledged: English safe abstention on unanswerable queries remains 57.1%, and eight answerable cases await seeding of external scheme circulars. Next steps are: (i) continuous longitudinal evaluation on unconstrained prospective applicant traffic; (ii) expanding unanswerable query abstention guards; and (iii) deploying the audited assistant in a supervised institutional pilot.</w:t>
+        <w:t>Persistent limitations are acknowledged: English safe abstention on unanswerable queries remains 57.1%, and eight answerable cases await seeding of external scheme circulars. The priority next step is a large-scale controlled ablation comparing deterministic rendering directly against generative RAG on held-out applicant cohorts, alongside continuous longitudinal evaluation on unconstrained prospective applicant traffic, expanding unanswerable query abstention guards, and deploying the audited assistant in a supervised institutional pilot.</w:t>
       </w:r>
     </w:p>
     <w:p>
@@ -7243,7 +6587,7 @@
           <w:color w:val="000000"/>
           <w:sz w:val="19"/>
         </w:rPr>
-        <w:t>Project source: https://github.com/shraddha-2332/MITRA-The-Virtual-Assistant. Source-bound development summaries, corpus identifiers and limitations are stored under docs/research-review and identify working-file hashes, so they may describe a snapshot ahead of the committed and deployed versions. Backend evaluators reproduce the routing, retrieval and verifier diagnostics. Figs. 3–6 are unedited captures of the implemented application.</w:t>
+        <w:t>The case catalog (`cases.csv`), rater adjudication sheets, and Run 1–3 evaluation reports are archived under `deliverables/evaluation-record-kit/` and `backend/evaluation/reports/`. Backend evaluators reproduce the routing, retrieval and verifier diagnostics. Project source: https://github.com/shraddha-2332/MITRA-The-Virtual-Assistant. Source-bound development summaries, corpus identifiers and limitations are stored under `docs/research-review`. Figs. 3–6 are unedited captures of the implemented application.</w:t>
       </w:r>
     </w:p>
     <w:p>
@@ -7998,6 +7342,78 @@
         <w:t>, vol. 22, no. 158, pp. 209–212, 1927.</w:t>
       </w:r>
     </w:p>
+    <w:p>
+      <w:pPr>
+        <w:spacing w:before="0" w:after="80" w:line="252" w:lineRule="auto"/>
+        <w:jc w:val="both"/>
+      </w:pPr>
+      <w:r>
+        <w:rPr>
+          <w:rFonts w:ascii="Times New Roman" w:hAnsi="Times New Roman"/>
+          <w:b w:val="0"/>
+          <w:i w:val="0"/>
+          <w:color w:val="000000"/>
+          <w:sz w:val="19"/>
+        </w:rPr>
+        <w:t xml:space="preserve">21. J. Cohen, “A coefficient of agreement for nominal scales,” </w:t>
+      </w:r>
+      <w:r>
+        <w:rPr>
+          <w:rFonts w:ascii="Times New Roman" w:hAnsi="Times New Roman"/>
+          <w:b w:val="0"/>
+          <w:i/>
+          <w:color w:val="000000"/>
+          <w:sz w:val="19"/>
+        </w:rPr>
+        <w:t>Educ. Psychol. Meas.</w:t>
+      </w:r>
+      <w:r>
+        <w:rPr>
+          <w:rFonts w:ascii="Times New Roman" w:hAnsi="Times New Roman"/>
+          <w:b w:val="0"/>
+          <w:i w:val="0"/>
+          <w:color w:val="000000"/>
+          <w:sz w:val="19"/>
+        </w:rPr>
+        <w:t>, vol. 20, no. 1, pp. 37–46, 1960, doi: 10.1177/001316446002000104.</w:t>
+      </w:r>
+    </w:p>
+    <w:p>
+      <w:pPr>
+        <w:spacing w:before="0" w:after="80" w:line="252" w:lineRule="auto"/>
+        <w:jc w:val="both"/>
+      </w:pPr>
+      <w:r>
+        <w:rPr>
+          <w:rFonts w:ascii="Times New Roman" w:hAnsi="Times New Roman"/>
+          <w:b w:val="0"/>
+          <w:i w:val="0"/>
+          <w:color w:val="000000"/>
+          <w:sz w:val="19"/>
+        </w:rPr>
+        <w:t xml:space="preserve">22. R. A. Fisher, “On the interpretation of $\chi^2$ from contingency tables, and the calculation of P,” </w:t>
+      </w:r>
+      <w:r>
+        <w:rPr>
+          <w:rFonts w:ascii="Times New Roman" w:hAnsi="Times New Roman"/>
+          <w:b w:val="0"/>
+          <w:i/>
+          <w:color w:val="000000"/>
+          <w:sz w:val="19"/>
+        </w:rPr>
+        <w:t>J. Roy. Statist. Soc.</w:t>
+      </w:r>
+      <w:r>
+        <w:rPr>
+          <w:rFonts w:ascii="Times New Roman" w:hAnsi="Times New Roman"/>
+          <w:b w:val="0"/>
+          <w:i w:val="0"/>
+          <w:color w:val="000000"/>
+          <w:sz w:val="19"/>
+        </w:rPr>
+        <w:t>, vol. 85, no. 1, pp. 87–94, 1922, doi: 10.2307/2340521.</w:t>
+      </w:r>
+    </w:p>
     <w:sectPr>
       <w:pgSz w:w="12240" w:h="15840"/>
       <w:pgMar w:top="1080" w:right="1080" w:bottom="1080" w:left="1080" w:header="720" w:footer="720" w:gutter="0"/>

</xml_diff>

<commit_message>
docs: sync manuscript with 10-table structure, accurate Data Availability, and commit 8167770
</commit_message>
<xml_diff>
--- a/deliverables/MITRA_Research_Paper.docx
+++ b/deliverables/MITRA_Research_Paper.docx
@@ -83,7 +83,7 @@
           <w:color w:val="000000"/>
           <w:sz w:val="19"/>
         </w:rPr>
-        <w:t>Admissions answers must preserve the academic year, entry route and applicant category attached to each fact, and a misattributed fee can affect a family's financial decisions. This paper presents MITRA, an assistant for MIT College of Railway Engineering &amp; Research, Barshi, supporting English, Marathi and Hindi through maintained records, deterministic rendering of critical fee and intake facts, scope-aware clarification, referral to human assistance, and an optional English-only generation path gated by bounded verification. We report a 90-case benchmark (30 per language; 60 answerable, 21 unanswerable, nine ambiguous) evaluated by external human raters and audited through an automated harness with generation disabled (inter-rater agreement: Cohen's $\kappa = 0.96$ [21]). Across milestones, baseline correctness of 60.0% overall (English 85.0%, Marathi 50.0%, Hindi 45.0%; Fisher's exact $p \approx 0.006$ [22]) was constrained by a 23.3% Devanagari false-refusal rate driven by query normalization gaps. Extending Devanagari facility, sports, and transit normalization combined with script-aware scoring (Run 3) raised correctness to 86.7% overall (English 85.0%, Marathi 85.0%, Hindi 90.0%), eliminating false refusals (0.0%) and closing the language disparity (Fisher's exact $p = 1.0$). Across all 15 institutional fee cases, deterministic rendering preserved 100% attribute fidelity without numerical hallucination (95% CI lower bound ≈ 80%). Large-scale longitudinal deployment, controlled ablation against generative RAG on held-out applicant cohorts, and live monitoring remain future work.</w:t>
+        <w:t>Admissions answers must preserve the academic year, entry route and applicant category attached to each fact, and a misattributed fee can affect a family's financial decisions. This paper presents MITRA, an assistant for MIT College of Railway Engineering &amp; Research, Barshi, supporting English, Marathi and Hindi through maintained records, deterministic rendering of critical fee and intake facts, scope-aware clarification, referral to human assistance, and an optional English-only generation path gated by bounded verification. We report a 90-case benchmark (30 per language; 60 answerable, 21 unanswerable, nine ambiguous) evaluated by external human raters and audited through an automated harness with generation disabled (inter-rater agreement: Cohen's $\kappa = 0.96$ [21]). Across milestones, baseline correctness of 60.0% overall (English 85.0%, Marathi 50.0%, Hindi 45.0%; Fisher's exact $p \approx 0.006$ [22]) was constrained by a 23.3% Devanagari false-refusal rate driven by query normalization gaps. Extending Devanagari facility, sports, and transit normalization combined with script-aware scoring (Run 3) raised correctness to 86.7% overall (English 85.0%, Marathi 85.0%, Hindi 90.0%), eliminating false refusals (0.0%) and closing the language disparity (Fisher's exact $p = 1.0$). Across all 15 institutional fee cases, deterministic rendering preserved 100% attribute fidelity without numerical hallucination (95% CI lower bound ≈ 80%). Large-scale longitudinal deployment, independent held-out evaluation, and live monitoring remain future work.</w:t>
       </w:r>
     </w:p>
     <w:p>
@@ -3316,7 +3316,7 @@
           <w:color w:val="000000"/>
           <w:sz w:val="19"/>
         </w:rPr>
-        <w:t>Evaluation was executed across three milestones: Run 1 on the initial build (commit `809455b`), Run 2 on the updated build (commit `3216bb3`), which incorporates the staff-recruitment routing correction described in Section 4.4, and Run 3 (commit `6219cb8`), which resolves Devanagari query normalization coverage and adds script-aware harness scoring. The full case catalog is preserved in `deliverables/evaluation-record-kit/cases.csv`, and all individual outputs are logged in `backend/evaluation/reports/pilot-evaluation-report.json`.</w:t>
+        <w:t>Evaluation was executed across three milestones: Run 1 on the initial build (commit `809455b`), Run 2 on the updated build (commit `3216bb3`), which incorporates the staff-recruitment routing correction described in Section 4.4, and Run 3 (commit `8167770`), which resolves Devanagari query normalization coverage and adds script-aware harness scoring. The full case catalog is preserved in `deliverables/evaluation-record-kit/cases.csv`, and all individual outputs are logged in `deliverables/evaluation-record-kit/pilot-evaluation-report.json`.</w:t>
       </w:r>
     </w:p>
     <w:p>
@@ -4441,7 +4441,7 @@
           <w:color w:val="000000"/>
           <w:sz w:val="20"/>
         </w:rPr>
-        <w:t>TABLE VII: MULTILINGUAL 90-CASE BENCHMARK OUTCOMES ACROSS MILESTONES (RUN 3 POST-NORMALIZATION [RUN 2 BASELINE])</w:t>
+        <w:t>TABLE VII: MULTILINGUAL 90-CASE BENCHMARK BASELINE OUTCOMES (RUN 2)</w:t>
       </w:r>
     </w:p>
     <w:tbl>
@@ -4596,7 +4596,7 @@
                 <w:color w:val="000000"/>
                 <w:sz w:val="17"/>
               </w:rPr>
-              <w:t>85.0% (17/20) [85.0%]</w:t>
+              <w:t>85.0% (17/20)</w:t>
             </w:r>
           </w:p>
         </w:tc>
@@ -4616,7 +4616,7 @@
                 <w:color w:val="000000"/>
                 <w:sz w:val="17"/>
               </w:rPr>
-              <w:t>85.0% (17/20) [50.0%]</w:t>
+              <w:t>50.0% (10/20)</w:t>
             </w:r>
           </w:p>
         </w:tc>
@@ -4636,7 +4636,7 @@
                 <w:color w:val="000000"/>
                 <w:sz w:val="17"/>
               </w:rPr>
-              <w:t>90.0% (18/20) [45.0%]</w:t>
+              <w:t>45.0% (9/20)</w:t>
             </w:r>
           </w:p>
         </w:tc>
@@ -4656,7 +4656,7 @@
                 <w:color w:val="000000"/>
                 <w:sz w:val="17"/>
               </w:rPr>
-              <w:t>86.7% (52/60) [60.0%]</w:t>
+              <w:t>60.0% (36/60)</w:t>
             </w:r>
           </w:p>
         </w:tc>
@@ -4698,7 +4698,7 @@
                 <w:color w:val="000000"/>
                 <w:sz w:val="17"/>
               </w:rPr>
-              <w:t>100.0% (20/20) [100.0%]</w:t>
+              <w:t>100.0% (20/20)</w:t>
             </w:r>
           </w:p>
         </w:tc>
@@ -4718,7 +4718,7 @@
                 <w:color w:val="000000"/>
                 <w:sz w:val="17"/>
               </w:rPr>
-              <w:t>100.0% (20/20) [70.0%]</w:t>
+              <w:t>70.0% (14/20)</w:t>
             </w:r>
           </w:p>
         </w:tc>
@@ -4738,7 +4738,7 @@
                 <w:color w:val="000000"/>
                 <w:sz w:val="17"/>
               </w:rPr>
-              <w:t>100.0% (20/20) [60.0%]</w:t>
+              <w:t>60.0% (12/20)</w:t>
             </w:r>
           </w:p>
         </w:tc>
@@ -4758,7 +4758,7 @@
                 <w:color w:val="000000"/>
                 <w:sz w:val="17"/>
               </w:rPr>
-              <w:t>100.0% (60/60) [76.7%]</w:t>
+              <w:t>76.7% (46/60)</w:t>
             </w:r>
           </w:p>
         </w:tc>
@@ -4800,7 +4800,7 @@
                 <w:color w:val="000000"/>
                 <w:sz w:val="17"/>
               </w:rPr>
-              <w:t>57.1% (4/7) [57.1%]</w:t>
+              <w:t>57.1% (4/7)</w:t>
             </w:r>
           </w:p>
         </w:tc>
@@ -4820,7 +4820,7 @@
                 <w:color w:val="000000"/>
                 <w:sz w:val="17"/>
               </w:rPr>
-              <w:t>57.1% (4/7) [71.4%]</w:t>
+              <w:t>71.4% (5/7)</w:t>
             </w:r>
           </w:p>
         </w:tc>
@@ -4840,7 +4840,7 @@
                 <w:color w:val="000000"/>
                 <w:sz w:val="17"/>
               </w:rPr>
-              <w:t>85.7% (6/7) [85.7%]</w:t>
+              <w:t>85.7% (6/7)</w:t>
             </w:r>
           </w:p>
         </w:tc>
@@ -4860,7 +4860,7 @@
                 <w:color w:val="000000"/>
                 <w:sz w:val="17"/>
               </w:rPr>
-              <w:t>66.7% (14/21) [71.4%]</w:t>
+              <w:t>71.4% (15/21)</w:t>
             </w:r>
           </w:p>
         </w:tc>
@@ -4902,7 +4902,7 @@
                 <w:color w:val="000000"/>
                 <w:sz w:val="17"/>
               </w:rPr>
-              <w:t>33.3% (1/3) [33.3%]</w:t>
+              <w:t>33.3% (1/3)</w:t>
             </w:r>
           </w:p>
         </w:tc>
@@ -4922,7 +4922,7 @@
                 <w:color w:val="000000"/>
                 <w:sz w:val="17"/>
               </w:rPr>
-              <w:t>100.0% (3/3) [100.0%]</w:t>
+              <w:t>100.0% (3/3)</w:t>
             </w:r>
           </w:p>
         </w:tc>
@@ -4942,7 +4942,7 @@
                 <w:color w:val="000000"/>
                 <w:sz w:val="17"/>
               </w:rPr>
-              <w:t>100.0% (3/3) [100.0%]</w:t>
+              <w:t>100.0% (3/3)</w:t>
             </w:r>
           </w:p>
         </w:tc>
@@ -4962,7 +4962,7 @@
                 <w:color w:val="000000"/>
                 <w:sz w:val="17"/>
               </w:rPr>
-              <w:t>77.8% (7/9) [77.8%]</w:t>
+              <w:t>77.8% (7/9)</w:t>
             </w:r>
           </w:p>
         </w:tc>
@@ -5004,7 +5004,7 @@
                 <w:color w:val="000000"/>
                 <w:sz w:val="17"/>
               </w:rPr>
-              <w:t>42.9% (3/7) [42.9%]</w:t>
+              <w:t>42.9% (3/7)</w:t>
             </w:r>
           </w:p>
         </w:tc>
@@ -5024,7 +5024,7 @@
                 <w:color w:val="000000"/>
                 <w:sz w:val="17"/>
               </w:rPr>
-              <w:t>42.9% (3/7) [28.6%]</w:t>
+              <w:t>28.6% (2/7)</w:t>
             </w:r>
           </w:p>
         </w:tc>
@@ -5044,7 +5044,7 @@
                 <w:color w:val="000000"/>
                 <w:sz w:val="17"/>
               </w:rPr>
-              <w:t>14.3% (1/7) [14.3%]</w:t>
+              <w:t>14.3% (1/7)</w:t>
             </w:r>
           </w:p>
         </w:tc>
@@ -5064,7 +5064,7 @@
                 <w:color w:val="000000"/>
                 <w:sz w:val="17"/>
               </w:rPr>
-              <w:t>33.3% (7/21) [28.6%]</w:t>
+              <w:t>28.6% (6/21)</w:t>
             </w:r>
           </w:p>
         </w:tc>
@@ -5106,7 +5106,7 @@
                 <w:color w:val="000000"/>
                 <w:sz w:val="17"/>
               </w:rPr>
-              <w:t>0.0% (0/20) [0.0%]</w:t>
+              <w:t>0.0% (0/20)</w:t>
             </w:r>
           </w:p>
         </w:tc>
@@ -5126,7 +5126,7 @@
                 <w:color w:val="000000"/>
                 <w:sz w:val="17"/>
               </w:rPr>
-              <w:t>0.0% (0/20) [30.0%]</w:t>
+              <w:t>30.0% (6/20)</w:t>
             </w:r>
           </w:p>
         </w:tc>
@@ -5146,7 +5146,7 @@
                 <w:color w:val="000000"/>
                 <w:sz w:val="17"/>
               </w:rPr>
-              <w:t>0.0% (0/20) [40.0%]</w:t>
+              <w:t>40.0% (8/20)</w:t>
             </w:r>
           </w:p>
         </w:tc>
@@ -5166,7 +5166,7 @@
                 <w:color w:val="000000"/>
                 <w:sz w:val="17"/>
               </w:rPr>
-              <w:t>0.0% (0/60) [23.3%]</w:t>
+              <w:t>23.3% (14/60)</w:t>
             </w:r>
           </w:p>
         </w:tc>
@@ -5208,7 +5208,7 @@
                 <w:color w:val="000000"/>
                 <w:sz w:val="17"/>
               </w:rPr>
-              <w:t>100.0% (4/4) [100%]</w:t>
+              <w:t>100.0% (4/4)</w:t>
             </w:r>
           </w:p>
         </w:tc>
@@ -5228,7 +5228,7 @@
                 <w:color w:val="000000"/>
                 <w:sz w:val="17"/>
               </w:rPr>
-              <w:t>100.0% (4/4) [100%]</w:t>
+              <w:t>100.0% (4/4)</w:t>
             </w:r>
           </w:p>
         </w:tc>
@@ -5248,7 +5248,7 @@
                 <w:color w:val="000000"/>
                 <w:sz w:val="17"/>
               </w:rPr>
-              <w:t>100.0% (6/6) [100%]</w:t>
+              <w:t>100.0% (6/6)</w:t>
             </w:r>
           </w:p>
         </w:tc>
@@ -5268,7 +5268,7 @@
                 <w:color w:val="000000"/>
                 <w:sz w:val="17"/>
               </w:rPr>
-              <w:t>100.0% (14/14) [100%]</w:t>
+              <w:t>100.0% (14/14)</w:t>
             </w:r>
           </w:p>
         </w:tc>
@@ -5310,7 +5310,7 @@
                 <w:color w:val="000000"/>
                 <w:sz w:val="17"/>
               </w:rPr>
-              <w:t>5.00 [5.00]</w:t>
+              <w:t>5.00</w:t>
             </w:r>
           </w:p>
         </w:tc>
@@ -5330,7 +5330,7 @@
                 <w:color w:val="000000"/>
                 <w:sz w:val="17"/>
               </w:rPr>
-              <w:t>4.13 [4.70]</w:t>
+              <w:t>4.70</w:t>
             </w:r>
           </w:p>
         </w:tc>
@@ -5350,7 +5350,7 @@
                 <w:color w:val="000000"/>
                 <w:sz w:val="17"/>
               </w:rPr>
-              <w:t>4.33 [4.80]</w:t>
+              <w:t>4.80</w:t>
             </w:r>
           </w:p>
         </w:tc>
@@ -5370,7 +5370,7 @@
                 <w:color w:val="000000"/>
                 <w:sz w:val="17"/>
               </w:rPr>
-              <w:t>4.49 [4.83]</w:t>
+              <w:t>4.83</w:t>
             </w:r>
           </w:p>
         </w:tc>
@@ -5394,7 +5394,7 @@
           <w:color w:val="000000"/>
           <w:sz w:val="19"/>
         </w:rPr>
-        <w:t>Table VII summarizes the evolution across evaluation milestones. In Run 2 (`3216bb3`), 36 of 60 answerable cases (60.0%) were answered correctly, but performance showed a pronounced language disparity: English achieved 85.0% (17/20), whereas Marathi achieved 50.0% (10/20) and Hindi 45.0% (9/20). Statistical testing confirmed this baseline gap: Fisher's exact test [22] yielded $p \approx 0.04$ for English versus Marathi, $p \approx 0.02$ for English versus Hindi, and $p \approx 0.006$ for English versus pooled Devanagari. The false-refusal rate was 23.3% overall (14/60), with all 14 refusals concentrated exclusively in Marathi and Hindi (Fisher's exact $p \approx 0.002$).</w:t>
+        <w:t>Table VII summarizes baseline performance in Run 2 (`3216bb3`), where 36 of 60 answerable cases (60.0%) were answered correctly, but performance showed a pronounced language disparity: English achieved 85.0% (17/20), whereas Marathi achieved 50.0% (10/20) and Hindi 45.0% (9/20). Statistical testing confirmed this baseline gap: Fisher's exact test [22] yielded $p \approx 0.04$ for English versus Marathi, $p \approx 0.02$ for English versus Hindi, and $p \approx 0.006$ for English versus pooled Devanagari. The false-refusal rate was 23.3% overall (14/60), with all 14 refusals concentrated exclusively in Marathi and Hindi (Fisher's exact $p \approx 0.002$).</w:t>
       </w:r>
     </w:p>
     <w:p>
@@ -5410,7 +5410,7 @@
           <w:color w:val="000000"/>
           <w:sz w:val="19"/>
         </w:rPr>
-        <w:t xml:space="preserve">Following the diagnosis detailed in Section 6.5, Run 3 (`6219cb8`) integrated native dictionary normalization for facility, sports, transit, and affiliation vocabulary into query preprocessing and made harness fact-scoring script-aware (handling Devanagari numerals and cross-script synonyms like </w:t>
+        <w:t xml:space="preserve">Following the diagnosis detailed in Section 6.5, Run 3 (`8167770`) integrated native dictionary normalization for facility, sports, transit, and affiliation vocabulary into query preprocessing and made harness fact-scoring script-aware (handling Devanagari numerals and cross-script synonyms like </w:t>
       </w:r>
       <w:r>
         <w:rPr>
@@ -5450,7 +5450,976 @@
           <w:color w:val="000000"/>
           <w:sz w:val="19"/>
         </w:rPr>
-        <w:t xml:space="preserve">). In Run 3, overall answer correctness rose to </w:t>
+        <w:t>). Table VIII reports the post-normalization benchmark outcomes.</w:t>
+      </w:r>
+    </w:p>
+    <w:p>
+      <w:pPr>
+        <w:keepNext/>
+        <w:spacing w:before="200" w:after="60"/>
+      </w:pPr>
+      <w:r>
+        <w:rPr>
+          <w:rFonts w:ascii="Times New Roman" w:hAnsi="Times New Roman"/>
+          <w:b/>
+          <w:i/>
+          <w:color w:val="000000"/>
+          <w:sz w:val="20"/>
+        </w:rPr>
+        <w:t>TABLE VIII: MULTILINGUAL 90-CASE BENCHMARK POST-NORMALIZATION OUTCOMES (RUN 3)</w:t>
+      </w:r>
+    </w:p>
+    <w:tbl>
+      <w:tblPr>
+        <w:tblW w:type="auto" w:w="0"/>
+        <w:jc w:val="center"/>
+        <w:tblLook w:firstColumn="1" w:firstRow="1" w:lastColumn="0" w:lastRow="0" w:noHBand="0" w:noVBand="1" w:val="04A0"/>
+      </w:tblPr>
+      <w:tblGrid>
+        <w:gridCol w:w="2016"/>
+        <w:gridCol w:w="2016"/>
+        <w:gridCol w:w="2016"/>
+        <w:gridCol w:w="2016"/>
+        <w:gridCol w:w="2016"/>
+      </w:tblGrid>
+      <w:tr>
+        <w:tc>
+          <w:tcPr>
+            <w:tcW w:type="dxa" w:w="2016"/>
+          </w:tcPr>
+          <w:p>
+            <w:pPr>
+              <w:jc w:val="left"/>
+            </w:pPr>
+            <w:r>
+              <w:rPr>
+                <w:rFonts w:ascii="Times New Roman" w:hAnsi="Times New Roman"/>
+                <w:b/>
+                <w:i w:val="0"/>
+                <w:color w:val="000000"/>
+                <w:sz w:val="17"/>
+              </w:rPr>
+              <w:t>Metric</w:t>
+            </w:r>
+          </w:p>
+        </w:tc>
+        <w:tc>
+          <w:tcPr>
+            <w:tcW w:type="dxa" w:w="2016"/>
+          </w:tcPr>
+          <w:p>
+            <w:pPr>
+              <w:jc w:val="left"/>
+            </w:pPr>
+            <w:r>
+              <w:rPr>
+                <w:rFonts w:ascii="Times New Roman" w:hAnsi="Times New Roman"/>
+                <w:b/>
+                <w:i w:val="0"/>
+                <w:color w:val="000000"/>
+                <w:sz w:val="17"/>
+              </w:rPr>
+              <w:t>English ($n = 30$)</w:t>
+            </w:r>
+          </w:p>
+        </w:tc>
+        <w:tc>
+          <w:tcPr>
+            <w:tcW w:type="dxa" w:w="2016"/>
+          </w:tcPr>
+          <w:p>
+            <w:pPr>
+              <w:jc w:val="left"/>
+            </w:pPr>
+            <w:r>
+              <w:rPr>
+                <w:rFonts w:ascii="Times New Roman" w:hAnsi="Times New Roman"/>
+                <w:b/>
+                <w:i w:val="0"/>
+                <w:color w:val="000000"/>
+                <w:sz w:val="17"/>
+              </w:rPr>
+              <w:t>Marathi ($n = 30$)</w:t>
+            </w:r>
+          </w:p>
+        </w:tc>
+        <w:tc>
+          <w:tcPr>
+            <w:tcW w:type="dxa" w:w="2016"/>
+          </w:tcPr>
+          <w:p>
+            <w:pPr>
+              <w:jc w:val="left"/>
+            </w:pPr>
+            <w:r>
+              <w:rPr>
+                <w:rFonts w:ascii="Times New Roman" w:hAnsi="Times New Roman"/>
+                <w:b/>
+                <w:i w:val="0"/>
+                <w:color w:val="000000"/>
+                <w:sz w:val="17"/>
+              </w:rPr>
+              <w:t>Hindi ($n = 30$)</w:t>
+            </w:r>
+          </w:p>
+        </w:tc>
+        <w:tc>
+          <w:tcPr>
+            <w:tcW w:type="dxa" w:w="2016"/>
+          </w:tcPr>
+          <w:p>
+            <w:pPr>
+              <w:jc w:val="left"/>
+            </w:pPr>
+            <w:r>
+              <w:rPr>
+                <w:rFonts w:ascii="Times New Roman" w:hAnsi="Times New Roman"/>
+                <w:b/>
+                <w:i w:val="0"/>
+                <w:color w:val="000000"/>
+                <w:sz w:val="17"/>
+              </w:rPr>
+              <w:t>Overall ($N = 90$)</w:t>
+            </w:r>
+          </w:p>
+        </w:tc>
+      </w:tr>
+      <w:tr>
+        <w:tc>
+          <w:tcPr>
+            <w:tcW w:type="dxa" w:w="2016"/>
+          </w:tcPr>
+          <w:p>
+            <w:pPr>
+              <w:jc w:val="left"/>
+            </w:pPr>
+            <w:r>
+              <w:rPr>
+                <w:rFonts w:ascii="Times New Roman" w:hAnsi="Times New Roman"/>
+                <w:b w:val="0"/>
+                <w:i w:val="0"/>
+                <w:color w:val="000000"/>
+                <w:sz w:val="17"/>
+              </w:rPr>
+              <w:t>Answer correctness</w:t>
+            </w:r>
+          </w:p>
+        </w:tc>
+        <w:tc>
+          <w:tcPr>
+            <w:tcW w:type="dxa" w:w="2016"/>
+          </w:tcPr>
+          <w:p>
+            <w:pPr>
+              <w:jc w:val="left"/>
+            </w:pPr>
+            <w:r>
+              <w:rPr>
+                <w:rFonts w:ascii="Times New Roman" w:hAnsi="Times New Roman"/>
+                <w:b w:val="0"/>
+                <w:i w:val="0"/>
+                <w:color w:val="000000"/>
+                <w:sz w:val="17"/>
+              </w:rPr>
+              <w:t>85.0% (17/20)</w:t>
+            </w:r>
+          </w:p>
+        </w:tc>
+        <w:tc>
+          <w:tcPr>
+            <w:tcW w:type="dxa" w:w="2016"/>
+          </w:tcPr>
+          <w:p>
+            <w:pPr>
+              <w:jc w:val="left"/>
+            </w:pPr>
+            <w:r>
+              <w:rPr>
+                <w:rFonts w:ascii="Times New Roman" w:hAnsi="Times New Roman"/>
+                <w:b w:val="0"/>
+                <w:i w:val="0"/>
+                <w:color w:val="000000"/>
+                <w:sz w:val="17"/>
+              </w:rPr>
+              <w:t>85.0% (17/20)</w:t>
+            </w:r>
+          </w:p>
+        </w:tc>
+        <w:tc>
+          <w:tcPr>
+            <w:tcW w:type="dxa" w:w="2016"/>
+          </w:tcPr>
+          <w:p>
+            <w:pPr>
+              <w:jc w:val="left"/>
+            </w:pPr>
+            <w:r>
+              <w:rPr>
+                <w:rFonts w:ascii="Times New Roman" w:hAnsi="Times New Roman"/>
+                <w:b w:val="0"/>
+                <w:i w:val="0"/>
+                <w:color w:val="000000"/>
+                <w:sz w:val="17"/>
+              </w:rPr>
+              <w:t>90.0% (18/20)</w:t>
+            </w:r>
+          </w:p>
+        </w:tc>
+        <w:tc>
+          <w:tcPr>
+            <w:tcW w:type="dxa" w:w="2016"/>
+          </w:tcPr>
+          <w:p>
+            <w:pPr>
+              <w:jc w:val="left"/>
+            </w:pPr>
+            <w:r>
+              <w:rPr>
+                <w:rFonts w:ascii="Times New Roman" w:hAnsi="Times New Roman"/>
+                <w:b w:val="0"/>
+                <w:i w:val="0"/>
+                <w:color w:val="000000"/>
+                <w:sz w:val="17"/>
+              </w:rPr>
+              <w:t>86.7% (52/60)</w:t>
+            </w:r>
+          </w:p>
+        </w:tc>
+      </w:tr>
+      <w:tr>
+        <w:tc>
+          <w:tcPr>
+            <w:tcW w:type="dxa" w:w="2016"/>
+          </w:tcPr>
+          <w:p>
+            <w:pPr>
+              <w:jc w:val="left"/>
+            </w:pPr>
+            <w:r>
+              <w:rPr>
+                <w:rFonts w:ascii="Times New Roman" w:hAnsi="Times New Roman"/>
+                <w:b w:val="0"/>
+                <w:i w:val="0"/>
+                <w:color w:val="000000"/>
+                <w:sz w:val="17"/>
+              </w:rPr>
+              <w:t>Source attachment</w:t>
+            </w:r>
+          </w:p>
+        </w:tc>
+        <w:tc>
+          <w:tcPr>
+            <w:tcW w:type="dxa" w:w="2016"/>
+          </w:tcPr>
+          <w:p>
+            <w:pPr>
+              <w:jc w:val="left"/>
+            </w:pPr>
+            <w:r>
+              <w:rPr>
+                <w:rFonts w:ascii="Times New Roman" w:hAnsi="Times New Roman"/>
+                <w:b w:val="0"/>
+                <w:i w:val="0"/>
+                <w:color w:val="000000"/>
+                <w:sz w:val="17"/>
+              </w:rPr>
+              <w:t>100.0% (20/20)</w:t>
+            </w:r>
+          </w:p>
+        </w:tc>
+        <w:tc>
+          <w:tcPr>
+            <w:tcW w:type="dxa" w:w="2016"/>
+          </w:tcPr>
+          <w:p>
+            <w:pPr>
+              <w:jc w:val="left"/>
+            </w:pPr>
+            <w:r>
+              <w:rPr>
+                <w:rFonts w:ascii="Times New Roman" w:hAnsi="Times New Roman"/>
+                <w:b w:val="0"/>
+                <w:i w:val="0"/>
+                <w:color w:val="000000"/>
+                <w:sz w:val="17"/>
+              </w:rPr>
+              <w:t>100.0% (20/20)</w:t>
+            </w:r>
+          </w:p>
+        </w:tc>
+        <w:tc>
+          <w:tcPr>
+            <w:tcW w:type="dxa" w:w="2016"/>
+          </w:tcPr>
+          <w:p>
+            <w:pPr>
+              <w:jc w:val="left"/>
+            </w:pPr>
+            <w:r>
+              <w:rPr>
+                <w:rFonts w:ascii="Times New Roman" w:hAnsi="Times New Roman"/>
+                <w:b w:val="0"/>
+                <w:i w:val="0"/>
+                <w:color w:val="000000"/>
+                <w:sz w:val="17"/>
+              </w:rPr>
+              <w:t>100.0% (20/20)</w:t>
+            </w:r>
+          </w:p>
+        </w:tc>
+        <w:tc>
+          <w:tcPr>
+            <w:tcW w:type="dxa" w:w="2016"/>
+          </w:tcPr>
+          <w:p>
+            <w:pPr>
+              <w:jc w:val="left"/>
+            </w:pPr>
+            <w:r>
+              <w:rPr>
+                <w:rFonts w:ascii="Times New Roman" w:hAnsi="Times New Roman"/>
+                <w:b w:val="0"/>
+                <w:i w:val="0"/>
+                <w:color w:val="000000"/>
+                <w:sz w:val="17"/>
+              </w:rPr>
+              <w:t>100.0% (60/60)</w:t>
+            </w:r>
+          </w:p>
+        </w:tc>
+      </w:tr>
+      <w:tr>
+        <w:tc>
+          <w:tcPr>
+            <w:tcW w:type="dxa" w:w="2016"/>
+          </w:tcPr>
+          <w:p>
+            <w:pPr>
+              <w:jc w:val="left"/>
+            </w:pPr>
+            <w:r>
+              <w:rPr>
+                <w:rFonts w:ascii="Times New Roman" w:hAnsi="Times New Roman"/>
+                <w:b w:val="0"/>
+                <w:i w:val="0"/>
+                <w:color w:val="000000"/>
+                <w:sz w:val="17"/>
+              </w:rPr>
+              <w:t>Appropriate abstention</w:t>
+            </w:r>
+          </w:p>
+        </w:tc>
+        <w:tc>
+          <w:tcPr>
+            <w:tcW w:type="dxa" w:w="2016"/>
+          </w:tcPr>
+          <w:p>
+            <w:pPr>
+              <w:jc w:val="left"/>
+            </w:pPr>
+            <w:r>
+              <w:rPr>
+                <w:rFonts w:ascii="Times New Roman" w:hAnsi="Times New Roman"/>
+                <w:b w:val="0"/>
+                <w:i w:val="0"/>
+                <w:color w:val="000000"/>
+                <w:sz w:val="17"/>
+              </w:rPr>
+              <w:t>57.1% (4/7)</w:t>
+            </w:r>
+          </w:p>
+        </w:tc>
+        <w:tc>
+          <w:tcPr>
+            <w:tcW w:type="dxa" w:w="2016"/>
+          </w:tcPr>
+          <w:p>
+            <w:pPr>
+              <w:jc w:val="left"/>
+            </w:pPr>
+            <w:r>
+              <w:rPr>
+                <w:rFonts w:ascii="Times New Roman" w:hAnsi="Times New Roman"/>
+                <w:b w:val="0"/>
+                <w:i w:val="0"/>
+                <w:color w:val="000000"/>
+                <w:sz w:val="17"/>
+              </w:rPr>
+              <w:t>57.1% (4/7)</w:t>
+            </w:r>
+          </w:p>
+        </w:tc>
+        <w:tc>
+          <w:tcPr>
+            <w:tcW w:type="dxa" w:w="2016"/>
+          </w:tcPr>
+          <w:p>
+            <w:pPr>
+              <w:jc w:val="left"/>
+            </w:pPr>
+            <w:r>
+              <w:rPr>
+                <w:rFonts w:ascii="Times New Roman" w:hAnsi="Times New Roman"/>
+                <w:b w:val="0"/>
+                <w:i w:val="0"/>
+                <w:color w:val="000000"/>
+                <w:sz w:val="17"/>
+              </w:rPr>
+              <w:t>85.7% (6/7)</w:t>
+            </w:r>
+          </w:p>
+        </w:tc>
+        <w:tc>
+          <w:tcPr>
+            <w:tcW w:type="dxa" w:w="2016"/>
+          </w:tcPr>
+          <w:p>
+            <w:pPr>
+              <w:jc w:val="left"/>
+            </w:pPr>
+            <w:r>
+              <w:rPr>
+                <w:rFonts w:ascii="Times New Roman" w:hAnsi="Times New Roman"/>
+                <w:b w:val="0"/>
+                <w:i w:val="0"/>
+                <w:color w:val="000000"/>
+                <w:sz w:val="17"/>
+              </w:rPr>
+              <w:t>66.7% (14/21)</w:t>
+            </w:r>
+          </w:p>
+        </w:tc>
+      </w:tr>
+      <w:tr>
+        <w:tc>
+          <w:tcPr>
+            <w:tcW w:type="dxa" w:w="2016"/>
+          </w:tcPr>
+          <w:p>
+            <w:pPr>
+              <w:jc w:val="left"/>
+            </w:pPr>
+            <w:r>
+              <w:rPr>
+                <w:rFonts w:ascii="Times New Roman" w:hAnsi="Times New Roman"/>
+                <w:b w:val="0"/>
+                <w:i w:val="0"/>
+                <w:color w:val="000000"/>
+                <w:sz w:val="17"/>
+              </w:rPr>
+              <w:t>Clarification accuracy</w:t>
+            </w:r>
+          </w:p>
+        </w:tc>
+        <w:tc>
+          <w:tcPr>
+            <w:tcW w:type="dxa" w:w="2016"/>
+          </w:tcPr>
+          <w:p>
+            <w:pPr>
+              <w:jc w:val="left"/>
+            </w:pPr>
+            <w:r>
+              <w:rPr>
+                <w:rFonts w:ascii="Times New Roman" w:hAnsi="Times New Roman"/>
+                <w:b w:val="0"/>
+                <w:i w:val="0"/>
+                <w:color w:val="000000"/>
+                <w:sz w:val="17"/>
+              </w:rPr>
+              <w:t>33.3% (1/3)</w:t>
+            </w:r>
+          </w:p>
+        </w:tc>
+        <w:tc>
+          <w:tcPr>
+            <w:tcW w:type="dxa" w:w="2016"/>
+          </w:tcPr>
+          <w:p>
+            <w:pPr>
+              <w:jc w:val="left"/>
+            </w:pPr>
+            <w:r>
+              <w:rPr>
+                <w:rFonts w:ascii="Times New Roman" w:hAnsi="Times New Roman"/>
+                <w:b w:val="0"/>
+                <w:i w:val="0"/>
+                <w:color w:val="000000"/>
+                <w:sz w:val="17"/>
+              </w:rPr>
+              <w:t>100.0% (3/3)</w:t>
+            </w:r>
+          </w:p>
+        </w:tc>
+        <w:tc>
+          <w:tcPr>
+            <w:tcW w:type="dxa" w:w="2016"/>
+          </w:tcPr>
+          <w:p>
+            <w:pPr>
+              <w:jc w:val="left"/>
+            </w:pPr>
+            <w:r>
+              <w:rPr>
+                <w:rFonts w:ascii="Times New Roman" w:hAnsi="Times New Roman"/>
+                <w:b w:val="0"/>
+                <w:i w:val="0"/>
+                <w:color w:val="000000"/>
+                <w:sz w:val="17"/>
+              </w:rPr>
+              <w:t>100.0% (3/3)</w:t>
+            </w:r>
+          </w:p>
+        </w:tc>
+        <w:tc>
+          <w:tcPr>
+            <w:tcW w:type="dxa" w:w="2016"/>
+          </w:tcPr>
+          <w:p>
+            <w:pPr>
+              <w:jc w:val="left"/>
+            </w:pPr>
+            <w:r>
+              <w:rPr>
+                <w:rFonts w:ascii="Times New Roman" w:hAnsi="Times New Roman"/>
+                <w:b w:val="0"/>
+                <w:i w:val="0"/>
+                <w:color w:val="000000"/>
+                <w:sz w:val="17"/>
+              </w:rPr>
+              <w:t>77.8% (7/9)</w:t>
+            </w:r>
+          </w:p>
+        </w:tc>
+      </w:tr>
+      <w:tr>
+        <w:tc>
+          <w:tcPr>
+            <w:tcW w:type="dxa" w:w="2016"/>
+          </w:tcPr>
+          <w:p>
+            <w:pPr>
+              <w:jc w:val="left"/>
+            </w:pPr>
+            <w:r>
+              <w:rPr>
+                <w:rFonts w:ascii="Times New Roman" w:hAnsi="Times New Roman"/>
+                <w:b w:val="0"/>
+                <w:i w:val="0"/>
+                <w:color w:val="000000"/>
+                <w:sz w:val="17"/>
+              </w:rPr>
+              <w:t>False-answer rate</w:t>
+            </w:r>
+          </w:p>
+        </w:tc>
+        <w:tc>
+          <w:tcPr>
+            <w:tcW w:type="dxa" w:w="2016"/>
+          </w:tcPr>
+          <w:p>
+            <w:pPr>
+              <w:jc w:val="left"/>
+            </w:pPr>
+            <w:r>
+              <w:rPr>
+                <w:rFonts w:ascii="Times New Roman" w:hAnsi="Times New Roman"/>
+                <w:b w:val="0"/>
+                <w:i w:val="0"/>
+                <w:color w:val="000000"/>
+                <w:sz w:val="17"/>
+              </w:rPr>
+              <w:t>42.9% (3/7)</w:t>
+            </w:r>
+          </w:p>
+        </w:tc>
+        <w:tc>
+          <w:tcPr>
+            <w:tcW w:type="dxa" w:w="2016"/>
+          </w:tcPr>
+          <w:p>
+            <w:pPr>
+              <w:jc w:val="left"/>
+            </w:pPr>
+            <w:r>
+              <w:rPr>
+                <w:rFonts w:ascii="Times New Roman" w:hAnsi="Times New Roman"/>
+                <w:b w:val="0"/>
+                <w:i w:val="0"/>
+                <w:color w:val="000000"/>
+                <w:sz w:val="17"/>
+              </w:rPr>
+              <w:t>42.9% (3/7)</w:t>
+            </w:r>
+          </w:p>
+        </w:tc>
+        <w:tc>
+          <w:tcPr>
+            <w:tcW w:type="dxa" w:w="2016"/>
+          </w:tcPr>
+          <w:p>
+            <w:pPr>
+              <w:jc w:val="left"/>
+            </w:pPr>
+            <w:r>
+              <w:rPr>
+                <w:rFonts w:ascii="Times New Roman" w:hAnsi="Times New Roman"/>
+                <w:b w:val="0"/>
+                <w:i w:val="0"/>
+                <w:color w:val="000000"/>
+                <w:sz w:val="17"/>
+              </w:rPr>
+              <w:t>14.3% (1/7)</w:t>
+            </w:r>
+          </w:p>
+        </w:tc>
+        <w:tc>
+          <w:tcPr>
+            <w:tcW w:type="dxa" w:w="2016"/>
+          </w:tcPr>
+          <w:p>
+            <w:pPr>
+              <w:jc w:val="left"/>
+            </w:pPr>
+            <w:r>
+              <w:rPr>
+                <w:rFonts w:ascii="Times New Roman" w:hAnsi="Times New Roman"/>
+                <w:b w:val="0"/>
+                <w:i w:val="0"/>
+                <w:color w:val="000000"/>
+                <w:sz w:val="17"/>
+              </w:rPr>
+              <w:t>33.3% (7/21)</w:t>
+            </w:r>
+          </w:p>
+        </w:tc>
+      </w:tr>
+      <w:tr>
+        <w:tc>
+          <w:tcPr>
+            <w:tcW w:type="dxa" w:w="2016"/>
+          </w:tcPr>
+          <w:p>
+            <w:pPr>
+              <w:jc w:val="left"/>
+            </w:pPr>
+            <w:r>
+              <w:rPr>
+                <w:rFonts w:ascii="Times New Roman" w:hAnsi="Times New Roman"/>
+                <w:b w:val="0"/>
+                <w:i w:val="0"/>
+                <w:color w:val="000000"/>
+                <w:sz w:val="17"/>
+              </w:rPr>
+              <w:t>False-refusal rate</w:t>
+            </w:r>
+          </w:p>
+        </w:tc>
+        <w:tc>
+          <w:tcPr>
+            <w:tcW w:type="dxa" w:w="2016"/>
+          </w:tcPr>
+          <w:p>
+            <w:pPr>
+              <w:jc w:val="left"/>
+            </w:pPr>
+            <w:r>
+              <w:rPr>
+                <w:rFonts w:ascii="Times New Roman" w:hAnsi="Times New Roman"/>
+                <w:b w:val="0"/>
+                <w:i w:val="0"/>
+                <w:color w:val="000000"/>
+                <w:sz w:val="17"/>
+              </w:rPr>
+              <w:t>0.0% (0/20)</w:t>
+            </w:r>
+          </w:p>
+        </w:tc>
+        <w:tc>
+          <w:tcPr>
+            <w:tcW w:type="dxa" w:w="2016"/>
+          </w:tcPr>
+          <w:p>
+            <w:pPr>
+              <w:jc w:val="left"/>
+            </w:pPr>
+            <w:r>
+              <w:rPr>
+                <w:rFonts w:ascii="Times New Roman" w:hAnsi="Times New Roman"/>
+                <w:b w:val="0"/>
+                <w:i w:val="0"/>
+                <w:color w:val="000000"/>
+                <w:sz w:val="17"/>
+              </w:rPr>
+              <w:t>0.0% (0/20)</w:t>
+            </w:r>
+          </w:p>
+        </w:tc>
+        <w:tc>
+          <w:tcPr>
+            <w:tcW w:type="dxa" w:w="2016"/>
+          </w:tcPr>
+          <w:p>
+            <w:pPr>
+              <w:jc w:val="left"/>
+            </w:pPr>
+            <w:r>
+              <w:rPr>
+                <w:rFonts w:ascii="Times New Roman" w:hAnsi="Times New Roman"/>
+                <w:b w:val="0"/>
+                <w:i w:val="0"/>
+                <w:color w:val="000000"/>
+                <w:sz w:val="17"/>
+              </w:rPr>
+              <w:t>0.0% (0/20)</w:t>
+            </w:r>
+          </w:p>
+        </w:tc>
+        <w:tc>
+          <w:tcPr>
+            <w:tcW w:type="dxa" w:w="2016"/>
+          </w:tcPr>
+          <w:p>
+            <w:pPr>
+              <w:jc w:val="left"/>
+            </w:pPr>
+            <w:r>
+              <w:rPr>
+                <w:rFonts w:ascii="Times New Roman" w:hAnsi="Times New Roman"/>
+                <w:b w:val="0"/>
+                <w:i w:val="0"/>
+                <w:color w:val="000000"/>
+                <w:sz w:val="17"/>
+              </w:rPr>
+              <w:t>0.0% (0/60)</w:t>
+            </w:r>
+          </w:p>
+        </w:tc>
+      </w:tr>
+      <w:tr>
+        <w:tc>
+          <w:tcPr>
+            <w:tcW w:type="dxa" w:w="2016"/>
+          </w:tcPr>
+          <w:p>
+            <w:pPr>
+              <w:jc w:val="left"/>
+            </w:pPr>
+            <w:r>
+              <w:rPr>
+                <w:rFonts w:ascii="Times New Roman" w:hAnsi="Times New Roman"/>
+                <w:b w:val="0"/>
+                <w:i w:val="0"/>
+                <w:color w:val="000000"/>
+                <w:sz w:val="17"/>
+              </w:rPr>
+              <w:t>Referral routing</w:t>
+            </w:r>
+          </w:p>
+        </w:tc>
+        <w:tc>
+          <w:tcPr>
+            <w:tcW w:type="dxa" w:w="2016"/>
+          </w:tcPr>
+          <w:p>
+            <w:pPr>
+              <w:jc w:val="left"/>
+            </w:pPr>
+            <w:r>
+              <w:rPr>
+                <w:rFonts w:ascii="Times New Roman" w:hAnsi="Times New Roman"/>
+                <w:b w:val="0"/>
+                <w:i w:val="0"/>
+                <w:color w:val="000000"/>
+                <w:sz w:val="17"/>
+              </w:rPr>
+              <w:t>100.0% (4/4)</w:t>
+            </w:r>
+          </w:p>
+        </w:tc>
+        <w:tc>
+          <w:tcPr>
+            <w:tcW w:type="dxa" w:w="2016"/>
+          </w:tcPr>
+          <w:p>
+            <w:pPr>
+              <w:jc w:val="left"/>
+            </w:pPr>
+            <w:r>
+              <w:rPr>
+                <w:rFonts w:ascii="Times New Roman" w:hAnsi="Times New Roman"/>
+                <w:b w:val="0"/>
+                <w:i w:val="0"/>
+                <w:color w:val="000000"/>
+                <w:sz w:val="17"/>
+              </w:rPr>
+              <w:t>100.0% (4/4)</w:t>
+            </w:r>
+          </w:p>
+        </w:tc>
+        <w:tc>
+          <w:tcPr>
+            <w:tcW w:type="dxa" w:w="2016"/>
+          </w:tcPr>
+          <w:p>
+            <w:pPr>
+              <w:jc w:val="left"/>
+            </w:pPr>
+            <w:r>
+              <w:rPr>
+                <w:rFonts w:ascii="Times New Roman" w:hAnsi="Times New Roman"/>
+                <w:b w:val="0"/>
+                <w:i w:val="0"/>
+                <w:color w:val="000000"/>
+                <w:sz w:val="17"/>
+              </w:rPr>
+              <w:t>100.0% (6/6)</w:t>
+            </w:r>
+          </w:p>
+        </w:tc>
+        <w:tc>
+          <w:tcPr>
+            <w:tcW w:type="dxa" w:w="2016"/>
+          </w:tcPr>
+          <w:p>
+            <w:pPr>
+              <w:jc w:val="left"/>
+            </w:pPr>
+            <w:r>
+              <w:rPr>
+                <w:rFonts w:ascii="Times New Roman" w:hAnsi="Times New Roman"/>
+                <w:b w:val="0"/>
+                <w:i w:val="0"/>
+                <w:color w:val="000000"/>
+                <w:sz w:val="17"/>
+              </w:rPr>
+              <w:t>100.0% (14/14)</w:t>
+            </w:r>
+          </w:p>
+        </w:tc>
+      </w:tr>
+      <w:tr>
+        <w:tc>
+          <w:tcPr>
+            <w:tcW w:type="dxa" w:w="2016"/>
+          </w:tcPr>
+          <w:p>
+            <w:pPr>
+              <w:jc w:val="left"/>
+            </w:pPr>
+            <w:r>
+              <w:rPr>
+                <w:rFonts w:ascii="Times New Roman" w:hAnsi="Times New Roman"/>
+                <w:b w:val="0"/>
+                <w:i w:val="0"/>
+                <w:color w:val="000000"/>
+                <w:sz w:val="17"/>
+              </w:rPr>
+              <w:t>Language fidelity (mean/5)</w:t>
+            </w:r>
+          </w:p>
+        </w:tc>
+        <w:tc>
+          <w:tcPr>
+            <w:tcW w:type="dxa" w:w="2016"/>
+          </w:tcPr>
+          <w:p>
+            <w:pPr>
+              <w:jc w:val="left"/>
+            </w:pPr>
+            <w:r>
+              <w:rPr>
+                <w:rFonts w:ascii="Times New Roman" w:hAnsi="Times New Roman"/>
+                <w:b w:val="0"/>
+                <w:i w:val="0"/>
+                <w:color w:val="000000"/>
+                <w:sz w:val="17"/>
+              </w:rPr>
+              <w:t>5.00</w:t>
+            </w:r>
+          </w:p>
+        </w:tc>
+        <w:tc>
+          <w:tcPr>
+            <w:tcW w:type="dxa" w:w="2016"/>
+          </w:tcPr>
+          <w:p>
+            <w:pPr>
+              <w:jc w:val="left"/>
+            </w:pPr>
+            <w:r>
+              <w:rPr>
+                <w:rFonts w:ascii="Times New Roman" w:hAnsi="Times New Roman"/>
+                <w:b w:val="0"/>
+                <w:i w:val="0"/>
+                <w:color w:val="000000"/>
+                <w:sz w:val="17"/>
+              </w:rPr>
+              <w:t>4.13</w:t>
+            </w:r>
+          </w:p>
+        </w:tc>
+        <w:tc>
+          <w:tcPr>
+            <w:tcW w:type="dxa" w:w="2016"/>
+          </w:tcPr>
+          <w:p>
+            <w:pPr>
+              <w:jc w:val="left"/>
+            </w:pPr>
+            <w:r>
+              <w:rPr>
+                <w:rFonts w:ascii="Times New Roman" w:hAnsi="Times New Roman"/>
+                <w:b w:val="0"/>
+                <w:i w:val="0"/>
+                <w:color w:val="000000"/>
+                <w:sz w:val="17"/>
+              </w:rPr>
+              <w:t>4.33</w:t>
+            </w:r>
+          </w:p>
+        </w:tc>
+        <w:tc>
+          <w:tcPr>
+            <w:tcW w:type="dxa" w:w="2016"/>
+          </w:tcPr>
+          <w:p>
+            <w:pPr>
+              <w:jc w:val="left"/>
+            </w:pPr>
+            <w:r>
+              <w:rPr>
+                <w:rFonts w:ascii="Times New Roman" w:hAnsi="Times New Roman"/>
+                <w:b w:val="0"/>
+                <w:i w:val="0"/>
+                <w:color w:val="000000"/>
+                <w:sz w:val="17"/>
+              </w:rPr>
+              <w:t>4.49</w:t>
+            </w:r>
+          </w:p>
+        </w:tc>
+      </w:tr>
+    </w:tbl>
+    <w:p>
+      <w:pPr>
+        <w:spacing w:after="120"/>
+      </w:pPr>
+    </w:p>
+    <w:p>
+      <w:pPr>
+        <w:spacing w:before="0" w:after="80" w:line="252" w:lineRule="auto"/>
+        <w:jc w:val="both"/>
+      </w:pPr>
+      <w:r>
+        <w:rPr>
+          <w:rFonts w:ascii="Times New Roman" w:hAnsi="Times New Roman"/>
+          <w:b w:val="0"/>
+          <w:i w:val="0"/>
+          <w:color w:val="000000"/>
+          <w:sz w:val="19"/>
+        </w:rPr>
+        <w:t xml:space="preserve">In Run 3, overall answer correctness rose to </w:t>
       </w:r>
       <w:r>
         <w:rPr>
@@ -5631,7 +6600,7 @@
           <w:color w:val="000000"/>
           <w:sz w:val="19"/>
         </w:rPr>
-        <w:t xml:space="preserve"> Table VIII classifies the remaining eight answerable cases that did not achieve full credit in Run 3 (English 3, Marathi 3, Hindi 2).</w:t>
+        <w:t xml:space="preserve"> Table IX classifies the remaining eight answerable cases that did not achieve full credit in Run 3 (English 3, Marathi 3, Hindi 2).</w:t>
       </w:r>
     </w:p>
     <w:p>
@@ -5647,7 +6616,7 @@
           <w:color w:val="000000"/>
           <w:sz w:val="20"/>
         </w:rPr>
-        <w:t>TABLE VIII: AUDIT OF EIGHT NON-CORRECT ANSWERABLE CASES IN RUN 3</w:t>
+        <w:t>TABLE IX: AUDIT OF EIGHT NON-CORRECT ANSWERABLE CASES IN RUN 3</w:t>
       </w:r>
     </w:p>
     <w:tbl>
@@ -6057,7 +7026,7 @@
           <w:color w:val="000000"/>
           <w:sz w:val="20"/>
         </w:rPr>
-        <w:t>TABLE IX: SUMMARY OF EVIDENCE LAYERS AND WHAT EACH SUPPORTS</w:t>
+        <w:t>TABLE X: SUMMARY OF EVIDENCE LAYERS AND WHAT EACH SUPPORTS</w:t>
       </w:r>
     </w:p>
     <w:tbl>
@@ -6299,7 +7268,7 @@
           <w:color w:val="000000"/>
           <w:sz w:val="19"/>
         </w:rPr>
-        <w:t>Table IX summarizes the four evidence layers. Together they demonstrate that deterministic rendering eliminates financial hallucinations on critical institutional facts, while query normalization and script-aware scoring close the regional language gap.</w:t>
+        <w:t>Table X summarizes the four evidence layers. Together they demonstrate that deterministic rendering eliminates financial hallucinations on critical institutional facts, while query normalization and script-aware scoring close the regional language gap.</w:t>
       </w:r>
     </w:p>
     <w:p>
@@ -6475,7 +7444,7 @@
           <w:color w:val="000000"/>
           <w:sz w:val="19"/>
         </w:rPr>
-        <w:t>Marathi and Hindi use rule-based interpretations and source-bound translations. The progression across milestones traces the resolution of key engineering limits: in Run 1 (`809455b`), two Marathi and Hindi staff-recruitment cases were misrouted to admissions (13/15 referrals correct); extending employment patterns in Run 2 (`3216bb3`) achieved 100% routing closure. In Run 2, 14 Devanagari queries were falsely refused; extending the normalizer to facility and transit vocabulary in Run 3 (`6219cb8`) eliminated all false refusals (0/60). No experiment reported here calls a live generation model; production HTTPS, cloud persistence, and high-concurrency load testing remain deployment requirements.</w:t>
+        <w:t>Marathi and Hindi use rule-based interpretations and source-bound translations. The progression across milestones traces the resolution of key engineering limits: in Run 1 (`809455b`), two Marathi and Hindi staff-recruitment cases were misrouted to admissions (13/15 referrals correct); extending employment patterns in Run 2 (`3216bb3`) achieved 100% routing closure. In Run 2, 14 Devanagari queries were falsely refused; extending the normalizer to facility and transit vocabulary in Run 3 (`8167770`) eliminated all false refusals (0/60). No experiment reported here calls a live generation model; production HTTPS, cloud persistence, and high-concurrency load testing remain deployment requirements.</w:t>
       </w:r>
     </w:p>
     <w:p>
@@ -6555,7 +7524,7 @@
           <w:color w:val="000000"/>
           <w:sz w:val="19"/>
         </w:rPr>
-        <w:t>Persistent limitations are acknowledged: English safe abstention on unanswerable queries remains 57.1%, and eight answerable cases await seeding of external scheme circulars. The priority next step is a large-scale controlled ablation comparing deterministic rendering directly against generative RAG on held-out applicant cohorts, alongside continuous longitudinal evaluation on unconstrained prospective applicant traffic, expanding unanswerable query abstention guards, and deploying the audited assistant in a supervised institutional pilot.</w:t>
+        <w:t>Persistent limitations are acknowledged: English safe abstention on unanswerable queries remains 57.1%, and eight answerable cases await seeding of external scheme circulars. The priority next step is a controlled, larger-scale ablation of deterministic rendering against full generative retrieval-augmented generation on the frozen corpus, alongside continuous longitudinal evaluation on unconstrained prospective applicant traffic, expanding unanswerable query abstention guards, and deploying the audited assistant in a supervised institutional pilot.</w:t>
       </w:r>
     </w:p>
     <w:p>
@@ -6587,7 +7556,7 @@
           <w:color w:val="000000"/>
           <w:sz w:val="19"/>
         </w:rPr>
-        <w:t>The case catalog (`cases.csv`), rater adjudication sheets, and Run 1–3 evaluation reports are archived under `deliverables/evaluation-record-kit/` and `backend/evaluation/reports/`. Backend evaluators reproduce the routing, retrieval and verifier diagnostics. Project source: https://github.com/shraddha-2332/MITRA-The-Virtual-Assistant. Source-bound development summaries, corpus identifiers and limitations are stored under `docs/research-review`. Figs. 3–6 are unedited captures of the implemented application.</w:t>
+        <w:t>The case catalog (`cases.csv`), rater adjudication sheets, and Run 1–3 evaluation reports are archived in the project repository at `deliverables/evaluation-record-kit/`. Backend evaluators reproduce the routing, retrieval and verifier diagnostics. Project source: https://github.com/shraddha-2332/MITRA-The-Virtual-Assistant. Source-bound development summaries, corpus identifiers and limitations are stored under `docs/research-review`. Figs. 3–6 are unedited captures of the implemented application.</w:t>
       </w:r>
     </w:p>
     <w:p>

</xml_diff>

<commit_message>
docs: mirror exact 10-table structure, Run 2 audit, and Abstract ending from docx
</commit_message>
<xml_diff>
--- a/deliverables/MITRA_Research_Paper.docx
+++ b/deliverables/MITRA_Research_Paper.docx
@@ -83,7 +83,7 @@
           <w:color w:val="000000"/>
           <w:sz w:val="19"/>
         </w:rPr>
-        <w:t>Admissions answers must preserve the academic year, entry route and applicant category attached to each fact, and a misattributed fee can affect a family's financial decisions. This paper presents MITRA, an assistant for MIT College of Railway Engineering &amp; Research, Barshi, supporting English, Marathi and Hindi through maintained records, deterministic rendering of critical fee and intake facts, scope-aware clarification, referral to human assistance, and an optional English-only generation path gated by bounded verification. We report a 90-case benchmark (30 per language; 60 answerable, 21 unanswerable, nine ambiguous) evaluated by external human raters and audited through an automated harness with generation disabled (inter-rater agreement: Cohen's $\kappa = 0.96$ [21]). Across milestones, baseline correctness of 60.0% overall (English 85.0%, Marathi 50.0%, Hindi 45.0%; Fisher's exact $p \approx 0.006$ [22]) was constrained by a 23.3% Devanagari false-refusal rate driven by query normalization gaps. Extending Devanagari facility, sports, and transit normalization combined with script-aware scoring (Run 3) raised correctness to 86.7% overall (English 85.0%, Marathi 85.0%, Hindi 90.0%), eliminating false refusals (0.0%) and closing the language disparity (Fisher's exact $p = 1.0$). Across all 15 institutional fee cases, deterministic rendering preserved 100% attribute fidelity without numerical hallucination (95% CI lower bound ≈ 80%). Large-scale longitudinal deployment, independent held-out evaluation, and live monitoring remain future work.</w:t>
+        <w:t>Admissions answers must preserve the academic year, entry route and applicant category attached to each fact, and a misattributed fee can affect a family's financial decisions. This paper presents MITRA, an assistant for MIT College of Railway Engineering &amp; Research, Barshi, supporting English, Marathi and Hindi through maintained records, deterministic rendering of critical fee and intake facts, scope-aware clarification, referral to human assistance, and an optional English-only generation path gated by bounded verification. We report a 90-case benchmark (30 per language; 60 answerable, 21 unanswerable, nine ambiguous) evaluated by external human raters and audited through an automated harness with generation disabled (inter-rater agreement: Cohen's $\kappa = 0.96$ [21]). Across milestones, baseline correctness of 60.0% overall (English 85.0%, Marathi 50.0%, Hindi 45.0%; Fisher's exact $p \approx 0.006$ [22]) was constrained by a 23.3% Devanagari false-refusal rate driven by query normalization gaps. Extending Devanagari facility, sports, and transit normalization combined with script-aware scoring (Run 3) raised correctness to 86.7% overall (English 85.0%, Marathi 85.0%, Hindi 90.0%), eliminating false refusals (0.0%) and closing the language disparity (Fisher's exact $p = 1.0$). Across all 15 institutional fee cases, deterministic rendering preserved 100% attribute fidelity without numerical hallucination (95% CI lower bound ≈ 80%). An independent, held-out evaluation remains future work.</w:t>
       </w:r>
     </w:p>
     <w:p>
@@ -5399,1091 +5399,6 @@
     </w:p>
     <w:p>
       <w:pPr>
-        <w:spacing w:before="0" w:after="80" w:line="252" w:lineRule="auto"/>
-        <w:jc w:val="both"/>
-      </w:pPr>
-      <w:r>
-        <w:rPr>
-          <w:rFonts w:ascii="Times New Roman" w:hAnsi="Times New Roman"/>
-          <w:b w:val="0"/>
-          <w:i w:val="0"/>
-          <w:color w:val="000000"/>
-          <w:sz w:val="19"/>
-        </w:rPr>
-        <w:t xml:space="preserve">Following the diagnosis detailed in Section 6.5, Run 3 (`8167770`) integrated native dictionary normalization for facility, sports, transit, and affiliation vocabulary into query preprocessing and made harness fact-scoring script-aware (handling Devanagari numerals and cross-script synonyms like </w:t>
-      </w:r>
-      <w:r>
-        <w:rPr>
-          <w:rFonts w:ascii="Times New Roman" w:hAnsi="Times New Roman"/>
-          <w:b w:val="0"/>
-          <w:i/>
-          <w:color w:val="000000"/>
-          <w:sz w:val="19"/>
-        </w:rPr>
-        <w:t>railway</w:t>
-      </w:r>
-      <w:r>
-        <w:rPr>
-          <w:rFonts w:ascii="Times New Roman" w:hAnsi="Times New Roman"/>
-          <w:b w:val="0"/>
-          <w:i w:val="0"/>
-          <w:color w:val="000000"/>
-          <w:sz w:val="19"/>
-        </w:rPr>
-        <w:t xml:space="preserve"> / </w:t>
-      </w:r>
-      <w:r>
-        <w:rPr>
-          <w:rFonts w:ascii="Times New Roman" w:hAnsi="Times New Roman"/>
-          <w:b w:val="0"/>
-          <w:i/>
-          <w:color w:val="000000"/>
-          <w:sz w:val="19"/>
-        </w:rPr>
-        <w:t>रेल्वे</w:t>
-      </w:r>
-      <w:r>
-        <w:rPr>
-          <w:rFonts w:ascii="Times New Roman" w:hAnsi="Times New Roman"/>
-          <w:b w:val="0"/>
-          <w:i w:val="0"/>
-          <w:color w:val="000000"/>
-          <w:sz w:val="19"/>
-        </w:rPr>
-        <w:t>). Table VIII reports the post-normalization benchmark outcomes.</w:t>
-      </w:r>
-    </w:p>
-    <w:p>
-      <w:pPr>
-        <w:keepNext/>
-        <w:spacing w:before="200" w:after="60"/>
-      </w:pPr>
-      <w:r>
-        <w:rPr>
-          <w:rFonts w:ascii="Times New Roman" w:hAnsi="Times New Roman"/>
-          <w:b/>
-          <w:i/>
-          <w:color w:val="000000"/>
-          <w:sz w:val="20"/>
-        </w:rPr>
-        <w:t>TABLE VIII: MULTILINGUAL 90-CASE BENCHMARK POST-NORMALIZATION OUTCOMES (RUN 3)</w:t>
-      </w:r>
-    </w:p>
-    <w:tbl>
-      <w:tblPr>
-        <w:tblW w:type="auto" w:w="0"/>
-        <w:jc w:val="center"/>
-        <w:tblLook w:firstColumn="1" w:firstRow="1" w:lastColumn="0" w:lastRow="0" w:noHBand="0" w:noVBand="1" w:val="04A0"/>
-      </w:tblPr>
-      <w:tblGrid>
-        <w:gridCol w:w="2016"/>
-        <w:gridCol w:w="2016"/>
-        <w:gridCol w:w="2016"/>
-        <w:gridCol w:w="2016"/>
-        <w:gridCol w:w="2016"/>
-      </w:tblGrid>
-      <w:tr>
-        <w:tc>
-          <w:tcPr>
-            <w:tcW w:type="dxa" w:w="2016"/>
-          </w:tcPr>
-          <w:p>
-            <w:pPr>
-              <w:jc w:val="left"/>
-            </w:pPr>
-            <w:r>
-              <w:rPr>
-                <w:rFonts w:ascii="Times New Roman" w:hAnsi="Times New Roman"/>
-                <w:b/>
-                <w:i w:val="0"/>
-                <w:color w:val="000000"/>
-                <w:sz w:val="17"/>
-              </w:rPr>
-              <w:t>Metric</w:t>
-            </w:r>
-          </w:p>
-        </w:tc>
-        <w:tc>
-          <w:tcPr>
-            <w:tcW w:type="dxa" w:w="2016"/>
-          </w:tcPr>
-          <w:p>
-            <w:pPr>
-              <w:jc w:val="left"/>
-            </w:pPr>
-            <w:r>
-              <w:rPr>
-                <w:rFonts w:ascii="Times New Roman" w:hAnsi="Times New Roman"/>
-                <w:b/>
-                <w:i w:val="0"/>
-                <w:color w:val="000000"/>
-                <w:sz w:val="17"/>
-              </w:rPr>
-              <w:t>English ($n = 30$)</w:t>
-            </w:r>
-          </w:p>
-        </w:tc>
-        <w:tc>
-          <w:tcPr>
-            <w:tcW w:type="dxa" w:w="2016"/>
-          </w:tcPr>
-          <w:p>
-            <w:pPr>
-              <w:jc w:val="left"/>
-            </w:pPr>
-            <w:r>
-              <w:rPr>
-                <w:rFonts w:ascii="Times New Roman" w:hAnsi="Times New Roman"/>
-                <w:b/>
-                <w:i w:val="0"/>
-                <w:color w:val="000000"/>
-                <w:sz w:val="17"/>
-              </w:rPr>
-              <w:t>Marathi ($n = 30$)</w:t>
-            </w:r>
-          </w:p>
-        </w:tc>
-        <w:tc>
-          <w:tcPr>
-            <w:tcW w:type="dxa" w:w="2016"/>
-          </w:tcPr>
-          <w:p>
-            <w:pPr>
-              <w:jc w:val="left"/>
-            </w:pPr>
-            <w:r>
-              <w:rPr>
-                <w:rFonts w:ascii="Times New Roman" w:hAnsi="Times New Roman"/>
-                <w:b/>
-                <w:i w:val="0"/>
-                <w:color w:val="000000"/>
-                <w:sz w:val="17"/>
-              </w:rPr>
-              <w:t>Hindi ($n = 30$)</w:t>
-            </w:r>
-          </w:p>
-        </w:tc>
-        <w:tc>
-          <w:tcPr>
-            <w:tcW w:type="dxa" w:w="2016"/>
-          </w:tcPr>
-          <w:p>
-            <w:pPr>
-              <w:jc w:val="left"/>
-            </w:pPr>
-            <w:r>
-              <w:rPr>
-                <w:rFonts w:ascii="Times New Roman" w:hAnsi="Times New Roman"/>
-                <w:b/>
-                <w:i w:val="0"/>
-                <w:color w:val="000000"/>
-                <w:sz w:val="17"/>
-              </w:rPr>
-              <w:t>Overall ($N = 90$)</w:t>
-            </w:r>
-          </w:p>
-        </w:tc>
-      </w:tr>
-      <w:tr>
-        <w:tc>
-          <w:tcPr>
-            <w:tcW w:type="dxa" w:w="2016"/>
-          </w:tcPr>
-          <w:p>
-            <w:pPr>
-              <w:jc w:val="left"/>
-            </w:pPr>
-            <w:r>
-              <w:rPr>
-                <w:rFonts w:ascii="Times New Roman" w:hAnsi="Times New Roman"/>
-                <w:b w:val="0"/>
-                <w:i w:val="0"/>
-                <w:color w:val="000000"/>
-                <w:sz w:val="17"/>
-              </w:rPr>
-              <w:t>Answer correctness</w:t>
-            </w:r>
-          </w:p>
-        </w:tc>
-        <w:tc>
-          <w:tcPr>
-            <w:tcW w:type="dxa" w:w="2016"/>
-          </w:tcPr>
-          <w:p>
-            <w:pPr>
-              <w:jc w:val="left"/>
-            </w:pPr>
-            <w:r>
-              <w:rPr>
-                <w:rFonts w:ascii="Times New Roman" w:hAnsi="Times New Roman"/>
-                <w:b w:val="0"/>
-                <w:i w:val="0"/>
-                <w:color w:val="000000"/>
-                <w:sz w:val="17"/>
-              </w:rPr>
-              <w:t>85.0% (17/20)</w:t>
-            </w:r>
-          </w:p>
-        </w:tc>
-        <w:tc>
-          <w:tcPr>
-            <w:tcW w:type="dxa" w:w="2016"/>
-          </w:tcPr>
-          <w:p>
-            <w:pPr>
-              <w:jc w:val="left"/>
-            </w:pPr>
-            <w:r>
-              <w:rPr>
-                <w:rFonts w:ascii="Times New Roman" w:hAnsi="Times New Roman"/>
-                <w:b w:val="0"/>
-                <w:i w:val="0"/>
-                <w:color w:val="000000"/>
-                <w:sz w:val="17"/>
-              </w:rPr>
-              <w:t>85.0% (17/20)</w:t>
-            </w:r>
-          </w:p>
-        </w:tc>
-        <w:tc>
-          <w:tcPr>
-            <w:tcW w:type="dxa" w:w="2016"/>
-          </w:tcPr>
-          <w:p>
-            <w:pPr>
-              <w:jc w:val="left"/>
-            </w:pPr>
-            <w:r>
-              <w:rPr>
-                <w:rFonts w:ascii="Times New Roman" w:hAnsi="Times New Roman"/>
-                <w:b w:val="0"/>
-                <w:i w:val="0"/>
-                <w:color w:val="000000"/>
-                <w:sz w:val="17"/>
-              </w:rPr>
-              <w:t>90.0% (18/20)</w:t>
-            </w:r>
-          </w:p>
-        </w:tc>
-        <w:tc>
-          <w:tcPr>
-            <w:tcW w:type="dxa" w:w="2016"/>
-          </w:tcPr>
-          <w:p>
-            <w:pPr>
-              <w:jc w:val="left"/>
-            </w:pPr>
-            <w:r>
-              <w:rPr>
-                <w:rFonts w:ascii="Times New Roman" w:hAnsi="Times New Roman"/>
-                <w:b w:val="0"/>
-                <w:i w:val="0"/>
-                <w:color w:val="000000"/>
-                <w:sz w:val="17"/>
-              </w:rPr>
-              <w:t>86.7% (52/60)</w:t>
-            </w:r>
-          </w:p>
-        </w:tc>
-      </w:tr>
-      <w:tr>
-        <w:tc>
-          <w:tcPr>
-            <w:tcW w:type="dxa" w:w="2016"/>
-          </w:tcPr>
-          <w:p>
-            <w:pPr>
-              <w:jc w:val="left"/>
-            </w:pPr>
-            <w:r>
-              <w:rPr>
-                <w:rFonts w:ascii="Times New Roman" w:hAnsi="Times New Roman"/>
-                <w:b w:val="0"/>
-                <w:i w:val="0"/>
-                <w:color w:val="000000"/>
-                <w:sz w:val="17"/>
-              </w:rPr>
-              <w:t>Source attachment</w:t>
-            </w:r>
-          </w:p>
-        </w:tc>
-        <w:tc>
-          <w:tcPr>
-            <w:tcW w:type="dxa" w:w="2016"/>
-          </w:tcPr>
-          <w:p>
-            <w:pPr>
-              <w:jc w:val="left"/>
-            </w:pPr>
-            <w:r>
-              <w:rPr>
-                <w:rFonts w:ascii="Times New Roman" w:hAnsi="Times New Roman"/>
-                <w:b w:val="0"/>
-                <w:i w:val="0"/>
-                <w:color w:val="000000"/>
-                <w:sz w:val="17"/>
-              </w:rPr>
-              <w:t>100.0% (20/20)</w:t>
-            </w:r>
-          </w:p>
-        </w:tc>
-        <w:tc>
-          <w:tcPr>
-            <w:tcW w:type="dxa" w:w="2016"/>
-          </w:tcPr>
-          <w:p>
-            <w:pPr>
-              <w:jc w:val="left"/>
-            </w:pPr>
-            <w:r>
-              <w:rPr>
-                <w:rFonts w:ascii="Times New Roman" w:hAnsi="Times New Roman"/>
-                <w:b w:val="0"/>
-                <w:i w:val="0"/>
-                <w:color w:val="000000"/>
-                <w:sz w:val="17"/>
-              </w:rPr>
-              <w:t>100.0% (20/20)</w:t>
-            </w:r>
-          </w:p>
-        </w:tc>
-        <w:tc>
-          <w:tcPr>
-            <w:tcW w:type="dxa" w:w="2016"/>
-          </w:tcPr>
-          <w:p>
-            <w:pPr>
-              <w:jc w:val="left"/>
-            </w:pPr>
-            <w:r>
-              <w:rPr>
-                <w:rFonts w:ascii="Times New Roman" w:hAnsi="Times New Roman"/>
-                <w:b w:val="0"/>
-                <w:i w:val="0"/>
-                <w:color w:val="000000"/>
-                <w:sz w:val="17"/>
-              </w:rPr>
-              <w:t>100.0% (20/20)</w:t>
-            </w:r>
-          </w:p>
-        </w:tc>
-        <w:tc>
-          <w:tcPr>
-            <w:tcW w:type="dxa" w:w="2016"/>
-          </w:tcPr>
-          <w:p>
-            <w:pPr>
-              <w:jc w:val="left"/>
-            </w:pPr>
-            <w:r>
-              <w:rPr>
-                <w:rFonts w:ascii="Times New Roman" w:hAnsi="Times New Roman"/>
-                <w:b w:val="0"/>
-                <w:i w:val="0"/>
-                <w:color w:val="000000"/>
-                <w:sz w:val="17"/>
-              </w:rPr>
-              <w:t>100.0% (60/60)</w:t>
-            </w:r>
-          </w:p>
-        </w:tc>
-      </w:tr>
-      <w:tr>
-        <w:tc>
-          <w:tcPr>
-            <w:tcW w:type="dxa" w:w="2016"/>
-          </w:tcPr>
-          <w:p>
-            <w:pPr>
-              <w:jc w:val="left"/>
-            </w:pPr>
-            <w:r>
-              <w:rPr>
-                <w:rFonts w:ascii="Times New Roman" w:hAnsi="Times New Roman"/>
-                <w:b w:val="0"/>
-                <w:i w:val="0"/>
-                <w:color w:val="000000"/>
-                <w:sz w:val="17"/>
-              </w:rPr>
-              <w:t>Appropriate abstention</w:t>
-            </w:r>
-          </w:p>
-        </w:tc>
-        <w:tc>
-          <w:tcPr>
-            <w:tcW w:type="dxa" w:w="2016"/>
-          </w:tcPr>
-          <w:p>
-            <w:pPr>
-              <w:jc w:val="left"/>
-            </w:pPr>
-            <w:r>
-              <w:rPr>
-                <w:rFonts w:ascii="Times New Roman" w:hAnsi="Times New Roman"/>
-                <w:b w:val="0"/>
-                <w:i w:val="0"/>
-                <w:color w:val="000000"/>
-                <w:sz w:val="17"/>
-              </w:rPr>
-              <w:t>57.1% (4/7)</w:t>
-            </w:r>
-          </w:p>
-        </w:tc>
-        <w:tc>
-          <w:tcPr>
-            <w:tcW w:type="dxa" w:w="2016"/>
-          </w:tcPr>
-          <w:p>
-            <w:pPr>
-              <w:jc w:val="left"/>
-            </w:pPr>
-            <w:r>
-              <w:rPr>
-                <w:rFonts w:ascii="Times New Roman" w:hAnsi="Times New Roman"/>
-                <w:b w:val="0"/>
-                <w:i w:val="0"/>
-                <w:color w:val="000000"/>
-                <w:sz w:val="17"/>
-              </w:rPr>
-              <w:t>57.1% (4/7)</w:t>
-            </w:r>
-          </w:p>
-        </w:tc>
-        <w:tc>
-          <w:tcPr>
-            <w:tcW w:type="dxa" w:w="2016"/>
-          </w:tcPr>
-          <w:p>
-            <w:pPr>
-              <w:jc w:val="left"/>
-            </w:pPr>
-            <w:r>
-              <w:rPr>
-                <w:rFonts w:ascii="Times New Roman" w:hAnsi="Times New Roman"/>
-                <w:b w:val="0"/>
-                <w:i w:val="0"/>
-                <w:color w:val="000000"/>
-                <w:sz w:val="17"/>
-              </w:rPr>
-              <w:t>85.7% (6/7)</w:t>
-            </w:r>
-          </w:p>
-        </w:tc>
-        <w:tc>
-          <w:tcPr>
-            <w:tcW w:type="dxa" w:w="2016"/>
-          </w:tcPr>
-          <w:p>
-            <w:pPr>
-              <w:jc w:val="left"/>
-            </w:pPr>
-            <w:r>
-              <w:rPr>
-                <w:rFonts w:ascii="Times New Roman" w:hAnsi="Times New Roman"/>
-                <w:b w:val="0"/>
-                <w:i w:val="0"/>
-                <w:color w:val="000000"/>
-                <w:sz w:val="17"/>
-              </w:rPr>
-              <w:t>66.7% (14/21)</w:t>
-            </w:r>
-          </w:p>
-        </w:tc>
-      </w:tr>
-      <w:tr>
-        <w:tc>
-          <w:tcPr>
-            <w:tcW w:type="dxa" w:w="2016"/>
-          </w:tcPr>
-          <w:p>
-            <w:pPr>
-              <w:jc w:val="left"/>
-            </w:pPr>
-            <w:r>
-              <w:rPr>
-                <w:rFonts w:ascii="Times New Roman" w:hAnsi="Times New Roman"/>
-                <w:b w:val="0"/>
-                <w:i w:val="0"/>
-                <w:color w:val="000000"/>
-                <w:sz w:val="17"/>
-              </w:rPr>
-              <w:t>Clarification accuracy</w:t>
-            </w:r>
-          </w:p>
-        </w:tc>
-        <w:tc>
-          <w:tcPr>
-            <w:tcW w:type="dxa" w:w="2016"/>
-          </w:tcPr>
-          <w:p>
-            <w:pPr>
-              <w:jc w:val="left"/>
-            </w:pPr>
-            <w:r>
-              <w:rPr>
-                <w:rFonts w:ascii="Times New Roman" w:hAnsi="Times New Roman"/>
-                <w:b w:val="0"/>
-                <w:i w:val="0"/>
-                <w:color w:val="000000"/>
-                <w:sz w:val="17"/>
-              </w:rPr>
-              <w:t>33.3% (1/3)</w:t>
-            </w:r>
-          </w:p>
-        </w:tc>
-        <w:tc>
-          <w:tcPr>
-            <w:tcW w:type="dxa" w:w="2016"/>
-          </w:tcPr>
-          <w:p>
-            <w:pPr>
-              <w:jc w:val="left"/>
-            </w:pPr>
-            <w:r>
-              <w:rPr>
-                <w:rFonts w:ascii="Times New Roman" w:hAnsi="Times New Roman"/>
-                <w:b w:val="0"/>
-                <w:i w:val="0"/>
-                <w:color w:val="000000"/>
-                <w:sz w:val="17"/>
-              </w:rPr>
-              <w:t>100.0% (3/3)</w:t>
-            </w:r>
-          </w:p>
-        </w:tc>
-        <w:tc>
-          <w:tcPr>
-            <w:tcW w:type="dxa" w:w="2016"/>
-          </w:tcPr>
-          <w:p>
-            <w:pPr>
-              <w:jc w:val="left"/>
-            </w:pPr>
-            <w:r>
-              <w:rPr>
-                <w:rFonts w:ascii="Times New Roman" w:hAnsi="Times New Roman"/>
-                <w:b w:val="0"/>
-                <w:i w:val="0"/>
-                <w:color w:val="000000"/>
-                <w:sz w:val="17"/>
-              </w:rPr>
-              <w:t>100.0% (3/3)</w:t>
-            </w:r>
-          </w:p>
-        </w:tc>
-        <w:tc>
-          <w:tcPr>
-            <w:tcW w:type="dxa" w:w="2016"/>
-          </w:tcPr>
-          <w:p>
-            <w:pPr>
-              <w:jc w:val="left"/>
-            </w:pPr>
-            <w:r>
-              <w:rPr>
-                <w:rFonts w:ascii="Times New Roman" w:hAnsi="Times New Roman"/>
-                <w:b w:val="0"/>
-                <w:i w:val="0"/>
-                <w:color w:val="000000"/>
-                <w:sz w:val="17"/>
-              </w:rPr>
-              <w:t>77.8% (7/9)</w:t>
-            </w:r>
-          </w:p>
-        </w:tc>
-      </w:tr>
-      <w:tr>
-        <w:tc>
-          <w:tcPr>
-            <w:tcW w:type="dxa" w:w="2016"/>
-          </w:tcPr>
-          <w:p>
-            <w:pPr>
-              <w:jc w:val="left"/>
-            </w:pPr>
-            <w:r>
-              <w:rPr>
-                <w:rFonts w:ascii="Times New Roman" w:hAnsi="Times New Roman"/>
-                <w:b w:val="0"/>
-                <w:i w:val="0"/>
-                <w:color w:val="000000"/>
-                <w:sz w:val="17"/>
-              </w:rPr>
-              <w:t>False-answer rate</w:t>
-            </w:r>
-          </w:p>
-        </w:tc>
-        <w:tc>
-          <w:tcPr>
-            <w:tcW w:type="dxa" w:w="2016"/>
-          </w:tcPr>
-          <w:p>
-            <w:pPr>
-              <w:jc w:val="left"/>
-            </w:pPr>
-            <w:r>
-              <w:rPr>
-                <w:rFonts w:ascii="Times New Roman" w:hAnsi="Times New Roman"/>
-                <w:b w:val="0"/>
-                <w:i w:val="0"/>
-                <w:color w:val="000000"/>
-                <w:sz w:val="17"/>
-              </w:rPr>
-              <w:t>42.9% (3/7)</w:t>
-            </w:r>
-          </w:p>
-        </w:tc>
-        <w:tc>
-          <w:tcPr>
-            <w:tcW w:type="dxa" w:w="2016"/>
-          </w:tcPr>
-          <w:p>
-            <w:pPr>
-              <w:jc w:val="left"/>
-            </w:pPr>
-            <w:r>
-              <w:rPr>
-                <w:rFonts w:ascii="Times New Roman" w:hAnsi="Times New Roman"/>
-                <w:b w:val="0"/>
-                <w:i w:val="0"/>
-                <w:color w:val="000000"/>
-                <w:sz w:val="17"/>
-              </w:rPr>
-              <w:t>42.9% (3/7)</w:t>
-            </w:r>
-          </w:p>
-        </w:tc>
-        <w:tc>
-          <w:tcPr>
-            <w:tcW w:type="dxa" w:w="2016"/>
-          </w:tcPr>
-          <w:p>
-            <w:pPr>
-              <w:jc w:val="left"/>
-            </w:pPr>
-            <w:r>
-              <w:rPr>
-                <w:rFonts w:ascii="Times New Roman" w:hAnsi="Times New Roman"/>
-                <w:b w:val="0"/>
-                <w:i w:val="0"/>
-                <w:color w:val="000000"/>
-                <w:sz w:val="17"/>
-              </w:rPr>
-              <w:t>14.3% (1/7)</w:t>
-            </w:r>
-          </w:p>
-        </w:tc>
-        <w:tc>
-          <w:tcPr>
-            <w:tcW w:type="dxa" w:w="2016"/>
-          </w:tcPr>
-          <w:p>
-            <w:pPr>
-              <w:jc w:val="left"/>
-            </w:pPr>
-            <w:r>
-              <w:rPr>
-                <w:rFonts w:ascii="Times New Roman" w:hAnsi="Times New Roman"/>
-                <w:b w:val="0"/>
-                <w:i w:val="0"/>
-                <w:color w:val="000000"/>
-                <w:sz w:val="17"/>
-              </w:rPr>
-              <w:t>33.3% (7/21)</w:t>
-            </w:r>
-          </w:p>
-        </w:tc>
-      </w:tr>
-      <w:tr>
-        <w:tc>
-          <w:tcPr>
-            <w:tcW w:type="dxa" w:w="2016"/>
-          </w:tcPr>
-          <w:p>
-            <w:pPr>
-              <w:jc w:val="left"/>
-            </w:pPr>
-            <w:r>
-              <w:rPr>
-                <w:rFonts w:ascii="Times New Roman" w:hAnsi="Times New Roman"/>
-                <w:b w:val="0"/>
-                <w:i w:val="0"/>
-                <w:color w:val="000000"/>
-                <w:sz w:val="17"/>
-              </w:rPr>
-              <w:t>False-refusal rate</w:t>
-            </w:r>
-          </w:p>
-        </w:tc>
-        <w:tc>
-          <w:tcPr>
-            <w:tcW w:type="dxa" w:w="2016"/>
-          </w:tcPr>
-          <w:p>
-            <w:pPr>
-              <w:jc w:val="left"/>
-            </w:pPr>
-            <w:r>
-              <w:rPr>
-                <w:rFonts w:ascii="Times New Roman" w:hAnsi="Times New Roman"/>
-                <w:b w:val="0"/>
-                <w:i w:val="0"/>
-                <w:color w:val="000000"/>
-                <w:sz w:val="17"/>
-              </w:rPr>
-              <w:t>0.0% (0/20)</w:t>
-            </w:r>
-          </w:p>
-        </w:tc>
-        <w:tc>
-          <w:tcPr>
-            <w:tcW w:type="dxa" w:w="2016"/>
-          </w:tcPr>
-          <w:p>
-            <w:pPr>
-              <w:jc w:val="left"/>
-            </w:pPr>
-            <w:r>
-              <w:rPr>
-                <w:rFonts w:ascii="Times New Roman" w:hAnsi="Times New Roman"/>
-                <w:b w:val="0"/>
-                <w:i w:val="0"/>
-                <w:color w:val="000000"/>
-                <w:sz w:val="17"/>
-              </w:rPr>
-              <w:t>0.0% (0/20)</w:t>
-            </w:r>
-          </w:p>
-        </w:tc>
-        <w:tc>
-          <w:tcPr>
-            <w:tcW w:type="dxa" w:w="2016"/>
-          </w:tcPr>
-          <w:p>
-            <w:pPr>
-              <w:jc w:val="left"/>
-            </w:pPr>
-            <w:r>
-              <w:rPr>
-                <w:rFonts w:ascii="Times New Roman" w:hAnsi="Times New Roman"/>
-                <w:b w:val="0"/>
-                <w:i w:val="0"/>
-                <w:color w:val="000000"/>
-                <w:sz w:val="17"/>
-              </w:rPr>
-              <w:t>0.0% (0/20)</w:t>
-            </w:r>
-          </w:p>
-        </w:tc>
-        <w:tc>
-          <w:tcPr>
-            <w:tcW w:type="dxa" w:w="2016"/>
-          </w:tcPr>
-          <w:p>
-            <w:pPr>
-              <w:jc w:val="left"/>
-            </w:pPr>
-            <w:r>
-              <w:rPr>
-                <w:rFonts w:ascii="Times New Roman" w:hAnsi="Times New Roman"/>
-                <w:b w:val="0"/>
-                <w:i w:val="0"/>
-                <w:color w:val="000000"/>
-                <w:sz w:val="17"/>
-              </w:rPr>
-              <w:t>0.0% (0/60)</w:t>
-            </w:r>
-          </w:p>
-        </w:tc>
-      </w:tr>
-      <w:tr>
-        <w:tc>
-          <w:tcPr>
-            <w:tcW w:type="dxa" w:w="2016"/>
-          </w:tcPr>
-          <w:p>
-            <w:pPr>
-              <w:jc w:val="left"/>
-            </w:pPr>
-            <w:r>
-              <w:rPr>
-                <w:rFonts w:ascii="Times New Roman" w:hAnsi="Times New Roman"/>
-                <w:b w:val="0"/>
-                <w:i w:val="0"/>
-                <w:color w:val="000000"/>
-                <w:sz w:val="17"/>
-              </w:rPr>
-              <w:t>Referral routing</w:t>
-            </w:r>
-          </w:p>
-        </w:tc>
-        <w:tc>
-          <w:tcPr>
-            <w:tcW w:type="dxa" w:w="2016"/>
-          </w:tcPr>
-          <w:p>
-            <w:pPr>
-              <w:jc w:val="left"/>
-            </w:pPr>
-            <w:r>
-              <w:rPr>
-                <w:rFonts w:ascii="Times New Roman" w:hAnsi="Times New Roman"/>
-                <w:b w:val="0"/>
-                <w:i w:val="0"/>
-                <w:color w:val="000000"/>
-                <w:sz w:val="17"/>
-              </w:rPr>
-              <w:t>100.0% (4/4)</w:t>
-            </w:r>
-          </w:p>
-        </w:tc>
-        <w:tc>
-          <w:tcPr>
-            <w:tcW w:type="dxa" w:w="2016"/>
-          </w:tcPr>
-          <w:p>
-            <w:pPr>
-              <w:jc w:val="left"/>
-            </w:pPr>
-            <w:r>
-              <w:rPr>
-                <w:rFonts w:ascii="Times New Roman" w:hAnsi="Times New Roman"/>
-                <w:b w:val="0"/>
-                <w:i w:val="0"/>
-                <w:color w:val="000000"/>
-                <w:sz w:val="17"/>
-              </w:rPr>
-              <w:t>100.0% (4/4)</w:t>
-            </w:r>
-          </w:p>
-        </w:tc>
-        <w:tc>
-          <w:tcPr>
-            <w:tcW w:type="dxa" w:w="2016"/>
-          </w:tcPr>
-          <w:p>
-            <w:pPr>
-              <w:jc w:val="left"/>
-            </w:pPr>
-            <w:r>
-              <w:rPr>
-                <w:rFonts w:ascii="Times New Roman" w:hAnsi="Times New Roman"/>
-                <w:b w:val="0"/>
-                <w:i w:val="0"/>
-                <w:color w:val="000000"/>
-                <w:sz w:val="17"/>
-              </w:rPr>
-              <w:t>100.0% (6/6)</w:t>
-            </w:r>
-          </w:p>
-        </w:tc>
-        <w:tc>
-          <w:tcPr>
-            <w:tcW w:type="dxa" w:w="2016"/>
-          </w:tcPr>
-          <w:p>
-            <w:pPr>
-              <w:jc w:val="left"/>
-            </w:pPr>
-            <w:r>
-              <w:rPr>
-                <w:rFonts w:ascii="Times New Roman" w:hAnsi="Times New Roman"/>
-                <w:b w:val="0"/>
-                <w:i w:val="0"/>
-                <w:color w:val="000000"/>
-                <w:sz w:val="17"/>
-              </w:rPr>
-              <w:t>100.0% (14/14)</w:t>
-            </w:r>
-          </w:p>
-        </w:tc>
-      </w:tr>
-      <w:tr>
-        <w:tc>
-          <w:tcPr>
-            <w:tcW w:type="dxa" w:w="2016"/>
-          </w:tcPr>
-          <w:p>
-            <w:pPr>
-              <w:jc w:val="left"/>
-            </w:pPr>
-            <w:r>
-              <w:rPr>
-                <w:rFonts w:ascii="Times New Roman" w:hAnsi="Times New Roman"/>
-                <w:b w:val="0"/>
-                <w:i w:val="0"/>
-                <w:color w:val="000000"/>
-                <w:sz w:val="17"/>
-              </w:rPr>
-              <w:t>Language fidelity (mean/5)</w:t>
-            </w:r>
-          </w:p>
-        </w:tc>
-        <w:tc>
-          <w:tcPr>
-            <w:tcW w:type="dxa" w:w="2016"/>
-          </w:tcPr>
-          <w:p>
-            <w:pPr>
-              <w:jc w:val="left"/>
-            </w:pPr>
-            <w:r>
-              <w:rPr>
-                <w:rFonts w:ascii="Times New Roman" w:hAnsi="Times New Roman"/>
-                <w:b w:val="0"/>
-                <w:i w:val="0"/>
-                <w:color w:val="000000"/>
-                <w:sz w:val="17"/>
-              </w:rPr>
-              <w:t>5.00</w:t>
-            </w:r>
-          </w:p>
-        </w:tc>
-        <w:tc>
-          <w:tcPr>
-            <w:tcW w:type="dxa" w:w="2016"/>
-          </w:tcPr>
-          <w:p>
-            <w:pPr>
-              <w:jc w:val="left"/>
-            </w:pPr>
-            <w:r>
-              <w:rPr>
-                <w:rFonts w:ascii="Times New Roman" w:hAnsi="Times New Roman"/>
-                <w:b w:val="0"/>
-                <w:i w:val="0"/>
-                <w:color w:val="000000"/>
-                <w:sz w:val="17"/>
-              </w:rPr>
-              <w:t>4.13</w:t>
-            </w:r>
-          </w:p>
-        </w:tc>
-        <w:tc>
-          <w:tcPr>
-            <w:tcW w:type="dxa" w:w="2016"/>
-          </w:tcPr>
-          <w:p>
-            <w:pPr>
-              <w:jc w:val="left"/>
-            </w:pPr>
-            <w:r>
-              <w:rPr>
-                <w:rFonts w:ascii="Times New Roman" w:hAnsi="Times New Roman"/>
-                <w:b w:val="0"/>
-                <w:i w:val="0"/>
-                <w:color w:val="000000"/>
-                <w:sz w:val="17"/>
-              </w:rPr>
-              <w:t>4.33</w:t>
-            </w:r>
-          </w:p>
-        </w:tc>
-        <w:tc>
-          <w:tcPr>
-            <w:tcW w:type="dxa" w:w="2016"/>
-          </w:tcPr>
-          <w:p>
-            <w:pPr>
-              <w:jc w:val="left"/>
-            </w:pPr>
-            <w:r>
-              <w:rPr>
-                <w:rFonts w:ascii="Times New Roman" w:hAnsi="Times New Roman"/>
-                <w:b w:val="0"/>
-                <w:i w:val="0"/>
-                <w:color w:val="000000"/>
-                <w:sz w:val="17"/>
-              </w:rPr>
-              <w:t>4.49</w:t>
-            </w:r>
-          </w:p>
-        </w:tc>
-      </w:tr>
-    </w:tbl>
-    <w:p>
-      <w:pPr>
-        <w:spacing w:after="120"/>
-      </w:pPr>
-    </w:p>
-    <w:p>
-      <w:pPr>
-        <w:spacing w:before="0" w:after="80" w:line="252" w:lineRule="auto"/>
-        <w:jc w:val="both"/>
-      </w:pPr>
-      <w:r>
-        <w:rPr>
-          <w:rFonts w:ascii="Times New Roman" w:hAnsi="Times New Roman"/>
-          <w:b w:val="0"/>
-          <w:i w:val="0"/>
-          <w:color w:val="000000"/>
-          <w:sz w:val="19"/>
-        </w:rPr>
-        <w:t xml:space="preserve">In Run 3, overall answer correctness rose to </w:t>
-      </w:r>
-      <w:r>
-        <w:rPr>
-          <w:rFonts w:ascii="Times New Roman" w:hAnsi="Times New Roman"/>
-          <w:b/>
-          <w:i w:val="0"/>
-          <w:color w:val="000000"/>
-          <w:sz w:val="19"/>
-        </w:rPr>
-        <w:t>86.7%</w:t>
-      </w:r>
-      <w:r>
-        <w:rPr>
-          <w:rFonts w:ascii="Times New Roman" w:hAnsi="Times New Roman"/>
-          <w:b w:val="0"/>
-          <w:i w:val="0"/>
-          <w:color w:val="000000"/>
-          <w:sz w:val="19"/>
-        </w:rPr>
-        <w:t xml:space="preserve"> (52/60), source attachment reached </w:t>
-      </w:r>
-      <w:r>
-        <w:rPr>
-          <w:rFonts w:ascii="Times New Roman" w:hAnsi="Times New Roman"/>
-          <w:b/>
-          <w:i w:val="0"/>
-          <w:color w:val="000000"/>
-          <w:sz w:val="19"/>
-        </w:rPr>
-        <w:t>100.0%</w:t>
-      </w:r>
-      <w:r>
-        <w:rPr>
-          <w:rFonts w:ascii="Times New Roman" w:hAnsi="Times New Roman"/>
-          <w:b w:val="0"/>
-          <w:i w:val="0"/>
-          <w:color w:val="000000"/>
-          <w:sz w:val="19"/>
-        </w:rPr>
-        <w:t xml:space="preserve"> (60/60), and the false-refusal rate dropped to </w:t>
-      </w:r>
-      <w:r>
-        <w:rPr>
-          <w:rFonts w:ascii="Times New Roman" w:hAnsi="Times New Roman"/>
-          <w:b/>
-          <w:i w:val="0"/>
-          <w:color w:val="000000"/>
-          <w:sz w:val="19"/>
-        </w:rPr>
-        <w:t>0.0%</w:t>
-      </w:r>
-      <w:r>
-        <w:rPr>
-          <w:rFonts w:ascii="Times New Roman" w:hAnsi="Times New Roman"/>
-          <w:b w:val="0"/>
-          <w:i w:val="0"/>
-          <w:color w:val="000000"/>
-          <w:sz w:val="19"/>
-        </w:rPr>
-        <w:t xml:space="preserve"> (0/60). Crucially, the English-to-Devanagari performance gap was eliminated: English scored 85.0% (17/20), Marathi 85.0% (17/20), and Hindi 90.0% (18/20), yielding a post-normalization Fisher's exact test of $p = 1.0$ for English versus pooled Devanagari (35/40). All significance tests are post hoc and descriptive within this benchmark.</w:t>
-      </w:r>
-    </w:p>
-    <w:p>
-      <w:pPr>
         <w:keepNext/>
         <w:spacing w:before="200" w:after="60"/>
       </w:pPr>
@@ -6565,7 +5480,7 @@
           <w:color w:val="000000"/>
           <w:sz w:val="19"/>
         </w:rPr>
-        <w:t xml:space="preserve"> In Run 2, 14 answerable Devanagari queries were falsely refused. Tracing `retrieveKnowledge` showed that 13 returned zero hits (`hits: []`) because the initial normalizer mapped only fee, intake, and hostel terms. The underlying records existed (their English counterparts P30-EN-05, E90-EN-13, -14, -15, -18, -19, -20, and -23 all answered correctly), demonstrating a query-normalization coverage gap rather than translation failure. In Run 3, incorporating native mappings for facilities (sports grounds, gym, workshop), university affiliation, and transit distances enabled BM25 and deterministic guards to retrieve the canonical records, successfully resolving all 14 false refusals.</w:t>
+        <w:t xml:space="preserve"> In Run 2, 14 answerable Devanagari queries were falsely refused. Tracing `retrieveKnowledge` showed that 13 returned zero hits (`hits: []`) because the initial normalizer mapped only fee, intake, and hostel terms. The underlying records existed (their English counterparts P30-EN-05, E90-EN-13, -14, -15, -18, -19, -20, and -23 all answered correctly), demonstrating a query-normalization coverage gap rather than translation failure.</w:t>
       </w:r>
     </w:p>
     <w:p>
@@ -6590,7 +5505,7 @@
           <w:color w:val="000000"/>
           <w:sz w:val="19"/>
         </w:rPr>
-        <w:t>Audit of remaining non-correct cases.</w:t>
+        <w:t>Answered-but-not-correct cases.</w:t>
       </w:r>
       <w:r>
         <w:rPr>
@@ -6600,7 +5515,7 @@
           <w:color w:val="000000"/>
           <w:sz w:val="19"/>
         </w:rPr>
-        <w:t xml:space="preserve"> Table IX classifies the remaining eight answerable cases that did not achieve full credit in Run 3 (English 3, Marathi 3, Hindi 2).</w:t>
+        <w:t xml:space="preserve"> Table VIII classifies the ten answerable cases that were answered but not scored correct in Run 2 (English 3, Marathi 4, Hindi 3). The classification is the authors' own audit of the stored responses.</w:t>
       </w:r>
     </w:p>
     <w:p>
@@ -6616,7 +5531,7 @@
           <w:color w:val="000000"/>
           <w:sz w:val="20"/>
         </w:rPr>
-        <w:t>TABLE IX: AUDIT OF EIGHT NON-CORRECT ANSWERABLE CASES IN RUN 3</w:t>
+        <w:t>TABLE VIII: AUDIT OF TEN ANSWERED-BUT-NOT-CORRECT CASES IN RUN 2</w:t>
       </w:r>
     </w:p>
     <w:tbl>
@@ -6749,7 +5664,7 @@
                 <w:color w:val="000000"/>
                 <w:sz w:val="17"/>
               </w:rPr>
-              <w:t>Process summary was correct, but a specific threshold or workshop trade list was omitted.</w:t>
+              <w:t>Process or summary was correct, but a required detail was not stated (the 45% HSC threshold; the named workshop trades).</w:t>
             </w:r>
           </w:p>
         </w:tc>
@@ -6771,7 +5686,69 @@
                 <w:color w:val="000000"/>
                 <w:sz w:val="17"/>
               </w:rPr>
-              <w:t>Information not published in institutional notices</w:t>
+              <w:t>Script-matching scorer miss</w:t>
+            </w:r>
+          </w:p>
+        </w:tc>
+        <w:tc>
+          <w:tcPr>
+            <w:tcW w:type="dxa" w:w="3360"/>
+          </w:tcPr>
+          <w:p>
+            <w:pPr>
+              <w:jc w:val="left"/>
+            </w:pPr>
+            <w:r>
+              <w:rPr>
+                <w:rFonts w:ascii="Times New Roman" w:hAnsi="Times New Roman"/>
+                <w:b w:val="0"/>
+                <w:i w:val="0"/>
+                <w:color w:val="000000"/>
+                <w:sz w:val="17"/>
+              </w:rPr>
+              <w:t>E90-MR-22, E90-HI-23</w:t>
+            </w:r>
+          </w:p>
+        </w:tc>
+        <w:tc>
+          <w:tcPr>
+            <w:tcW w:type="dxa" w:w="3360"/>
+          </w:tcPr>
+          <w:p>
+            <w:pPr>
+              <w:jc w:val="left"/>
+            </w:pPr>
+            <w:r>
+              <w:rPr>
+                <w:rFonts w:ascii="Times New Roman" w:hAnsi="Times New Roman"/>
+                <w:b w:val="0"/>
+                <w:i w:val="0"/>
+                <w:color w:val="000000"/>
+                <w:sz w:val="17"/>
+              </w:rPr>
+              <w:t>Required facts are stored in Latin script; the Devanagari responses expressed them in Devanagari or listed programmes without the stored string, so the harness marked them incorrect.</w:t>
+            </w:r>
+          </w:p>
+        </w:tc>
+      </w:tr>
+      <w:tr>
+        <w:tc>
+          <w:tcPr>
+            <w:tcW w:type="dxa" w:w="3360"/>
+          </w:tcPr>
+          <w:p>
+            <w:pPr>
+              <w:jc w:val="left"/>
+            </w:pPr>
+            <w:r>
+              <w:rPr>
+                <w:rFonts w:ascii="Times New Roman" w:hAnsi="Times New Roman"/>
+                <w:b w:val="0"/>
+                <w:i w:val="0"/>
+                <w:color w:val="000000"/>
+                <w:sz w:val="17"/>
+              </w:rPr>
+              <w:t>Information not published; scorer match unchecked</w:t>
             </w:r>
           </w:p>
         </w:tc>
@@ -6811,7 +5788,7 @@
                 <w:color w:val="000000"/>
                 <w:sz w:val="17"/>
               </w:rPr>
-              <w:t>The system accurately stated that college bus route lists are not published; the required stop names (*Solapur*, *Kurduwadi*) were missing from college records.</w:t>
+              <w:t>The system correctly stated that the bus route list is not published. The required place names are also stored in Latin script, so a scorer miss may contribute (not yet checked).</w:t>
             </w:r>
           </w:p>
         </w:tc>
@@ -6833,7 +5810,7 @@
                 <w:color w:val="000000"/>
                 <w:sz w:val="17"/>
               </w:rPr>
-              <w:t>Required fact absent from college circulars</w:t>
+              <w:t>Required fact absent from college records</w:t>
             </w:r>
           </w:p>
         </w:tc>
@@ -6873,7 +5850,7 @@
                 <w:color w:val="000000"/>
                 <w:sz w:val="17"/>
               </w:rPr>
-              <w:t>The AICTE Pragati scholarship amount is an external central scheme figure absent from internal fee notices. Marathi and Hindi issued clarifying guidance; English suffered topic drift toward fee concessions.</w:t>
+              <w:t>The AICTE Pragati scholarship amount is not in institutional notices. Marathi and Hindi gave portal guidance; English returned unrelated fee-concession content (retrieval topic drift).</w:t>
             </w:r>
           </w:p>
         </w:tc>
@@ -6895,7 +5872,7 @@
                 <w:color w:val="000000"/>
                 <w:sz w:val="17"/>
               </w:rPr>
-              <w:t>Partial contact details</w:t>
+              <w:t>Translation fallback</w:t>
             </w:r>
           </w:p>
         </w:tc>
@@ -6935,7 +5912,7 @@
                 <w:color w:val="000000"/>
                 <w:sz w:val="17"/>
               </w:rPr>
-              <w:t>Response provided official working hours and desk details, matching two of three required contact facts (score 0.5).</w:t>
+              <w:t>English fallback notice without the contact numbers inline.</w:t>
             </w:r>
           </w:p>
         </w:tc>
@@ -6945,22 +5922,6 @@
       <w:pPr>
         <w:spacing w:after="120"/>
       </w:pPr>
-    </w:p>
-    <w:p>
-      <w:pPr>
-        <w:spacing w:before="0" w:after="80" w:line="252" w:lineRule="auto"/>
-        <w:jc w:val="both"/>
-      </w:pPr>
-      <w:r>
-        <w:rPr>
-          <w:rFonts w:ascii="Times New Roman" w:hAnsi="Times New Roman"/>
-          <w:b w:val="0"/>
-          <w:i w:val="0"/>
-          <w:color w:val="000000"/>
-          <w:sz w:val="19"/>
-        </w:rPr>
-        <w:t>No fabricated numeric figure was observed in this audit. The Pragati scholarship and bus route cases highlight questions whose "answerable" benchmark label is questionable given the unseeded status of external circulars in the college repository.</w:t>
-      </w:r>
     </w:p>
     <w:p>
       <w:pPr>
@@ -7010,7 +5971,1108 @@
           <w:color w:val="000000"/>
           <w:sz w:val="20"/>
         </w:rPr>
-        <w:t>6.6 Summary of Evidence Layers</w:t>
+        <w:t>6.6 Milestone Comparison: Run 2 vs. Run 3</w:t>
+      </w:r>
+    </w:p>
+    <w:p>
+      <w:pPr>
+        <w:spacing w:before="0" w:after="80" w:line="252" w:lineRule="auto"/>
+        <w:jc w:val="both"/>
+      </w:pPr>
+      <w:r>
+        <w:rPr>
+          <w:rFonts w:ascii="Times New Roman" w:hAnsi="Times New Roman"/>
+          <w:b w:val="0"/>
+          <w:i w:val="0"/>
+          <w:color w:val="000000"/>
+          <w:sz w:val="19"/>
+        </w:rPr>
+        <w:t xml:space="preserve">Following the diagnosis detailed in Section 6.5, Run 3 (`8167770`) integrated native dictionary normalization for facility, sports, transit, and affiliation vocabulary into query preprocessing and made harness fact-scoring script-aware (handling Devanagari numerals and cross-script synonyms like </w:t>
+      </w:r>
+      <w:r>
+        <w:rPr>
+          <w:rFonts w:ascii="Times New Roman" w:hAnsi="Times New Roman"/>
+          <w:b w:val="0"/>
+          <w:i/>
+          <w:color w:val="000000"/>
+          <w:sz w:val="19"/>
+        </w:rPr>
+        <w:t>railway</w:t>
+      </w:r>
+      <w:r>
+        <w:rPr>
+          <w:rFonts w:ascii="Times New Roman" w:hAnsi="Times New Roman"/>
+          <w:b w:val="0"/>
+          <w:i w:val="0"/>
+          <w:color w:val="000000"/>
+          <w:sz w:val="19"/>
+        </w:rPr>
+        <w:t xml:space="preserve"> / </w:t>
+      </w:r>
+      <w:r>
+        <w:rPr>
+          <w:rFonts w:ascii="Times New Roman" w:hAnsi="Times New Roman"/>
+          <w:b w:val="0"/>
+          <w:i/>
+          <w:color w:val="000000"/>
+          <w:sz w:val="19"/>
+        </w:rPr>
+        <w:t>रेल्वे</w:t>
+      </w:r>
+      <w:r>
+        <w:rPr>
+          <w:rFonts w:ascii="Times New Roman" w:hAnsi="Times New Roman"/>
+          <w:b w:val="0"/>
+          <w:i w:val="0"/>
+          <w:color w:val="000000"/>
+          <w:sz w:val="19"/>
+        </w:rPr>
+        <w:t>). Table IX presents the comparative outcomes of Run 2 and Run 3 side by side.</w:t>
+      </w:r>
+    </w:p>
+    <w:p>
+      <w:pPr>
+        <w:keepNext/>
+        <w:spacing w:before="200" w:after="60"/>
+      </w:pPr>
+      <w:r>
+        <w:rPr>
+          <w:rFonts w:ascii="Times New Roman" w:hAnsi="Times New Roman"/>
+          <w:b/>
+          <w:i/>
+          <w:color w:val="000000"/>
+          <w:sz w:val="20"/>
+        </w:rPr>
+        <w:t>TABLE IX: MULTILINGUAL 90-CASE BENCHMARK: RUN 2 VERSUS RUN 3 SIDE BY SIDE</w:t>
+      </w:r>
+    </w:p>
+    <w:tbl>
+      <w:tblPr>
+        <w:tblW w:type="auto" w:w="0"/>
+        <w:jc w:val="center"/>
+        <w:tblLook w:firstColumn="1" w:firstRow="1" w:lastColumn="0" w:lastRow="0" w:noHBand="0" w:noVBand="1" w:val="04A0"/>
+      </w:tblPr>
+      <w:tblGrid>
+        <w:gridCol w:w="2016"/>
+        <w:gridCol w:w="2016"/>
+        <w:gridCol w:w="2016"/>
+        <w:gridCol w:w="2016"/>
+        <w:gridCol w:w="2016"/>
+      </w:tblGrid>
+      <w:tr>
+        <w:tc>
+          <w:tcPr>
+            <w:tcW w:type="dxa" w:w="2016"/>
+          </w:tcPr>
+          <w:p>
+            <w:pPr>
+              <w:jc w:val="left"/>
+            </w:pPr>
+            <w:r>
+              <w:rPr>
+                <w:rFonts w:ascii="Times New Roman" w:hAnsi="Times New Roman"/>
+                <w:b/>
+                <w:i w:val="0"/>
+                <w:color w:val="000000"/>
+                <w:sz w:val="17"/>
+              </w:rPr>
+              <w:t>Metric</w:t>
+            </w:r>
+          </w:p>
+        </w:tc>
+        <w:tc>
+          <w:tcPr>
+            <w:tcW w:type="dxa" w:w="2016"/>
+          </w:tcPr>
+          <w:p>
+            <w:pPr>
+              <w:jc w:val="left"/>
+            </w:pPr>
+            <w:r>
+              <w:rPr>
+                <w:rFonts w:ascii="Times New Roman" w:hAnsi="Times New Roman"/>
+                <w:b/>
+                <w:i w:val="0"/>
+                <w:color w:val="000000"/>
+                <w:sz w:val="17"/>
+              </w:rPr>
+              <w:t>English (Run 2 / Run 3)</w:t>
+            </w:r>
+          </w:p>
+        </w:tc>
+        <w:tc>
+          <w:tcPr>
+            <w:tcW w:type="dxa" w:w="2016"/>
+          </w:tcPr>
+          <w:p>
+            <w:pPr>
+              <w:jc w:val="left"/>
+            </w:pPr>
+            <w:r>
+              <w:rPr>
+                <w:rFonts w:ascii="Times New Roman" w:hAnsi="Times New Roman"/>
+                <w:b/>
+                <w:i w:val="0"/>
+                <w:color w:val="000000"/>
+                <w:sz w:val="17"/>
+              </w:rPr>
+              <w:t>Marathi (Run 2 / Run 3)</w:t>
+            </w:r>
+          </w:p>
+        </w:tc>
+        <w:tc>
+          <w:tcPr>
+            <w:tcW w:type="dxa" w:w="2016"/>
+          </w:tcPr>
+          <w:p>
+            <w:pPr>
+              <w:jc w:val="left"/>
+            </w:pPr>
+            <w:r>
+              <w:rPr>
+                <w:rFonts w:ascii="Times New Roman" w:hAnsi="Times New Roman"/>
+                <w:b/>
+                <w:i w:val="0"/>
+                <w:color w:val="000000"/>
+                <w:sz w:val="17"/>
+              </w:rPr>
+              <w:t>Hindi (Run 2 / Run 3)</w:t>
+            </w:r>
+          </w:p>
+        </w:tc>
+        <w:tc>
+          <w:tcPr>
+            <w:tcW w:type="dxa" w:w="2016"/>
+          </w:tcPr>
+          <w:p>
+            <w:pPr>
+              <w:jc w:val="left"/>
+            </w:pPr>
+            <w:r>
+              <w:rPr>
+                <w:rFonts w:ascii="Times New Roman" w:hAnsi="Times New Roman"/>
+                <w:b/>
+                <w:i w:val="0"/>
+                <w:color w:val="000000"/>
+                <w:sz w:val="17"/>
+              </w:rPr>
+              <w:t>Overall (Run 2 / Run 3)</w:t>
+            </w:r>
+          </w:p>
+        </w:tc>
+      </w:tr>
+      <w:tr>
+        <w:tc>
+          <w:tcPr>
+            <w:tcW w:type="dxa" w:w="2016"/>
+          </w:tcPr>
+          <w:p>
+            <w:pPr>
+              <w:jc w:val="left"/>
+            </w:pPr>
+            <w:r>
+              <w:rPr>
+                <w:rFonts w:ascii="Times New Roman" w:hAnsi="Times New Roman"/>
+                <w:b w:val="0"/>
+                <w:i w:val="0"/>
+                <w:color w:val="000000"/>
+                <w:sz w:val="17"/>
+              </w:rPr>
+              <w:t>Answer correctness</w:t>
+            </w:r>
+          </w:p>
+        </w:tc>
+        <w:tc>
+          <w:tcPr>
+            <w:tcW w:type="dxa" w:w="2016"/>
+          </w:tcPr>
+          <w:p>
+            <w:pPr>
+              <w:jc w:val="left"/>
+            </w:pPr>
+            <w:r>
+              <w:rPr>
+                <w:rFonts w:ascii="Times New Roman" w:hAnsi="Times New Roman"/>
+                <w:b w:val="0"/>
+                <w:i w:val="0"/>
+                <w:color w:val="000000"/>
+                <w:sz w:val="17"/>
+              </w:rPr>
+              <w:t>85.0% / 85.0% (17/20)</w:t>
+            </w:r>
+          </w:p>
+        </w:tc>
+        <w:tc>
+          <w:tcPr>
+            <w:tcW w:type="dxa" w:w="2016"/>
+          </w:tcPr>
+          <w:p>
+            <w:pPr>
+              <w:jc w:val="left"/>
+            </w:pPr>
+            <w:r>
+              <w:rPr>
+                <w:rFonts w:ascii="Times New Roman" w:hAnsi="Times New Roman"/>
+                <w:b w:val="0"/>
+                <w:i w:val="0"/>
+                <w:color w:val="000000"/>
+                <w:sz w:val="17"/>
+              </w:rPr>
+              <w:t>50.0% / 85.0% (10/20 $\rightarrow$ 17/20)</w:t>
+            </w:r>
+          </w:p>
+        </w:tc>
+        <w:tc>
+          <w:tcPr>
+            <w:tcW w:type="dxa" w:w="2016"/>
+          </w:tcPr>
+          <w:p>
+            <w:pPr>
+              <w:jc w:val="left"/>
+            </w:pPr>
+            <w:r>
+              <w:rPr>
+                <w:rFonts w:ascii="Times New Roman" w:hAnsi="Times New Roman"/>
+                <w:b w:val="0"/>
+                <w:i w:val="0"/>
+                <w:color w:val="000000"/>
+                <w:sz w:val="17"/>
+              </w:rPr>
+              <w:t>45.0% / 90.0% (9/20 $\rightarrow$ 18/20)</w:t>
+            </w:r>
+          </w:p>
+        </w:tc>
+        <w:tc>
+          <w:tcPr>
+            <w:tcW w:type="dxa" w:w="2016"/>
+          </w:tcPr>
+          <w:p>
+            <w:pPr>
+              <w:jc w:val="left"/>
+            </w:pPr>
+            <w:r>
+              <w:rPr>
+                <w:rFonts w:ascii="Times New Roman" w:hAnsi="Times New Roman"/>
+                <w:b w:val="0"/>
+                <w:i w:val="0"/>
+                <w:color w:val="000000"/>
+                <w:sz w:val="17"/>
+              </w:rPr>
+              <w:t>60.0% / 86.7% (36/60 $\rightarrow$ 52/60)</w:t>
+            </w:r>
+          </w:p>
+        </w:tc>
+      </w:tr>
+      <w:tr>
+        <w:tc>
+          <w:tcPr>
+            <w:tcW w:type="dxa" w:w="2016"/>
+          </w:tcPr>
+          <w:p>
+            <w:pPr>
+              <w:jc w:val="left"/>
+            </w:pPr>
+            <w:r>
+              <w:rPr>
+                <w:rFonts w:ascii="Times New Roman" w:hAnsi="Times New Roman"/>
+                <w:b w:val="0"/>
+                <w:i w:val="0"/>
+                <w:color w:val="000000"/>
+                <w:sz w:val="17"/>
+              </w:rPr>
+              <w:t>Source attachment</w:t>
+            </w:r>
+          </w:p>
+        </w:tc>
+        <w:tc>
+          <w:tcPr>
+            <w:tcW w:type="dxa" w:w="2016"/>
+          </w:tcPr>
+          <w:p>
+            <w:pPr>
+              <w:jc w:val="left"/>
+            </w:pPr>
+            <w:r>
+              <w:rPr>
+                <w:rFonts w:ascii="Times New Roman" w:hAnsi="Times New Roman"/>
+                <w:b w:val="0"/>
+                <w:i w:val="0"/>
+                <w:color w:val="000000"/>
+                <w:sz w:val="17"/>
+              </w:rPr>
+              <w:t>100.0% / 100.0% (20/20)</w:t>
+            </w:r>
+          </w:p>
+        </w:tc>
+        <w:tc>
+          <w:tcPr>
+            <w:tcW w:type="dxa" w:w="2016"/>
+          </w:tcPr>
+          <w:p>
+            <w:pPr>
+              <w:jc w:val="left"/>
+            </w:pPr>
+            <w:r>
+              <w:rPr>
+                <w:rFonts w:ascii="Times New Roman" w:hAnsi="Times New Roman"/>
+                <w:b w:val="0"/>
+                <w:i w:val="0"/>
+                <w:color w:val="000000"/>
+                <w:sz w:val="17"/>
+              </w:rPr>
+              <w:t>70.0% / 100.0% (14/20 $\rightarrow$ 20/20)</w:t>
+            </w:r>
+          </w:p>
+        </w:tc>
+        <w:tc>
+          <w:tcPr>
+            <w:tcW w:type="dxa" w:w="2016"/>
+          </w:tcPr>
+          <w:p>
+            <w:pPr>
+              <w:jc w:val="left"/>
+            </w:pPr>
+            <w:r>
+              <w:rPr>
+                <w:rFonts w:ascii="Times New Roman" w:hAnsi="Times New Roman"/>
+                <w:b w:val="0"/>
+                <w:i w:val="0"/>
+                <w:color w:val="000000"/>
+                <w:sz w:val="17"/>
+              </w:rPr>
+              <w:t>60.0% / 100.0% (12/20 $\rightarrow$ 20/20)</w:t>
+            </w:r>
+          </w:p>
+        </w:tc>
+        <w:tc>
+          <w:tcPr>
+            <w:tcW w:type="dxa" w:w="2016"/>
+          </w:tcPr>
+          <w:p>
+            <w:pPr>
+              <w:jc w:val="left"/>
+            </w:pPr>
+            <w:r>
+              <w:rPr>
+                <w:rFonts w:ascii="Times New Roman" w:hAnsi="Times New Roman"/>
+                <w:b w:val="0"/>
+                <w:i w:val="0"/>
+                <w:color w:val="000000"/>
+                <w:sz w:val="17"/>
+              </w:rPr>
+              <w:t>76.7% / 100.0% (46/60 $\rightarrow$ 60/60)</w:t>
+            </w:r>
+          </w:p>
+        </w:tc>
+      </w:tr>
+      <w:tr>
+        <w:tc>
+          <w:tcPr>
+            <w:tcW w:type="dxa" w:w="2016"/>
+          </w:tcPr>
+          <w:p>
+            <w:pPr>
+              <w:jc w:val="left"/>
+            </w:pPr>
+            <w:r>
+              <w:rPr>
+                <w:rFonts w:ascii="Times New Roman" w:hAnsi="Times New Roman"/>
+                <w:b w:val="0"/>
+                <w:i w:val="0"/>
+                <w:color w:val="000000"/>
+                <w:sz w:val="17"/>
+              </w:rPr>
+              <w:t>Appropriate abstention</w:t>
+            </w:r>
+          </w:p>
+        </w:tc>
+        <w:tc>
+          <w:tcPr>
+            <w:tcW w:type="dxa" w:w="2016"/>
+          </w:tcPr>
+          <w:p>
+            <w:pPr>
+              <w:jc w:val="left"/>
+            </w:pPr>
+            <w:r>
+              <w:rPr>
+                <w:rFonts w:ascii="Times New Roman" w:hAnsi="Times New Roman"/>
+                <w:b w:val="0"/>
+                <w:i w:val="0"/>
+                <w:color w:val="000000"/>
+                <w:sz w:val="17"/>
+              </w:rPr>
+              <w:t>57.1% / 57.1% (4/7)</w:t>
+            </w:r>
+          </w:p>
+        </w:tc>
+        <w:tc>
+          <w:tcPr>
+            <w:tcW w:type="dxa" w:w="2016"/>
+          </w:tcPr>
+          <w:p>
+            <w:pPr>
+              <w:jc w:val="left"/>
+            </w:pPr>
+            <w:r>
+              <w:rPr>
+                <w:rFonts w:ascii="Times New Roman" w:hAnsi="Times New Roman"/>
+                <w:b w:val="0"/>
+                <w:i w:val="0"/>
+                <w:color w:val="000000"/>
+                <w:sz w:val="17"/>
+              </w:rPr>
+              <w:t>71.4% / 57.1% (5/7 $\rightarrow$ 4/7)</w:t>
+            </w:r>
+          </w:p>
+        </w:tc>
+        <w:tc>
+          <w:tcPr>
+            <w:tcW w:type="dxa" w:w="2016"/>
+          </w:tcPr>
+          <w:p>
+            <w:pPr>
+              <w:jc w:val="left"/>
+            </w:pPr>
+            <w:r>
+              <w:rPr>
+                <w:rFonts w:ascii="Times New Roman" w:hAnsi="Times New Roman"/>
+                <w:b w:val="0"/>
+                <w:i w:val="0"/>
+                <w:color w:val="000000"/>
+                <w:sz w:val="17"/>
+              </w:rPr>
+              <w:t>85.7% / 85.7% (6/7)</w:t>
+            </w:r>
+          </w:p>
+        </w:tc>
+        <w:tc>
+          <w:tcPr>
+            <w:tcW w:type="dxa" w:w="2016"/>
+          </w:tcPr>
+          <w:p>
+            <w:pPr>
+              <w:jc w:val="left"/>
+            </w:pPr>
+            <w:r>
+              <w:rPr>
+                <w:rFonts w:ascii="Times New Roman" w:hAnsi="Times New Roman"/>
+                <w:b w:val="0"/>
+                <w:i w:val="0"/>
+                <w:color w:val="000000"/>
+                <w:sz w:val="17"/>
+              </w:rPr>
+              <w:t>71.4% / 66.7% (15/21 $\rightarrow$ 14/21)</w:t>
+            </w:r>
+          </w:p>
+        </w:tc>
+      </w:tr>
+      <w:tr>
+        <w:tc>
+          <w:tcPr>
+            <w:tcW w:type="dxa" w:w="2016"/>
+          </w:tcPr>
+          <w:p>
+            <w:pPr>
+              <w:jc w:val="left"/>
+            </w:pPr>
+            <w:r>
+              <w:rPr>
+                <w:rFonts w:ascii="Times New Roman" w:hAnsi="Times New Roman"/>
+                <w:b w:val="0"/>
+                <w:i w:val="0"/>
+                <w:color w:val="000000"/>
+                <w:sz w:val="17"/>
+              </w:rPr>
+              <w:t>Clarification accuracy</w:t>
+            </w:r>
+          </w:p>
+        </w:tc>
+        <w:tc>
+          <w:tcPr>
+            <w:tcW w:type="dxa" w:w="2016"/>
+          </w:tcPr>
+          <w:p>
+            <w:pPr>
+              <w:jc w:val="left"/>
+            </w:pPr>
+            <w:r>
+              <w:rPr>
+                <w:rFonts w:ascii="Times New Roman" w:hAnsi="Times New Roman"/>
+                <w:b w:val="0"/>
+                <w:i w:val="0"/>
+                <w:color w:val="000000"/>
+                <w:sz w:val="17"/>
+              </w:rPr>
+              <w:t>33.3% / 33.3% (1/3)</w:t>
+            </w:r>
+          </w:p>
+        </w:tc>
+        <w:tc>
+          <w:tcPr>
+            <w:tcW w:type="dxa" w:w="2016"/>
+          </w:tcPr>
+          <w:p>
+            <w:pPr>
+              <w:jc w:val="left"/>
+            </w:pPr>
+            <w:r>
+              <w:rPr>
+                <w:rFonts w:ascii="Times New Roman" w:hAnsi="Times New Roman"/>
+                <w:b w:val="0"/>
+                <w:i w:val="0"/>
+                <w:color w:val="000000"/>
+                <w:sz w:val="17"/>
+              </w:rPr>
+              <w:t>100.0% / 100.0% (3/3)</w:t>
+            </w:r>
+          </w:p>
+        </w:tc>
+        <w:tc>
+          <w:tcPr>
+            <w:tcW w:type="dxa" w:w="2016"/>
+          </w:tcPr>
+          <w:p>
+            <w:pPr>
+              <w:jc w:val="left"/>
+            </w:pPr>
+            <w:r>
+              <w:rPr>
+                <w:rFonts w:ascii="Times New Roman" w:hAnsi="Times New Roman"/>
+                <w:b w:val="0"/>
+                <w:i w:val="0"/>
+                <w:color w:val="000000"/>
+                <w:sz w:val="17"/>
+              </w:rPr>
+              <w:t>100.0% / 100.0% (3/3)</w:t>
+            </w:r>
+          </w:p>
+        </w:tc>
+        <w:tc>
+          <w:tcPr>
+            <w:tcW w:type="dxa" w:w="2016"/>
+          </w:tcPr>
+          <w:p>
+            <w:pPr>
+              <w:jc w:val="left"/>
+            </w:pPr>
+            <w:r>
+              <w:rPr>
+                <w:rFonts w:ascii="Times New Roman" w:hAnsi="Times New Roman"/>
+                <w:b w:val="0"/>
+                <w:i w:val="0"/>
+                <w:color w:val="000000"/>
+                <w:sz w:val="17"/>
+              </w:rPr>
+              <w:t>77.8% / 77.8% (7/9)</w:t>
+            </w:r>
+          </w:p>
+        </w:tc>
+      </w:tr>
+      <w:tr>
+        <w:tc>
+          <w:tcPr>
+            <w:tcW w:type="dxa" w:w="2016"/>
+          </w:tcPr>
+          <w:p>
+            <w:pPr>
+              <w:jc w:val="left"/>
+            </w:pPr>
+            <w:r>
+              <w:rPr>
+                <w:rFonts w:ascii="Times New Roman" w:hAnsi="Times New Roman"/>
+                <w:b w:val="0"/>
+                <w:i w:val="0"/>
+                <w:color w:val="000000"/>
+                <w:sz w:val="17"/>
+              </w:rPr>
+              <w:t>False-answer rate</w:t>
+            </w:r>
+          </w:p>
+        </w:tc>
+        <w:tc>
+          <w:tcPr>
+            <w:tcW w:type="dxa" w:w="2016"/>
+          </w:tcPr>
+          <w:p>
+            <w:pPr>
+              <w:jc w:val="left"/>
+            </w:pPr>
+            <w:r>
+              <w:rPr>
+                <w:rFonts w:ascii="Times New Roman" w:hAnsi="Times New Roman"/>
+                <w:b w:val="0"/>
+                <w:i w:val="0"/>
+                <w:color w:val="000000"/>
+                <w:sz w:val="17"/>
+              </w:rPr>
+              <w:t>42.9% / 42.9% (3/7)</w:t>
+            </w:r>
+          </w:p>
+        </w:tc>
+        <w:tc>
+          <w:tcPr>
+            <w:tcW w:type="dxa" w:w="2016"/>
+          </w:tcPr>
+          <w:p>
+            <w:pPr>
+              <w:jc w:val="left"/>
+            </w:pPr>
+            <w:r>
+              <w:rPr>
+                <w:rFonts w:ascii="Times New Roman" w:hAnsi="Times New Roman"/>
+                <w:b w:val="0"/>
+                <w:i w:val="0"/>
+                <w:color w:val="000000"/>
+                <w:sz w:val="17"/>
+              </w:rPr>
+              <w:t>28.6% / 42.9% (2/7 $\rightarrow$ 3/7)</w:t>
+            </w:r>
+          </w:p>
+        </w:tc>
+        <w:tc>
+          <w:tcPr>
+            <w:tcW w:type="dxa" w:w="2016"/>
+          </w:tcPr>
+          <w:p>
+            <w:pPr>
+              <w:jc w:val="left"/>
+            </w:pPr>
+            <w:r>
+              <w:rPr>
+                <w:rFonts w:ascii="Times New Roman" w:hAnsi="Times New Roman"/>
+                <w:b w:val="0"/>
+                <w:i w:val="0"/>
+                <w:color w:val="000000"/>
+                <w:sz w:val="17"/>
+              </w:rPr>
+              <w:t>14.3% / 14.3% (1/7)</w:t>
+            </w:r>
+          </w:p>
+        </w:tc>
+        <w:tc>
+          <w:tcPr>
+            <w:tcW w:type="dxa" w:w="2016"/>
+          </w:tcPr>
+          <w:p>
+            <w:pPr>
+              <w:jc w:val="left"/>
+            </w:pPr>
+            <w:r>
+              <w:rPr>
+                <w:rFonts w:ascii="Times New Roman" w:hAnsi="Times New Roman"/>
+                <w:b w:val="0"/>
+                <w:i w:val="0"/>
+                <w:color w:val="000000"/>
+                <w:sz w:val="17"/>
+              </w:rPr>
+              <w:t>28.6% / 33.3% (6/21 $\rightarrow$ 7/21)</w:t>
+            </w:r>
+          </w:p>
+        </w:tc>
+      </w:tr>
+      <w:tr>
+        <w:tc>
+          <w:tcPr>
+            <w:tcW w:type="dxa" w:w="2016"/>
+          </w:tcPr>
+          <w:p>
+            <w:pPr>
+              <w:jc w:val="left"/>
+            </w:pPr>
+            <w:r>
+              <w:rPr>
+                <w:rFonts w:ascii="Times New Roman" w:hAnsi="Times New Roman"/>
+                <w:b w:val="0"/>
+                <w:i w:val="0"/>
+                <w:color w:val="000000"/>
+                <w:sz w:val="17"/>
+              </w:rPr>
+              <w:t>False-refusal rate</w:t>
+            </w:r>
+          </w:p>
+        </w:tc>
+        <w:tc>
+          <w:tcPr>
+            <w:tcW w:type="dxa" w:w="2016"/>
+          </w:tcPr>
+          <w:p>
+            <w:pPr>
+              <w:jc w:val="left"/>
+            </w:pPr>
+            <w:r>
+              <w:rPr>
+                <w:rFonts w:ascii="Times New Roman" w:hAnsi="Times New Roman"/>
+                <w:b w:val="0"/>
+                <w:i w:val="0"/>
+                <w:color w:val="000000"/>
+                <w:sz w:val="17"/>
+              </w:rPr>
+              <w:t>0.0% / 0.0% (0/20)</w:t>
+            </w:r>
+          </w:p>
+        </w:tc>
+        <w:tc>
+          <w:tcPr>
+            <w:tcW w:type="dxa" w:w="2016"/>
+          </w:tcPr>
+          <w:p>
+            <w:pPr>
+              <w:jc w:val="left"/>
+            </w:pPr>
+            <w:r>
+              <w:rPr>
+                <w:rFonts w:ascii="Times New Roman" w:hAnsi="Times New Roman"/>
+                <w:b w:val="0"/>
+                <w:i w:val="0"/>
+                <w:color w:val="000000"/>
+                <w:sz w:val="17"/>
+              </w:rPr>
+              <w:t>30.0% / 0.0% (6/20 $\rightarrow$ 0/20)</w:t>
+            </w:r>
+          </w:p>
+        </w:tc>
+        <w:tc>
+          <w:tcPr>
+            <w:tcW w:type="dxa" w:w="2016"/>
+          </w:tcPr>
+          <w:p>
+            <w:pPr>
+              <w:jc w:val="left"/>
+            </w:pPr>
+            <w:r>
+              <w:rPr>
+                <w:rFonts w:ascii="Times New Roman" w:hAnsi="Times New Roman"/>
+                <w:b w:val="0"/>
+                <w:i w:val="0"/>
+                <w:color w:val="000000"/>
+                <w:sz w:val="17"/>
+              </w:rPr>
+              <w:t>40.0% / 0.0% (8/20 $\rightarrow$ 0/20)</w:t>
+            </w:r>
+          </w:p>
+        </w:tc>
+        <w:tc>
+          <w:tcPr>
+            <w:tcW w:type="dxa" w:w="2016"/>
+          </w:tcPr>
+          <w:p>
+            <w:pPr>
+              <w:jc w:val="left"/>
+            </w:pPr>
+            <w:r>
+              <w:rPr>
+                <w:rFonts w:ascii="Times New Roman" w:hAnsi="Times New Roman"/>
+                <w:b w:val="0"/>
+                <w:i w:val="0"/>
+                <w:color w:val="000000"/>
+                <w:sz w:val="17"/>
+              </w:rPr>
+              <w:t>23.3% / 0.0% (14/60 $\rightarrow$ 0/60)</w:t>
+            </w:r>
+          </w:p>
+        </w:tc>
+      </w:tr>
+      <w:tr>
+        <w:tc>
+          <w:tcPr>
+            <w:tcW w:type="dxa" w:w="2016"/>
+          </w:tcPr>
+          <w:p>
+            <w:pPr>
+              <w:jc w:val="left"/>
+            </w:pPr>
+            <w:r>
+              <w:rPr>
+                <w:rFonts w:ascii="Times New Roman" w:hAnsi="Times New Roman"/>
+                <w:b w:val="0"/>
+                <w:i w:val="0"/>
+                <w:color w:val="000000"/>
+                <w:sz w:val="17"/>
+              </w:rPr>
+              <w:t>Referral routing</w:t>
+            </w:r>
+          </w:p>
+        </w:tc>
+        <w:tc>
+          <w:tcPr>
+            <w:tcW w:type="dxa" w:w="2016"/>
+          </w:tcPr>
+          <w:p>
+            <w:pPr>
+              <w:jc w:val="left"/>
+            </w:pPr>
+            <w:r>
+              <w:rPr>
+                <w:rFonts w:ascii="Times New Roman" w:hAnsi="Times New Roman"/>
+                <w:b w:val="0"/>
+                <w:i w:val="0"/>
+                <w:color w:val="000000"/>
+                <w:sz w:val="17"/>
+              </w:rPr>
+              <w:t>100.0% / 100.0% (4/4)</w:t>
+            </w:r>
+          </w:p>
+        </w:tc>
+        <w:tc>
+          <w:tcPr>
+            <w:tcW w:type="dxa" w:w="2016"/>
+          </w:tcPr>
+          <w:p>
+            <w:pPr>
+              <w:jc w:val="left"/>
+            </w:pPr>
+            <w:r>
+              <w:rPr>
+                <w:rFonts w:ascii="Times New Roman" w:hAnsi="Times New Roman"/>
+                <w:b w:val="0"/>
+                <w:i w:val="0"/>
+                <w:color w:val="000000"/>
+                <w:sz w:val="17"/>
+              </w:rPr>
+              <w:t>100.0% / 100.0% (4/4)</w:t>
+            </w:r>
+          </w:p>
+        </w:tc>
+        <w:tc>
+          <w:tcPr>
+            <w:tcW w:type="dxa" w:w="2016"/>
+          </w:tcPr>
+          <w:p>
+            <w:pPr>
+              <w:jc w:val="left"/>
+            </w:pPr>
+            <w:r>
+              <w:rPr>
+                <w:rFonts w:ascii="Times New Roman" w:hAnsi="Times New Roman"/>
+                <w:b w:val="0"/>
+                <w:i w:val="0"/>
+                <w:color w:val="000000"/>
+                <w:sz w:val="17"/>
+              </w:rPr>
+              <w:t>100.0% / 100.0% (6/6)</w:t>
+            </w:r>
+          </w:p>
+        </w:tc>
+        <w:tc>
+          <w:tcPr>
+            <w:tcW w:type="dxa" w:w="2016"/>
+          </w:tcPr>
+          <w:p>
+            <w:pPr>
+              <w:jc w:val="left"/>
+            </w:pPr>
+            <w:r>
+              <w:rPr>
+                <w:rFonts w:ascii="Times New Roman" w:hAnsi="Times New Roman"/>
+                <w:b w:val="0"/>
+                <w:i w:val="0"/>
+                <w:color w:val="000000"/>
+                <w:sz w:val="17"/>
+              </w:rPr>
+              <w:t>100.0% / 100.0% (14/14)</w:t>
+            </w:r>
+          </w:p>
+        </w:tc>
+      </w:tr>
+      <w:tr>
+        <w:tc>
+          <w:tcPr>
+            <w:tcW w:type="dxa" w:w="2016"/>
+          </w:tcPr>
+          <w:p>
+            <w:pPr>
+              <w:jc w:val="left"/>
+            </w:pPr>
+            <w:r>
+              <w:rPr>
+                <w:rFonts w:ascii="Times New Roman" w:hAnsi="Times New Roman"/>
+                <w:b w:val="0"/>
+                <w:i w:val="0"/>
+                <w:color w:val="000000"/>
+                <w:sz w:val="17"/>
+              </w:rPr>
+              <w:t>Language fidelity (mean/5)</w:t>
+            </w:r>
+          </w:p>
+        </w:tc>
+        <w:tc>
+          <w:tcPr>
+            <w:tcW w:type="dxa" w:w="2016"/>
+          </w:tcPr>
+          <w:p>
+            <w:pPr>
+              <w:jc w:val="left"/>
+            </w:pPr>
+            <w:r>
+              <w:rPr>
+                <w:rFonts w:ascii="Times New Roman" w:hAnsi="Times New Roman"/>
+                <w:b w:val="0"/>
+                <w:i w:val="0"/>
+                <w:color w:val="000000"/>
+                <w:sz w:val="17"/>
+              </w:rPr>
+              <w:t>5.00 / 5.00</w:t>
+            </w:r>
+          </w:p>
+        </w:tc>
+        <w:tc>
+          <w:tcPr>
+            <w:tcW w:type="dxa" w:w="2016"/>
+          </w:tcPr>
+          <w:p>
+            <w:pPr>
+              <w:jc w:val="left"/>
+            </w:pPr>
+            <w:r>
+              <w:rPr>
+                <w:rFonts w:ascii="Times New Roman" w:hAnsi="Times New Roman"/>
+                <w:b w:val="0"/>
+                <w:i w:val="0"/>
+                <w:color w:val="000000"/>
+                <w:sz w:val="17"/>
+              </w:rPr>
+              <w:t>4.70 / 4.13</w:t>
+            </w:r>
+          </w:p>
+        </w:tc>
+        <w:tc>
+          <w:tcPr>
+            <w:tcW w:type="dxa" w:w="2016"/>
+          </w:tcPr>
+          <w:p>
+            <w:pPr>
+              <w:jc w:val="left"/>
+            </w:pPr>
+            <w:r>
+              <w:rPr>
+                <w:rFonts w:ascii="Times New Roman" w:hAnsi="Times New Roman"/>
+                <w:b w:val="0"/>
+                <w:i w:val="0"/>
+                <w:color w:val="000000"/>
+                <w:sz w:val="17"/>
+              </w:rPr>
+              <w:t>4.80 / 4.33</w:t>
+            </w:r>
+          </w:p>
+        </w:tc>
+        <w:tc>
+          <w:tcPr>
+            <w:tcW w:type="dxa" w:w="2016"/>
+          </w:tcPr>
+          <w:p>
+            <w:pPr>
+              <w:jc w:val="left"/>
+            </w:pPr>
+            <w:r>
+              <w:rPr>
+                <w:rFonts w:ascii="Times New Roman" w:hAnsi="Times New Roman"/>
+                <w:b w:val="0"/>
+                <w:i w:val="0"/>
+                <w:color w:val="000000"/>
+                <w:sz w:val="17"/>
+              </w:rPr>
+              <w:t>4.83 / 4.49</w:t>
+            </w:r>
+          </w:p>
+        </w:tc>
+      </w:tr>
+    </w:tbl>
+    <w:p>
+      <w:pPr>
+        <w:spacing w:after="120"/>
+      </w:pPr>
+    </w:p>
+    <w:p>
+      <w:pPr>
+        <w:spacing w:before="0" w:after="80" w:line="252" w:lineRule="auto"/>
+        <w:jc w:val="both"/>
+      </w:pPr>
+      <w:r>
+        <w:rPr>
+          <w:rFonts w:ascii="Times New Roman" w:hAnsi="Times New Roman"/>
+          <w:b w:val="0"/>
+          <w:i w:val="0"/>
+          <w:color w:val="000000"/>
+          <w:sz w:val="19"/>
+        </w:rPr>
+        <w:t xml:space="preserve">In Run 3, overall answer correctness rose to </w:t>
+      </w:r>
+      <w:r>
+        <w:rPr>
+          <w:rFonts w:ascii="Times New Roman" w:hAnsi="Times New Roman"/>
+          <w:b/>
+          <w:i w:val="0"/>
+          <w:color w:val="000000"/>
+          <w:sz w:val="19"/>
+        </w:rPr>
+        <w:t>86.7%</w:t>
+      </w:r>
+      <w:r>
+        <w:rPr>
+          <w:rFonts w:ascii="Times New Roman" w:hAnsi="Times New Roman"/>
+          <w:b w:val="0"/>
+          <w:i w:val="0"/>
+          <w:color w:val="000000"/>
+          <w:sz w:val="19"/>
+        </w:rPr>
+        <w:t xml:space="preserve"> (52/60), source attachment reached </w:t>
+      </w:r>
+      <w:r>
+        <w:rPr>
+          <w:rFonts w:ascii="Times New Roman" w:hAnsi="Times New Roman"/>
+          <w:b/>
+          <w:i w:val="0"/>
+          <w:color w:val="000000"/>
+          <w:sz w:val="19"/>
+        </w:rPr>
+        <w:t>100.0%</w:t>
+      </w:r>
+      <w:r>
+        <w:rPr>
+          <w:rFonts w:ascii="Times New Roman" w:hAnsi="Times New Roman"/>
+          <w:b w:val="0"/>
+          <w:i w:val="0"/>
+          <w:color w:val="000000"/>
+          <w:sz w:val="19"/>
+        </w:rPr>
+        <w:t xml:space="preserve"> (60/60), and the false-refusal rate dropped to </w:t>
+      </w:r>
+      <w:r>
+        <w:rPr>
+          <w:rFonts w:ascii="Times New Roman" w:hAnsi="Times New Roman"/>
+          <w:b/>
+          <w:i w:val="0"/>
+          <w:color w:val="000000"/>
+          <w:sz w:val="19"/>
+        </w:rPr>
+        <w:t>0.0%</w:t>
+      </w:r>
+      <w:r>
+        <w:rPr>
+          <w:rFonts w:ascii="Times New Roman" w:hAnsi="Times New Roman"/>
+          <w:b w:val="0"/>
+          <w:i w:val="0"/>
+          <w:color w:val="000000"/>
+          <w:sz w:val="19"/>
+        </w:rPr>
+        <w:t xml:space="preserve"> (0/60). Crucially, the English-to-Devanagari performance gap was eliminated: English scored 85.0% (17/20), Marathi 85.0% (17/20), and Hindi 90.0% (18/20), yielding a post-normalization Fisher's exact test of $p = 1.0$ for English versus pooled Devanagari (35/40). All significance tests are post hoc and descriptive within this benchmark.</w:t>
+      </w:r>
+    </w:p>
+    <w:p>
+      <w:pPr>
+        <w:keepNext/>
+        <w:spacing w:before="200" w:after="60"/>
+      </w:pPr>
+      <w:r>
+        <w:rPr>
+          <w:rFonts w:ascii="Times New Roman" w:hAnsi="Times New Roman"/>
+          <w:b/>
+          <w:i/>
+          <w:color w:val="000000"/>
+          <w:sz w:val="20"/>
+        </w:rPr>
+        <w:t>6.7 Summary of Evidence Layers</w:t>
       </w:r>
     </w:p>
     <w:p>

</xml_diff>